<commit_message>
Avance Documentación currently trabajando con las rotaciones y desplazamientos
</commit_message>
<xml_diff>
--- a/Documentacion_Desafio1.docx
+++ b/Documentacion_Desafio1.docx
@@ -588,7 +588,6 @@
           <w:highlight w:val="none"/>
           <w:lang w:val="es-ES"/>
         </w:rPr>
-        <w:t xml:space="preserve">Mateo Rodriguez Yepez</w:t>
       </w:r>
       <w:r>
         <w:rPr>
@@ -612,9 +611,9 @@
     <w:p>
       <w:pPr>
         <w:pBdr/>
-        <w:shd w:val="nil" w:color="auto"/>
-        <w:spacing/>
-        <w:ind/>
+        <w:spacing/>
+        <w:ind/>
+        <w:jc w:val="center"/>
         <w:rPr>
           <w:rFonts w:ascii="Asana Math" w:hAnsi="Asana Math" w:eastAsia="Asana Math" w:cs="Asana Math"/>
           <w:sz w:val="40"/>
@@ -631,7 +630,6 @@
           <w:highlight w:val="none"/>
           <w:lang w:val="es-ES"/>
         </w:rPr>
-        <w:br w:type="page" w:clear="all"/>
       </w:r>
       <w:r>
         <w:rPr>
@@ -660,30 +658,266 @@
         <w:jc w:val="center"/>
         <w:rPr>
           <w:rFonts w:ascii="Asana Math" w:hAnsi="Asana Math" w:eastAsia="Asana Math" w:cs="Asana Math"/>
-          <w:sz w:val="28"/>
-          <w:szCs w:val="28"/>
+          <w:sz w:val="40"/>
+          <w:szCs w:val="40"/>
           <w:highlight w:val="none"/>
           <w:lang w:val="es-ES"/>
         </w:rPr>
       </w:pPr>
       <w:r>
+        <w:rPr>
+          <w:rFonts w:ascii="Asana Math" w:hAnsi="Asana Math" w:eastAsia="Asana Math" w:cs="Asana Math"/>
+          <w:sz w:val="40"/>
+          <w:szCs w:val="40"/>
+          <w:highlight w:val="none"/>
+          <w:lang w:val="es-ES"/>
+        </w:rPr>
+      </w:r>
+      <w:r>
+        <w:rPr>
+          <w:rFonts w:ascii="Asana Math" w:hAnsi="Asana Math" w:eastAsia="Asana Math" w:cs="Asana Math"/>
+          <w:sz w:val="40"/>
+          <w:szCs w:val="40"/>
+          <w:highlight w:val="none"/>
+          <w:lang w:val="es-ES"/>
+        </w:rPr>
+      </w:r>
+      <w:r>
+        <w:rPr>
+          <w:rFonts w:ascii="Asana Math" w:hAnsi="Asana Math" w:eastAsia="Asana Math" w:cs="Asana Math"/>
+          <w:sz w:val="40"/>
+          <w:szCs w:val="40"/>
+          <w:highlight w:val="none"/>
+          <w:lang w:val="es-ES"/>
+        </w:rPr>
+      </w:r>
+    </w:p>
+    <w:p>
+      <w:pPr>
+        <w:pBdr/>
+        <w:spacing/>
+        <w:ind/>
+        <w:jc w:val="center"/>
+        <w:rPr>
+          <w:rFonts w:ascii="Asana Math" w:hAnsi="Asana Math" w:eastAsia="Asana Math" w:cs="Asana Math"/>
+          <w:sz w:val="40"/>
+          <w:szCs w:val="40"/>
+          <w:highlight w:val="none"/>
+          <w:lang w:val="es-ES"/>
+        </w:rPr>
+      </w:pPr>
+      <w:r>
+        <w:rPr>
+          <w:rFonts w:ascii="Asana Math" w:hAnsi="Asana Math" w:eastAsia="Asana Math" w:cs="Asana Math"/>
+          <w:sz w:val="40"/>
+          <w:szCs w:val="40"/>
+          <w:highlight w:val="none"/>
+          <w:lang w:val="es-ES"/>
+        </w:rPr>
+      </w:r>
+      <w:r>
+        <w:rPr>
+          <w:rFonts w:ascii="Asana Math" w:hAnsi="Asana Math" w:eastAsia="Asana Math" w:cs="Asana Math"/>
+          <w:sz w:val="40"/>
+          <w:szCs w:val="40"/>
+          <w:highlight w:val="none"/>
+          <w:lang w:val="es-ES"/>
+        </w:rPr>
+      </w:r>
+      <w:r>
+        <w:rPr>
+          <w:rFonts w:ascii="Asana Math" w:hAnsi="Asana Math" w:eastAsia="Asana Math" w:cs="Asana Math"/>
+          <w:sz w:val="40"/>
+          <w:szCs w:val="40"/>
+          <w:highlight w:val="none"/>
+          <w:lang w:val="es-ES"/>
+        </w:rPr>
+      </w:r>
+    </w:p>
+    <w:p>
+      <w:pPr>
+        <w:pBdr/>
+        <w:spacing/>
+        <w:ind/>
+        <w:jc w:val="center"/>
+        <w:rPr>
+          <w:rFonts w:ascii="Asana Math" w:hAnsi="Asana Math" w:eastAsia="Asana Math" w:cs="Asana Math"/>
+          <w:sz w:val="40"/>
+          <w:szCs w:val="40"/>
+          <w:highlight w:val="none"/>
+          <w:lang w:val="es-ES"/>
+        </w:rPr>
+      </w:pPr>
+      <w:r>
+        <w:rPr>
+          <w:rFonts w:ascii="Asana Math" w:hAnsi="Asana Math" w:eastAsia="Asana Math" w:cs="Asana Math"/>
+          <w:sz w:val="40"/>
+          <w:szCs w:val="40"/>
+          <w:highlight w:val="none"/>
+          <w:lang w:val="es-ES"/>
+        </w:rPr>
+      </w:r>
+      <w:r>
+        <w:rPr>
+          <w:rFonts w:ascii="Asana Math" w:hAnsi="Asana Math" w:eastAsia="Asana Math" w:cs="Asana Math"/>
+          <w:sz w:val="40"/>
+          <w:szCs w:val="40"/>
+          <w:highlight w:val="none"/>
+          <w:lang w:val="es-ES"/>
+        </w:rPr>
+      </w:r>
+      <w:r>
+        <w:rPr>
+          <w:rFonts w:ascii="Asana Math" w:hAnsi="Asana Math" w:eastAsia="Asana Math" w:cs="Asana Math"/>
+          <w:sz w:val="40"/>
+          <w:szCs w:val="40"/>
+          <w:highlight w:val="none"/>
+          <w:lang w:val="es-ES"/>
+        </w:rPr>
+      </w:r>
+    </w:p>
+    <w:p>
+      <w:pPr>
+        <w:pBdr/>
+        <w:spacing/>
+        <w:ind/>
+        <w:jc w:val="center"/>
+        <w:rPr>
+          <w:rFonts w:ascii="Asana Math" w:hAnsi="Asana Math" w:eastAsia="Asana Math" w:cs="Asana Math"/>
+          <w:sz w:val="40"/>
+          <w:szCs w:val="40"/>
+          <w:highlight w:val="none"/>
+          <w:lang w:val="es-ES"/>
+        </w:rPr>
+      </w:pPr>
+      <w:r>
+        <w:rPr>
+          <w:rFonts w:ascii="Asana Math" w:hAnsi="Asana Math" w:eastAsia="Asana Math" w:cs="Asana Math"/>
+          <w:sz w:val="40"/>
+          <w:szCs w:val="40"/>
+          <w:highlight w:val="none"/>
+          <w:lang w:val="es-ES" w:bidi="es-ES"/>
+        </w:rPr>
+      </w:r>
+      <w:r>
+        <w:rPr>
+          <w:rFonts w:ascii="Asana Math" w:hAnsi="Asana Math" w:eastAsia="Asana Math" w:cs="Asana Math"/>
+          <w:sz w:val="40"/>
+          <w:szCs w:val="40"/>
+          <w:highlight w:val="none"/>
+          <w:lang w:val="es-ES" w:bidi="es-ES"/>
+        </w:rPr>
+      </w:r>
+      <w:r>
+        <w:rPr>
+          <w:rFonts w:ascii="Asana Math" w:hAnsi="Asana Math" w:eastAsia="Asana Math" w:cs="Asana Math"/>
+          <w:sz w:val="40"/>
+          <w:szCs w:val="40"/>
+          <w:highlight w:val="none"/>
+          <w:lang w:val="es-ES"/>
+        </w:rPr>
+      </w:r>
+    </w:p>
+    <w:p>
+      <w:pPr>
+        <w:pBdr/>
+        <w:spacing/>
+        <w:ind/>
+        <w:jc w:val="center"/>
+        <w:rPr>
+          <w:rFonts w:ascii="Asana Math" w:hAnsi="Asana Math" w:eastAsia="Asana Math" w:cs="Asana Math"/>
+          <w:sz w:val="40"/>
+          <w:szCs w:val="40"/>
+          <w:highlight w:val="none"/>
+          <w:lang w:val="es-ES"/>
+        </w:rPr>
+      </w:pPr>
+      <w:r>
+        <w:rPr>
+          <w:rFonts w:ascii="Asana Math" w:hAnsi="Asana Math" w:eastAsia="Asana Math" w:cs="Asana Math"/>
+          <w:sz w:val="40"/>
+          <w:szCs w:val="40"/>
+          <w:highlight w:val="none"/>
+          <w:lang w:val="es-ES"/>
+        </w:rPr>
+        <w:t xml:space="preserve">Mateo Rodriguez Yepez</w:t>
+      </w:r>
+      <w:r>
+        <w:rPr>
+          <w:rFonts w:ascii="Asana Math" w:hAnsi="Asana Math" w:eastAsia="Asana Math" w:cs="Asana Math"/>
+          <w:sz w:val="40"/>
+          <w:szCs w:val="40"/>
+          <w:highlight w:val="none"/>
+          <w:lang w:val="es-ES"/>
+        </w:rPr>
+      </w:r>
+      <w:r>
+        <w:rPr>
+          <w:rFonts w:ascii="Asana Math" w:hAnsi="Asana Math" w:eastAsia="Asana Math" w:cs="Asana Math"/>
+          <w:sz w:val="40"/>
+          <w:szCs w:val="40"/>
+          <w:highlight w:val="none"/>
+          <w:lang w:val="es-ES"/>
+        </w:rPr>
+      </w:r>
+    </w:p>
+    <w:p>
+      <w:pPr>
+        <w:pageBreakBefore w:val="true"/>
+        <w:pBdr/>
+        <w:shd w:val="nil" w:color="auto"/>
+        <w:spacing/>
+        <w:ind/>
+        <w:rPr>
+          <w:rFonts w:ascii="Asana Math" w:hAnsi="Asana Math" w:eastAsia="Asana Math" w:cs="Asana Math"/>
+          <w:sz w:val="40"/>
+          <w:szCs w:val="40"/>
+          <w:highlight w:val="none"/>
+          <w:lang w:val="es-ES"/>
+        </w:rPr>
+      </w:pPr>
+      <w:r>
+        <w:rPr>
+          <w:rFonts w:ascii="Asana Math" w:hAnsi="Asana Math" w:eastAsia="Asana Math" w:cs="Asana Math"/>
+          <w:sz w:val="40"/>
+          <w:szCs w:val="40"/>
+          <w:highlight w:val="none"/>
+          <w:lang w:val="es-ES"/>
+        </w:rPr>
+      </w:r>
+      <w:r>
+        <w:rPr>
+          <w:rFonts w:ascii="Asana Math" w:hAnsi="Asana Math" w:eastAsia="Asana Math" w:cs="Asana Math"/>
+          <w:sz w:val="40"/>
+          <w:szCs w:val="40"/>
+          <w:highlight w:val="none"/>
+          <w:lang w:val="es-ES"/>
+        </w:rPr>
+      </w:r>
+    </w:p>
+    <w:p>
+      <w:pPr>
+        <w:pBdr/>
+        <w:spacing/>
+        <w:ind/>
+        <w:jc w:val="center"/>
         <w:rPr>
           <w:rFonts w:ascii="Asana Math" w:hAnsi="Asana Math" w:eastAsia="Asana Math" w:cs="Asana Math"/>
           <w:sz w:val="28"/>
           <w:szCs w:val="28"/>
           <w:highlight w:val="none"/>
-          <w:lang w:val="es-ES" w:bidi="es-ES"/>
-        </w:rPr>
-        <w:t xml:space="preserve">TABLA DE CONTENIDOS</w:t>
-      </w:r>
+          <w:lang w:val="es-ES"/>
+        </w:rPr>
+      </w:pPr>
       <w:r>
         <w:rPr>
           <w:rFonts w:ascii="Asana Math" w:hAnsi="Asana Math" w:eastAsia="Asana Math" w:cs="Asana Math"/>
           <w:sz w:val="28"/>
           <w:szCs w:val="28"/>
           <w:highlight w:val="none"/>
-          <w:lang w:val="es-ES"/>
-        </w:rPr>
+          <w:lang w:val="es-ES" w:bidi="es-ES"/>
+        </w:rPr>
+        <w:t xml:space="preserve">TABLA DE CONTENIDOS</w:t>
       </w:r>
       <w:r>
         <w:rPr>
@@ -694,13 +928,7 @@
           <w:lang w:val="es-ES"/>
         </w:rPr>
       </w:r>
-    </w:p>
-    <w:p>
-      <w:pPr>
-        <w:pBdr/>
-        <w:spacing/>
-        <w:ind w:firstLine="0" w:left="0"/>
-        <w:jc w:val="left"/>
+      <w:r>
         <w:rPr>
           <w:rFonts w:ascii="Asana Math" w:hAnsi="Asana Math" w:eastAsia="Asana Math" w:cs="Asana Math"/>
           <w:sz w:val="28"/>
@@ -708,6 +936,21 @@
           <w:highlight w:val="none"/>
           <w:lang w:val="es-ES"/>
         </w:rPr>
+      </w:r>
+    </w:p>
+    <w:p>
+      <w:pPr>
+        <w:pBdr/>
+        <w:spacing/>
+        <w:ind w:firstLine="0" w:left="0"/>
+        <w:jc w:val="left"/>
+        <w:rPr>
+          <w:rFonts w:ascii="Asana Math" w:hAnsi="Asana Math" w:eastAsia="Asana Math" w:cs="Asana Math"/>
+          <w:sz w:val="28"/>
+          <w:szCs w:val="28"/>
+          <w:highlight w:val="none"/>
+          <w:lang w:val="es-ES"/>
+        </w:rPr>
       </w:pPr>
       <w:r>
         <w:rPr>
@@ -819,28 +1062,169 @@
         <w:jc w:val="left"/>
         <w:rPr>
           <w:rFonts w:ascii="Asana Math" w:hAnsi="Asana Math" w:eastAsia="Asana Math" w:cs="Asana Math"/>
-          <w:sz w:val="28"/>
-          <w:szCs w:val="28"/>
+          <w:sz w:val="24"/>
+          <w:szCs w:val="24"/>
+          <w:highlight w:val="none"/>
+          <w:lang w:val="es-ES" w:bidi="es-ES"/>
+        </w:rPr>
+      </w:pPr>
+      <w:r>
+        <w:rPr>
+          <w:rFonts w:ascii="Asana Math" w:hAnsi="Asana Math" w:eastAsia="Asana Math" w:cs="Asana Math"/>
+          <w:sz w:val="24"/>
+          <w:szCs w:val="24"/>
+          <w:highlight w:val="none"/>
+          <w:lang w:val="es-ES" w:bidi="es-ES"/>
+        </w:rPr>
+        <w:t xml:space="preserve">2.1.</w:t>
+      </w:r>
+      <w:r>
+        <w:rPr>
+          <w:rFonts w:ascii="Asana Math" w:hAnsi="Asana Math" w:eastAsia="Asana Math" w:cs="Asana Math"/>
+          <w:sz w:val="24"/>
+          <w:szCs w:val="24"/>
+          <w:highlight w:val="none"/>
+          <w:lang w:val="es-ES" w:bidi="es-ES"/>
+        </w:rPr>
+        <w:t xml:space="preserve">CREACI</w:t>
+      </w:r>
+      <w:r>
+        <w:rPr>
+          <w:rFonts w:ascii="Asana Math" w:hAnsi="Asana Math" w:eastAsia="Asana Math" w:cs="Asana Math"/>
+          <w:sz w:val="24"/>
+          <w:szCs w:val="24"/>
+          <w:highlight w:val="none"/>
+          <w:lang w:val="es-ES" w:bidi="es-ES"/>
+        </w:rPr>
+        <w:t xml:space="preserve">ÓN DEL TABLERO................................................................................................</w:t>
+      </w:r>
+      <w:r>
+        <w:rPr>
+          <w:rFonts w:ascii="Asana Math" w:hAnsi="Asana Math" w:eastAsia="Asana Math" w:cs="Asana Math"/>
+          <w:sz w:val="24"/>
+          <w:szCs w:val="24"/>
           <w:highlight w:val="none"/>
           <w:lang w:val="es-ES"/>
         </w:rPr>
-      </w:pPr>
-      <w:r>
+      </w:r>
+    </w:p>
+    <w:p>
+      <w:pPr>
+        <w:pBdr/>
+        <w:spacing/>
+        <w:ind/>
+        <w:jc w:val="left"/>
+        <w:rPr>
+          <w:rFonts w:ascii="Asana Math" w:hAnsi="Asana Math" w:eastAsia="Asana Math" w:cs="Asana Math"/>
+          <w:sz w:val="24"/>
+          <w:szCs w:val="24"/>
+          <w:highlight w:val="none"/>
+          <w:lang w:val="es-ES"/>
+        </w:rPr>
+      </w:pPr>
+      <w:r>
+        <w:rPr>
+          <w:rFonts w:ascii="Asana Math" w:hAnsi="Asana Math" w:eastAsia="Asana Math" w:cs="Asana Math"/>
+          <w:sz w:val="24"/>
+          <w:szCs w:val="24"/>
+          <w:highlight w:val="none"/>
+          <w:lang w:val="es-ES" w:bidi="es-ES"/>
+        </w:rPr>
+        <w:t xml:space="preserve">2.2.USO DE MEMORIA DINAMICA.......................................................................................</w:t>
+      </w:r>
+      <w:r>
+        <w:rPr>
+          <w:rFonts w:ascii="Asana Math" w:hAnsi="Asana Math" w:eastAsia="Asana Math" w:cs="Asana Math"/>
+          <w:sz w:val="24"/>
+          <w:szCs w:val="24"/>
+          <w:highlight w:val="none"/>
+          <w:lang w:val="es-ES" w:bidi="es-ES"/>
+        </w:rPr>
+      </w:r>
+      <w:r>
+        <w:rPr>
+          <w:rFonts w:ascii="Asana Math" w:hAnsi="Asana Math" w:eastAsia="Asana Math" w:cs="Asana Math"/>
+          <w:sz w:val="24"/>
+          <w:szCs w:val="24"/>
+          <w:highlight w:val="none"/>
+          <w:lang w:val="es-ES" w:bidi="es-ES"/>
+        </w:rPr>
+      </w:r>
+    </w:p>
+    <w:p>
+      <w:pPr>
+        <w:pBdr/>
+        <w:spacing/>
+        <w:ind/>
+        <w:jc w:val="left"/>
+        <w:rPr>
+          <w:rFonts w:ascii="Asana Math" w:hAnsi="Asana Math" w:eastAsia="Asana Math" w:cs="Asana Math"/>
+          <w:sz w:val="24"/>
+          <w:szCs w:val="24"/>
+          <w:highlight w:val="none"/>
+          <w:lang w:val="es-ES"/>
+        </w:rPr>
+      </w:pPr>
+      <w:r>
+        <w:rPr>
+          <w:rFonts w:ascii="Asana Math" w:hAnsi="Asana Math" w:eastAsia="Asana Math" w:cs="Asana Math"/>
+          <w:sz w:val="24"/>
+          <w:szCs w:val="24"/>
+          <w:highlight w:val="none"/>
+          <w:lang w:val="es-ES" w:bidi="es-ES"/>
+        </w:rPr>
+        <w:t xml:space="preserve">3. PIEZAS Y SU REPRESENTACI</w:t>
+      </w:r>
+      <w:r>
+        <w:rPr>
+          <w:rFonts w:ascii="Asana Math" w:hAnsi="Asana Math" w:eastAsia="Asana Math" w:cs="Asana Math"/>
+          <w:sz w:val="24"/>
+          <w:szCs w:val="24"/>
+          <w:highlight w:val="none"/>
+          <w:lang w:val="es-ES" w:bidi="es-ES"/>
+        </w:rPr>
+        <w:t xml:space="preserve">ÓN.......................................................................................</w:t>
+      </w:r>
+      <w:r>
+        <w:rPr>
+          <w:rFonts w:ascii="Asana Math" w:hAnsi="Asana Math" w:eastAsia="Asana Math" w:cs="Asana Math"/>
+          <w:sz w:val="24"/>
+          <w:szCs w:val="24"/>
+          <w:highlight w:val="none"/>
+          <w:lang w:val="es-ES" w:bidi="es-ES"/>
+        </w:rPr>
+      </w:r>
+      <w:r>
+        <w:rPr>
+          <w:rFonts w:ascii="Asana Math" w:hAnsi="Asana Math" w:eastAsia="Asana Math" w:cs="Asana Math"/>
+          <w:sz w:val="24"/>
+          <w:szCs w:val="24"/>
+          <w:highlight w:val="none"/>
+          <w:lang w:val="es-ES"/>
+        </w:rPr>
+      </w:r>
+    </w:p>
+    <w:p>
+      <w:pPr>
+        <w:pBdr/>
+        <w:spacing/>
+        <w:ind/>
+        <w:jc w:val="left"/>
         <w:rPr>
           <w:rFonts w:ascii="Asana Math" w:hAnsi="Asana Math" w:eastAsia="Asana Math" w:cs="Asana Math"/>
           <w:sz w:val="28"/>
           <w:szCs w:val="28"/>
           <w:highlight w:val="none"/>
-          <w:lang w:val="es-ES" w:bidi="es-ES"/>
-        </w:rPr>
-      </w:r>
+          <w:lang w:val="es-ES"/>
+        </w:rPr>
+      </w:pPr>
       <w:r>
         <w:rPr>
           <w:rFonts w:ascii="Asana Math" w:hAnsi="Asana Math" w:eastAsia="Asana Math" w:cs="Asana Math"/>
           <w:sz w:val="28"/>
           <w:szCs w:val="28"/>
           <w:highlight w:val="none"/>
-          <w:lang w:val="es-ES"/>
+          <w:lang w:val="es-ES" w:bidi="es-ES"/>
         </w:rPr>
       </w:r>
       <w:r>
@@ -852,13 +1236,7 @@
           <w:lang w:val="es-ES"/>
         </w:rPr>
       </w:r>
-    </w:p>
-    <w:p>
-      <w:pPr>
-        <w:pBdr/>
-        <w:spacing/>
-        <w:ind/>
-        <w:jc w:val="left"/>
+      <w:r>
         <w:rPr>
           <w:rFonts w:ascii="Asana Math" w:hAnsi="Asana Math" w:eastAsia="Asana Math" w:cs="Asana Math"/>
           <w:sz w:val="28"/>
@@ -866,23 +1244,29 @@
           <w:highlight w:val="none"/>
           <w:lang w:val="es-ES"/>
         </w:rPr>
-      </w:pPr>
-      <w:r>
+      </w:r>
+    </w:p>
+    <w:p>
+      <w:pPr>
+        <w:pBdr/>
+        <w:spacing/>
+        <w:ind/>
+        <w:jc w:val="left"/>
         <w:rPr>
           <w:rFonts w:ascii="Asana Math" w:hAnsi="Asana Math" w:eastAsia="Asana Math" w:cs="Asana Math"/>
           <w:sz w:val="28"/>
           <w:szCs w:val="28"/>
           <w:highlight w:val="none"/>
-          <w:lang w:val="es-ES" w:bidi="es-ES"/>
-        </w:rPr>
-      </w:r>
+          <w:lang w:val="es-ES"/>
+        </w:rPr>
+      </w:pPr>
       <w:r>
         <w:rPr>
           <w:rFonts w:ascii="Asana Math" w:hAnsi="Asana Math" w:eastAsia="Asana Math" w:cs="Asana Math"/>
           <w:sz w:val="28"/>
           <w:szCs w:val="28"/>
           <w:highlight w:val="none"/>
-          <w:lang w:val="es-ES"/>
+          <w:lang w:val="es-ES" w:bidi="es-ES"/>
         </w:rPr>
       </w:r>
       <w:r>
@@ -894,6 +1278,15 @@
           <w:lang w:val="es-ES"/>
         </w:rPr>
       </w:r>
+      <w:r>
+        <w:rPr>
+          <w:rFonts w:ascii="Asana Math" w:hAnsi="Asana Math" w:eastAsia="Asana Math" w:cs="Asana Math"/>
+          <w:sz w:val="28"/>
+          <w:szCs w:val="28"/>
+          <w:highlight w:val="none"/>
+          <w:lang w:val="es-ES"/>
+        </w:rPr>
+      </w:r>
     </w:p>
     <w:p>
       <w:pPr>
@@ -1355,6 +1748,7 @@
           <w:highlight w:val="none"/>
           <w:lang w:val="es-ES"/>
         </w:rPr>
+        <w:t xml:space="preserve">.</w:t>
       </w:r>
       <w:r>
         <w:rPr>
@@ -1458,7 +1852,7 @@
           <w:sz w:val="28"/>
           <w:szCs w:val="28"/>
           <w:highlight w:val="none"/>
-          <w:lang w:val="es-ES"/>
+          <w:lang w:val="es-ES" w:bidi="es-ES"/>
         </w:rPr>
       </w:r>
       <w:r>
@@ -1467,7 +1861,7 @@
           <w:sz w:val="28"/>
           <w:szCs w:val="28"/>
           <w:highlight w:val="none"/>
-          <w:lang w:val="es-ES" w:bidi="es-ES"/>
+          <w:lang w:val="es-ES"/>
         </w:rPr>
       </w:r>
     </w:p>
@@ -1501,8 +1895,9 @@
           <w:sz w:val="22"/>
           <w:szCs w:val="22"/>
           <w:highlight w:val="none"/>
-          <w:lang w:val="es-ES" w:bidi="es-ES"/>
-        </w:rPr>
+          <w:lang w:val="es-ES"/>
+        </w:rPr>
+        <w:t xml:space="preserve">.</w:t>
       </w:r>
       <w:r>
         <w:rPr>
@@ -1510,9 +1905,8 @@
           <w:sz w:val="22"/>
           <w:szCs w:val="22"/>
           <w:highlight w:val="none"/>
-          <w:lang w:val="es-ES"/>
-        </w:rPr>
-        <w:t xml:space="preserve">.</w:t>
+          <w:lang w:val="es-ES" w:bidi="es-ES"/>
+        </w:rPr>
       </w:r>
       <w:r>
         <w:rPr>
@@ -1520,7 +1914,7 @@
           <w:sz w:val="22"/>
           <w:szCs w:val="22"/>
           <w:highlight w:val="none"/>
-          <w:lang w:val="es-ES" w:bidi="es-ES"/>
+          <w:lang w:val="es-ES"/>
         </w:rPr>
       </w:r>
     </w:p>
@@ -1556,7 +1950,7 @@
           <w:highlight w:val="none"/>
           <w:lang w:val="es-ES"/>
         </w:rPr>
-        <w:t xml:space="preserve">y el tipo de variables que utilizaremos para ello; Pero debido a una obligacion de entrega tendremos que  trabajar a nivel de bits con operadores bitwise(Bit a bit) asi que la mejor manera de manejarlo es trabajar con enteros , mas directamente con su valor binario; es decir que lo que nos interesa es el manejo de los bits.</w:t>
+        <w:t xml:space="preserve">y el tipo de variables que utilizaremos para ello; Pero debido a una </w:t>
       </w:r>
       <w:r>
         <w:rPr>
@@ -1566,33 +1960,33 @@
           <w:highlight w:val="none"/>
           <w:lang w:val="es-ES"/>
         </w:rPr>
-      </w:r>
-    </w:p>
-    <w:p>
-      <w:pPr>
-        <w:pBdr/>
-        <w:spacing/>
-        <w:ind/>
-        <w:jc w:val="center"/>
+        <w:t xml:space="preserve">obligacion de entrega tendremos que  trabajar a nivel de bits con operadores bitwise(Bit a bit) asi que la mejor manera de manejarlo es trabajar con enteros , mas directamente con su valor binario; es decir que lo que nos interesa es el manejo de los bits.</w:t>
+      </w:r>
+      <w:r>
         <w:rPr>
           <w:rFonts w:ascii="Asana Math" w:hAnsi="Asana Math" w:eastAsia="Asana Math" w:cs="Asana Math"/>
           <w:sz w:val="22"/>
           <w:szCs w:val="22"/>
           <w:highlight w:val="none"/>
-          <w:lang w:val="es-ES" w:bidi="es-ES"/>
-        </w:rPr>
-      </w:pPr>
+          <w:lang w:val="es-ES"/>
+        </w:rPr>
+      </w:r>
       <w:r>
         <w:rPr>
           <w:rFonts w:ascii="Asana Math" w:hAnsi="Asana Math" w:eastAsia="Asana Math" w:cs="Asana Math"/>
           <w:sz w:val="22"/>
           <w:szCs w:val="22"/>
           <w:highlight w:val="none"/>
-          <w:lang w:val="es-ES" w:bidi="es-ES"/>
-        </w:rPr>
-        <w:t xml:space="preserve">Nosotros por b</w:t>
-      </w:r>
-      <w:r>
+          <w:lang w:val="es-ES"/>
+        </w:rPr>
+      </w:r>
+    </w:p>
+    <w:p>
+      <w:pPr>
+        <w:pBdr/>
+        <w:spacing/>
+        <w:ind/>
+        <w:jc w:val="center"/>
         <w:rPr>
           <w:rFonts w:ascii="Asana Math" w:hAnsi="Asana Math" w:eastAsia="Asana Math" w:cs="Asana Math"/>
           <w:sz w:val="22"/>
@@ -1600,8 +1994,7 @@
           <w:highlight w:val="none"/>
           <w:lang w:val="es-ES" w:bidi="es-ES"/>
         </w:rPr>
-        <w:t xml:space="preserve">ásica informatica sabemos que un entero tiene un valor en bytes que lo define la arquitectura en la que se emplea dicho valor informatico teniendo asi, que el valor b</w:t>
-      </w:r>
+      </w:pPr>
       <w:r>
         <w:rPr>
           <w:rFonts w:ascii="Asana Math" w:hAnsi="Asana Math" w:eastAsia="Asana Math" w:cs="Asana Math"/>
@@ -1610,7 +2003,7 @@
           <w:highlight w:val="none"/>
           <w:lang w:val="es-ES" w:bidi="es-ES"/>
         </w:rPr>
-        <w:t xml:space="preserve">ásico informatico de un entero es 4 byte.</w:t>
+        <w:t xml:space="preserve">Nosotros por b</w:t>
       </w:r>
       <w:r>
         <w:rPr>
@@ -1620,14 +2013,9 @@
           <w:highlight w:val="none"/>
           <w:lang w:val="es-ES" w:bidi="es-ES"/>
         </w:rPr>
-      </w:r>
-    </w:p>
-    <w:p>
-      <w:pPr>
-        <w:pBdr/>
-        <w:spacing/>
-        <w:ind/>
-        <w:jc w:val="center"/>
+        <w:t xml:space="preserve">ásica informatica sabemos que un entero tiene un valor en bytes que lo define la arquitectura en la que se emplea dicho valor informatico teniendo asi, que el valor b</w:t>
+      </w:r>
+      <w:r>
         <w:rPr>
           <w:rFonts w:ascii="Asana Math" w:hAnsi="Asana Math" w:eastAsia="Asana Math" w:cs="Asana Math"/>
           <w:sz w:val="22"/>
@@ -1635,7 +2023,8 @@
           <w:highlight w:val="none"/>
           <w:lang w:val="es-ES" w:bidi="es-ES"/>
         </w:rPr>
-      </w:pPr>
+        <w:t xml:space="preserve">ásico informatico de un entero es 4 byte.</w:t>
+      </w:r>
       <w:r>
         <w:rPr>
           <w:rFonts w:ascii="Asana Math" w:hAnsi="Asana Math" w:eastAsia="Asana Math" w:cs="Asana Math"/>
@@ -1644,7 +2033,6 @@
           <w:highlight w:val="none"/>
           <w:lang w:val="es-ES" w:bidi="es-ES"/>
         </w:rPr>
-        <w:t xml:space="preserve">4 byte en binario serian 32 bits disponibles viendolo de una forma gr</w:t>
       </w:r>
       <w:r>
         <w:rPr>
@@ -1654,7 +2042,50 @@
           <w:highlight w:val="none"/>
           <w:lang w:val="es-ES" w:bidi="es-ES"/>
         </w:rPr>
+      </w:r>
+    </w:p>
+    <w:p>
+      <w:pPr>
+        <w:pBdr/>
+        <w:spacing/>
+        <w:ind/>
+        <w:jc w:val="center"/>
+        <w:rPr>
+          <w:rFonts w:ascii="Asana Math" w:hAnsi="Asana Math" w:eastAsia="Asana Math" w:cs="Asana Math"/>
+          <w:sz w:val="22"/>
+          <w:szCs w:val="22"/>
+          <w:highlight w:val="none"/>
+          <w:lang w:val="es-ES" w:bidi="es-ES"/>
+        </w:rPr>
+      </w:pPr>
+      <w:r>
+        <w:rPr>
+          <w:rFonts w:ascii="Asana Math" w:hAnsi="Asana Math" w:eastAsia="Asana Math" w:cs="Asana Math"/>
+          <w:sz w:val="22"/>
+          <w:szCs w:val="22"/>
+          <w:highlight w:val="none"/>
+          <w:lang w:val="es-ES" w:bidi="es-ES"/>
+        </w:rPr>
+        <w:t xml:space="preserve">4 byte en binario serian 32 bits disponibles viendolo de una forma gr</w:t>
+      </w:r>
+      <w:r>
+        <w:rPr>
+          <w:rFonts w:ascii="Asana Math" w:hAnsi="Asana Math" w:eastAsia="Asana Math" w:cs="Asana Math"/>
+          <w:sz w:val="22"/>
+          <w:szCs w:val="22"/>
+          <w:highlight w:val="none"/>
+          <w:lang w:val="es-ES" w:bidi="es-ES"/>
+        </w:rPr>
         <w:t xml:space="preserve">áfica.</w:t>
+      </w:r>
+      <w:r>
+        <w:rPr>
+          <w:rFonts w:ascii="Asana Math" w:hAnsi="Asana Math" w:eastAsia="Asana Math" w:cs="Asana Math"/>
+          <w:sz w:val="22"/>
+          <w:szCs w:val="22"/>
+          <w:highlight w:val="none"/>
+          <w:lang w:val="es-ES" w:bidi="es-ES"/>
+        </w:rPr>
       </w:r>
       <w:r>
         <w:rPr>
@@ -1776,15 +2207,6 @@
           <w:lang w:val="es-ES" w:bidi="es-ES"/>
         </w:rPr>
       </w:r>
-      <w:r>
-        <w:rPr>
-          <w:rFonts w:ascii="Asana Math" w:hAnsi="Asana Math" w:eastAsia="Asana Math" w:cs="Asana Math"/>
-          <w:sz w:val="22"/>
-          <w:szCs w:val="22"/>
-          <w:highlight w:val="none"/>
-          <w:lang w:val="es-ES" w:bidi="es-ES"/>
-        </w:rPr>
-      </w:r>
     </w:p>
     <w:p>
       <w:pPr>
@@ -1841,10 +2263,6 @@
         <w:t xml:space="preserve">áfica de un entero a binarios.</w:t>
       </w:r>
       <w:r/>
-      <w:r/>
-      <w:r/>
-      <w:r/>
-      <w:r/>
     </w:p>
     <w:p>
       <w:pPr>
@@ -1877,6 +2295,13 @@
           <w:rFonts w:ascii="Asana Math" w:hAnsi="Asana Math" w:cs="Asana Math"/>
         </w:rPr>
       </w:r>
+      <w:r>
+        <w:rPr>
+          <w:rFonts w:ascii="Asana Math" w:hAnsi="Asana Math" w:eastAsia="Asana Math" w:cs="Asana Math"/>
+          <w:highlight w:val="none"/>
+          <w:lang w:val="es-ES"/>
+        </w:rPr>
+      </w:r>
     </w:p>
     <w:p>
       <w:pPr>
@@ -1895,7 +2320,6 @@
           <w:lang w:val="es-ES"/>
         </w:rPr>
       </w:r>
-      <w:r/>
       <w:r>
         <mc:AlternateContent>
           <mc:Choice Requires="wpg">
@@ -1965,7 +2389,6 @@
           </mc:Fallback>
         </mc:AlternateContent>
       </w:r>
-      <w:r/>
       <w:r>
         <w:rPr>
           <w:rFonts w:ascii="Asana Math" w:hAnsi="Asana Math" w:eastAsia="Asana Math" w:cs="Asana Math"/>
@@ -1975,16 +2398,7 @@
       </w:r>
       <w:r>
         <w:rPr>
-          <w:rFonts w:ascii="Asana Math" w:hAnsi="Asana Math" w:eastAsia="Asana Math" w:cs="Asana Math"/>
-          <w:highlight w:val="none"/>
-          <w:lang w:val="es-ES"/>
-        </w:rPr>
-      </w:r>
-      <w:r>
-        <w:rPr>
-          <w:rFonts w:ascii="Asana Math" w:hAnsi="Asana Math" w:eastAsia="Asana Math" w:cs="Asana Math"/>
-          <w:highlight w:val="none"/>
-          <w:lang w:val="es-ES"/>
+          <w:rFonts w:ascii="Asana Math" w:hAnsi="Asana Math" w:cs="Asana Math"/>
         </w:rPr>
       </w:r>
     </w:p>
@@ -2067,6 +2481,13 @@
         <w:rPr>
           <w:rFonts w:ascii="Asana Math" w:hAnsi="Asana Math" w:cs="Asana Math"/>
           <w:highlight w:val="none"/>
+        </w:rPr>
+      </w:r>
+      <w:r>
+        <w:rPr>
+          <w:rFonts w:ascii="Asana Math" w:hAnsi="Asana Math" w:eastAsia="Asana Math" w:cs="Asana Math"/>
+          <w:highlight w:val="none"/>
+          <w:lang w:val="es-ES"/>
         </w:rPr>
       </w:r>
     </w:p>
@@ -2115,6 +2536,12 @@
           <w:lang w:val="es-ES"/>
         </w:rPr>
       </w:r>
+      <w:r>
+        <w:rPr>
+          <w:rFonts w:ascii="Asana Math" w:hAnsi="Asana Math" w:cs="Asana Math"/>
+          <w:highlight w:val="none"/>
+        </w:rPr>
+      </w:r>
     </w:p>
     <w:p>
       <w:pPr>
@@ -2142,7 +2569,9 @@
       </w:r>
       <w:r>
         <w:rPr>
-          <w:rFonts w:ascii="Asana Math" w:hAnsi="Asana Math" w:cs="Asana Math"/>
+          <w:rFonts w:ascii="Asana Math" w:hAnsi="Asana Math" w:eastAsia="Asana Math" w:cs="Asana Math"/>
+          <w:highlight w:val="none"/>
+          <w:lang w:val="es-ES"/>
         </w:rPr>
       </w:r>
     </w:p>
@@ -2177,6 +2606,13 @@
       <w:r>
         <w:rPr>
           <w:rFonts w:ascii="Asana Math" w:hAnsi="Asana Math" w:cs="Asana Math"/>
+        </w:rPr>
+      </w:r>
+      <w:r>
+        <w:rPr>
+          <w:rFonts w:ascii="Asana Math" w:hAnsi="Asana Math" w:cs="Asana Math"/>
+          <w:highlight w:val="none"/>
+          <w:lang w:val="es-ES"/>
         </w:rPr>
       </w:r>
     </w:p>
@@ -2276,15 +2712,6 @@
       <w:r>
         <w:rPr>
           <w:rFonts w:ascii="Asana Math" w:hAnsi="Asana Math" w:cs="Asana Math"/>
-          <w:highlight w:val="none"/>
-          <w:lang w:val="es-ES"/>
-        </w:rPr>
-      </w:r>
-      <w:r>
-        <w:rPr>
-          <w:rFonts w:ascii="Asana Math" w:hAnsi="Asana Math" w:cs="Asana Math"/>
-          <w:highlight w:val="none"/>
-          <w:lang w:val="es-ES"/>
         </w:rPr>
       </w:r>
     </w:p>
@@ -2366,6 +2793,13 @@
           <w:rFonts w:ascii="Asana Math" w:hAnsi="Asana Math" w:cs="Asana Math"/>
         </w:rPr>
       </w:r>
+      <w:r>
+        <w:rPr>
+          <w:rFonts w:ascii="Asana Math" w:hAnsi="Asana Math" w:eastAsia="Asana Math" w:cs="Asana Math"/>
+          <w:highlight w:val="none"/>
+          <w:lang w:val="es-ES"/>
+        </w:rPr>
+      </w:r>
     </w:p>
     <w:p>
       <w:pPr>
@@ -2398,6 +2832,13 @@
       <w:r>
         <w:rPr>
           <w:rFonts w:ascii="Asana Math" w:hAnsi="Asana Math" w:cs="Asana Math"/>
+        </w:rPr>
+      </w:r>
+      <w:r>
+        <w:rPr>
+          <w:rFonts w:ascii="Asana Math" w:hAnsi="Asana Math" w:eastAsia="Asana Math" w:cs="Asana Math"/>
+          <w:highlight w:val="none"/>
+          <w:lang w:val="es-ES"/>
         </w:rPr>
       </w:r>
     </w:p>
@@ -2446,7 +2887,11 @@
           <w:lang w:val="es-ES"/>
         </w:rPr>
       </w:r>
-      <w:r/>
+      <w:r>
+        <w:rPr>
+          <w:rFonts w:ascii="Asana Math" w:hAnsi="Asana Math" w:cs="Asana Math"/>
+        </w:rPr>
+      </w:r>
     </w:p>
     <w:p>
       <w:pPr>
@@ -2491,6 +2936,15 @@
           <w:lang w:val="es-ES"/>
         </w:rPr>
       </w:r>
+      <w:r>
+        <w:rPr>
+          <w:rFonts w:ascii="Asana Math" w:hAnsi="Asana Math" w:eastAsia="Asana Math" w:cs="Asana Math"/>
+          <w:sz w:val="28"/>
+          <w:szCs w:val="28"/>
+          <w:highlight w:val="none"/>
+          <w:lang w:val="es-ES" w:bidi="es-ES"/>
+        </w:rPr>
+      </w:r>
     </w:p>
     <w:p>
       <w:pPr>
@@ -2542,34 +2996,7 @@
           <w:sz w:val="22"/>
           <w:szCs w:val="22"/>
           <w:highlight w:val="none"/>
-          <w:lang w:val="es-ES"/>
-        </w:rPr>
-      </w:r>
-      <w:r>
-        <w:rPr>
-          <w:rFonts w:ascii="Asana Math" w:hAnsi="Asana Math" w:eastAsia="Asana Math" w:cs="Asana Math"/>
-          <w:sz w:val="22"/>
-          <w:szCs w:val="22"/>
-          <w:highlight w:val="none"/>
-          <w:lang w:val="es-ES"/>
-        </w:rPr>
-      </w:r>
-      <w:r>
-        <w:rPr>
-          <w:rFonts w:ascii="Asana Math" w:hAnsi="Asana Math" w:eastAsia="Asana Math" w:cs="Asana Math"/>
-          <w:sz w:val="22"/>
-          <w:szCs w:val="22"/>
-          <w:highlight w:val="none"/>
-          <w:lang w:val="es-ES"/>
-        </w:rPr>
-      </w:r>
-      <w:r>
-        <w:rPr>
-          <w:rFonts w:ascii="Asana Math" w:hAnsi="Asana Math" w:eastAsia="Asana Math" w:cs="Asana Math"/>
-          <w:sz w:val="22"/>
-          <w:szCs w:val="22"/>
-          <w:highlight w:val="none"/>
-          <w:lang w:val="es-ES"/>
+          <w:lang w:val="es-ES" w:bidi="es-ES"/>
         </w:rPr>
       </w:r>
       <w:r>
@@ -2711,7 +3138,6 @@
           <w:sz w:val="22"/>
           <w:szCs w:val="22"/>
           <w:highlight w:val="none"/>
-          <w:lang w:val="es-ES" w:bidi="es-ES"/>
         </w:rPr>
       </w:r>
     </w:p>
@@ -2757,6 +3183,15 @@
           <w:lang w:val="es-ES"/>
         </w:rPr>
         <w:t xml:space="preserve">ón podemos asignar de cuantos byte a nuestro entero.</w:t>
+      </w:r>
+      <w:r>
+        <w:rPr>
+          <w:rFonts w:ascii="Asana Math" w:hAnsi="Asana Math" w:eastAsia="Asana Math" w:cs="Asana Math"/>
+          <w:sz w:val="22"/>
+          <w:szCs w:val="22"/>
+          <w:highlight w:val="none"/>
+          <w:lang w:val="es-ES"/>
+        </w:rPr>
       </w:r>
       <w:r>
         <w:rPr>
@@ -2788,6 +3223,7 @@
           <w:highlight w:val="none"/>
         </w:rPr>
       </w:pPr>
+      <w:r/>
       <m:oMathPara>
         <m:oMathParaPr/>
         <m:oMath>
@@ -2806,7 +3242,6 @@
           </m:r>
         </m:oMath>
       </m:oMathPara>
-      <w:r/>
       <w:r>
         <w:rPr>
           <w:rFonts w:ascii="Asana Math" w:hAnsi="Asana Math" w:eastAsia="Asana Math" w:cs="Asana Math"/>
@@ -2816,6 +3251,14 @@
           <w:lang w:val="es-ES"/>
         </w:rPr>
       </w:r>
+      <w:r>
+        <w:rPr>
+          <w:rFonts w:ascii="Cambria Math" w:hAnsi="Cambria Math" w:eastAsia="Cambria Math" w:cs="Cambria Math"/>
+          <w:sz w:val="22"/>
+          <w:szCs w:val="22"/>
+          <w:highlight w:val="none"/>
+        </w:rPr>
+      </w:r>
     </w:p>
     <w:p>
       <w:pPr>
@@ -2870,13 +3313,7 @@
           <w:lang w:val="es-ES"/>
         </w:rPr>
       </w:r>
-    </w:p>
-    <w:p>
-      <w:pPr>
-        <w:pBdr/>
-        <w:spacing/>
-        <w:ind/>
-        <w:jc w:val="center"/>
+      <w:r>
         <w:rPr>
           <w:rFonts w:ascii="Asana Math" w:hAnsi="Asana Math" w:eastAsia="Asana Math" w:cs="Asana Math"/>
           <w:sz w:val="22"/>
@@ -2884,16 +3321,22 @@
           <w:highlight w:val="none"/>
           <w:lang w:val="es-ES"/>
         </w:rPr>
-      </w:pPr>
-      <w:r>
+      </w:r>
+    </w:p>
+    <w:p>
+      <w:pPr>
+        <w:pBdr/>
+        <w:spacing/>
+        <w:ind/>
+        <w:jc w:val="center"/>
         <w:rPr>
           <w:rFonts w:ascii="Asana Math" w:hAnsi="Asana Math" w:eastAsia="Asana Math" w:cs="Asana Math"/>
           <w:sz w:val="22"/>
           <w:szCs w:val="22"/>
           <w:highlight w:val="none"/>
-          <w:lang w:val="es-ES" w:bidi="es-ES"/>
-        </w:rPr>
-      </w:r>
+          <w:lang w:val="es-ES"/>
+        </w:rPr>
+      </w:pPr>
       <w:r>
         <w:rPr>
           <w:rFonts w:ascii="Asana Math" w:hAnsi="Asana Math" w:eastAsia="Asana Math" w:cs="Asana Math"/>
@@ -2912,22 +3355,22 @@
           <w:lang w:val="es-ES"/>
         </w:rPr>
       </w:r>
-    </w:p>
-    <w:p>
-      <w:pPr>
-        <w:pBdr/>
-        <w:spacing/>
-        <w:ind/>
-        <w:jc w:val="center"/>
+      <w:r>
         <w:rPr>
           <w:rFonts w:ascii="Asana Math" w:hAnsi="Asana Math" w:eastAsia="Asana Math" w:cs="Asana Math"/>
           <w:sz w:val="22"/>
           <w:szCs w:val="22"/>
           <w:highlight w:val="none"/>
-          <w:lang w:val="es-ES" w:bidi="es-ES"/>
-        </w:rPr>
-      </w:pPr>
-      <w:r>
+          <w:lang w:val="es-ES"/>
+        </w:rPr>
+      </w:r>
+    </w:p>
+    <w:p>
+      <w:pPr>
+        <w:pBdr/>
+        <w:spacing/>
+        <w:ind/>
+        <w:jc w:val="center"/>
         <w:rPr>
           <w:rFonts w:ascii="Asana Math" w:hAnsi="Asana Math" w:eastAsia="Asana Math" w:cs="Asana Math"/>
           <w:sz w:val="22"/>
@@ -2935,7 +3378,7 @@
           <w:highlight w:val="none"/>
           <w:lang w:val="es-ES" w:bidi="es-ES"/>
         </w:rPr>
-      </w:r>
+      </w:pPr>
       <w:r>
         <w:rPr>
           <w:rFonts w:ascii="Asana Math" w:hAnsi="Asana Math" w:eastAsia="Asana Math" w:cs="Asana Math"/>
@@ -3020,7 +3463,7 @@
           <w:sz w:val="22"/>
           <w:szCs w:val="22"/>
           <w:highlight w:val="none"/>
-          <w:lang w:val="es-ES" w:bidi="es-ES"/>
+          <w:lang w:val="es-ES"/>
         </w:rPr>
       </w:r>
       <w:r>
@@ -3029,7 +3472,7 @@
           <w:sz w:val="22"/>
           <w:szCs w:val="22"/>
           <w:highlight w:val="none"/>
-          <w:lang w:val="es-ES"/>
+          <w:lang w:val="es-ES" w:bidi="es-ES"/>
         </w:rPr>
       </w:r>
     </w:p>
@@ -3085,7 +3528,6 @@
           <w:lang w:val="es-ES"/>
         </w:rPr>
       </w:pPr>
-      <w:r/>
       <w:r>
         <w:rPr>
           <w:rFonts w:ascii="Asana Math" w:hAnsi="Asana Math" w:eastAsia="Asana Math" w:cs="Asana Math"/>
@@ -3100,6 +3542,17 @@
           <w:rFonts w:ascii="Asana Math" w:hAnsi="Asana Math" w:cs="Asana Math"/>
           <w:sz w:val="28"/>
           <w:szCs w:val="28"/>
+          <w:lang w:val="es-ES"/>
+        </w:rPr>
+        <w:t xml:space="preserve">.</w:t>
+      </w:r>
+      <w:r>
+        <w:rPr>
+          <w:rFonts w:ascii="Asana Math" w:hAnsi="Asana Math" w:eastAsia="Asana Math" w:cs="Asana Math"/>
+          <w:sz w:val="28"/>
+          <w:szCs w:val="28"/>
+          <w:highlight w:val="none"/>
+          <w:lang w:val="es-ES"/>
         </w:rPr>
       </w:r>
     </w:p>
@@ -3136,22 +3589,22 @@
           <w:lang w:val="es-ES"/>
         </w:rPr>
       </w:r>
-    </w:p>
-    <w:p>
-      <w:pPr>
-        <w:pBdr/>
-        <w:spacing/>
-        <w:ind/>
-        <w:jc w:val="center"/>
+      <w:r>
         <w:rPr>
           <w:rFonts w:ascii="Asana Math" w:hAnsi="Asana Math" w:eastAsia="Asana Math" w:cs="Asana Math"/>
           <w:sz w:val="22"/>
           <w:szCs w:val="22"/>
           <w:highlight w:val="none"/>
-          <w:lang w:val="es-ES" w:bidi="es-ES"/>
-        </w:rPr>
-      </w:pPr>
-      <w:r>
+          <w:lang w:val="es-ES"/>
+        </w:rPr>
+      </w:r>
+    </w:p>
+    <w:p>
+      <w:pPr>
+        <w:pBdr/>
+        <w:spacing/>
+        <w:ind/>
+        <w:jc w:val="center"/>
         <w:rPr>
           <w:rFonts w:ascii="Asana Math" w:hAnsi="Asana Math" w:eastAsia="Asana Math" w:cs="Asana Math"/>
           <w:sz w:val="22"/>
@@ -3159,15 +3612,33 @@
           <w:highlight w:val="none"/>
           <w:lang w:val="es-ES" w:bidi="es-ES"/>
         </w:rPr>
-        <w:t xml:space="preserve">Primero necesito un puntero que me apunte a un puntero que apunte a filas y ese puntero a filas que me apunte a las columnas</w:t>
-      </w:r>
+      </w:pPr>
       <w:r>
         <w:rPr>
           <w:rFonts w:ascii="Asana Math" w:hAnsi="Asana Math" w:eastAsia="Asana Math" w:cs="Asana Math"/>
           <w:sz w:val="22"/>
           <w:szCs w:val="22"/>
           <w:highlight w:val="none"/>
+          <w:lang w:val="es-ES" w:bidi="es-ES"/>
+        </w:rPr>
+        <w:t xml:space="preserve">Primero necesito un puntero que me apunte a un puntero que apunte a filas y ese puntero a filas que me apunte a las columnas</w:t>
+      </w:r>
+      <w:r>
+        <w:rPr>
+          <w:rFonts w:ascii="Asana Math" w:hAnsi="Asana Math" w:eastAsia="Asana Math" w:cs="Asana Math"/>
+          <w:sz w:val="22"/>
+          <w:szCs w:val="22"/>
+          <w:highlight w:val="none"/>
           <w:lang w:val="es-ES"/>
+        </w:rPr>
+      </w:r>
+      <w:r>
+        <w:rPr>
+          <w:rFonts w:ascii="Asana Math" w:hAnsi="Asana Math" w:eastAsia="Asana Math" w:cs="Asana Math"/>
+          <w:sz w:val="22"/>
+          <w:szCs w:val="22"/>
+          <w:highlight w:val="none"/>
+          <w:lang w:val="es-ES" w:bidi="es-ES"/>
         </w:rPr>
       </w:r>
     </w:p>
@@ -3224,7 +3695,6 @@
           <w:sz w:val="22"/>
           <w:szCs w:val="22"/>
           <w:highlight w:val="none"/>
-          <w:lang w:val="es-ES" w:bidi="es-ES"/>
         </w:rPr>
       </w:r>
       <w:r>
@@ -3233,26 +3703,32 @@
           <w:sz w:val="22"/>
           <w:szCs w:val="22"/>
           <w:highlight w:val="none"/>
-          <w:lang w:val="es-ES" w:bidi="es-ES"/>
-        </w:rPr>
-      </w:r>
-      <w:r>
+        </w:rPr>
+      </w:r>
+    </w:p>
+    <w:p>
+      <w:pPr>
+        <w:pBdr/>
+        <w:spacing/>
+        <w:ind/>
+        <w:jc w:val="center"/>
         <w:rPr>
           <w:rFonts w:ascii="Asana Math" w:hAnsi="Asana Math" w:eastAsia="Asana Math" w:cs="Asana Math"/>
           <w:sz w:val="22"/>
           <w:szCs w:val="22"/>
           <w:highlight w:val="none"/>
-          <w:lang w:val="es-ES" w:bidi="es-ES"/>
-        </w:rPr>
-      </w:r>
+          <w:lang w:val="es-ES"/>
+        </w:rPr>
+      </w:pPr>
       <w:r>
         <w:rPr>
           <w:rFonts w:ascii="Asana Math" w:hAnsi="Asana Math" w:eastAsia="Asana Math" w:cs="Asana Math"/>
           <w:sz w:val="22"/>
           <w:szCs w:val="22"/>
           <w:highlight w:val="none"/>
-          <w:lang w:val="es-ES"/>
-        </w:rPr>
+          <w:lang w:val="es-ES" w:bidi="es-ES"/>
+        </w:rPr>
+        <w:t xml:space="preserve">Despues reservo un arreglo de punteros que me apuntaran a cada fila</w:t>
       </w:r>
       <w:r>
         <w:rPr>
@@ -3260,40 +3736,7 @@
           <w:sz w:val="22"/>
           <w:szCs w:val="22"/>
           <w:highlight w:val="none"/>
-        </w:rPr>
-      </w:r>
-    </w:p>
-    <w:p>
-      <w:pPr>
-        <w:pBdr/>
-        <w:spacing/>
-        <w:ind/>
-        <w:jc w:val="center"/>
-        <w:rPr>
-          <w:rFonts w:ascii="Asana Math" w:hAnsi="Asana Math" w:eastAsia="Asana Math" w:cs="Asana Math"/>
-          <w:sz w:val="22"/>
-          <w:szCs w:val="22"/>
-          <w:highlight w:val="none"/>
           <w:lang w:val="es-ES"/>
-        </w:rPr>
-      </w:pPr>
-      <w:r>
-        <w:rPr>
-          <w:rFonts w:ascii="Asana Math" w:hAnsi="Asana Math" w:eastAsia="Asana Math" w:cs="Asana Math"/>
-          <w:sz w:val="22"/>
-          <w:szCs w:val="22"/>
-          <w:highlight w:val="none"/>
-          <w:lang w:val="es-ES" w:bidi="es-ES"/>
-        </w:rPr>
-        <w:t xml:space="preserve">Despues reservo un arreglo de punteros que me apuntaran a cada fila</w:t>
-      </w:r>
-      <w:r>
-        <w:rPr>
-          <w:rFonts w:ascii="Asana Math" w:hAnsi="Asana Math" w:eastAsia="Asana Math" w:cs="Asana Math"/>
-          <w:sz w:val="22"/>
-          <w:szCs w:val="22"/>
-          <w:highlight w:val="none"/>
-          <w:lang w:val="es-ES" w:bidi="es-ES"/>
         </w:rPr>
       </w:r>
       <w:r>
@@ -3355,12 +3798,43 @@
       </m:oMathPara>
       <w:r>
         <w:rPr>
+          <w:rFonts w:ascii="Asana Math" w:hAnsi="Asana Math" w:cs="Asana Math"/>
+          <w:sz w:val="18"/>
+          <w:szCs w:val="18"/>
+        </w:rPr>
+      </w:r>
+      <w:r>
+        <w:rPr>
           <w:rFonts w:ascii="Asana Math" w:hAnsi="Asana Math" w:eastAsia="Asana Math" w:cs="Asana Math"/>
           <w:sz w:val="22"/>
           <w:szCs w:val="22"/>
           <w:highlight w:val="none"/>
+        </w:rPr>
+      </w:r>
+    </w:p>
+    <w:p>
+      <w:pPr>
+        <w:pBdr/>
+        <w:spacing/>
+        <w:ind/>
+        <w:jc w:val="center"/>
+        <w:rPr>
+          <w:rFonts w:ascii="Asana Math" w:hAnsi="Asana Math" w:eastAsia="Asana Math" w:cs="Asana Math"/>
+          <w:sz w:val="22"/>
+          <w:szCs w:val="22"/>
+          <w:highlight w:val="none"/>
           <w:lang w:val="es-ES"/>
         </w:rPr>
+      </w:pPr>
+      <w:r>
+        <w:rPr>
+          <w:rFonts w:ascii="Asana Math" w:hAnsi="Asana Math" w:eastAsia="Asana Math" w:cs="Asana Math"/>
+          <w:sz w:val="22"/>
+          <w:szCs w:val="22"/>
+          <w:highlight w:val="none"/>
+          <w:lang w:val="es-ES"/>
+        </w:rPr>
+        <w:t xml:space="preserve">Luego reservo los bis que utilizare para cada fila </w:t>
       </w:r>
       <w:r>
         <w:rPr>
@@ -3369,36 +3843,13 @@
           <w:szCs w:val="18"/>
         </w:rPr>
       </w:r>
-    </w:p>
-    <w:p>
-      <w:pPr>
-        <w:pBdr/>
-        <w:spacing/>
-        <w:ind/>
-        <w:jc w:val="center"/>
+      <w:r>
         <w:rPr>
           <w:rFonts w:ascii="Asana Math" w:hAnsi="Asana Math" w:eastAsia="Asana Math" w:cs="Asana Math"/>
           <w:sz w:val="22"/>
           <w:szCs w:val="22"/>
           <w:highlight w:val="none"/>
           <w:lang w:val="es-ES"/>
-        </w:rPr>
-      </w:pPr>
-      <w:r>
-        <w:rPr>
-          <w:rFonts w:ascii="Asana Math" w:hAnsi="Asana Math" w:eastAsia="Asana Math" w:cs="Asana Math"/>
-          <w:sz w:val="22"/>
-          <w:szCs w:val="22"/>
-          <w:highlight w:val="none"/>
-          <w:lang w:val="es-ES"/>
-        </w:rPr>
-        <w:t xml:space="preserve">Luego reservo los bis que utilizare para cada fila </w:t>
-      </w:r>
-      <w:r>
-        <w:rPr>
-          <w:rFonts w:ascii="Asana Math" w:hAnsi="Asana Math" w:cs="Asana Math"/>
-          <w:sz w:val="18"/>
-          <w:szCs w:val="18"/>
         </w:rPr>
       </w:r>
     </w:p>
@@ -3453,7 +3904,7 @@
               <m:endChr m:val="]"/>
               <m:ctrlPr>
                 <w:rPr>
-                  <w:rFonts w:hint="default" w:ascii="Cambria Math" w:hAnsi="Cambria Math" w:eastAsia="Cambria Math" w:cs="Cambria Math"/>
+                  <w:rFonts w:ascii="Cambria Math" w:hAnsi="Cambria Math" w:eastAsia="Cambria Math" w:cs="Cambria Math"/>
                   <w:sz w:val="22"/>
                   <w:szCs w:val="22"/>
                   <w:highlight w:val="none"/>
@@ -3498,7 +3949,6 @@
           <w:sz w:val="22"/>
           <w:szCs w:val="22"/>
           <w:highlight w:val="none"/>
-          <w:lang w:val="es-ES"/>
         </w:rPr>
       </w:r>
       <w:r>
@@ -3514,10 +3964,10 @@
       <w:pPr>
         <w:suppressLineNumbers w:val="false"/>
         <w:pBdr>
-          <w:top w:val="nil" w:color="000000" w:sz="4" w:space="0"/>
-          <w:left w:val="nil" w:color="000000" w:sz="4" w:space="0"/>
-          <w:bottom w:val="nil" w:color="000000" w:sz="4" w:space="0"/>
-          <w:right w:val="nil" w:color="000000" w:sz="4" w:space="0"/>
+          <w:top w:val="none" w:color="000000" w:sz="4" w:space="0"/>
+          <w:left w:val="none" w:color="000000" w:sz="4" w:space="0"/>
+          <w:bottom w:val="none" w:color="000000" w:sz="4" w:space="0"/>
+          <w:right w:val="none" w:color="000000" w:sz="4" w:space="0"/>
           <w:between w:val="none" w:color="000000" w:sz="4" w:space="0"/>
         </w:pBdr>
         <w:spacing/>
@@ -3559,15 +4009,24 @@
           <w:highlight w:val="none"/>
         </w:rPr>
       </w:r>
+      <w:r>
+        <w:rPr>
+          <w:rFonts w:ascii="Asana Math" w:hAnsi="Asana Math" w:eastAsia="Asana Math" w:cs="Asana Math"/>
+          <w:sz w:val="22"/>
+          <w:szCs w:val="22"/>
+          <w:highlight w:val="none"/>
+          <w:lang w:val="es-ES"/>
+        </w:rPr>
+      </w:r>
     </w:p>
     <w:p>
       <w:pPr>
         <w:suppressLineNumbers w:val="false"/>
         <w:pBdr>
-          <w:top w:val="nil" w:color="000000" w:sz="4" w:space="0"/>
-          <w:left w:val="nil" w:color="000000" w:sz="4" w:space="0"/>
-          <w:bottom w:val="nil" w:color="000000" w:sz="4" w:space="0"/>
-          <w:right w:val="nil" w:color="000000" w:sz="4" w:space="0"/>
+          <w:top w:val="none" w:color="000000" w:sz="4" w:space="0"/>
+          <w:left w:val="none" w:color="000000" w:sz="4" w:space="0"/>
+          <w:bottom w:val="none" w:color="000000" w:sz="4" w:space="0"/>
+          <w:right w:val="none" w:color="000000" w:sz="4" w:space="0"/>
           <w:between w:val="none" w:color="000000" w:sz="4" w:space="0"/>
         </w:pBdr>
         <w:spacing/>
@@ -3673,16 +4132,6 @@
           <w:sz w:val="22"/>
           <w:szCs w:val="22"/>
           <w:highlight w:val="none"/>
-          <w:lang w:val="es-ES"/>
-        </w:rPr>
-      </w:r>
-      <w:r>
-        <w:rPr>
-          <w:rFonts w:ascii="Asana Math" w:hAnsi="Asana Math" w:eastAsia="Asana Math" w:cs="Asana Math"/>
-          <w:sz w:val="22"/>
-          <w:szCs w:val="22"/>
-          <w:highlight w:val="none"/>
-          <w:lang w:val="es-ES"/>
         </w:rPr>
       </w:r>
     </w:p>
@@ -3714,7 +4163,6 @@
         <w:t xml:space="preserve">. Representación Gráfica de punteros sucesivos </w:t>
       </w:r>
       <w:r/>
-      <w:r/>
     </w:p>
     <w:p>
       <w:pPr>
@@ -3734,6 +4182,13 @@
           <w:lang w:val="es-ES"/>
         </w:rPr>
         <w:t xml:space="preserve">Al final unicamente rellenamos los valores con 0 para que nos quede algo tipo:</w:t>
+      </w:r>
+      <w:r>
+        <w:rPr>
+          <w:rFonts w:ascii="Asana Math" w:hAnsi="Asana Math" w:eastAsia="Asana Math" w:cs="Asana Math"/>
+          <w:highlight w:val="none"/>
+          <w:lang w:val="es-ES"/>
+        </w:rPr>
       </w:r>
       <w:r>
         <w:rPr>
@@ -3835,14 +4290,7 @@
         <w:rPr>
           <w:rFonts w:ascii="Asana Math" w:hAnsi="Asana Math" w:eastAsia="Asana Math" w:cs="Asana Math"/>
           <w:highlight w:val="none"/>
-          <w:lang w:val="es-ES" w:bidi="es-ES"/>
-        </w:rPr>
-      </w:r>
-      <w:r>
-        <w:rPr>
-          <w:rFonts w:ascii="Asana Math" w:hAnsi="Asana Math" w:eastAsia="Asana Math" w:cs="Asana Math"/>
-          <w:highlight w:val="none"/>
-          <w:lang w:val="es-ES" w:bidi="es-ES"/>
+          <w:lang w:val="es-ES"/>
         </w:rPr>
       </w:r>
       <w:r>
@@ -3898,14 +4346,14 @@
         <w:rPr>
           <w:rFonts w:ascii="Asana Math" w:hAnsi="Asana Math" w:eastAsia="Asana Math" w:cs="Asana Math"/>
           <w:highlight w:val="none"/>
-          <w:lang w:val="es-ES" w:bidi="es-ES"/>
+          <w:lang w:val="es-ES"/>
         </w:rPr>
       </w:r>
       <w:r>
         <w:rPr>
           <w:rFonts w:ascii="Asana Math" w:hAnsi="Asana Math" w:eastAsia="Asana Math" w:cs="Asana Math"/>
           <w:highlight w:val="none"/>
-          <w:lang w:val="es-ES" w:bidi="es-ES"/>
+          <w:lang w:val="es-ES"/>
         </w:rPr>
       </w:r>
       <w:r>
@@ -3923,7 +4371,390 @@
         <w:ind/>
         <w:jc w:val="center"/>
         <w:rPr>
+          <w:rFonts w:ascii="Asana Math" w:hAnsi="Asana Math" w:eastAsia="Asana Math" w:cs="Asana Math"/>
+          <w:sz w:val="28"/>
+          <w:szCs w:val="28"/>
+          <w:highlight w:val="none"/>
+          <w:lang w:val="es-ES"/>
+        </w:rPr>
+      </w:pPr>
+      <w:r>
+        <w:rPr>
+          <w:rFonts w:ascii="Asana Math" w:hAnsi="Asana Math" w:eastAsia="Asana Math" w:cs="Asana Math"/>
+          <w:sz w:val="28"/>
+          <w:szCs w:val="28"/>
+          <w:highlight w:val="none"/>
+          <w:lang w:val="es-ES"/>
+        </w:rPr>
+        <w:t xml:space="preserve">PIEZAS Y SU REPRESENTACI</w:t>
+      </w:r>
+      <w:r>
+        <w:rPr>
+          <w:rFonts w:ascii="Asana Math" w:hAnsi="Asana Math" w:eastAsia="Asana Math" w:cs="Asana Math"/>
+          <w:sz w:val="28"/>
+          <w:szCs w:val="28"/>
+          <w:highlight w:val="none"/>
+          <w:lang w:val="es-ES"/>
+        </w:rPr>
+        <w:t xml:space="preserve">ÓN.</w:t>
+      </w:r>
+      <w:r>
+        <w:rPr>
+          <w:rFonts w:ascii="Asana Math" w:hAnsi="Asana Math" w:eastAsia="Asana Math" w:cs="Asana Math"/>
+          <w:sz w:val="28"/>
+          <w:szCs w:val="28"/>
+          <w:highlight w:val="none"/>
+          <w:lang w:val="es-ES"/>
+        </w:rPr>
+      </w:r>
+    </w:p>
+    <w:p>
+      <w:pPr>
+        <w:pBdr/>
+        <w:spacing/>
+        <w:ind/>
+        <w:jc w:val="center"/>
+        <w:rPr>
+          <w:rFonts w:ascii="Asana Math" w:hAnsi="Asana Math" w:eastAsia="Asana Math" w:cs="Asana Math"/>
+          <w:sz w:val="22"/>
+          <w:szCs w:val="22"/>
+          <w:highlight w:val="none"/>
+          <w:lang w:val="es-ES"/>
+        </w:rPr>
+      </w:pPr>
+      <w:r>
+        <w:rPr>
+          <w:rFonts w:ascii="Asana Math" w:hAnsi="Asana Math" w:eastAsia="Asana Math" w:cs="Asana Math"/>
+          <w:sz w:val="22"/>
+          <w:szCs w:val="22"/>
+          <w:highlight w:val="none"/>
+          <w:lang w:val="es-ES"/>
+        </w:rPr>
+      </w:r>
+      <w:r>
+        <w:rPr>
+          <w:rFonts w:ascii="Asana Math" w:hAnsi="Asana Math" w:eastAsia="Asana Math" w:cs="Asana Math"/>
+          <w:sz w:val="22"/>
+          <w:szCs w:val="22"/>
+          <w:highlight w:val="none"/>
+          <w:lang w:val="es-ES"/>
+        </w:rPr>
+      </w:r>
+      <w:r>
+        <w:rPr>
+          <w:rFonts w:ascii="Asana Math" w:hAnsi="Asana Math" w:eastAsia="Asana Math" w:cs="Asana Math"/>
+          <w:sz w:val="22"/>
+          <w:szCs w:val="22"/>
+          <w:highlight w:val="none"/>
+          <w:lang w:val="es-ES"/>
+        </w:rPr>
+      </w:r>
+    </w:p>
+    <w:p>
+      <w:pPr>
+        <w:pBdr/>
+        <w:spacing/>
+        <w:ind/>
+        <w:jc w:val="center"/>
+        <w:rPr>
+          <w:rFonts w:ascii="Asana Math" w:hAnsi="Asana Math" w:eastAsia="Asana Math" w:cs="Asana Math"/>
+          <w:sz w:val="22"/>
+          <w:szCs w:val="22"/>
+          <w:highlight w:val="none"/>
+          <w:lang w:val="es-ES" w:bidi="es-ES"/>
+        </w:rPr>
+      </w:pPr>
+      <w:r>
+        <w:rPr>
+          <w:rFonts w:ascii="Asana Math" w:hAnsi="Asana Math" w:eastAsia="Asana Math" w:cs="Asana Math"/>
+          <w:sz w:val="22"/>
+          <w:szCs w:val="22"/>
+          <w:highlight w:val="none"/>
+          <w:lang w:val="es-ES" w:bidi="es-ES"/>
+        </w:rPr>
+        <w:t xml:space="preserve">Ahora nos enfrentamos a la representaci</w:t>
+      </w:r>
+      <w:r>
+        <w:rPr>
+          <w:rFonts w:ascii="Asana Math" w:hAnsi="Asana Math" w:eastAsia="Asana Math" w:cs="Asana Math"/>
+          <w:sz w:val="22"/>
+          <w:szCs w:val="22"/>
+          <w:highlight w:val="none"/>
+          <w:lang w:val="es-ES" w:bidi="es-ES"/>
+        </w:rPr>
+        <w:t xml:space="preserve">ón y l</w:t>
+      </w:r>
+      <w:r>
+        <w:rPr>
+          <w:rFonts w:ascii="Asana Math" w:hAnsi="Asana Math" w:eastAsia="Asana Math" w:cs="Asana Math"/>
+          <w:sz w:val="22"/>
+          <w:szCs w:val="22"/>
+          <w:highlight w:val="none"/>
+          <w:lang w:val="es-ES" w:bidi="es-ES"/>
+        </w:rPr>
+        <w:t xml:space="preserve">ógica de nuestros tetriminos(7 en total).</w:t>
+      </w:r>
+      <w:r>
+        <w:rPr>
+          <w:rFonts w:ascii="Asana Math" w:hAnsi="Asana Math" w:eastAsia="Asana Math" w:cs="Asana Math"/>
+          <w:sz w:val="18"/>
+          <w:szCs w:val="18"/>
+          <w:highlight w:val="none"/>
+          <w:lang w:val="es-ES"/>
+        </w:rPr>
+      </w:r>
+    </w:p>
+    <w:p>
+      <w:pPr>
+        <w:pBdr/>
+        <w:spacing/>
+        <w:ind/>
+        <w:jc w:val="center"/>
+        <w:rPr>
+          <w:rFonts w:ascii="Asana Math" w:hAnsi="Asana Math" w:eastAsia="Asana Math" w:cs="Asana Math"/>
+          <w:b w:val="0"/>
+          <w:bCs w:val="0"/>
+          <w:sz w:val="22"/>
+          <w:szCs w:val="22"/>
+          <w:highlight w:val="none"/>
+          <w:lang w:val="es-ES" w:bidi="es-ES"/>
+        </w:rPr>
+      </w:pPr>
+      <w:r>
+        <w:rPr>
+          <w:rFonts w:ascii="Asana Math" w:hAnsi="Asana Math" w:eastAsia="Asana Math" w:cs="Asana Math"/>
+          <w:sz w:val="22"/>
+          <w:szCs w:val="22"/>
+          <w:highlight w:val="none"/>
+          <w:lang w:val="es-ES" w:bidi="es-ES"/>
+        </w:rPr>
+        <w:t xml:space="preserve">Primero nos enfrentamos como los representaremos a nivel de  bits ya que son estos los que nos daran una mecanica fundamental en nuestro desarrollo “el </w:t>
+      </w:r>
+      <w:r>
+        <w:rPr>
+          <w:rFonts w:ascii="Asana Math" w:hAnsi="Asana Math" w:eastAsia="Asana Math" w:cs="Asana Math"/>
+          <w:b/>
+          <w:bCs/>
+          <w:sz w:val="22"/>
+          <w:szCs w:val="22"/>
+          <w:highlight w:val="none"/>
+          <w:lang w:val="es-ES" w:bidi="es-ES"/>
+        </w:rPr>
+        <w:t xml:space="preserve">bit masking </w:t>
+      </w:r>
+      <w:r>
+        <w:rPr>
+          <w:rFonts w:ascii="Asana Math" w:hAnsi="Asana Math" w:eastAsia="Asana Math" w:cs="Asana Math"/>
+          <w:b w:val="0"/>
+          <w:bCs w:val="0"/>
+          <w:sz w:val="22"/>
+          <w:szCs w:val="22"/>
+          <w:highlight w:val="none"/>
+          <w:lang w:val="es-ES" w:bidi="es-ES"/>
+        </w:rPr>
+        <w:t xml:space="preserve">“ asi que lo primordial es nuestros tetriminos y la representaci</w:t>
+      </w:r>
+      <w:r>
+        <w:rPr>
+          <w:rFonts w:ascii="Asana Math" w:hAnsi="Asana Math" w:eastAsia="Asana Math" w:cs="Asana Math"/>
+          <w:b w:val="0"/>
+          <w:bCs w:val="0"/>
+          <w:sz w:val="22"/>
+          <w:szCs w:val="22"/>
+          <w:highlight w:val="none"/>
+          <w:lang w:val="es-ES" w:bidi="es-ES"/>
+        </w:rPr>
+        <w:t xml:space="preserve">ón en binario</w:t>
+      </w:r>
+      <w:r>
+        <w:rPr>
+          <w:rFonts w:ascii="Asana Math" w:hAnsi="Asana Math" w:eastAsia="Asana Math" w:cs="Asana Math"/>
+          <w:b w:val="0"/>
+          <w:bCs w:val="0"/>
+          <w:sz w:val="22"/>
+          <w:szCs w:val="22"/>
+          <w:highlight w:val="none"/>
+          <w:lang w:val="es-ES" w:bidi="es-ES"/>
+        </w:rPr>
+        <w:t xml:space="preserve">.</w:t>
+      </w:r>
+      <w:r>
+        <w:rPr>
+          <w:rFonts w:ascii="Asana Math" w:hAnsi="Asana Math" w:eastAsia="Asana Math" w:cs="Asana Math"/>
+          <w:sz w:val="22"/>
+          <w:szCs w:val="22"/>
+          <w:highlight w:val="none"/>
+          <w:lang w:val="es-ES" w:bidi="es-ES"/>
+        </w:rPr>
+      </w:r>
+    </w:p>
+    <w:p>
+      <w:pPr>
+        <w:pBdr/>
+        <w:spacing/>
+        <w:ind/>
+        <w:jc w:val="center"/>
+        <w:rPr>
+          <w:rFonts w:ascii="Asana Math" w:hAnsi="Asana Math" w:eastAsia="Asana Math" w:cs="Asana Math"/>
+          <w:sz w:val="22"/>
+          <w:szCs w:val="22"/>
+          <w:highlight w:val="none"/>
+          <w:lang w:val="es-ES" w:bidi="es-ES"/>
+        </w:rPr>
+      </w:pPr>
+      <w:r>
+        <w:rPr>
+          <w:rFonts w:ascii="Asana Math" w:hAnsi="Asana Math" w:eastAsia="Asana Math" w:cs="Asana Math"/>
+          <w:b w:val="0"/>
+          <w:bCs w:val="0"/>
+          <w:sz w:val="22"/>
+          <w:szCs w:val="22"/>
+          <w:highlight w:val="none"/>
+          <w:lang w:val="es-ES" w:bidi="es-ES"/>
+        </w:rPr>
+      </w:r>
+      <w:r>
+        <mc:AlternateContent>
+          <mc:Choice Requires="wpg">
+            <w:drawing>
+              <wp:inline xmlns:wp="http://schemas.openxmlformats.org/drawingml/2006/wordprocessingDrawing" distT="0" distB="0" distL="0" distR="0">
+                <wp:extent cx="1607644" cy="1592618"/>
+                <wp:effectExtent l="0" t="0" r="0" b="0"/>
+                <wp:docPr id="8" name=""/>
+                <wp:cNvGraphicFramePr>
+                  <a:graphicFrameLocks xmlns:a="http://schemas.openxmlformats.org/drawingml/2006/main" noChangeAspect="1"/>
+                </wp:cNvGraphicFramePr>
+                <a:graphic xmlns:a="http://schemas.openxmlformats.org/drawingml/2006/main">
+                  <a:graphicData uri="http://schemas.openxmlformats.org/drawingml/2006/picture">
+                    <pic:pic xmlns:pic="http://schemas.openxmlformats.org/drawingml/2006/picture">
+                      <pic:nvPicPr>
+                        <pic:cNvPr id="634993907" name=""/>
+                        <pic:cNvPicPr>
+                          <a:picLocks noChangeAspect="1"/>
+                        </pic:cNvPicPr>
+                        <pic:nvPr/>
+                      </pic:nvPicPr>
+                      <pic:blipFill rotWithShape="1">
+                        <a:blip r:embed="rId17"/>
+                        <a:stretch/>
+                      </pic:blipFill>
+                      <pic:spPr bwMode="auto">
+                        <a:xfrm flipH="0" flipV="0">
+                          <a:off x="0" y="0"/>
+                          <a:ext cx="1607644" cy="1592618"/>
+                        </a:xfrm>
+                        <a:prstGeom prst="rect">
+                          <a:avLst/>
+                        </a:prstGeom>
+                      </pic:spPr>
+                    </pic:pic>
+                  </a:graphicData>
+                </a:graphic>
+              </wp:inline>
+            </w:drawing>
+          </mc:Choice>
+          <mc:Fallback>
+            <w:pict>
+              <v:shapetype id="_x0000_t75" coordsize="21600,21600" o:spt="75" o:preferrelative="t" path="m@4@5l@4@11@9@11@9@5xe" filled="f" stroked="f">
+                <v:stroke joinstyle="miter"/>
+                <v:formulas>
+                  <v:f eqn="if lineDrawn pixelLineWidth 0"/>
+                  <v:f eqn="sum @0 1 0"/>
+                  <v:f eqn="sum 0 0 @1"/>
+                  <v:f eqn="prod @2 1 2"/>
+                  <v:f eqn="prod @3 21600 pixelWidth"/>
+                  <v:f eqn="prod @3 21600 pixelHeight"/>
+                  <v:f eqn="sum @0 0 1"/>
+                  <v:f eqn="prod @6 1 2"/>
+                  <v:f eqn="prod @7 21600 pixelWidth"/>
+                  <v:f eqn="sum @8 21600 0"/>
+                  <v:f eqn="prod @7 21600 pixelHeight"/>
+                  <v:f eqn="sum @10 21600 0"/>
+                </v:formulas>
+                <v:path o:extrusionok="f" gradientshapeok="t" o:connecttype="rect"/>
+                <o:lock v:ext="edit" aspectratio="t"/>
+              </v:shapetype>
+              <v:shape id="_x0000_i7" o:spid="_x0000_s7" type="#_x0000_t75" style="width:126.59pt;height:125.40pt;mso-wrap-distance-left:0.00pt;mso-wrap-distance-top:0.00pt;mso-wrap-distance-right:0.00pt;mso-wrap-distance-bottom:0.00pt;z-index:1;" stroked="false">
+                <v:imagedata r:id="rId17" o:title=""/>
+                <o:lock v:ext="edit" rotation="t"/>
+              </v:shape>
+            </w:pict>
+          </mc:Fallback>
+        </mc:AlternateContent>
+      </w:r>
+      <w:r>
+        <w:rPr>
+          <w:rFonts w:ascii="Asana Math" w:hAnsi="Asana Math" w:eastAsia="Asana Math" w:cs="Asana Math"/>
+          <w:b w:val="0"/>
+          <w:bCs w:val="0"/>
+          <w:sz w:val="22"/>
+          <w:szCs w:val="22"/>
+          <w:highlight w:val="none"/>
+          <w:lang w:val="es-ES" w:bidi="es-ES"/>
+        </w:rPr>
+      </w:r>
+      <w:r>
+        <w:rPr>
+          <w:rFonts w:ascii="Asana Math" w:hAnsi="Asana Math" w:eastAsia="Asana Math" w:cs="Asana Math"/>
+          <w:b w:val="0"/>
+          <w:bCs w:val="0"/>
+          <w:sz w:val="22"/>
+          <w:szCs w:val="22"/>
+          <w:highlight w:val="none"/>
+          <w:lang w:val="es-ES" w:bidi="es-ES"/>
+        </w:rPr>
+      </w:r>
+      <w:r>
+        <w:rPr>
+          <w:rFonts w:ascii="Asana Math" w:hAnsi="Asana Math" w:eastAsia="Asana Math" w:cs="Asana Math"/>
+          <w:b w:val="0"/>
+          <w:bCs w:val="0"/>
+          <w:sz w:val="22"/>
+          <w:szCs w:val="22"/>
+          <w:highlight w:val="none"/>
+          <w:lang w:val="es-ES" w:bidi="es-ES"/>
+        </w:rPr>
+      </w:r>
+    </w:p>
+    <w:p>
+      <w:pPr>
+        <w:pStyle w:val="883"/>
+        <w:pBdr/>
+        <w:spacing/>
+        <w:ind/>
+        <w:jc w:val="center"/>
+        <w:rPr/>
+      </w:pPr>
+      <w:r>
+        <w:t xml:space="preserve">Figure </w:t>
+      </w:r>
+      <w:r>
+        <w:fldChar w:fldCharType="begin"/>
+        <w:instrText xml:space="preserve"> SEQ Figure \* Arabic </w:instrText>
+        <w:fldChar w:fldCharType="separate"/>
+      </w:r>
+      <w:r>
+        <w:t xml:space="preserve">7</w:t>
+      </w:r>
+      <w:r/>
+      <w:r>
+        <w:fldChar w:fldCharType="end"/>
+      </w:r>
+      <w:r>
+        <w:t xml:space="preserve">.Tetriminos y sus rotaciones. </w:t>
+      </w:r>
+      <w:r/>
+    </w:p>
+    <w:p>
+      <w:pPr>
+        <w:pBdr/>
+        <w:spacing/>
+        <w:ind/>
+        <w:jc w:val="center"/>
+        <w:rPr>
           <w:rFonts w:ascii="Asana Math" w:hAnsi="Asana Math" w:cs="Asana Math"/>
+          <w:highlight w:val="none"/>
+          <w:lang w:val="es-ES"/>
         </w:rPr>
       </w:pPr>
       <w:r>
@@ -3932,6 +4763,7 @@
           <w:highlight w:val="none"/>
           <w:lang w:val="es-ES"/>
         </w:rPr>
+        <w:t xml:space="preserve">Utilizando su representaci</w:t>
       </w:r>
       <w:r>
         <w:rPr>
@@ -3939,10 +4771,2945 @@
           <w:highlight w:val="none"/>
           <w:lang w:val="es-ES"/>
         </w:rPr>
-      </w:r>
-      <w:r>
-        <w:rPr>
-          <w:rFonts w:ascii="Asana Math" w:hAnsi="Asana Math" w:eastAsia="Asana Math" w:cs="Asana Math"/>
+        <w:t xml:space="preserve">ón de bits podemos decir que en matrices si hay color </w:t>
+      </w:r>
+      <w:r>
+        <w:rPr>
+          <w:rFonts w:ascii="Asana Math" w:hAnsi="Asana Math" w:cs="Asana Math"/>
+          <w:lang w:val="es-ES"/>
+        </w:rPr>
+        <w:t xml:space="preserve">es un 1’s y si hay negro es un 0’s, teniendo una representac</w:t>
+      </w:r>
+      <w:r>
+        <w:rPr>
+          <w:rFonts w:ascii="Asana Math" w:hAnsi="Asana Math" w:cs="Asana Math"/>
+          <w:lang w:val="es-ES"/>
+        </w:rPr>
+        <w:t xml:space="preserve">i</w:t>
+      </w:r>
+      <w:r>
+        <w:rPr>
+          <w:rFonts w:ascii="Asana Math" w:hAnsi="Asana Math" w:cs="Asana Math"/>
+          <w:lang w:val="es-ES"/>
+        </w:rPr>
+        <w:t xml:space="preserve">ón acertada de bits</w:t>
+      </w:r>
+      <w:r>
+        <w:rPr>
+          <w:rFonts w:ascii="Asana Math" w:hAnsi="Asana Math" w:cs="Asana Math"/>
+          <w:lang w:val="es-ES"/>
+        </w:rPr>
+        <w:t xml:space="preserve">.</w:t>
+      </w:r>
+      <w:r>
+        <w:rPr>
+          <w:rFonts w:ascii="Asana Math" w:hAnsi="Asana Math" w:cs="Asana Math"/>
+          <w:highlight w:val="none"/>
+          <w:lang w:val="es-ES"/>
+        </w:rPr>
+      </w:r>
+    </w:p>
+    <w:p>
+      <w:pPr>
+        <w:pBdr/>
+        <w:spacing/>
+        <w:ind/>
+        <w:jc w:val="center"/>
+        <w:rPr/>
+      </w:pPr>
+      <w:r>
+        <w:rPr>
+          <w:rFonts w:ascii="Asana Math" w:hAnsi="Asana Math" w:cs="Asana Math"/>
+          <w:highlight w:val="none"/>
+          <w:lang w:val="es-ES" w:bidi="es-ES"/>
+        </w:rPr>
+      </w:r>
+      <w:r>
+        <mc:AlternateContent>
+          <mc:Choice Requires="wpg">
+            <w:drawing>
+              <wp:anchor xmlns:wp="http://schemas.openxmlformats.org/drawingml/2006/wordprocessingDrawing" xmlns:wp14="http://schemas.microsoft.com/office/word/2010/wordprocessingDrawing" distT="0" distB="0" distL="115200" distR="115200" simplePos="0" relativeHeight="14336" behindDoc="0" locked="0" layoutInCell="1" allowOverlap="1">
+                <wp:simplePos x="0" y="0"/>
+                <wp:positionH relativeFrom="column">
+                  <wp:posOffset>2429289</wp:posOffset>
+                </wp:positionH>
+                <wp:positionV relativeFrom="paragraph">
+                  <wp:posOffset>284822</wp:posOffset>
+                </wp:positionV>
+                <wp:extent cx="939267" cy="1242750"/>
+                <wp:effectExtent l="3175" t="3175" r="3175" b="3175"/>
+                <wp:wrapNone/>
+                <wp:docPr id="9" name=""/>
+                <wp:cNvGraphicFramePr/>
+                <a:graphic xmlns:a="http://schemas.openxmlformats.org/drawingml/2006/main">
+                  <a:graphicData uri="http://schemas.microsoft.com/office/word/2010/wordprocessingShape">
+                    <wps:wsp>
+                      <wps:cNvPr id="0" name=""/>
+                      <wps:cNvSpPr txBox="1"/>
+                      <wps:spPr bwMode="auto">
+                        <a:xfrm rot="0" flipH="0" flipV="0">
+                          <a:off x="0" y="0"/>
+                          <a:ext cx="939267" cy="1242749"/>
+                        </a:xfrm>
+                        <a:prstGeom prst="rect">
+                          <a:avLst/>
+                        </a:prstGeom>
+                        <a:solidFill>
+                          <a:schemeClr val="lt1"/>
+                        </a:solidFill>
+                        <a:ln w="6350">
+                          <a:solidFill>
+                            <a:prstClr val="black"/>
+                          </a:solidFill>
+                        </a:ln>
+                      </wps:spPr>
+                      <wps:txbx>
+                        <w:txbxContent>
+                          <w:p>
+                            <w:pPr>
+                              <w:pBdr/>
+                              <w:spacing/>
+                              <w:ind/>
+                              <w:rPr>
+                                <w:rFonts w:ascii="Asana Math" w:hAnsi="Asana Math" w:eastAsia="Asana Math" w:cs="Asana Math"/>
+                                <w:highlight w:val="none"/>
+                                <w:lang w:val="es-ES"/>
+                              </w:rPr>
+                            </w:pPr>
+                            <w:r>
+                              <w:rPr>
+                                <w:rFonts w:ascii="Asana Math" w:hAnsi="Asana Math" w:eastAsia="Asana Math" w:cs="Asana Math"/>
+                                <w:lang w:val="es-ES"/>
+                              </w:rPr>
+                              <w:t xml:space="preserve">0000  - 0010</w:t>
+                            </w:r>
+                            <w:r>
+                              <w:rPr>
+                                <w:rFonts w:ascii="Asana Math" w:hAnsi="Asana Math" w:cs="Asana Math"/>
+                              </w:rPr>
+                            </w:r>
+                          </w:p>
+                          <w:p>
+                            <w:pPr>
+                              <w:pBdr/>
+                              <w:spacing/>
+                              <w:ind/>
+                              <w:rPr>
+                                <w:rFonts w:ascii="Asana Math" w:hAnsi="Asana Math" w:eastAsia="Asana Math" w:cs="Asana Math"/>
+                                <w:highlight w:val="none"/>
+                                <w:lang w:val="es-ES"/>
+                              </w:rPr>
+                            </w:pPr>
+                            <w:r>
+                              <w:rPr>
+                                <w:rFonts w:ascii="Asana Math" w:hAnsi="Asana Math" w:eastAsia="Asana Math" w:cs="Asana Math"/>
+                                <w:highlight w:val="none"/>
+                                <w:lang w:val="es-ES"/>
+                              </w:rPr>
+                              <w:t xml:space="preserve">1111  - 0010</w:t>
+                            </w:r>
+                            <w:r>
+                              <w:rPr>
+                                <w:rFonts w:ascii="Asana Math" w:hAnsi="Asana Math" w:cs="Asana Math"/>
+                              </w:rPr>
+                            </w:r>
+                          </w:p>
+                          <w:p>
+                            <w:pPr>
+                              <w:pBdr/>
+                              <w:spacing/>
+                              <w:ind/>
+                              <w:rPr>
+                                <w:rFonts w:ascii="Asana Math" w:hAnsi="Asana Math" w:eastAsia="Asana Math" w:cs="Asana Math"/>
+                                <w:highlight w:val="none"/>
+                                <w:lang w:val="es-ES"/>
+                              </w:rPr>
+                            </w:pPr>
+                            <w:r>
+                              <w:rPr>
+                                <w:rFonts w:ascii="Asana Math" w:hAnsi="Asana Math" w:eastAsia="Asana Math" w:cs="Asana Math"/>
+                                <w:highlight w:val="none"/>
+                                <w:lang w:val="es-ES"/>
+                              </w:rPr>
+                              <w:t xml:space="preserve">0000  - 0010</w:t>
+                            </w:r>
+                            <w:r>
+                              <w:rPr>
+                                <w:rFonts w:ascii="Asana Math" w:hAnsi="Asana Math" w:cs="Asana Math"/>
+                              </w:rPr>
+                            </w:r>
+                          </w:p>
+                          <w:p>
+                            <w:pPr>
+                              <w:pBdr/>
+                              <w:spacing/>
+                              <w:ind/>
+                              <w:rPr>
+                                <w:rFonts w:ascii="Asana Math" w:hAnsi="Asana Math" w:cs="Asana Math"/>
+                              </w:rPr>
+                            </w:pPr>
+                            <w:r>
+                              <w:rPr>
+                                <w:rFonts w:ascii="Asana Math" w:hAnsi="Asana Math" w:eastAsia="Asana Math" w:cs="Asana Math"/>
+                                <w:highlight w:val="none"/>
+                                <w:lang w:val="es-ES"/>
+                              </w:rPr>
+                              <w:t xml:space="preserve">0000  - 0010</w:t>
+                            </w:r>
+                            <w:r>
+                              <w:rPr>
+                                <w:rFonts w:ascii="Asana Math" w:hAnsi="Asana Math" w:eastAsia="Asana Math" w:cs="Asana Math"/>
+                                <w:highlight w:val="none"/>
+                                <w:lang w:val="es-ES"/>
+                              </w:rPr>
+                            </w:r>
+                          </w:p>
+                        </w:txbxContent>
+                      </wps:txbx>
+                      <wps:bodyPr vertOverflow="overflow" horzOverflow="overflow" vert="horz" wrap="square" lIns="91440" tIns="45720" rIns="91440" bIns="45720" numCol="1" spcCol="0" rtlCol="0" fromWordArt="0" anchor="t" anchorCtr="0" forceAA="0" upright="0" compatLnSpc="0"/>
+                    </wps:wsp>
+                  </a:graphicData>
+                </a:graphic>
+              </wp:anchor>
+            </w:drawing>
+          </mc:Choice>
+          <mc:Fallback>
+            <w:pict>
+              <v:shape id="shape 8" o:spid="_x0000_s8" o:spt="202" type="#_x0000_t202" style="position:absolute;z-index:14336;o:allowoverlap:true;o:allowincell:true;mso-position-horizontal-relative:text;margin-left:191.28pt;mso-position-horizontal:absolute;mso-position-vertical-relative:text;margin-top:22.43pt;mso-position-vertical:absolute;width:73.96pt;height:97.85pt;mso-wrap-distance-left:9.07pt;mso-wrap-distance-top:0.00pt;mso-wrap-distance-right:9.07pt;mso-wrap-distance-bottom:0.00pt;rotation:0;v-text-anchor:top;visibility:visible;" fillcolor="#FFFFFF" strokecolor="#000000" strokeweight="0.50pt">
+                <v:textbox inset="0,0,0,0">
+                  <w:txbxContent>
+                    <w:p>
+                      <w:pPr>
+                        <w:pBdr/>
+                        <w:spacing/>
+                        <w:ind/>
+                        <w:rPr>
+                          <w:rFonts w:ascii="Asana Math" w:hAnsi="Asana Math" w:eastAsia="Asana Math" w:cs="Asana Math"/>
+                          <w:highlight w:val="none"/>
+                          <w:lang w:val="es-ES"/>
+                        </w:rPr>
+                      </w:pPr>
+                      <w:r>
+                        <w:rPr>
+                          <w:rFonts w:ascii="Asana Math" w:hAnsi="Asana Math" w:eastAsia="Asana Math" w:cs="Asana Math"/>
+                          <w:lang w:val="es-ES"/>
+                        </w:rPr>
+                        <w:t xml:space="preserve">0000  - 0010</w:t>
+                      </w:r>
+                      <w:r>
+                        <w:rPr>
+                          <w:rFonts w:ascii="Asana Math" w:hAnsi="Asana Math" w:cs="Asana Math"/>
+                        </w:rPr>
+                      </w:r>
+                    </w:p>
+                    <w:p>
+                      <w:pPr>
+                        <w:pBdr/>
+                        <w:spacing/>
+                        <w:ind/>
+                        <w:rPr>
+                          <w:rFonts w:ascii="Asana Math" w:hAnsi="Asana Math" w:eastAsia="Asana Math" w:cs="Asana Math"/>
+                          <w:highlight w:val="none"/>
+                          <w:lang w:val="es-ES"/>
+                        </w:rPr>
+                      </w:pPr>
+                      <w:r>
+                        <w:rPr>
+                          <w:rFonts w:ascii="Asana Math" w:hAnsi="Asana Math" w:eastAsia="Asana Math" w:cs="Asana Math"/>
+                          <w:highlight w:val="none"/>
+                          <w:lang w:val="es-ES"/>
+                        </w:rPr>
+                        <w:t xml:space="preserve">1111  - 0010</w:t>
+                      </w:r>
+                      <w:r>
+                        <w:rPr>
+                          <w:rFonts w:ascii="Asana Math" w:hAnsi="Asana Math" w:cs="Asana Math"/>
+                        </w:rPr>
+                      </w:r>
+                    </w:p>
+                    <w:p>
+                      <w:pPr>
+                        <w:pBdr/>
+                        <w:spacing/>
+                        <w:ind/>
+                        <w:rPr>
+                          <w:rFonts w:ascii="Asana Math" w:hAnsi="Asana Math" w:eastAsia="Asana Math" w:cs="Asana Math"/>
+                          <w:highlight w:val="none"/>
+                          <w:lang w:val="es-ES"/>
+                        </w:rPr>
+                      </w:pPr>
+                      <w:r>
+                        <w:rPr>
+                          <w:rFonts w:ascii="Asana Math" w:hAnsi="Asana Math" w:eastAsia="Asana Math" w:cs="Asana Math"/>
+                          <w:highlight w:val="none"/>
+                          <w:lang w:val="es-ES"/>
+                        </w:rPr>
+                        <w:t xml:space="preserve">0000  - 0010</w:t>
+                      </w:r>
+                      <w:r>
+                        <w:rPr>
+                          <w:rFonts w:ascii="Asana Math" w:hAnsi="Asana Math" w:cs="Asana Math"/>
+                        </w:rPr>
+                      </w:r>
+                    </w:p>
+                    <w:p>
+                      <w:pPr>
+                        <w:pBdr/>
+                        <w:spacing/>
+                        <w:ind/>
+                        <w:rPr>
+                          <w:rFonts w:ascii="Asana Math" w:hAnsi="Asana Math" w:cs="Asana Math"/>
+                        </w:rPr>
+                      </w:pPr>
+                      <w:r>
+                        <w:rPr>
+                          <w:rFonts w:ascii="Asana Math" w:hAnsi="Asana Math" w:eastAsia="Asana Math" w:cs="Asana Math"/>
+                          <w:highlight w:val="none"/>
+                          <w:lang w:val="es-ES"/>
+                        </w:rPr>
+                        <w:t xml:space="preserve">0000  - 0010</w:t>
+                      </w:r>
+                      <w:r>
+                        <w:rPr>
+                          <w:rFonts w:ascii="Asana Math" w:hAnsi="Asana Math" w:eastAsia="Asana Math" w:cs="Asana Math"/>
+                          <w:highlight w:val="none"/>
+                          <w:lang w:val="es-ES"/>
+                        </w:rPr>
+                      </w:r>
+                    </w:p>
+                  </w:txbxContent>
+                </v:textbox>
+              </v:shape>
+            </w:pict>
+          </mc:Fallback>
+        </mc:AlternateContent>
+      </w:r>
+      <w:r>
+        <w:rPr>
+          <w:rFonts w:ascii="Asana Math" w:hAnsi="Asana Math" w:cs="Asana Math"/>
+          <w:highlight w:val="none"/>
+          <w:lang w:val="es-ES" w:bidi="es-ES"/>
+        </w:rPr>
+        <w:t xml:space="preserve">− I (Línea o Pieza I): Recta de cuatro bloques (1x4).</w:t>
+      </w:r>
+      <w:r/>
+    </w:p>
+    <w:p>
+      <w:pPr>
+        <w:pBdr/>
+        <w:spacing/>
+        <w:ind/>
+        <w:jc w:val="center"/>
+        <w:rPr>
+          <w:rFonts w:ascii="Asana Math" w:hAnsi="Asana Math" w:cs="Asana Math"/>
+          <w:highlight w:val="none"/>
+          <w:lang w:val="es-ES" w:bidi="es-ES"/>
+        </w:rPr>
+      </w:pPr>
+      <w:r/>
+      <w:r/>
+      <w:r/>
+    </w:p>
+    <w:p>
+      <w:pPr>
+        <w:pBdr/>
+        <w:spacing/>
+        <w:ind/>
+        <w:jc w:val="center"/>
+        <w:rPr>
+          <w:rFonts w:ascii="Asana Math" w:hAnsi="Asana Math" w:cs="Asana Math"/>
+          <w:highlight w:val="none"/>
+          <w:lang w:val="es-ES" w:bidi="es-ES"/>
+        </w:rPr>
+      </w:pPr>
+      <w:r>
+        <w:rPr>
+          <w:rFonts w:ascii="Asana Math" w:hAnsi="Asana Math" w:cs="Asana Math"/>
+          <w:highlight w:val="none"/>
+          <w:lang w:val="es-ES" w:bidi="es-ES"/>
+        </w:rPr>
+      </w:r>
+      <w:r>
+        <w:rPr>
+          <w:rFonts w:ascii="Asana Math" w:hAnsi="Asana Math" w:cs="Asana Math"/>
+          <w:highlight w:val="none"/>
+          <w:lang w:val="es-ES" w:bidi="es-ES"/>
+        </w:rPr>
+      </w:r>
+      <w:r>
+        <w:rPr>
+          <w:rFonts w:ascii="Asana Math" w:hAnsi="Asana Math" w:cs="Asana Math"/>
+          <w:highlight w:val="none"/>
+          <w:lang w:val="es-ES" w:bidi="es-ES"/>
+        </w:rPr>
+      </w:r>
+    </w:p>
+    <w:p>
+      <w:pPr>
+        <w:pBdr/>
+        <w:spacing/>
+        <w:ind/>
+        <w:jc w:val="center"/>
+        <w:rPr>
+          <w:rFonts w:ascii="Asana Math" w:hAnsi="Asana Math" w:cs="Asana Math"/>
+          <w:highlight w:val="none"/>
+          <w:lang w:val="es-ES" w:bidi="es-ES"/>
+        </w:rPr>
+      </w:pPr>
+      <w:r>
+        <w:rPr>
+          <w:rFonts w:ascii="Asana Math" w:hAnsi="Asana Math" w:cs="Asana Math"/>
+          <w:highlight w:val="none"/>
+          <w:lang w:val="es-ES" w:bidi="es-ES"/>
+        </w:rPr>
+        <w:t xml:space="preserve"> O (Cu</w:t>
+      </w:r>
+      <w:r>
+        <mc:AlternateContent>
+          <mc:Choice Requires="wpg">
+            <w:drawing>
+              <wp:anchor xmlns:wp="http://schemas.openxmlformats.org/drawingml/2006/wordprocessingDrawing" xmlns:wp14="http://schemas.microsoft.com/office/word/2010/wordprocessingDrawing" distT="0" distB="0" distL="115200" distR="115200" simplePos="0" relativeHeight="15360" behindDoc="0" locked="0" layoutInCell="1" allowOverlap="1">
+                <wp:simplePos x="0" y="0"/>
+                <wp:positionH relativeFrom="column">
+                  <wp:posOffset>2789582</wp:posOffset>
+                </wp:positionH>
+                <wp:positionV relativeFrom="paragraph">
+                  <wp:posOffset>257948</wp:posOffset>
+                </wp:positionV>
+                <wp:extent cx="364434" cy="646043"/>
+                <wp:effectExtent l="3175" t="3175" r="3175" b="3175"/>
+                <wp:wrapNone/>
+                <wp:docPr id="10" name=""/>
+                <wp:cNvGraphicFramePr/>
+                <a:graphic xmlns:a="http://schemas.openxmlformats.org/drawingml/2006/main">
+                  <a:graphicData uri="http://schemas.microsoft.com/office/word/2010/wordprocessingShape">
+                    <wps:wsp>
+                      <wps:cNvPr id="0" name=""/>
+                      <wps:cNvSpPr txBox="1"/>
+                      <wps:spPr bwMode="auto">
+                        <a:xfrm rot="0" flipH="0" flipV="0">
+                          <a:off x="0" y="0"/>
+                          <a:ext cx="364434" cy="646043"/>
+                        </a:xfrm>
+                        <a:prstGeom prst="rect">
+                          <a:avLst/>
+                        </a:prstGeom>
+                        <a:solidFill>
+                          <a:schemeClr val="lt1"/>
+                        </a:solidFill>
+                        <a:ln w="6350">
+                          <a:solidFill>
+                            <a:prstClr val="black"/>
+                          </a:solidFill>
+                        </a:ln>
+                      </wps:spPr>
+                      <wps:txbx>
+                        <w:txbxContent>
+                          <w:p>
+                            <w:pPr>
+                              <w:pBdr/>
+                              <w:spacing/>
+                              <w:ind/>
+                              <w:rPr>
+                                <w:rFonts w:ascii="Asana Math" w:hAnsi="Asana Math" w:eastAsia="Asana Math" w:cs="Asana Math"/>
+                                <w:highlight w:val="none"/>
+                                <w:lang w:val="es-ES"/>
+                              </w:rPr>
+                            </w:pPr>
+                            <w:r>
+                              <w:rPr>
+                                <w:rFonts w:ascii="Asana Math" w:hAnsi="Asana Math" w:eastAsia="Asana Math" w:cs="Asana Math"/>
+                                <w:lang w:val="es-ES"/>
+                              </w:rPr>
+                              <w:t xml:space="preserve"> 11</w:t>
+                            </w:r>
+                            <w:r>
+                              <w:rPr>
+                                <w:rFonts w:ascii="Asana Math" w:hAnsi="Asana Math" w:cs="Asana Math"/>
+                              </w:rPr>
+                            </w:r>
+                          </w:p>
+                          <w:p>
+                            <w:pPr>
+                              <w:pBdr/>
+                              <w:spacing/>
+                              <w:ind/>
+                              <w:rPr>
+                                <w:rFonts w:ascii="Asana Math" w:hAnsi="Asana Math" w:cs="Asana Math"/>
+                              </w:rPr>
+                            </w:pPr>
+                            <w:r>
+                              <w:rPr>
+                                <w:rFonts w:ascii="Asana Math" w:hAnsi="Asana Math" w:eastAsia="Asana Math" w:cs="Asana Math"/>
+                                <w:highlight w:val="none"/>
+                                <w:lang w:val="es-ES"/>
+                              </w:rPr>
+                              <w:t xml:space="preserve"> 11</w:t>
+                            </w:r>
+                            <w:r>
+                              <w:rPr>
+                                <w:rFonts w:ascii="Asana Math" w:hAnsi="Asana Math" w:eastAsia="Asana Math" w:cs="Asana Math"/>
+                                <w:highlight w:val="none"/>
+                                <w:lang w:val="es-ES"/>
+                              </w:rPr>
+                            </w:r>
+                            <w:r>
+                              <w:rPr>
+                                <w:rFonts w:ascii="Asana Math" w:hAnsi="Asana Math" w:eastAsia="Asana Math" w:cs="Asana Math"/>
+                                <w:highlight w:val="none"/>
+                                <w:lang w:val="es-ES"/>
+                              </w:rPr>
+                            </w:r>
+                          </w:p>
+                        </w:txbxContent>
+                      </wps:txbx>
+                      <wps:bodyPr vertOverflow="overflow" horzOverflow="overflow" vert="horz" wrap="square" lIns="91440" tIns="45720" rIns="91440" bIns="45720" numCol="1" spcCol="0" rtlCol="0" fromWordArt="0" anchor="t" anchorCtr="0" forceAA="0" upright="0" compatLnSpc="0"/>
+                    </wps:wsp>
+                  </a:graphicData>
+                </a:graphic>
+              </wp:anchor>
+            </w:drawing>
+          </mc:Choice>
+          <mc:Fallback>
+            <w:pict>
+              <v:shape id="shape 9" o:spid="_x0000_s9" o:spt="202" type="#_x0000_t202" style="position:absolute;z-index:15360;o:allowoverlap:true;o:allowincell:true;mso-position-horizontal-relative:text;margin-left:219.65pt;mso-position-horizontal:absolute;mso-position-vertical-relative:text;margin-top:20.31pt;mso-position-vertical:absolute;width:28.70pt;height:50.87pt;mso-wrap-distance-left:9.07pt;mso-wrap-distance-top:0.00pt;mso-wrap-distance-right:9.07pt;mso-wrap-distance-bottom:0.00pt;rotation:0;v-text-anchor:top;visibility:visible;" fillcolor="#FFFFFF" strokecolor="#000000" strokeweight="0.50pt">
+                <v:textbox inset="0,0,0,0">
+                  <w:txbxContent>
+                    <w:p>
+                      <w:pPr>
+                        <w:pBdr/>
+                        <w:spacing/>
+                        <w:ind/>
+                        <w:rPr>
+                          <w:rFonts w:ascii="Asana Math" w:hAnsi="Asana Math" w:eastAsia="Asana Math" w:cs="Asana Math"/>
+                          <w:highlight w:val="none"/>
+                          <w:lang w:val="es-ES"/>
+                        </w:rPr>
+                      </w:pPr>
+                      <w:r>
+                        <w:rPr>
+                          <w:rFonts w:ascii="Asana Math" w:hAnsi="Asana Math" w:eastAsia="Asana Math" w:cs="Asana Math"/>
+                          <w:lang w:val="es-ES"/>
+                        </w:rPr>
+                        <w:t xml:space="preserve"> 11</w:t>
+                      </w:r>
+                      <w:r>
+                        <w:rPr>
+                          <w:rFonts w:ascii="Asana Math" w:hAnsi="Asana Math" w:cs="Asana Math"/>
+                        </w:rPr>
+                      </w:r>
+                    </w:p>
+                    <w:p>
+                      <w:pPr>
+                        <w:pBdr/>
+                        <w:spacing/>
+                        <w:ind/>
+                        <w:rPr>
+                          <w:rFonts w:ascii="Asana Math" w:hAnsi="Asana Math" w:cs="Asana Math"/>
+                        </w:rPr>
+                      </w:pPr>
+                      <w:r>
+                        <w:rPr>
+                          <w:rFonts w:ascii="Asana Math" w:hAnsi="Asana Math" w:eastAsia="Asana Math" w:cs="Asana Math"/>
+                          <w:highlight w:val="none"/>
+                          <w:lang w:val="es-ES"/>
+                        </w:rPr>
+                        <w:t xml:space="preserve"> 11</w:t>
+                      </w:r>
+                      <w:r>
+                        <w:rPr>
+                          <w:rFonts w:ascii="Asana Math" w:hAnsi="Asana Math" w:eastAsia="Asana Math" w:cs="Asana Math"/>
+                          <w:highlight w:val="none"/>
+                          <w:lang w:val="es-ES"/>
+                        </w:rPr>
+                      </w:r>
+                      <w:r>
+                        <w:rPr>
+                          <w:rFonts w:ascii="Asana Math" w:hAnsi="Asana Math" w:eastAsia="Asana Math" w:cs="Asana Math"/>
+                          <w:highlight w:val="none"/>
+                          <w:lang w:val="es-ES"/>
+                        </w:rPr>
+                      </w:r>
+                    </w:p>
+                  </w:txbxContent>
+                </v:textbox>
+              </v:shape>
+            </w:pict>
+          </mc:Fallback>
+        </mc:AlternateContent>
+      </w:r>
+      <w:r>
+        <w:rPr>
+          <w:rFonts w:ascii="Asana Math" w:hAnsi="Asana Math" w:cs="Asana Math"/>
+          <w:highlight w:val="none"/>
+          <w:lang w:val="es-ES" w:bidi="es-ES"/>
+        </w:rPr>
+        <w:t xml:space="preserve">adrado): Bloque de 2x2.</w:t>
+      </w:r>
+      <w:r>
+        <w:rPr>
+          <w:rFonts w:ascii="Asana Math" w:hAnsi="Asana Math" w:cs="Asana Math"/>
+          <w:highlight w:val="none"/>
+          <w:lang w:val="es-ES" w:bidi="es-ES"/>
+        </w:rPr>
+      </w:r>
+    </w:p>
+    <w:p>
+      <w:pPr>
+        <w:pBdr/>
+        <w:spacing/>
+        <w:ind/>
+        <w:jc w:val="center"/>
+        <w:rPr>
+          <w:rFonts w:ascii="Asana Math" w:hAnsi="Asana Math" w:cs="Asana Math"/>
+          <w:highlight w:val="none"/>
+          <w:lang w:val="es-ES" w:bidi="es-ES"/>
+        </w:rPr>
+      </w:pPr>
+      <w:r>
+        <w:rPr>
+          <w:rFonts w:ascii="Asana Math" w:hAnsi="Asana Math" w:cs="Asana Math"/>
+          <w:highlight w:val="none"/>
+          <w:lang w:val="es-ES" w:bidi="es-ES"/>
+        </w:rPr>
+      </w:r>
+      <w:r>
+        <w:rPr>
+          <w:rFonts w:ascii="Asana Math" w:hAnsi="Asana Math" w:cs="Asana Math"/>
+          <w:highlight w:val="none"/>
+          <w:lang w:val="es-ES" w:bidi="es-ES"/>
+        </w:rPr>
+      </w:r>
+      <w:r>
+        <w:rPr>
+          <w:rFonts w:ascii="Asana Math" w:hAnsi="Asana Math" w:cs="Asana Math"/>
+          <w:highlight w:val="none"/>
+          <w:lang w:val="es-ES" w:bidi="es-ES"/>
+        </w:rPr>
+      </w:r>
+    </w:p>
+    <w:p>
+      <w:pPr>
+        <w:pBdr/>
+        <w:spacing/>
+        <w:ind/>
+        <w:jc w:val="left"/>
+        <w:rPr>
+          <w:rFonts w:ascii="Asana Math" w:hAnsi="Asana Math" w:cs="Asana Math"/>
+          <w:highlight w:val="none"/>
+          <w:lang w:val="es-ES" w:bidi="es-ES"/>
+        </w:rPr>
+      </w:pPr>
+      <w:r>
+        <w:rPr>
+          <w:rFonts w:ascii="Asana Math" w:hAnsi="Asana Math" w:cs="Asana Math"/>
+          <w:highlight w:val="none"/>
+          <w:lang w:val="es-ES" w:bidi="es-ES"/>
+        </w:rPr>
+      </w:r>
+      <w:r>
+        <w:rPr>
+          <w:rFonts w:ascii="Asana Math" w:hAnsi="Asana Math" w:cs="Asana Math"/>
+          <w:highlight w:val="none"/>
+          <w:lang w:val="es-ES" w:bidi="es-ES"/>
+        </w:rPr>
+      </w:r>
+      <w:r>
+        <w:rPr>
+          <w:rFonts w:ascii="Asana Math" w:hAnsi="Asana Math" w:cs="Asana Math"/>
+          <w:highlight w:val="none"/>
+          <w:lang w:val="es-ES" w:bidi="es-ES"/>
+        </w:rPr>
+      </w:r>
+    </w:p>
+    <w:p>
+      <w:pPr>
+        <w:pBdr/>
+        <w:spacing/>
+        <w:ind/>
+        <w:jc w:val="center"/>
+        <w:rPr/>
+      </w:pPr>
+      <w:r>
+        <w:rPr>
+          <w:rFonts w:ascii="Asana Math" w:hAnsi="Asana Math" w:cs="Asana Math"/>
+          <w:highlight w:val="none"/>
+          <w:lang w:val="es-ES" w:bidi="es-ES"/>
+        </w:rPr>
+        <w:t xml:space="preserve">−</w:t>
+      </w:r>
+      <w:r/>
+    </w:p>
+    <w:p>
+      <w:pPr>
+        <w:pBdr/>
+        <w:spacing/>
+        <w:ind/>
+        <w:jc w:val="center"/>
+        <w:rPr>
+          <w:rFonts w:ascii="Asana Math" w:hAnsi="Asana Math" w:cs="Asana Math"/>
+          <w:highlight w:val="none"/>
+          <w:lang w:val="es-ES" w:bidi="es-ES"/>
+        </w:rPr>
+      </w:pPr>
+      <w:r>
+        <w:rPr>
+          <w:rFonts w:ascii="Asana Math" w:hAnsi="Asana Math" w:cs="Asana Math"/>
+          <w:highlight w:val="none"/>
+          <w:lang w:val="es-ES" w:bidi="es-ES"/>
+        </w:rPr>
+        <w:t xml:space="preserve"> T (Pieza T): Forma de T. Versátil para encajar en espacios irregulares (3x2).</w:t>
+      </w:r>
+      <w:r>
+        <w:rPr>
+          <w:rFonts w:ascii="Asana Math" w:hAnsi="Asana Math" w:cs="Asana Math"/>
+          <w:highlight w:val="none"/>
+          <w:lang w:val="es-ES" w:bidi="es-ES"/>
+        </w:rPr>
+      </w:r>
+    </w:p>
+    <w:p>
+      <w:pPr>
+        <w:pBdr/>
+        <w:spacing/>
+        <w:ind/>
+        <w:jc w:val="center"/>
+        <w:rPr>
+          <w:rFonts w:ascii="Asana Math" w:hAnsi="Asana Math" w:cs="Asana Math"/>
+          <w:highlight w:val="none"/>
+          <w:lang w:val="es-ES" w:bidi="es-ES"/>
+        </w:rPr>
+      </w:pPr>
+      <w:r>
+        <w:rPr>
+          <w:rFonts w:ascii="Asana Math" w:hAnsi="Asana Math" w:cs="Asana Math"/>
+          <w:highlight w:val="none"/>
+          <w:lang w:val="es-ES" w:bidi="es-ES"/>
+        </w:rPr>
+      </w:r>
+      <w:r>
+        <mc:AlternateContent>
+          <mc:Choice Requires="wpg">
+            <w:drawing>
+              <wp:anchor xmlns:wp="http://schemas.openxmlformats.org/drawingml/2006/wordprocessingDrawing" xmlns:wp14="http://schemas.microsoft.com/office/word/2010/wordprocessingDrawing" distT="0" distB="0" distL="115200" distR="115200" simplePos="0" relativeHeight="16384" behindDoc="0" locked="0" layoutInCell="1" allowOverlap="1">
+                <wp:simplePos x="0" y="0"/>
+                <wp:positionH relativeFrom="column">
+                  <wp:posOffset>2205658</wp:posOffset>
+                </wp:positionH>
+                <wp:positionV relativeFrom="paragraph">
+                  <wp:posOffset>9068</wp:posOffset>
+                </wp:positionV>
+                <wp:extent cx="1532282" cy="911087"/>
+                <wp:effectExtent l="3175" t="3175" r="3175" b="3175"/>
+                <wp:wrapNone/>
+                <wp:docPr id="11" name=""/>
+                <wp:cNvGraphicFramePr/>
+                <a:graphic xmlns:a="http://schemas.openxmlformats.org/drawingml/2006/main">
+                  <a:graphicData uri="http://schemas.microsoft.com/office/word/2010/wordprocessingShape">
+                    <wps:wsp>
+                      <wps:cNvPr id="0" name=""/>
+                      <wps:cNvSpPr txBox="1"/>
+                      <wps:spPr bwMode="auto">
+                        <a:xfrm rot="0" flipH="0" flipV="0">
+                          <a:off x="0" y="0"/>
+                          <a:ext cx="1532282" cy="911086"/>
+                        </a:xfrm>
+                        <a:prstGeom prst="rect">
+                          <a:avLst/>
+                        </a:prstGeom>
+                        <a:solidFill>
+                          <a:schemeClr val="lt1"/>
+                        </a:solidFill>
+                        <a:ln w="6350">
+                          <a:solidFill>
+                            <a:prstClr val="black"/>
+                          </a:solidFill>
+                        </a:ln>
+                      </wps:spPr>
+                      <wps:txbx>
+                        <w:txbxContent>
+                          <w:p>
+                            <w:pPr>
+                              <w:pBdr/>
+                              <w:spacing/>
+                              <w:ind/>
+                              <w:rPr>
+                                <w:rFonts w:ascii="Asana Math" w:hAnsi="Asana Math" w:eastAsia="Asana Math" w:cs="Asana Math"/>
+                                <w:highlight w:val="none"/>
+                                <w:lang w:val="es-ES"/>
+                              </w:rPr>
+                            </w:pPr>
+                            <w:r>
+                              <w:rPr>
+                                <w:rFonts w:ascii="Asana Math" w:hAnsi="Asana Math" w:eastAsia="Asana Math" w:cs="Asana Math"/>
+                                <w:lang w:val="es-ES"/>
+                              </w:rPr>
+                              <w:t xml:space="preserve">000  - 010</w:t>
+                            </w:r>
+                            <w:r>
+                              <w:rPr>
+                                <w:rFonts w:ascii="Asana Math" w:hAnsi="Asana Math" w:cs="Asana Math"/>
+                                <w:lang w:val="es-ES"/>
+                              </w:rPr>
+                              <w:t xml:space="preserve">  - 000 - 010</w:t>
+                            </w:r>
+                            <w:r>
+                              <w:rPr>
+                                <w:rFonts w:ascii="Asana Math" w:hAnsi="Asana Math" w:cs="Asana Math"/>
+                              </w:rPr>
+                            </w:r>
+                          </w:p>
+                          <w:p>
+                            <w:pPr>
+                              <w:pBdr/>
+                              <w:spacing/>
+                              <w:ind/>
+                              <w:rPr>
+                                <w:rFonts w:ascii="Asana Math" w:hAnsi="Asana Math" w:eastAsia="Asana Math" w:cs="Asana Math"/>
+                                <w:highlight w:val="none"/>
+                                <w:lang w:val="es-ES"/>
+                              </w:rPr>
+                            </w:pPr>
+                            <w:r>
+                              <w:rPr>
+                                <w:rFonts w:ascii="Asana Math" w:hAnsi="Asana Math" w:eastAsia="Asana Math" w:cs="Asana Math"/>
+                                <w:highlight w:val="none"/>
+                                <w:lang w:val="es-ES"/>
+                              </w:rPr>
+                              <w:t xml:space="preserve">010  - 110  - 010 -</w:t>
+                            </w:r>
+                            <w:r>
+                              <w:rPr>
+                                <w:rFonts w:ascii="Asana Math" w:hAnsi="Asana Math" w:cs="Asana Math"/>
+                                <w:lang w:val="es-ES"/>
+                              </w:rPr>
+                              <w:t xml:space="preserve"> 011</w:t>
+                            </w:r>
+                            <w:r>
+                              <w:rPr>
+                                <w:rFonts w:ascii="Asana Math" w:hAnsi="Asana Math" w:cs="Asana Math"/>
+                              </w:rPr>
+                            </w:r>
+                          </w:p>
+                          <w:p>
+                            <w:pPr>
+                              <w:pBdr/>
+                              <w:spacing/>
+                              <w:ind/>
+                              <w:rPr>
+                                <w:rFonts w:ascii="Asana Math" w:hAnsi="Asana Math" w:cs="Asana Math"/>
+                              </w:rPr>
+                            </w:pPr>
+                            <w:r>
+                              <w:rPr>
+                                <w:rFonts w:ascii="Asana Math" w:hAnsi="Asana Math" w:eastAsia="Asana Math" w:cs="Asana Math"/>
+                                <w:highlight w:val="none"/>
+                                <w:lang w:val="es-ES"/>
+                              </w:rPr>
+                              <w:t xml:space="preserve">111  - 010  - 111 - 010</w:t>
+                            </w:r>
+                            <w:r>
+                              <w:rPr>
+                                <w:rFonts w:ascii="Asana Math" w:hAnsi="Asana Math" w:eastAsia="Asana Math" w:cs="Asana Math"/>
+                                <w:highlight w:val="none"/>
+                                <w:lang w:val="es-ES"/>
+                              </w:rPr>
+                            </w:r>
+                          </w:p>
+                        </w:txbxContent>
+                      </wps:txbx>
+                      <wps:bodyPr vertOverflow="overflow" horzOverflow="overflow" vert="horz" wrap="square" lIns="91440" tIns="45720" rIns="91440" bIns="45720" numCol="1" spcCol="0" rtlCol="0" fromWordArt="0" anchor="t" anchorCtr="0" forceAA="0" upright="0" compatLnSpc="0"/>
+                    </wps:wsp>
+                  </a:graphicData>
+                </a:graphic>
+              </wp:anchor>
+            </w:drawing>
+          </mc:Choice>
+          <mc:Fallback>
+            <w:pict>
+              <v:shape id="shape 10" o:spid="_x0000_s10" o:spt="202" type="#_x0000_t202" style="position:absolute;z-index:16384;o:allowoverlap:true;o:allowincell:true;mso-position-horizontal-relative:text;margin-left:173.67pt;mso-position-horizontal:absolute;mso-position-vertical-relative:text;margin-top:0.71pt;mso-position-vertical:absolute;width:120.65pt;height:71.74pt;mso-wrap-distance-left:9.07pt;mso-wrap-distance-top:0.00pt;mso-wrap-distance-right:9.07pt;mso-wrap-distance-bottom:0.00pt;rotation:0;v-text-anchor:top;visibility:visible;" fillcolor="#FFFFFF" strokecolor="#000000" strokeweight="0.50pt">
+                <v:textbox inset="0,0,0,0">
+                  <w:txbxContent>
+                    <w:p>
+                      <w:pPr>
+                        <w:pBdr/>
+                        <w:spacing/>
+                        <w:ind/>
+                        <w:rPr>
+                          <w:rFonts w:ascii="Asana Math" w:hAnsi="Asana Math" w:eastAsia="Asana Math" w:cs="Asana Math"/>
+                          <w:highlight w:val="none"/>
+                          <w:lang w:val="es-ES"/>
+                        </w:rPr>
+                      </w:pPr>
+                      <w:r>
+                        <w:rPr>
+                          <w:rFonts w:ascii="Asana Math" w:hAnsi="Asana Math" w:eastAsia="Asana Math" w:cs="Asana Math"/>
+                          <w:lang w:val="es-ES"/>
+                        </w:rPr>
+                        <w:t xml:space="preserve">000  - 010</w:t>
+                      </w:r>
+                      <w:r>
+                        <w:rPr>
+                          <w:rFonts w:ascii="Asana Math" w:hAnsi="Asana Math" w:cs="Asana Math"/>
+                          <w:lang w:val="es-ES"/>
+                        </w:rPr>
+                        <w:t xml:space="preserve">  - 000 - 010</w:t>
+                      </w:r>
+                      <w:r>
+                        <w:rPr>
+                          <w:rFonts w:ascii="Asana Math" w:hAnsi="Asana Math" w:cs="Asana Math"/>
+                        </w:rPr>
+                      </w:r>
+                    </w:p>
+                    <w:p>
+                      <w:pPr>
+                        <w:pBdr/>
+                        <w:spacing/>
+                        <w:ind/>
+                        <w:rPr>
+                          <w:rFonts w:ascii="Asana Math" w:hAnsi="Asana Math" w:eastAsia="Asana Math" w:cs="Asana Math"/>
+                          <w:highlight w:val="none"/>
+                          <w:lang w:val="es-ES"/>
+                        </w:rPr>
+                      </w:pPr>
+                      <w:r>
+                        <w:rPr>
+                          <w:rFonts w:ascii="Asana Math" w:hAnsi="Asana Math" w:eastAsia="Asana Math" w:cs="Asana Math"/>
+                          <w:highlight w:val="none"/>
+                          <w:lang w:val="es-ES"/>
+                        </w:rPr>
+                        <w:t xml:space="preserve">010  - 110  - 010 -</w:t>
+                      </w:r>
+                      <w:r>
+                        <w:rPr>
+                          <w:rFonts w:ascii="Asana Math" w:hAnsi="Asana Math" w:cs="Asana Math"/>
+                          <w:lang w:val="es-ES"/>
+                        </w:rPr>
+                        <w:t xml:space="preserve"> 011</w:t>
+                      </w:r>
+                      <w:r>
+                        <w:rPr>
+                          <w:rFonts w:ascii="Asana Math" w:hAnsi="Asana Math" w:cs="Asana Math"/>
+                        </w:rPr>
+                      </w:r>
+                    </w:p>
+                    <w:p>
+                      <w:pPr>
+                        <w:pBdr/>
+                        <w:spacing/>
+                        <w:ind/>
+                        <w:rPr>
+                          <w:rFonts w:ascii="Asana Math" w:hAnsi="Asana Math" w:cs="Asana Math"/>
+                        </w:rPr>
+                      </w:pPr>
+                      <w:r>
+                        <w:rPr>
+                          <w:rFonts w:ascii="Asana Math" w:hAnsi="Asana Math" w:eastAsia="Asana Math" w:cs="Asana Math"/>
+                          <w:highlight w:val="none"/>
+                          <w:lang w:val="es-ES"/>
+                        </w:rPr>
+                        <w:t xml:space="preserve">111  - 010  - 111 - 010</w:t>
+                      </w:r>
+                      <w:r>
+                        <w:rPr>
+                          <w:rFonts w:ascii="Asana Math" w:hAnsi="Asana Math" w:eastAsia="Asana Math" w:cs="Asana Math"/>
+                          <w:highlight w:val="none"/>
+                          <w:lang w:val="es-ES"/>
+                        </w:rPr>
+                      </w:r>
+                    </w:p>
+                  </w:txbxContent>
+                </v:textbox>
+              </v:shape>
+            </w:pict>
+          </mc:Fallback>
+        </mc:AlternateContent>
+      </w:r>
+      <w:r>
+        <w:rPr>
+          <w:rFonts w:ascii="Asana Math" w:hAnsi="Asana Math" w:cs="Asana Math"/>
+          <w:highlight w:val="none"/>
+          <w:lang w:val="es-ES" w:bidi="es-ES"/>
+        </w:rPr>
+      </w:r>
+      <w:r>
+        <w:rPr>
+          <w:rFonts w:ascii="Asana Math" w:hAnsi="Asana Math" w:cs="Asana Math"/>
+          <w:highlight w:val="none"/>
+          <w:lang w:val="es-ES" w:bidi="es-ES"/>
+        </w:rPr>
+      </w:r>
+      <w:r>
+        <w:rPr>
+          <w:rFonts w:ascii="Asana Math" w:hAnsi="Asana Math" w:cs="Asana Math"/>
+          <w:highlight w:val="none"/>
+          <w:lang w:val="es-ES" w:bidi="es-ES"/>
+        </w:rPr>
+      </w:r>
+    </w:p>
+    <w:p>
+      <w:pPr>
+        <w:pBdr/>
+        <w:spacing/>
+        <w:ind/>
+        <w:jc w:val="center"/>
+        <w:rPr>
+          <w:rFonts w:ascii="Asana Math" w:hAnsi="Asana Math" w:cs="Asana Math"/>
+          <w:highlight w:val="none"/>
+          <w:lang w:val="es-ES" w:bidi="es-ES"/>
+        </w:rPr>
+      </w:pPr>
+      <w:r>
+        <w:rPr>
+          <w:rFonts w:ascii="Asana Math" w:hAnsi="Asana Math" w:cs="Asana Math"/>
+          <w:highlight w:val="none"/>
+          <w:lang w:val="es-ES" w:bidi="es-ES"/>
+        </w:rPr>
+      </w:r>
+      <w:r>
+        <w:rPr>
+          <w:rFonts w:ascii="Asana Math" w:hAnsi="Asana Math" w:cs="Asana Math"/>
+          <w:highlight w:val="none"/>
+          <w:lang w:val="es-ES" w:bidi="es-ES"/>
+        </w:rPr>
+      </w:r>
+      <w:r>
+        <w:rPr>
+          <w:rFonts w:ascii="Asana Math" w:hAnsi="Asana Math" w:cs="Asana Math"/>
+          <w:highlight w:val="none"/>
+          <w:lang w:val="es-ES" w:bidi="es-ES"/>
+        </w:rPr>
+      </w:r>
+    </w:p>
+    <w:p>
+      <w:pPr>
+        <w:pBdr/>
+        <w:spacing/>
+        <w:ind/>
+        <w:jc w:val="center"/>
+        <w:rPr>
+          <w:rFonts w:ascii="Asana Math" w:hAnsi="Asana Math" w:cs="Asana Math"/>
+          <w:highlight w:val="none"/>
+          <w:lang w:val="es-ES" w:bidi="es-ES"/>
+        </w:rPr>
+      </w:pPr>
+      <w:r>
+        <w:rPr>
+          <w:rFonts w:ascii="Asana Math" w:hAnsi="Asana Math" w:cs="Asana Math"/>
+          <w:highlight w:val="none"/>
+          <w:lang w:val="es-ES" w:bidi="es-ES"/>
+        </w:rPr>
+      </w:r>
+      <w:r>
+        <w:rPr>
+          <w:rFonts w:ascii="Asana Math" w:hAnsi="Asana Math" w:cs="Asana Math"/>
+          <w:highlight w:val="none"/>
+          <w:lang w:val="es-ES" w:bidi="es-ES"/>
+        </w:rPr>
+      </w:r>
+      <w:r>
+        <w:rPr>
+          <w:rFonts w:ascii="Asana Math" w:hAnsi="Asana Math" w:cs="Asana Math"/>
+          <w:highlight w:val="none"/>
+          <w:lang w:val="es-ES" w:bidi="es-ES"/>
+        </w:rPr>
+      </w:r>
+    </w:p>
+    <w:p>
+      <w:pPr>
+        <w:pBdr/>
+        <w:spacing/>
+        <w:ind/>
+        <w:jc w:val="center"/>
+        <w:rPr>
+          <w:rFonts w:ascii="Asana Math" w:hAnsi="Asana Math" w:cs="Asana Math"/>
+          <w:highlight w:val="none"/>
+          <w:lang w:val="es-ES" w:bidi="es-ES"/>
+        </w:rPr>
+      </w:pPr>
+      <w:r>
+        <w:rPr>
+          <w:rFonts w:ascii="Asana Math" w:hAnsi="Asana Math" w:cs="Asana Math"/>
+          <w:highlight w:val="none"/>
+          <w:lang w:val="es-ES" w:bidi="es-ES"/>
+        </w:rPr>
+      </w:r>
+      <w:r>
+        <w:rPr>
+          <w:rFonts w:ascii="Asana Math" w:hAnsi="Asana Math" w:cs="Asana Math"/>
+          <w:highlight w:val="none"/>
+          <w:lang w:val="es-ES" w:bidi="es-ES"/>
+        </w:rPr>
+      </w:r>
+      <w:r>
+        <w:rPr>
+          <w:rFonts w:ascii="Asana Math" w:hAnsi="Asana Math" w:cs="Asana Math"/>
+          <w:highlight w:val="none"/>
+          <w:lang w:val="es-ES" w:bidi="es-ES"/>
+        </w:rPr>
+      </w:r>
+    </w:p>
+    <w:p>
+      <w:pPr>
+        <w:pBdr/>
+        <w:spacing/>
+        <w:ind/>
+        <w:jc w:val="center"/>
+        <w:rPr/>
+      </w:pPr>
+      <w:r>
+        <w:rPr>
+          <w:rFonts w:ascii="Asana Math" w:hAnsi="Asana Math" w:cs="Asana Math"/>
+          <w:highlight w:val="none"/>
+          <w:lang w:val="es-ES" w:bidi="es-ES"/>
+        </w:rPr>
+        <w:t xml:space="preserve">−</w:t>
+      </w:r>
+      <w:r/>
+    </w:p>
+    <w:p>
+      <w:pPr>
+        <w:pBdr/>
+        <w:spacing/>
+        <w:ind/>
+        <w:jc w:val="center"/>
+        <w:rPr>
+          <w:highlight w:val="none"/>
+        </w:rPr>
+      </w:pPr>
+      <w:r>
+        <w:rPr>
+          <w:rFonts w:ascii="Asana Math" w:hAnsi="Asana Math" w:cs="Asana Math"/>
+          <w:highlight w:val="none"/>
+          <w:lang w:val="es-ES" w:bidi="es-ES"/>
+        </w:rPr>
+        <w:t xml:space="preserve"> S (Pieza S): Forma de S, se orienta hacia la derecha (3x2).</w:t>
+      </w:r>
+      <w:r/>
+      <w:r>
+        <w:rPr>
+          <w:rFonts w:ascii="Asana Math" w:hAnsi="Asana Math" w:cs="Asana Math"/>
+          <w:highlight w:val="none"/>
+          <w:lang w:val="es-ES" w:bidi="es-ES"/>
+        </w:rPr>
+      </w:r>
+    </w:p>
+    <w:p>
+      <w:pPr>
+        <w:pBdr/>
+        <w:spacing/>
+        <w:ind/>
+        <w:jc w:val="center"/>
+        <w:rPr>
+          <w:rFonts w:ascii="Asana Math" w:hAnsi="Asana Math" w:cs="Asana Math"/>
+          <w:highlight w:val="none"/>
+          <w:lang w:val="es-ES" w:bidi="es-ES"/>
+        </w:rPr>
+      </w:pPr>
+      <w:r>
+        <w:rPr>
+          <w:rFonts w:ascii="Asana Math" w:hAnsi="Asana Math" w:cs="Asana Math"/>
+          <w:highlight w:val="none"/>
+          <w:lang w:val="es-ES" w:bidi="es-ES"/>
+        </w:rPr>
+      </w:r>
+      <w:r>
+        <mc:AlternateContent>
+          <mc:Choice Requires="wpg">
+            <w:drawing>
+              <wp:anchor xmlns:wp="http://schemas.openxmlformats.org/drawingml/2006/wordprocessingDrawing" xmlns:wp14="http://schemas.microsoft.com/office/word/2010/wordprocessingDrawing" distT="0" distB="0" distL="115200" distR="115200" simplePos="0" relativeHeight="17408" behindDoc="0" locked="0" layoutInCell="1" allowOverlap="1">
+                <wp:simplePos x="0" y="0"/>
+                <wp:positionH relativeFrom="column">
+                  <wp:posOffset>2582113</wp:posOffset>
+                </wp:positionH>
+                <wp:positionV relativeFrom="paragraph">
+                  <wp:posOffset>10242</wp:posOffset>
+                </wp:positionV>
+                <wp:extent cx="779374" cy="927652"/>
+                <wp:effectExtent l="3175" t="3175" r="3175" b="3175"/>
+                <wp:wrapNone/>
+                <wp:docPr id="12" name=""/>
+                <wp:cNvGraphicFramePr/>
+                <a:graphic xmlns:a="http://schemas.openxmlformats.org/drawingml/2006/main">
+                  <a:graphicData uri="http://schemas.microsoft.com/office/word/2010/wordprocessingShape">
+                    <wps:wsp>
+                      <wps:cNvPr id="0" name=""/>
+                      <wps:cNvSpPr txBox="1"/>
+                      <wps:spPr bwMode="auto">
+                        <a:xfrm rot="0" flipH="0" flipV="0">
+                          <a:off x="0" y="0"/>
+                          <a:ext cx="779373" cy="927651"/>
+                        </a:xfrm>
+                        <a:prstGeom prst="rect">
+                          <a:avLst/>
+                        </a:prstGeom>
+                        <a:solidFill>
+                          <a:schemeClr val="lt1"/>
+                        </a:solidFill>
+                        <a:ln w="6350">
+                          <a:solidFill>
+                            <a:prstClr val="black"/>
+                          </a:solidFill>
+                        </a:ln>
+                      </wps:spPr>
+                      <wps:txbx>
+                        <w:txbxContent>
+                          <w:p>
+                            <w:pPr>
+                              <w:pBdr/>
+                              <w:spacing/>
+                              <w:ind/>
+                              <w:rPr>
+                                <w:rFonts w:ascii="Asana Math" w:hAnsi="Asana Math" w:eastAsia="Asana Math" w:cs="Asana Math"/>
+                                <w:highlight w:val="none"/>
+                                <w:lang w:val="es-ES"/>
+                              </w:rPr>
+                            </w:pPr>
+                            <w:r>
+                              <w:rPr>
+                                <w:rFonts w:ascii="Asana Math" w:hAnsi="Asana Math" w:eastAsia="Asana Math" w:cs="Asana Math"/>
+                                <w:lang w:val="es-ES"/>
+                              </w:rPr>
+                              <w:t xml:space="preserve">000  - 100  </w:t>
+                            </w:r>
+                            <w:r>
+                              <w:rPr>
+                                <w:rFonts w:ascii="Asana Math" w:hAnsi="Asana Math" w:cs="Asana Math"/>
+                              </w:rPr>
+                            </w:r>
+                          </w:p>
+                          <w:p>
+                            <w:pPr>
+                              <w:pBdr/>
+                              <w:spacing/>
+                              <w:ind/>
+                              <w:rPr>
+                                <w:rFonts w:ascii="Asana Math" w:hAnsi="Asana Math" w:eastAsia="Asana Math" w:cs="Asana Math"/>
+                                <w:highlight w:val="none"/>
+                                <w:lang w:val="es-ES"/>
+                              </w:rPr>
+                            </w:pPr>
+                            <w:r>
+                              <w:rPr>
+                                <w:rFonts w:ascii="Asana Math" w:hAnsi="Asana Math" w:eastAsia="Asana Math" w:cs="Asana Math"/>
+                                <w:highlight w:val="none"/>
+                                <w:lang w:val="es-ES"/>
+                              </w:rPr>
+                              <w:t xml:space="preserve">011  - 110</w:t>
+                            </w:r>
+                            <w:r>
+                              <w:rPr>
+                                <w:rFonts w:ascii="Asana Math" w:hAnsi="Asana Math" w:cs="Asana Math"/>
+                              </w:rPr>
+                            </w:r>
+                          </w:p>
+                          <w:p>
+                            <w:pPr>
+                              <w:pBdr/>
+                              <w:spacing/>
+                              <w:ind/>
+                              <w:rPr>
+                                <w:rFonts w:ascii="Asana Math" w:hAnsi="Asana Math" w:cs="Asana Math"/>
+                              </w:rPr>
+                            </w:pPr>
+                            <w:r>
+                              <w:rPr>
+                                <w:rFonts w:ascii="Asana Math" w:hAnsi="Asana Math" w:eastAsia="Asana Math" w:cs="Asana Math"/>
+                                <w:highlight w:val="none"/>
+                                <w:lang w:val="es-ES"/>
+                              </w:rPr>
+                              <w:t xml:space="preserve">110</w:t>
+                            </w:r>
+                            <w:r>
+                              <w:rPr>
+                                <w:rFonts w:ascii="Asana Math" w:hAnsi="Asana Math" w:eastAsia="Asana Math" w:cs="Asana Math"/>
+                                <w:highlight w:val="none"/>
+                                <w:lang w:val="es-ES"/>
+                              </w:rPr>
+                              <w:t xml:space="preserve">  - 010</w:t>
+                            </w:r>
+                            <w:r>
+                              <w:rPr>
+                                <w:rFonts w:ascii="Asana Math" w:hAnsi="Asana Math" w:eastAsia="Asana Math" w:cs="Asana Math"/>
+                                <w:highlight w:val="none"/>
+                                <w:lang w:val="es-ES"/>
+                              </w:rPr>
+                            </w:r>
+                          </w:p>
+                        </w:txbxContent>
+                      </wps:txbx>
+                      <wps:bodyPr vertOverflow="overflow" horzOverflow="overflow" vert="horz" wrap="square" lIns="91440" tIns="45720" rIns="91440" bIns="45720" numCol="1" spcCol="0" rtlCol="0" fromWordArt="0" anchor="t" anchorCtr="0" forceAA="0" upright="0" compatLnSpc="0"/>
+                    </wps:wsp>
+                  </a:graphicData>
+                </a:graphic>
+              </wp:anchor>
+            </w:drawing>
+          </mc:Choice>
+          <mc:Fallback>
+            <w:pict>
+              <v:shape id="shape 11" o:spid="_x0000_s11" o:spt="202" type="#_x0000_t202" style="position:absolute;z-index:17408;o:allowoverlap:true;o:allowincell:true;mso-position-horizontal-relative:text;margin-left:203.32pt;mso-position-horizontal:absolute;mso-position-vertical-relative:text;margin-top:0.81pt;mso-position-vertical:absolute;width:61.37pt;height:73.04pt;mso-wrap-distance-left:9.07pt;mso-wrap-distance-top:0.00pt;mso-wrap-distance-right:9.07pt;mso-wrap-distance-bottom:0.00pt;rotation:0;v-text-anchor:top;visibility:visible;" fillcolor="#FFFFFF" strokecolor="#000000" strokeweight="0.50pt">
+                <v:textbox inset="0,0,0,0">
+                  <w:txbxContent>
+                    <w:p>
+                      <w:pPr>
+                        <w:pBdr/>
+                        <w:spacing/>
+                        <w:ind/>
+                        <w:rPr>
+                          <w:rFonts w:ascii="Asana Math" w:hAnsi="Asana Math" w:eastAsia="Asana Math" w:cs="Asana Math"/>
+                          <w:highlight w:val="none"/>
+                          <w:lang w:val="es-ES"/>
+                        </w:rPr>
+                      </w:pPr>
+                      <w:r>
+                        <w:rPr>
+                          <w:rFonts w:ascii="Asana Math" w:hAnsi="Asana Math" w:eastAsia="Asana Math" w:cs="Asana Math"/>
+                          <w:lang w:val="es-ES"/>
+                        </w:rPr>
+                        <w:t xml:space="preserve">000  - 100  </w:t>
+                      </w:r>
+                      <w:r>
+                        <w:rPr>
+                          <w:rFonts w:ascii="Asana Math" w:hAnsi="Asana Math" w:cs="Asana Math"/>
+                        </w:rPr>
+                      </w:r>
+                    </w:p>
+                    <w:p>
+                      <w:pPr>
+                        <w:pBdr/>
+                        <w:spacing/>
+                        <w:ind/>
+                        <w:rPr>
+                          <w:rFonts w:ascii="Asana Math" w:hAnsi="Asana Math" w:eastAsia="Asana Math" w:cs="Asana Math"/>
+                          <w:highlight w:val="none"/>
+                          <w:lang w:val="es-ES"/>
+                        </w:rPr>
+                      </w:pPr>
+                      <w:r>
+                        <w:rPr>
+                          <w:rFonts w:ascii="Asana Math" w:hAnsi="Asana Math" w:eastAsia="Asana Math" w:cs="Asana Math"/>
+                          <w:highlight w:val="none"/>
+                          <w:lang w:val="es-ES"/>
+                        </w:rPr>
+                        <w:t xml:space="preserve">011  - 110</w:t>
+                      </w:r>
+                      <w:r>
+                        <w:rPr>
+                          <w:rFonts w:ascii="Asana Math" w:hAnsi="Asana Math" w:cs="Asana Math"/>
+                        </w:rPr>
+                      </w:r>
+                    </w:p>
+                    <w:p>
+                      <w:pPr>
+                        <w:pBdr/>
+                        <w:spacing/>
+                        <w:ind/>
+                        <w:rPr>
+                          <w:rFonts w:ascii="Asana Math" w:hAnsi="Asana Math" w:cs="Asana Math"/>
+                        </w:rPr>
+                      </w:pPr>
+                      <w:r>
+                        <w:rPr>
+                          <w:rFonts w:ascii="Asana Math" w:hAnsi="Asana Math" w:eastAsia="Asana Math" w:cs="Asana Math"/>
+                          <w:highlight w:val="none"/>
+                          <w:lang w:val="es-ES"/>
+                        </w:rPr>
+                        <w:t xml:space="preserve">110</w:t>
+                      </w:r>
+                      <w:r>
+                        <w:rPr>
+                          <w:rFonts w:ascii="Asana Math" w:hAnsi="Asana Math" w:eastAsia="Asana Math" w:cs="Asana Math"/>
+                          <w:highlight w:val="none"/>
+                          <w:lang w:val="es-ES"/>
+                        </w:rPr>
+                        <w:t xml:space="preserve">  - 010</w:t>
+                      </w:r>
+                      <w:r>
+                        <w:rPr>
+                          <w:rFonts w:ascii="Asana Math" w:hAnsi="Asana Math" w:eastAsia="Asana Math" w:cs="Asana Math"/>
+                          <w:highlight w:val="none"/>
+                          <w:lang w:val="es-ES"/>
+                        </w:rPr>
+                      </w:r>
+                    </w:p>
+                  </w:txbxContent>
+                </v:textbox>
+              </v:shape>
+            </w:pict>
+          </mc:Fallback>
+        </mc:AlternateContent>
+      </w:r>
+      <w:r>
+        <w:rPr>
+          <w:rFonts w:ascii="Asana Math" w:hAnsi="Asana Math" w:cs="Asana Math"/>
+          <w:highlight w:val="none"/>
+          <w:lang w:val="es-ES" w:bidi="es-ES"/>
+        </w:rPr>
+      </w:r>
+      <w:r>
+        <w:rPr>
+          <w:rFonts w:ascii="Asana Math" w:hAnsi="Asana Math" w:cs="Asana Math"/>
+          <w:highlight w:val="none"/>
+          <w:lang w:val="es-ES" w:bidi="es-ES"/>
+        </w:rPr>
+      </w:r>
+      <w:r>
+        <w:rPr>
+          <w:rFonts w:ascii="Asana Math" w:hAnsi="Asana Math" w:cs="Asana Math"/>
+          <w:highlight w:val="none"/>
+          <w:lang w:val="es-ES" w:bidi="es-ES"/>
+        </w:rPr>
+      </w:r>
+    </w:p>
+    <w:p>
+      <w:pPr>
+        <w:pBdr/>
+        <w:spacing/>
+        <w:ind/>
+        <w:jc w:val="center"/>
+        <w:rPr>
+          <w:rFonts w:ascii="Asana Math" w:hAnsi="Asana Math" w:cs="Asana Math"/>
+          <w:highlight w:val="none"/>
+          <w:lang w:val="es-ES" w:bidi="es-ES"/>
+        </w:rPr>
+      </w:pPr>
+      <w:r>
+        <w:rPr>
+          <w:rFonts w:ascii="Asana Math" w:hAnsi="Asana Math" w:cs="Asana Math"/>
+          <w:highlight w:val="none"/>
+          <w:lang w:val="es-ES" w:bidi="es-ES"/>
+        </w:rPr>
+      </w:r>
+      <w:r>
+        <w:rPr>
+          <w:rFonts w:ascii="Asana Math" w:hAnsi="Asana Math" w:cs="Asana Math"/>
+          <w:highlight w:val="none"/>
+          <w:lang w:val="es-ES" w:bidi="es-ES"/>
+        </w:rPr>
+      </w:r>
+      <w:r>
+        <w:rPr>
+          <w:rFonts w:ascii="Asana Math" w:hAnsi="Asana Math" w:cs="Asana Math"/>
+          <w:highlight w:val="none"/>
+          <w:lang w:val="es-ES" w:bidi="es-ES"/>
+        </w:rPr>
+      </w:r>
+    </w:p>
+    <w:p>
+      <w:pPr>
+        <w:pBdr/>
+        <w:spacing/>
+        <w:ind/>
+        <w:jc w:val="center"/>
+        <w:rPr>
+          <w:rFonts w:ascii="Asana Math" w:hAnsi="Asana Math" w:cs="Asana Math"/>
+          <w:highlight w:val="none"/>
+          <w:lang w:val="es-ES" w:bidi="es-ES"/>
+        </w:rPr>
+      </w:pPr>
+      <w:r>
+        <w:rPr>
+          <w:rFonts w:ascii="Asana Math" w:hAnsi="Asana Math" w:cs="Asana Math"/>
+          <w:highlight w:val="none"/>
+          <w:lang w:val="es-ES" w:bidi="es-ES"/>
+        </w:rPr>
+      </w:r>
+      <w:r>
+        <w:rPr>
+          <w:rFonts w:ascii="Asana Math" w:hAnsi="Asana Math" w:cs="Asana Math"/>
+          <w:highlight w:val="none"/>
+          <w:lang w:val="es-ES" w:bidi="es-ES"/>
+        </w:rPr>
+      </w:r>
+      <w:r>
+        <w:rPr>
+          <w:rFonts w:ascii="Asana Math" w:hAnsi="Asana Math" w:cs="Asana Math"/>
+          <w:highlight w:val="none"/>
+          <w:lang w:val="es-ES" w:bidi="es-ES"/>
+        </w:rPr>
+      </w:r>
+    </w:p>
+    <w:p>
+      <w:pPr>
+        <w:pBdr/>
+        <w:spacing/>
+        <w:ind/>
+        <w:jc w:val="center"/>
+        <w:rPr>
+          <w:rFonts w:ascii="Asana Math" w:hAnsi="Asana Math" w:cs="Asana Math"/>
+          <w:highlight w:val="none"/>
+          <w:lang w:val="es-ES" w:bidi="es-ES"/>
+        </w:rPr>
+      </w:pPr>
+      <w:r>
+        <w:rPr>
+          <w:highlight w:val="none"/>
+          <w:lang w:val="es-ES" w:bidi="es-ES"/>
+        </w:rPr>
+      </w:r>
+      <w:r>
+        <w:rPr>
+          <w:highlight w:val="none"/>
+          <w:lang w:val="es-ES" w:bidi="es-ES"/>
+        </w:rPr>
+      </w:r>
+      <w:r>
+        <w:rPr>
+          <w:highlight w:val="none"/>
+          <w:lang w:val="es-ES"/>
+        </w:rPr>
+      </w:r>
+    </w:p>
+    <w:p>
+      <w:pPr>
+        <w:pBdr/>
+        <w:spacing/>
+        <w:ind/>
+        <w:jc w:val="center"/>
+        <w:rPr/>
+      </w:pPr>
+      <w:r>
+        <w:rPr>
+          <w:rFonts w:ascii="Asana Math" w:hAnsi="Asana Math" w:cs="Asana Math"/>
+          <w:highlight w:val="none"/>
+          <w:lang w:val="es-ES" w:bidi="es-ES"/>
+        </w:rPr>
+        <w:t xml:space="preserve">−</w:t>
+      </w:r>
+      <w:r/>
+    </w:p>
+    <w:p>
+      <w:pPr>
+        <w:pBdr/>
+        <w:spacing/>
+        <w:ind/>
+        <w:jc w:val="center"/>
+        <w:rPr>
+          <w:rFonts w:ascii="Asana Math" w:hAnsi="Asana Math" w:cs="Asana Math"/>
+          <w:highlight w:val="none"/>
+          <w:lang w:val="es-ES" w:bidi="es-ES"/>
+        </w:rPr>
+      </w:pPr>
+      <w:r>
+        <w:rPr>
+          <w:rFonts w:ascii="Asana Math" w:hAnsi="Asana Math" w:cs="Asana Math"/>
+          <w:highlight w:val="none"/>
+          <w:lang w:val="es-ES" w:bidi="es-ES"/>
+        </w:rPr>
+      </w:r>
+      <w:r>
+        <mc:AlternateContent>
+          <mc:Choice Requires="wpg">
+            <w:drawing>
+              <wp:anchor xmlns:wp="http://schemas.openxmlformats.org/drawingml/2006/wordprocessingDrawing" xmlns:wp14="http://schemas.microsoft.com/office/word/2010/wordprocessingDrawing" distT="0" distB="0" distL="115200" distR="115200" simplePos="0" relativeHeight="18432" behindDoc="0" locked="0" layoutInCell="1" allowOverlap="1">
+                <wp:simplePos x="0" y="0"/>
+                <wp:positionH relativeFrom="column">
+                  <wp:posOffset>2544841</wp:posOffset>
+                </wp:positionH>
+                <wp:positionV relativeFrom="paragraph">
+                  <wp:posOffset>183776</wp:posOffset>
+                </wp:positionV>
+                <wp:extent cx="853917" cy="927652"/>
+                <wp:effectExtent l="3175" t="3175" r="3175" b="3175"/>
+                <wp:wrapNone/>
+                <wp:docPr id="13" name=""/>
+                <wp:cNvGraphicFramePr/>
+                <a:graphic xmlns:a="http://schemas.openxmlformats.org/drawingml/2006/main">
+                  <a:graphicData uri="http://schemas.microsoft.com/office/word/2010/wordprocessingShape">
+                    <wps:wsp>
+                      <wps:cNvPr id="0" name=""/>
+                      <wps:cNvSpPr txBox="1"/>
+                      <wps:spPr bwMode="auto">
+                        <a:xfrm rot="0" flipH="0" flipV="0">
+                          <a:off x="0" y="0"/>
+                          <a:ext cx="853917" cy="927651"/>
+                        </a:xfrm>
+                        <a:prstGeom prst="rect">
+                          <a:avLst/>
+                        </a:prstGeom>
+                        <a:solidFill>
+                          <a:schemeClr val="lt1"/>
+                        </a:solidFill>
+                        <a:ln w="6350">
+                          <a:solidFill>
+                            <a:prstClr val="black"/>
+                          </a:solidFill>
+                        </a:ln>
+                      </wps:spPr>
+                      <wps:txbx>
+                        <w:txbxContent>
+                          <w:p>
+                            <w:pPr>
+                              <w:pBdr/>
+                              <w:spacing/>
+                              <w:ind/>
+                              <w:rPr>
+                                <w:rFonts w:ascii="Asana Math" w:hAnsi="Asana Math" w:eastAsia="Asana Math" w:cs="Asana Math"/>
+                                <w:highlight w:val="none"/>
+                                <w:lang w:val="es-ES"/>
+                              </w:rPr>
+                            </w:pPr>
+                            <w:r>
+                              <w:rPr>
+                                <w:rFonts w:ascii="Asana Math" w:hAnsi="Asana Math" w:eastAsia="Asana Math" w:cs="Asana Math"/>
+                                <w:lang w:val="es-ES"/>
+                              </w:rPr>
+                              <w:t xml:space="preserve">000  - 001  </w:t>
+                            </w:r>
+                            <w:r>
+                              <w:rPr>
+                                <w:rFonts w:ascii="Asana Math" w:hAnsi="Asana Math" w:eastAsia="Asana Math" w:cs="Asana Math"/>
+                                <w:highlight w:val="none"/>
+                                <w:lang w:val="es-ES"/>
+                              </w:rPr>
+                            </w:r>
+                            <w:r>
+                              <w:rPr>
+                                <w:rFonts w:ascii="Asana Math" w:hAnsi="Asana Math" w:eastAsia="Asana Math" w:cs="Asana Math"/>
+                                <w:highlight w:val="none"/>
+                                <w:lang w:val="es-ES"/>
+                              </w:rPr>
+                            </w:r>
+                          </w:p>
+                          <w:p>
+                            <w:pPr>
+                              <w:pBdr/>
+                              <w:spacing/>
+                              <w:ind/>
+                              <w:rPr>
+                                <w:rFonts w:ascii="Asana Math" w:hAnsi="Asana Math" w:eastAsia="Asana Math" w:cs="Asana Math"/>
+                                <w:highlight w:val="none"/>
+                                <w:lang w:val="es-ES"/>
+                              </w:rPr>
+                            </w:pPr>
+                            <w:r>
+                              <w:rPr>
+                                <w:rFonts w:ascii="Asana Math" w:hAnsi="Asana Math" w:eastAsia="Asana Math" w:cs="Asana Math"/>
+                                <w:highlight w:val="none"/>
+                                <w:lang w:val="es-ES"/>
+                              </w:rPr>
+                              <w:t xml:space="preserve">110  - 011</w:t>
+                            </w:r>
+                            <w:r>
+                              <w:rPr>
+                                <w:rFonts w:ascii="Asana Math" w:hAnsi="Asana Math" w:eastAsia="Asana Math" w:cs="Asana Math"/>
+                                <w:highlight w:val="none"/>
+                                <w:lang w:val="es-ES"/>
+                              </w:rPr>
+                            </w:r>
+                            <w:r>
+                              <w:rPr>
+                                <w:rFonts w:ascii="Asana Math" w:hAnsi="Asana Math" w:eastAsia="Asana Math" w:cs="Asana Math"/>
+                                <w:highlight w:val="none"/>
+                                <w:lang w:val="es-ES"/>
+                              </w:rPr>
+                            </w:r>
+                          </w:p>
+                          <w:p>
+                            <w:pPr>
+                              <w:pBdr/>
+                              <w:spacing/>
+                              <w:ind/>
+                              <w:rPr>
+                                <w:rFonts w:ascii="Asana Math" w:hAnsi="Asana Math" w:cs="Asana Math"/>
+                              </w:rPr>
+                            </w:pPr>
+                            <w:r>
+                              <w:rPr>
+                                <w:rFonts w:ascii="Asana Math" w:hAnsi="Asana Math" w:eastAsia="Asana Math" w:cs="Asana Math"/>
+                                <w:highlight w:val="none"/>
+                                <w:lang w:val="es-ES"/>
+                              </w:rPr>
+                              <w:t xml:space="preserve">011</w:t>
+                            </w:r>
+                            <w:r>
+                              <w:rPr>
+                                <w:rFonts w:ascii="Asana Math" w:hAnsi="Asana Math" w:eastAsia="Asana Math" w:cs="Asana Math"/>
+                                <w:highlight w:val="none"/>
+                                <w:lang w:val="es-ES"/>
+                              </w:rPr>
+                              <w:t xml:space="preserve">  - 010</w:t>
+                            </w:r>
+                            <w:r>
+                              <w:rPr>
+                                <w:rFonts w:ascii="Asana Math" w:hAnsi="Asana Math" w:cs="Asana Math"/>
+                              </w:rPr>
+                            </w:r>
+                            <w:r>
+                              <w:rPr>
+                                <w:rFonts w:ascii="Asana Math" w:hAnsi="Asana Math" w:cs="Asana Math"/>
+                              </w:rPr>
+                            </w:r>
+                          </w:p>
+                          <w:p>
+                            <w:pPr>
+                              <w:pBdr/>
+                              <w:spacing/>
+                              <w:ind/>
+                              <w:rPr/>
+                            </w:pPr>
+                            <w:r/>
+                            <w:r/>
+                          </w:p>
+                        </w:txbxContent>
+                      </wps:txbx>
+                      <wps:bodyPr vertOverflow="overflow" horzOverflow="overflow" vert="horz" wrap="square" lIns="91440" tIns="45720" rIns="91440" bIns="45720" numCol="1" spcCol="0" rtlCol="0" fromWordArt="0" anchor="t" anchorCtr="0" forceAA="0" upright="0" compatLnSpc="0"/>
+                    </wps:wsp>
+                  </a:graphicData>
+                </a:graphic>
+              </wp:anchor>
+            </w:drawing>
+          </mc:Choice>
+          <mc:Fallback>
+            <w:pict>
+              <v:shape id="shape 12" o:spid="_x0000_s12" o:spt="202" type="#_x0000_t202" style="position:absolute;z-index:18432;o:allowoverlap:true;o:allowincell:true;mso-position-horizontal-relative:text;margin-left:200.38pt;mso-position-horizontal:absolute;mso-position-vertical-relative:text;margin-top:14.47pt;mso-position-vertical:absolute;width:67.24pt;height:73.04pt;mso-wrap-distance-left:9.07pt;mso-wrap-distance-top:0.00pt;mso-wrap-distance-right:9.07pt;mso-wrap-distance-bottom:0.00pt;rotation:0;v-text-anchor:top;visibility:visible;" fillcolor="#FFFFFF" strokecolor="#000000" strokeweight="0.50pt">
+                <v:textbox inset="0,0,0,0">
+                  <w:txbxContent>
+                    <w:p>
+                      <w:pPr>
+                        <w:pBdr/>
+                        <w:spacing/>
+                        <w:ind/>
+                        <w:rPr>
+                          <w:rFonts w:ascii="Asana Math" w:hAnsi="Asana Math" w:eastAsia="Asana Math" w:cs="Asana Math"/>
+                          <w:highlight w:val="none"/>
+                          <w:lang w:val="es-ES"/>
+                        </w:rPr>
+                      </w:pPr>
+                      <w:r>
+                        <w:rPr>
+                          <w:rFonts w:ascii="Asana Math" w:hAnsi="Asana Math" w:eastAsia="Asana Math" w:cs="Asana Math"/>
+                          <w:lang w:val="es-ES"/>
+                        </w:rPr>
+                        <w:t xml:space="preserve">000  - 001  </w:t>
+                      </w:r>
+                      <w:r>
+                        <w:rPr>
+                          <w:rFonts w:ascii="Asana Math" w:hAnsi="Asana Math" w:eastAsia="Asana Math" w:cs="Asana Math"/>
+                          <w:highlight w:val="none"/>
+                          <w:lang w:val="es-ES"/>
+                        </w:rPr>
+                      </w:r>
+                      <w:r>
+                        <w:rPr>
+                          <w:rFonts w:ascii="Asana Math" w:hAnsi="Asana Math" w:eastAsia="Asana Math" w:cs="Asana Math"/>
+                          <w:highlight w:val="none"/>
+                          <w:lang w:val="es-ES"/>
+                        </w:rPr>
+                      </w:r>
+                    </w:p>
+                    <w:p>
+                      <w:pPr>
+                        <w:pBdr/>
+                        <w:spacing/>
+                        <w:ind/>
+                        <w:rPr>
+                          <w:rFonts w:ascii="Asana Math" w:hAnsi="Asana Math" w:eastAsia="Asana Math" w:cs="Asana Math"/>
+                          <w:highlight w:val="none"/>
+                          <w:lang w:val="es-ES"/>
+                        </w:rPr>
+                      </w:pPr>
+                      <w:r>
+                        <w:rPr>
+                          <w:rFonts w:ascii="Asana Math" w:hAnsi="Asana Math" w:eastAsia="Asana Math" w:cs="Asana Math"/>
+                          <w:highlight w:val="none"/>
+                          <w:lang w:val="es-ES"/>
+                        </w:rPr>
+                        <w:t xml:space="preserve">110  - 011</w:t>
+                      </w:r>
+                      <w:r>
+                        <w:rPr>
+                          <w:rFonts w:ascii="Asana Math" w:hAnsi="Asana Math" w:eastAsia="Asana Math" w:cs="Asana Math"/>
+                          <w:highlight w:val="none"/>
+                          <w:lang w:val="es-ES"/>
+                        </w:rPr>
+                      </w:r>
+                      <w:r>
+                        <w:rPr>
+                          <w:rFonts w:ascii="Asana Math" w:hAnsi="Asana Math" w:eastAsia="Asana Math" w:cs="Asana Math"/>
+                          <w:highlight w:val="none"/>
+                          <w:lang w:val="es-ES"/>
+                        </w:rPr>
+                      </w:r>
+                    </w:p>
+                    <w:p>
+                      <w:pPr>
+                        <w:pBdr/>
+                        <w:spacing/>
+                        <w:ind/>
+                        <w:rPr>
+                          <w:rFonts w:ascii="Asana Math" w:hAnsi="Asana Math" w:cs="Asana Math"/>
+                        </w:rPr>
+                      </w:pPr>
+                      <w:r>
+                        <w:rPr>
+                          <w:rFonts w:ascii="Asana Math" w:hAnsi="Asana Math" w:eastAsia="Asana Math" w:cs="Asana Math"/>
+                          <w:highlight w:val="none"/>
+                          <w:lang w:val="es-ES"/>
+                        </w:rPr>
+                        <w:t xml:space="preserve">011</w:t>
+                      </w:r>
+                      <w:r>
+                        <w:rPr>
+                          <w:rFonts w:ascii="Asana Math" w:hAnsi="Asana Math" w:eastAsia="Asana Math" w:cs="Asana Math"/>
+                          <w:highlight w:val="none"/>
+                          <w:lang w:val="es-ES"/>
+                        </w:rPr>
+                        <w:t xml:space="preserve">  - 010</w:t>
+                      </w:r>
+                      <w:r>
+                        <w:rPr>
+                          <w:rFonts w:ascii="Asana Math" w:hAnsi="Asana Math" w:cs="Asana Math"/>
+                        </w:rPr>
+                      </w:r>
+                      <w:r>
+                        <w:rPr>
+                          <w:rFonts w:ascii="Asana Math" w:hAnsi="Asana Math" w:cs="Asana Math"/>
+                        </w:rPr>
+                      </w:r>
+                    </w:p>
+                    <w:p>
+                      <w:pPr>
+                        <w:pBdr/>
+                        <w:spacing/>
+                        <w:ind/>
+                        <w:rPr/>
+                      </w:pPr>
+                      <w:r/>
+                      <w:r/>
+                    </w:p>
+                  </w:txbxContent>
+                </v:textbox>
+              </v:shape>
+            </w:pict>
+          </mc:Fallback>
+        </mc:AlternateContent>
+      </w:r>
+      <w:r>
+        <w:rPr>
+          <w:rFonts w:ascii="Asana Math" w:hAnsi="Asana Math" w:cs="Asana Math"/>
+          <w:highlight w:val="none"/>
+          <w:lang w:val="es-ES" w:bidi="es-ES"/>
+        </w:rPr>
+        <w:t xml:space="preserve"> Z (Pieza Z): Forma de Z, se orienta hacia la izquierda (3x2).</w:t>
+      </w:r>
+      <w:r>
+        <w:rPr>
+          <w:rFonts w:ascii="Asana Math" w:hAnsi="Asana Math" w:cs="Asana Math"/>
+          <w:highlight w:val="none"/>
+          <w:lang w:val="es-ES" w:bidi="es-ES"/>
+        </w:rPr>
+      </w:r>
+    </w:p>
+    <w:p>
+      <w:pPr>
+        <w:pBdr/>
+        <w:spacing/>
+        <w:ind/>
+        <w:jc w:val="center"/>
+        <w:rPr>
+          <w:rFonts w:ascii="Asana Math" w:hAnsi="Asana Math" w:cs="Asana Math"/>
+          <w:highlight w:val="none"/>
+          <w:lang w:val="es-ES" w:bidi="es-ES"/>
+        </w:rPr>
+      </w:pPr>
+      <w:r>
+        <w:rPr>
+          <w:rFonts w:ascii="Asana Math" w:hAnsi="Asana Math" w:cs="Asana Math"/>
+          <w:highlight w:val="none"/>
+          <w:lang w:val="es-ES" w:bidi="es-ES"/>
+        </w:rPr>
+      </w:r>
+      <w:r>
+        <w:rPr>
+          <w:rFonts w:ascii="Asana Math" w:hAnsi="Asana Math" w:cs="Asana Math"/>
+          <w:highlight w:val="none"/>
+          <w:lang w:val="es-ES" w:bidi="es-ES"/>
+        </w:rPr>
+      </w:r>
+      <w:r>
+        <w:rPr>
+          <w:rFonts w:ascii="Asana Math" w:hAnsi="Asana Math" w:cs="Asana Math"/>
+          <w:highlight w:val="none"/>
+          <w:lang w:val="es-ES" w:bidi="es-ES"/>
+        </w:rPr>
+      </w:r>
+    </w:p>
+    <w:p>
+      <w:pPr>
+        <w:pBdr/>
+        <w:spacing/>
+        <w:ind/>
+        <w:jc w:val="center"/>
+        <w:rPr>
+          <w:rFonts w:ascii="Asana Math" w:hAnsi="Asana Math" w:cs="Asana Math"/>
+          <w:highlight w:val="none"/>
+          <w:lang w:val="es-ES" w:bidi="es-ES"/>
+        </w:rPr>
+      </w:pPr>
+      <w:r>
+        <w:rPr>
+          <w:rFonts w:ascii="Asana Math" w:hAnsi="Asana Math" w:cs="Asana Math"/>
+          <w:highlight w:val="none"/>
+          <w:lang w:val="es-ES" w:bidi="es-ES"/>
+        </w:rPr>
+      </w:r>
+      <w:r>
+        <w:rPr>
+          <w:rFonts w:ascii="Asana Math" w:hAnsi="Asana Math" w:cs="Asana Math"/>
+          <w:highlight w:val="none"/>
+          <w:lang w:val="es-ES" w:bidi="es-ES"/>
+        </w:rPr>
+      </w:r>
+      <w:r>
+        <w:rPr>
+          <w:rFonts w:ascii="Asana Math" w:hAnsi="Asana Math" w:cs="Asana Math"/>
+          <w:highlight w:val="none"/>
+          <w:lang w:val="es-ES" w:bidi="es-ES"/>
+        </w:rPr>
+      </w:r>
+    </w:p>
+    <w:p>
+      <w:pPr>
+        <w:pBdr/>
+        <w:spacing/>
+        <w:ind/>
+        <w:jc w:val="left"/>
+        <w:rPr>
+          <w:rFonts w:ascii="Asana Math" w:hAnsi="Asana Math" w:cs="Asana Math"/>
+          <w:highlight w:val="none"/>
+          <w:lang w:val="es-ES" w:bidi="es-ES"/>
+        </w:rPr>
+      </w:pPr>
+      <w:r>
+        <w:rPr>
+          <w:rFonts w:ascii="Asana Math" w:hAnsi="Asana Math" w:cs="Asana Math"/>
+          <w:highlight w:val="none"/>
+          <w:lang w:val="es-ES" w:bidi="es-ES"/>
+        </w:rPr>
+      </w:r>
+      <w:r>
+        <w:rPr>
+          <w:rFonts w:ascii="Asana Math" w:hAnsi="Asana Math" w:cs="Asana Math"/>
+          <w:highlight w:val="none"/>
+          <w:lang w:val="es-ES" w:bidi="es-ES"/>
+        </w:rPr>
+      </w:r>
+      <w:r>
+        <w:rPr>
+          <w:rFonts w:ascii="Asana Math" w:hAnsi="Asana Math" w:cs="Asana Math"/>
+          <w:highlight w:val="none"/>
+          <w:lang w:val="es-ES" w:bidi="es-ES"/>
+        </w:rPr>
+      </w:r>
+    </w:p>
+    <w:p>
+      <w:pPr>
+        <w:pBdr/>
+        <w:spacing/>
+        <w:ind/>
+        <w:jc w:val="center"/>
+        <w:rPr>
+          <w:rFonts w:ascii="Asana Math" w:hAnsi="Asana Math" w:cs="Asana Math"/>
+          <w:highlight w:val="none"/>
+          <w:lang w:val="es-ES" w:bidi="es-ES"/>
+        </w:rPr>
+      </w:pPr>
+      <w:r>
+        <w:rPr>
+          <w:rFonts w:ascii="Asana Math" w:hAnsi="Asana Math" w:cs="Asana Math"/>
+          <w:highlight w:val="none"/>
+          <w:lang w:val="es-ES" w:bidi="es-ES"/>
+        </w:rPr>
+        <w:t xml:space="preserve">−</w:t>
+      </w:r>
+      <w:r/>
+    </w:p>
+    <w:p>
+      <w:pPr>
+        <w:pBdr/>
+        <w:spacing/>
+        <w:ind/>
+        <w:jc w:val="center"/>
+        <w:rPr>
+          <w:rFonts w:ascii="Asana Math" w:hAnsi="Asana Math" w:cs="Asana Math"/>
+          <w:highlight w:val="none"/>
+          <w:lang w:val="es-ES" w:bidi="es-ES"/>
+        </w:rPr>
+      </w:pPr>
+      <w:r>
+        <w:rPr>
+          <w:rFonts w:ascii="Asana Math" w:hAnsi="Asana Math" w:cs="Asana Math"/>
+          <w:highlight w:val="none"/>
+          <w:lang w:val="es-ES" w:bidi="es-ES"/>
+        </w:rPr>
+        <w:t xml:space="preserve"> J (Pieza J): Forma de L invertida o con gancho a la izquierda (2x3).</w:t>
+      </w:r>
+      <w:r>
+        <w:rPr>
+          <w:rFonts w:ascii="Asana Math" w:hAnsi="Asana Math" w:cs="Asana Math"/>
+          <w:highlight w:val="none"/>
+          <w:lang w:val="es-ES" w:bidi="es-ES"/>
+        </w:rPr>
+      </w:r>
+    </w:p>
+    <w:p>
+      <w:pPr>
+        <w:pBdr/>
+        <w:spacing/>
+        <w:ind/>
+        <w:jc w:val="center"/>
+        <w:rPr>
+          <w:rFonts w:ascii="Asana Math" w:hAnsi="Asana Math" w:cs="Asana Math"/>
+          <w:highlight w:val="none"/>
+          <w:lang w:val="es-ES" w:bidi="es-ES"/>
+        </w:rPr>
+      </w:pPr>
+      <w:r>
+        <w:rPr>
+          <w:rFonts w:ascii="Asana Math" w:hAnsi="Asana Math" w:cs="Asana Math"/>
+          <w:highlight w:val="none"/>
+          <w:lang w:val="es-ES" w:bidi="es-ES"/>
+        </w:rPr>
+      </w:r>
+      <w:r>
+        <mc:AlternateContent>
+          <mc:Choice Requires="wpg">
+            <w:drawing>
+              <wp:anchor xmlns:wp="http://schemas.openxmlformats.org/drawingml/2006/wordprocessingDrawing" xmlns:wp14="http://schemas.microsoft.com/office/word/2010/wordprocessingDrawing" distT="0" distB="0" distL="115200" distR="115200" simplePos="0" relativeHeight="19456" behindDoc="0" locked="0" layoutInCell="1" allowOverlap="1">
+                <wp:simplePos x="0" y="0"/>
+                <wp:positionH relativeFrom="column">
+                  <wp:posOffset>2189093</wp:posOffset>
+                </wp:positionH>
+                <wp:positionV relativeFrom="paragraph">
+                  <wp:posOffset>52429</wp:posOffset>
+                </wp:positionV>
+                <wp:extent cx="1565413" cy="944217"/>
+                <wp:effectExtent l="3175" t="3175" r="3175" b="3175"/>
+                <wp:wrapNone/>
+                <wp:docPr id="14" name=""/>
+                <wp:cNvGraphicFramePr/>
+                <a:graphic xmlns:a="http://schemas.openxmlformats.org/drawingml/2006/main">
+                  <a:graphicData uri="http://schemas.microsoft.com/office/word/2010/wordprocessingShape">
+                    <wps:wsp>
+                      <wps:cNvPr id="0" name=""/>
+                      <wps:cNvSpPr txBox="1"/>
+                      <wps:spPr bwMode="auto">
+                        <a:xfrm rot="0" flipH="0" flipV="0">
+                          <a:off x="0" y="0"/>
+                          <a:ext cx="1565412" cy="944217"/>
+                        </a:xfrm>
+                        <a:prstGeom prst="rect">
+                          <a:avLst/>
+                        </a:prstGeom>
+                        <a:solidFill>
+                          <a:schemeClr val="lt1"/>
+                        </a:solidFill>
+                        <a:ln w="6350">
+                          <a:solidFill>
+                            <a:prstClr val="black"/>
+                          </a:solidFill>
+                        </a:ln>
+                      </wps:spPr>
+                      <wps:txbx>
+                        <w:txbxContent>
+                          <w:p>
+                            <w:pPr>
+                              <w:pBdr/>
+                              <w:spacing/>
+                              <w:ind/>
+                              <w:rPr>
+                                <w:rFonts w:ascii="Asana Math" w:hAnsi="Asana Math" w:eastAsia="Asana Math" w:cs="Asana Math"/>
+                                <w:highlight w:val="none"/>
+                                <w:lang w:val="es-ES"/>
+                              </w:rPr>
+                            </w:pPr>
+                            <w:r>
+                              <w:rPr>
+                                <w:rFonts w:ascii="Asana Math" w:hAnsi="Asana Math" w:eastAsia="Asana Math" w:cs="Asana Math"/>
+                                <w:lang w:val="es-ES"/>
+                              </w:rPr>
+                              <w:t xml:space="preserve">010</w:t>
+                            </w:r>
+                            <w:r>
+                              <w:rPr>
+                                <w:rFonts w:ascii="Asana Math" w:hAnsi="Asana Math" w:cs="Asana Math"/>
+                                <w:lang w:val="es-ES"/>
+                              </w:rPr>
+                              <w:t xml:space="preserve">  - 000  - 000  - 011</w:t>
+                            </w:r>
+                            <w:r>
+                              <w:rPr>
+                                <w:rFonts w:ascii="Asana Math" w:hAnsi="Asana Math" w:cs="Asana Math"/>
+                              </w:rPr>
+                            </w:r>
+                          </w:p>
+                          <w:p>
+                            <w:pPr>
+                              <w:pBdr/>
+                              <w:spacing/>
+                              <w:ind/>
+                              <w:rPr>
+                                <w:rFonts w:ascii="Asana Math" w:hAnsi="Asana Math" w:eastAsia="Asana Math" w:cs="Asana Math"/>
+                                <w:highlight w:val="none"/>
+                                <w:lang w:val="es-ES"/>
+                              </w:rPr>
+                            </w:pPr>
+                            <w:r>
+                              <w:rPr>
+                                <w:rFonts w:ascii="Asana Math" w:hAnsi="Asana Math" w:eastAsia="Asana Math" w:cs="Asana Math"/>
+                                <w:highlight w:val="none"/>
+                                <w:lang w:val="es-ES"/>
+                              </w:rPr>
+                              <w:t xml:space="preserve">010  - 111  - 100  - 010</w:t>
+                            </w:r>
+                            <w:r>
+                              <w:rPr>
+                                <w:rFonts w:ascii="Asana Math" w:hAnsi="Asana Math" w:cs="Asana Math"/>
+                              </w:rPr>
+                            </w:r>
+                          </w:p>
+                          <w:p>
+                            <w:pPr>
+                              <w:pBdr/>
+                              <w:spacing/>
+                              <w:ind/>
+                              <w:rPr>
+                                <w:rFonts w:ascii="Asana Math" w:hAnsi="Asana Math" w:cs="Asana Math"/>
+                              </w:rPr>
+                            </w:pPr>
+                            <w:r>
+                              <w:rPr>
+                                <w:rFonts w:ascii="Asana Math" w:hAnsi="Asana Math" w:eastAsia="Asana Math" w:cs="Asana Math"/>
+                                <w:highlight w:val="none"/>
+                                <w:lang w:val="es-ES"/>
+                              </w:rPr>
+                              <w:t xml:space="preserve">110</w:t>
+                            </w:r>
+                            <w:r>
+                              <w:rPr>
+                                <w:rFonts w:ascii="Asana Math" w:hAnsi="Asana Math" w:eastAsia="Asana Math" w:cs="Asana Math"/>
+                                <w:highlight w:val="none"/>
+                                <w:lang w:val="es-ES"/>
+                              </w:rPr>
+                              <w:t xml:space="preserve">  - 001</w:t>
+                            </w:r>
+                            <w:r>
+                              <w:rPr>
+                                <w:rFonts w:ascii="Asana Math" w:hAnsi="Asana Math" w:eastAsia="Asana Math" w:cs="Asana Math"/>
+                                <w:highlight w:val="none"/>
+                                <w:lang w:val="es-ES"/>
+                              </w:rPr>
+                              <w:t xml:space="preserve">  - 111  - 010</w:t>
+                            </w:r>
+                            <w:r>
+                              <w:rPr>
+                                <w:rFonts w:ascii="Asana Math" w:hAnsi="Asana Math" w:eastAsia="Asana Math" w:cs="Asana Math"/>
+                                <w:highlight w:val="none"/>
+                                <w:lang w:val="es-ES"/>
+                              </w:rPr>
+                            </w:r>
+                          </w:p>
+                        </w:txbxContent>
+                      </wps:txbx>
+                      <wps:bodyPr vertOverflow="overflow" horzOverflow="overflow" vert="horz" wrap="square" lIns="91440" tIns="45720" rIns="91440" bIns="45720" numCol="1" spcCol="0" rtlCol="0" fromWordArt="0" anchor="t" anchorCtr="0" forceAA="0" upright="0" compatLnSpc="0"/>
+                    </wps:wsp>
+                  </a:graphicData>
+                </a:graphic>
+              </wp:anchor>
+            </w:drawing>
+          </mc:Choice>
+          <mc:Fallback>
+            <w:pict>
+              <v:shape id="shape 13" o:spid="_x0000_s13" o:spt="202" type="#_x0000_t202" style="position:absolute;z-index:19456;o:allowoverlap:true;o:allowincell:true;mso-position-horizontal-relative:text;margin-left:172.37pt;mso-position-horizontal:absolute;mso-position-vertical-relative:text;margin-top:4.13pt;mso-position-vertical:absolute;width:123.26pt;height:74.35pt;mso-wrap-distance-left:9.07pt;mso-wrap-distance-top:0.00pt;mso-wrap-distance-right:9.07pt;mso-wrap-distance-bottom:0.00pt;rotation:0;v-text-anchor:top;visibility:visible;" fillcolor="#FFFFFF" strokecolor="#000000" strokeweight="0.50pt">
+                <v:textbox inset="0,0,0,0">
+                  <w:txbxContent>
+                    <w:p>
+                      <w:pPr>
+                        <w:pBdr/>
+                        <w:spacing/>
+                        <w:ind/>
+                        <w:rPr>
+                          <w:rFonts w:ascii="Asana Math" w:hAnsi="Asana Math" w:eastAsia="Asana Math" w:cs="Asana Math"/>
+                          <w:highlight w:val="none"/>
+                          <w:lang w:val="es-ES"/>
+                        </w:rPr>
+                      </w:pPr>
+                      <w:r>
+                        <w:rPr>
+                          <w:rFonts w:ascii="Asana Math" w:hAnsi="Asana Math" w:eastAsia="Asana Math" w:cs="Asana Math"/>
+                          <w:lang w:val="es-ES"/>
+                        </w:rPr>
+                        <w:t xml:space="preserve">010</w:t>
+                      </w:r>
+                      <w:r>
+                        <w:rPr>
+                          <w:rFonts w:ascii="Asana Math" w:hAnsi="Asana Math" w:cs="Asana Math"/>
+                          <w:lang w:val="es-ES"/>
+                        </w:rPr>
+                        <w:t xml:space="preserve">  - 000  - 000  - 011</w:t>
+                      </w:r>
+                      <w:r>
+                        <w:rPr>
+                          <w:rFonts w:ascii="Asana Math" w:hAnsi="Asana Math" w:cs="Asana Math"/>
+                        </w:rPr>
+                      </w:r>
+                    </w:p>
+                    <w:p>
+                      <w:pPr>
+                        <w:pBdr/>
+                        <w:spacing/>
+                        <w:ind/>
+                        <w:rPr>
+                          <w:rFonts w:ascii="Asana Math" w:hAnsi="Asana Math" w:eastAsia="Asana Math" w:cs="Asana Math"/>
+                          <w:highlight w:val="none"/>
+                          <w:lang w:val="es-ES"/>
+                        </w:rPr>
+                      </w:pPr>
+                      <w:r>
+                        <w:rPr>
+                          <w:rFonts w:ascii="Asana Math" w:hAnsi="Asana Math" w:eastAsia="Asana Math" w:cs="Asana Math"/>
+                          <w:highlight w:val="none"/>
+                          <w:lang w:val="es-ES"/>
+                        </w:rPr>
+                        <w:t xml:space="preserve">010  - 111  - 100  - 010</w:t>
+                      </w:r>
+                      <w:r>
+                        <w:rPr>
+                          <w:rFonts w:ascii="Asana Math" w:hAnsi="Asana Math" w:cs="Asana Math"/>
+                        </w:rPr>
+                      </w:r>
+                    </w:p>
+                    <w:p>
+                      <w:pPr>
+                        <w:pBdr/>
+                        <w:spacing/>
+                        <w:ind/>
+                        <w:rPr>
+                          <w:rFonts w:ascii="Asana Math" w:hAnsi="Asana Math" w:cs="Asana Math"/>
+                        </w:rPr>
+                      </w:pPr>
+                      <w:r>
+                        <w:rPr>
+                          <w:rFonts w:ascii="Asana Math" w:hAnsi="Asana Math" w:eastAsia="Asana Math" w:cs="Asana Math"/>
+                          <w:highlight w:val="none"/>
+                          <w:lang w:val="es-ES"/>
+                        </w:rPr>
+                        <w:t xml:space="preserve">110</w:t>
+                      </w:r>
+                      <w:r>
+                        <w:rPr>
+                          <w:rFonts w:ascii="Asana Math" w:hAnsi="Asana Math" w:eastAsia="Asana Math" w:cs="Asana Math"/>
+                          <w:highlight w:val="none"/>
+                          <w:lang w:val="es-ES"/>
+                        </w:rPr>
+                        <w:t xml:space="preserve">  - 001</w:t>
+                      </w:r>
+                      <w:r>
+                        <w:rPr>
+                          <w:rFonts w:ascii="Asana Math" w:hAnsi="Asana Math" w:eastAsia="Asana Math" w:cs="Asana Math"/>
+                          <w:highlight w:val="none"/>
+                          <w:lang w:val="es-ES"/>
+                        </w:rPr>
+                        <w:t xml:space="preserve">  - 111  - 010</w:t>
+                      </w:r>
+                      <w:r>
+                        <w:rPr>
+                          <w:rFonts w:ascii="Asana Math" w:hAnsi="Asana Math" w:eastAsia="Asana Math" w:cs="Asana Math"/>
+                          <w:highlight w:val="none"/>
+                          <w:lang w:val="es-ES"/>
+                        </w:rPr>
+                      </w:r>
+                    </w:p>
+                  </w:txbxContent>
+                </v:textbox>
+              </v:shape>
+            </w:pict>
+          </mc:Fallback>
+        </mc:AlternateContent>
+      </w:r>
+      <w:r>
+        <w:rPr>
+          <w:rFonts w:ascii="Asana Math" w:hAnsi="Asana Math" w:cs="Asana Math"/>
+          <w:highlight w:val="none"/>
+          <w:lang w:val="es-ES" w:bidi="es-ES"/>
+        </w:rPr>
+      </w:r>
+      <w:r>
+        <w:rPr>
+          <w:rFonts w:ascii="Asana Math" w:hAnsi="Asana Math" w:cs="Asana Math"/>
+          <w:highlight w:val="none"/>
+          <w:lang w:val="es-ES" w:bidi="es-ES"/>
+        </w:rPr>
+      </w:r>
+      <w:r>
+        <w:rPr>
+          <w:rFonts w:ascii="Asana Math" w:hAnsi="Asana Math" w:cs="Asana Math"/>
+          <w:highlight w:val="none"/>
+          <w:lang w:val="es-ES" w:bidi="es-ES"/>
+        </w:rPr>
+      </w:r>
+    </w:p>
+    <w:p>
+      <w:pPr>
+        <w:pBdr/>
+        <w:spacing/>
+        <w:ind/>
+        <w:jc w:val="center"/>
+        <w:rPr>
+          <w:rFonts w:ascii="Asana Math" w:hAnsi="Asana Math" w:cs="Asana Math"/>
+          <w:highlight w:val="none"/>
+          <w:lang w:val="es-ES" w:bidi="es-ES"/>
+        </w:rPr>
+      </w:pPr>
+      <w:r>
+        <w:rPr>
+          <w:rFonts w:ascii="Asana Math" w:hAnsi="Asana Math" w:cs="Asana Math"/>
+          <w:highlight w:val="none"/>
+          <w:lang w:val="es-ES" w:bidi="es-ES"/>
+        </w:rPr>
+      </w:r>
+      <w:r>
+        <w:rPr>
+          <w:rFonts w:ascii="Asana Math" w:hAnsi="Asana Math" w:cs="Asana Math"/>
+          <w:highlight w:val="none"/>
+          <w:lang w:val="es-ES" w:bidi="es-ES"/>
+        </w:rPr>
+      </w:r>
+      <w:r>
+        <w:rPr>
+          <w:rFonts w:ascii="Asana Math" w:hAnsi="Asana Math" w:cs="Asana Math"/>
+          <w:highlight w:val="none"/>
+          <w:lang w:val="es-ES" w:bidi="es-ES"/>
+        </w:rPr>
+      </w:r>
+    </w:p>
+    <w:p>
+      <w:pPr>
+        <w:pBdr/>
+        <w:spacing/>
+        <w:ind/>
+        <w:jc w:val="center"/>
+        <w:rPr>
+          <w:rFonts w:ascii="Asana Math" w:hAnsi="Asana Math" w:cs="Asana Math"/>
+          <w:highlight w:val="none"/>
+          <w:lang w:val="es-ES" w:bidi="es-ES"/>
+        </w:rPr>
+      </w:pPr>
+      <w:r>
+        <w:rPr>
+          <w:rFonts w:ascii="Asana Math" w:hAnsi="Asana Math" w:cs="Asana Math"/>
+          <w:highlight w:val="none"/>
+          <w:lang w:val="es-ES" w:bidi="es-ES"/>
+        </w:rPr>
+      </w:r>
+      <w:r>
+        <w:rPr>
+          <w:rFonts w:ascii="Asana Math" w:hAnsi="Asana Math" w:cs="Asana Math"/>
+          <w:highlight w:val="none"/>
+          <w:lang w:val="es-ES" w:bidi="es-ES"/>
+        </w:rPr>
+      </w:r>
+      <w:r>
+        <w:rPr>
+          <w:rFonts w:ascii="Asana Math" w:hAnsi="Asana Math" w:cs="Asana Math"/>
+          <w:highlight w:val="none"/>
+          <w:lang w:val="es-ES" w:bidi="es-ES"/>
+        </w:rPr>
+      </w:r>
+    </w:p>
+    <w:p>
+      <w:pPr>
+        <w:pBdr/>
+        <w:spacing/>
+        <w:ind/>
+        <w:jc w:val="left"/>
+        <w:rPr>
+          <w:rFonts w:ascii="Asana Math" w:hAnsi="Asana Math" w:cs="Asana Math"/>
+          <w:highlight w:val="none"/>
+          <w:lang w:val="es-ES" w:bidi="es-ES"/>
+        </w:rPr>
+      </w:pPr>
+      <w:r>
+        <w:rPr>
+          <w:rFonts w:ascii="Asana Math" w:hAnsi="Asana Math" w:cs="Asana Math"/>
+          <w:highlight w:val="none"/>
+          <w:lang w:val="es-ES" w:bidi="es-ES"/>
+        </w:rPr>
+      </w:r>
+      <w:r>
+        <w:rPr>
+          <w:rFonts w:ascii="Asana Math" w:hAnsi="Asana Math" w:cs="Asana Math"/>
+          <w:highlight w:val="none"/>
+          <w:lang w:val="es-ES" w:bidi="es-ES"/>
+        </w:rPr>
+      </w:r>
+    </w:p>
+    <w:p>
+      <w:pPr>
+        <w:pBdr/>
+        <w:spacing/>
+        <w:ind/>
+        <w:jc w:val="center"/>
+        <w:rPr/>
+      </w:pPr>
+      <w:r>
+        <w:rPr>
+          <w:rFonts w:ascii="Asana Math" w:hAnsi="Asana Math" w:cs="Asana Math"/>
+          <w:highlight w:val="none"/>
+          <w:lang w:val="es-ES" w:bidi="es-ES"/>
+        </w:rPr>
+        <w:t xml:space="preserve">−</w:t>
+      </w:r>
+      <w:r/>
+    </w:p>
+    <w:p>
+      <w:pPr>
+        <w:pBdr/>
+        <w:spacing/>
+        <w:ind/>
+        <w:jc w:val="center"/>
+        <w:rPr>
+          <w:rFonts w:ascii="Asana Math" w:hAnsi="Asana Math" w:cs="Asana Math"/>
+          <w:highlight w:val="none"/>
+          <w:lang w:val="es-ES"/>
+        </w:rPr>
+      </w:pPr>
+      <w:r>
+        <w:rPr>
+          <w:rFonts w:ascii="Asana Math" w:hAnsi="Asana Math" w:cs="Asana Math"/>
+          <w:highlight w:val="none"/>
+          <w:lang w:val="es-ES" w:bidi="es-ES"/>
+        </w:rPr>
+      </w:r>
+      <w:r>
+        <w:rPr>
+          <w:rFonts w:ascii="Asana Math" w:hAnsi="Asana Math" w:cs="Asana Math"/>
+          <w:highlight w:val="none"/>
+          <w:lang w:val="es-ES" w:bidi="es-ES"/>
+        </w:rPr>
+      </w:r>
+      <w:r>
+        <w:rPr>
+          <w:rFonts w:ascii="Asana Math" w:hAnsi="Asana Math" w:cs="Asana Math"/>
+          <w:highlight w:val="none"/>
+          <w:lang w:val="es-ES" w:bidi="es-ES"/>
+        </w:rPr>
+      </w:r>
+    </w:p>
+    <w:p>
+      <w:pPr>
+        <w:pBdr/>
+        <w:spacing/>
+        <w:ind/>
+        <w:jc w:val="center"/>
+        <w:rPr>
+          <w:rFonts w:ascii="Asana Math" w:hAnsi="Asana Math" w:cs="Asana Math"/>
+          <w:highlight w:val="none"/>
+          <w:lang w:val="es-ES" w:bidi="es-ES"/>
+        </w:rPr>
+      </w:pPr>
+      <w:r>
+        <w:rPr>
+          <w:rFonts w:ascii="Asana Math" w:hAnsi="Asana Math" w:cs="Asana Math"/>
+          <w:highlight w:val="none"/>
+          <w:lang w:val="es-ES" w:bidi="es-ES"/>
+        </w:rPr>
+        <w:t xml:space="preserve"> L (Pieza L): Forma d</w:t>
+      </w:r>
+      <w:r/>
+      <w:r>
+        <w:rPr>
+          <w:rFonts w:ascii="Asana Math" w:hAnsi="Asana Math" w:cs="Asana Math"/>
+          <w:highlight w:val="none"/>
+          <w:lang w:val="es-ES" w:bidi="es-ES"/>
+        </w:rPr>
+        <w:t xml:space="preserve">e L estándar o con gancho a la derecha(2x3).</w:t>
+      </w:r>
+      <w:r/>
+      <w:r>
+        <w:rPr>
+          <w:rFonts w:ascii="Asana Math" w:hAnsi="Asana Math" w:cs="Asana Math"/>
+          <w:highlight w:val="none"/>
+          <w:lang w:val="es-ES" w:bidi="es-ES"/>
+        </w:rPr>
+      </w:r>
+      <w:r>
+        <w:rPr>
+          <w:rFonts w:ascii="Asana Math" w:hAnsi="Asana Math" w:cs="Asana Math"/>
+          <w:highlight w:val="none"/>
+          <w:lang w:val="es-ES" w:bidi="es-ES"/>
+        </w:rPr>
+      </w:r>
+      <w:r>
+        <w:rPr>
+          <w:rFonts w:ascii="Asana Math" w:hAnsi="Asana Math" w:cs="Asana Math"/>
+          <w:highlight w:val="none"/>
+          <w:lang w:val="es-ES"/>
+        </w:rPr>
+      </w:r>
+    </w:p>
+    <w:p>
+      <w:pPr>
+        <w:pBdr/>
+        <w:spacing/>
+        <w:ind/>
+        <w:jc w:val="center"/>
+        <w:rPr>
+          <w:rFonts w:ascii="Asana Math" w:hAnsi="Asana Math" w:cs="Asana Math"/>
+        </w:rPr>
+      </w:pPr>
+      <w:r>
+        <w:rPr>
+          <w:rFonts w:ascii="Asana Math" w:hAnsi="Asana Math" w:cs="Asana Math"/>
+        </w:rPr>
+      </w:r>
+      <w:r>
+        <mc:AlternateContent>
+          <mc:Choice Requires="wpg">
+            <w:drawing>
+              <wp:anchor xmlns:wp="http://schemas.openxmlformats.org/drawingml/2006/wordprocessingDrawing" xmlns:wp14="http://schemas.microsoft.com/office/word/2010/wordprocessingDrawing" distT="0" distB="0" distL="115200" distR="115200" simplePos="0" relativeHeight="20480" behindDoc="0" locked="0" layoutInCell="1" allowOverlap="1">
+                <wp:simplePos x="0" y="0"/>
+                <wp:positionH relativeFrom="column">
+                  <wp:posOffset>2230506</wp:posOffset>
+                </wp:positionH>
+                <wp:positionV relativeFrom="paragraph">
+                  <wp:posOffset>55024</wp:posOffset>
+                </wp:positionV>
+                <wp:extent cx="1482587" cy="886239"/>
+                <wp:effectExtent l="3175" t="3175" r="3175" b="3175"/>
+                <wp:wrapNone/>
+                <wp:docPr id="15" name=""/>
+                <wp:cNvGraphicFramePr/>
+                <a:graphic xmlns:a="http://schemas.openxmlformats.org/drawingml/2006/main">
+                  <a:graphicData uri="http://schemas.microsoft.com/office/word/2010/wordprocessingShape">
+                    <wps:wsp>
+                      <wps:cNvPr id="0" name=""/>
+                      <wps:cNvSpPr txBox="1"/>
+                      <wps:spPr bwMode="auto">
+                        <a:xfrm rot="0" flipH="0" flipV="0">
+                          <a:off x="0" y="0"/>
+                          <a:ext cx="1482586" cy="886239"/>
+                        </a:xfrm>
+                        <a:prstGeom prst="rect">
+                          <a:avLst/>
+                        </a:prstGeom>
+                        <a:solidFill>
+                          <a:schemeClr val="lt1"/>
+                        </a:solidFill>
+                        <a:ln w="6350">
+                          <a:solidFill>
+                            <a:prstClr val="black"/>
+                          </a:solidFill>
+                        </a:ln>
+                      </wps:spPr>
+                      <wps:txbx>
+                        <w:txbxContent>
+                          <w:p>
+                            <w:pPr>
+                              <w:pBdr/>
+                              <w:spacing/>
+                              <w:ind/>
+                              <w:rPr>
+                                <w:rFonts w:ascii="Asana Math" w:hAnsi="Asana Math" w:eastAsia="Asana Math" w:cs="Asana Math"/>
+                                <w:highlight w:val="none"/>
+                                <w:lang w:val="es-ES"/>
+                              </w:rPr>
+                            </w:pPr>
+                            <w:r>
+                              <w:rPr>
+                                <w:rFonts w:ascii="Asana Math" w:hAnsi="Asana Math" w:eastAsia="Asana Math" w:cs="Asana Math"/>
+                                <w:lang w:val="es-ES"/>
+                              </w:rPr>
+                              <w:t xml:space="preserve">010</w:t>
+                            </w:r>
+                            <w:r>
+                              <w:rPr>
+                                <w:rFonts w:ascii="Asana Math" w:hAnsi="Asana Math" w:cs="Asana Math"/>
+                                <w:lang w:val="es-ES"/>
+                              </w:rPr>
+                              <w:t xml:space="preserve">  - 000  - 110  - 000</w:t>
+                            </w:r>
+                            <w:r>
+                              <w:rPr>
+                                <w:rFonts w:ascii="Asana Math" w:hAnsi="Asana Math" w:cs="Asana Math"/>
+                              </w:rPr>
+                            </w:r>
+                            <w:r>
+                              <w:rPr>
+                                <w:rFonts w:ascii="Asana Math" w:hAnsi="Asana Math" w:eastAsia="Asana Math" w:cs="Asana Math"/>
+                                <w:highlight w:val="none"/>
+                                <w:lang w:val="es-ES"/>
+                              </w:rPr>
+                            </w:r>
+                            <w:r>
+                              <w:rPr>
+                                <w:rFonts w:ascii="Asana Math" w:hAnsi="Asana Math" w:eastAsia="Asana Math" w:cs="Asana Math"/>
+                                <w:highlight w:val="none"/>
+                                <w:lang w:val="es-ES"/>
+                              </w:rPr>
+                            </w:r>
+                          </w:p>
+                          <w:p>
+                            <w:pPr>
+                              <w:pBdr/>
+                              <w:spacing/>
+                              <w:ind/>
+                              <w:rPr>
+                                <w:rFonts w:ascii="Asana Math" w:hAnsi="Asana Math" w:eastAsia="Asana Math" w:cs="Asana Math"/>
+                                <w:highlight w:val="none"/>
+                                <w:lang w:val="es-ES"/>
+                              </w:rPr>
+                            </w:pPr>
+                            <w:r>
+                              <w:rPr>
+                                <w:rFonts w:ascii="Asana Math" w:hAnsi="Asana Math" w:eastAsia="Asana Math" w:cs="Asana Math"/>
+                                <w:highlight w:val="none"/>
+                                <w:lang w:val="es-ES"/>
+                              </w:rPr>
+                              <w:t xml:space="preserve">010  - 111  - 010  - 001</w:t>
+                            </w:r>
+                            <w:r>
+                              <w:rPr>
+                                <w:rFonts w:ascii="Asana Math" w:hAnsi="Asana Math" w:cs="Asana Math"/>
+                              </w:rPr>
+                            </w:r>
+                            <w:r>
+                              <w:rPr>
+                                <w:rFonts w:ascii="Asana Math" w:hAnsi="Asana Math" w:eastAsia="Asana Math" w:cs="Asana Math"/>
+                                <w:highlight w:val="none"/>
+                                <w:lang w:val="es-ES"/>
+                              </w:rPr>
+                            </w:r>
+                            <w:r>
+                              <w:rPr>
+                                <w:rFonts w:ascii="Asana Math" w:hAnsi="Asana Math" w:eastAsia="Asana Math" w:cs="Asana Math"/>
+                                <w:highlight w:val="none"/>
+                                <w:lang w:val="es-ES"/>
+                              </w:rPr>
+                            </w:r>
+                          </w:p>
+                          <w:p>
+                            <w:pPr>
+                              <w:pBdr/>
+                              <w:spacing/>
+                              <w:ind/>
+                              <w:rPr>
+                                <w:rFonts w:ascii="Asana Math" w:hAnsi="Asana Math" w:cs="Asana Math"/>
+                              </w:rPr>
+                            </w:pPr>
+                            <w:r>
+                              <w:rPr>
+                                <w:rFonts w:ascii="Asana Math" w:hAnsi="Asana Math" w:eastAsia="Asana Math" w:cs="Asana Math"/>
+                                <w:highlight w:val="none"/>
+                                <w:lang w:val="es-ES"/>
+                              </w:rPr>
+                              <w:t xml:space="preserve">011</w:t>
+                            </w:r>
+                            <w:r>
+                              <w:rPr>
+                                <w:rFonts w:ascii="Asana Math" w:hAnsi="Asana Math" w:eastAsia="Asana Math" w:cs="Asana Math"/>
+                                <w:highlight w:val="none"/>
+                                <w:lang w:val="es-ES"/>
+                              </w:rPr>
+                              <w:t xml:space="preserve">  - 100  - 010  - 111</w:t>
+                            </w:r>
+                            <w:r>
+                              <w:rPr>
+                                <w:rFonts w:ascii="Asana Math" w:hAnsi="Asana Math" w:eastAsia="Asana Math" w:cs="Asana Math"/>
+                                <w:highlight w:val="none"/>
+                                <w:lang w:val="es-ES"/>
+                              </w:rPr>
+                            </w:r>
+                            <w:r>
+                              <w:rPr>
+                                <w:rFonts w:ascii="Asana Math" w:hAnsi="Asana Math" w:cs="Asana Math"/>
+                              </w:rPr>
+                            </w:r>
+                            <w:r>
+                              <w:rPr>
+                                <w:rFonts w:ascii="Asana Math" w:hAnsi="Asana Math" w:cs="Asana Math"/>
+                              </w:rPr>
+                            </w:r>
+                          </w:p>
+                        </w:txbxContent>
+                      </wps:txbx>
+                      <wps:bodyPr vertOverflow="overflow" horzOverflow="overflow" vert="horz" wrap="square" lIns="91440" tIns="45720" rIns="91440" bIns="45720" numCol="1" spcCol="0" rtlCol="0" fromWordArt="0" anchor="t" anchorCtr="0" forceAA="0" upright="0" compatLnSpc="0"/>
+                    </wps:wsp>
+                  </a:graphicData>
+                </a:graphic>
+              </wp:anchor>
+            </w:drawing>
+          </mc:Choice>
+          <mc:Fallback>
+            <w:pict>
+              <v:shape id="shape 14" o:spid="_x0000_s14" o:spt="202" type="#_x0000_t202" style="position:absolute;z-index:20480;o:allowoverlap:true;o:allowincell:true;mso-position-horizontal-relative:text;margin-left:175.63pt;mso-position-horizontal:absolute;mso-position-vertical-relative:text;margin-top:4.33pt;mso-position-vertical:absolute;width:116.74pt;height:69.78pt;mso-wrap-distance-left:9.07pt;mso-wrap-distance-top:0.00pt;mso-wrap-distance-right:9.07pt;mso-wrap-distance-bottom:0.00pt;rotation:0;v-text-anchor:top;visibility:visible;" fillcolor="#FFFFFF" strokecolor="#000000" strokeweight="0.50pt">
+                <v:textbox inset="0,0,0,0">
+                  <w:txbxContent>
+                    <w:p>
+                      <w:pPr>
+                        <w:pBdr/>
+                        <w:spacing/>
+                        <w:ind/>
+                        <w:rPr>
+                          <w:rFonts w:ascii="Asana Math" w:hAnsi="Asana Math" w:eastAsia="Asana Math" w:cs="Asana Math"/>
+                          <w:highlight w:val="none"/>
+                          <w:lang w:val="es-ES"/>
+                        </w:rPr>
+                      </w:pPr>
+                      <w:r>
+                        <w:rPr>
+                          <w:rFonts w:ascii="Asana Math" w:hAnsi="Asana Math" w:eastAsia="Asana Math" w:cs="Asana Math"/>
+                          <w:lang w:val="es-ES"/>
+                        </w:rPr>
+                        <w:t xml:space="preserve">010</w:t>
+                      </w:r>
+                      <w:r>
+                        <w:rPr>
+                          <w:rFonts w:ascii="Asana Math" w:hAnsi="Asana Math" w:cs="Asana Math"/>
+                          <w:lang w:val="es-ES"/>
+                        </w:rPr>
+                        <w:t xml:space="preserve">  - 000  - 110  - 000</w:t>
+                      </w:r>
+                      <w:r>
+                        <w:rPr>
+                          <w:rFonts w:ascii="Asana Math" w:hAnsi="Asana Math" w:cs="Asana Math"/>
+                        </w:rPr>
+                      </w:r>
+                      <w:r>
+                        <w:rPr>
+                          <w:rFonts w:ascii="Asana Math" w:hAnsi="Asana Math" w:eastAsia="Asana Math" w:cs="Asana Math"/>
+                          <w:highlight w:val="none"/>
+                          <w:lang w:val="es-ES"/>
+                        </w:rPr>
+                      </w:r>
+                      <w:r>
+                        <w:rPr>
+                          <w:rFonts w:ascii="Asana Math" w:hAnsi="Asana Math" w:eastAsia="Asana Math" w:cs="Asana Math"/>
+                          <w:highlight w:val="none"/>
+                          <w:lang w:val="es-ES"/>
+                        </w:rPr>
+                      </w:r>
+                    </w:p>
+                    <w:p>
+                      <w:pPr>
+                        <w:pBdr/>
+                        <w:spacing/>
+                        <w:ind/>
+                        <w:rPr>
+                          <w:rFonts w:ascii="Asana Math" w:hAnsi="Asana Math" w:eastAsia="Asana Math" w:cs="Asana Math"/>
+                          <w:highlight w:val="none"/>
+                          <w:lang w:val="es-ES"/>
+                        </w:rPr>
+                      </w:pPr>
+                      <w:r>
+                        <w:rPr>
+                          <w:rFonts w:ascii="Asana Math" w:hAnsi="Asana Math" w:eastAsia="Asana Math" w:cs="Asana Math"/>
+                          <w:highlight w:val="none"/>
+                          <w:lang w:val="es-ES"/>
+                        </w:rPr>
+                        <w:t xml:space="preserve">010  - 111  - 010  - 001</w:t>
+                      </w:r>
+                      <w:r>
+                        <w:rPr>
+                          <w:rFonts w:ascii="Asana Math" w:hAnsi="Asana Math" w:cs="Asana Math"/>
+                        </w:rPr>
+                      </w:r>
+                      <w:r>
+                        <w:rPr>
+                          <w:rFonts w:ascii="Asana Math" w:hAnsi="Asana Math" w:eastAsia="Asana Math" w:cs="Asana Math"/>
+                          <w:highlight w:val="none"/>
+                          <w:lang w:val="es-ES"/>
+                        </w:rPr>
+                      </w:r>
+                      <w:r>
+                        <w:rPr>
+                          <w:rFonts w:ascii="Asana Math" w:hAnsi="Asana Math" w:eastAsia="Asana Math" w:cs="Asana Math"/>
+                          <w:highlight w:val="none"/>
+                          <w:lang w:val="es-ES"/>
+                        </w:rPr>
+                      </w:r>
+                    </w:p>
+                    <w:p>
+                      <w:pPr>
+                        <w:pBdr/>
+                        <w:spacing/>
+                        <w:ind/>
+                        <w:rPr>
+                          <w:rFonts w:ascii="Asana Math" w:hAnsi="Asana Math" w:cs="Asana Math"/>
+                        </w:rPr>
+                      </w:pPr>
+                      <w:r>
+                        <w:rPr>
+                          <w:rFonts w:ascii="Asana Math" w:hAnsi="Asana Math" w:eastAsia="Asana Math" w:cs="Asana Math"/>
+                          <w:highlight w:val="none"/>
+                          <w:lang w:val="es-ES"/>
+                        </w:rPr>
+                        <w:t xml:space="preserve">011</w:t>
+                      </w:r>
+                      <w:r>
+                        <w:rPr>
+                          <w:rFonts w:ascii="Asana Math" w:hAnsi="Asana Math" w:eastAsia="Asana Math" w:cs="Asana Math"/>
+                          <w:highlight w:val="none"/>
+                          <w:lang w:val="es-ES"/>
+                        </w:rPr>
+                        <w:t xml:space="preserve">  - 100  - 010  - 111</w:t>
+                      </w:r>
+                      <w:r>
+                        <w:rPr>
+                          <w:rFonts w:ascii="Asana Math" w:hAnsi="Asana Math" w:eastAsia="Asana Math" w:cs="Asana Math"/>
+                          <w:highlight w:val="none"/>
+                          <w:lang w:val="es-ES"/>
+                        </w:rPr>
+                      </w:r>
+                      <w:r>
+                        <w:rPr>
+                          <w:rFonts w:ascii="Asana Math" w:hAnsi="Asana Math" w:cs="Asana Math"/>
+                        </w:rPr>
+                      </w:r>
+                      <w:r>
+                        <w:rPr>
+                          <w:rFonts w:ascii="Asana Math" w:hAnsi="Asana Math" w:cs="Asana Math"/>
+                        </w:rPr>
+                      </w:r>
+                    </w:p>
+                  </w:txbxContent>
+                </v:textbox>
+              </v:shape>
+            </w:pict>
+          </mc:Fallback>
+        </mc:AlternateContent>
+      </w:r>
+      <w:r>
+        <w:rPr>
+          <w:rFonts w:ascii="Asana Math" w:hAnsi="Asana Math" w:cs="Asana Math"/>
+        </w:rPr>
+      </w:r>
+      <w:r>
+        <w:rPr>
+          <w:rFonts w:ascii="Asana Math" w:hAnsi="Asana Math" w:cs="Asana Math"/>
+        </w:rPr>
+      </w:r>
+      <w:r>
+        <w:rPr>
+          <w:rFonts w:ascii="Asana Math" w:hAnsi="Asana Math" w:cs="Asana Math"/>
+        </w:rPr>
+      </w:r>
+    </w:p>
+    <w:p>
+      <w:pPr>
+        <w:pBdr/>
+        <w:spacing/>
+        <w:ind/>
+        <w:jc w:val="center"/>
+        <w:rPr>
+          <w:rFonts w:ascii="Asana Math" w:hAnsi="Asana Math" w:cs="Asana Math"/>
+        </w:rPr>
+      </w:pPr>
+      <w:r>
+        <w:rPr>
+          <w:rFonts w:ascii="Asana Math" w:hAnsi="Asana Math" w:cs="Asana Math"/>
+        </w:rPr>
+      </w:r>
+      <w:r>
+        <w:rPr>
+          <w:rFonts w:ascii="Asana Math" w:hAnsi="Asana Math" w:cs="Asana Math"/>
+        </w:rPr>
+      </w:r>
+      <w:r>
+        <w:rPr>
+          <w:rFonts w:ascii="Asana Math" w:hAnsi="Asana Math" w:cs="Asana Math"/>
+        </w:rPr>
+      </w:r>
+    </w:p>
+    <w:p>
+      <w:pPr>
+        <w:pBdr/>
+        <w:spacing/>
+        <w:ind/>
+        <w:jc w:val="center"/>
+        <w:rPr>
+          <w:rFonts w:ascii="Asana Math" w:hAnsi="Asana Math" w:cs="Asana Math"/>
+        </w:rPr>
+      </w:pPr>
+      <w:r>
+        <w:rPr>
+          <w:rFonts w:ascii="Asana Math" w:hAnsi="Asana Math" w:cs="Asana Math"/>
+          <w:highlight w:val="none"/>
+          <w:lang w:val="es-ES"/>
+        </w:rPr>
+      </w:r>
+      <w:r>
+        <w:rPr>
+          <w:rFonts w:ascii="Asana Math" w:hAnsi="Asana Math" w:cs="Asana Math"/>
+          <w:highlight w:val="none"/>
+          <w:lang w:val="es-ES"/>
+        </w:rPr>
+      </w:r>
+      <w:r>
+        <w:rPr>
+          <w:rFonts w:ascii="Asana Math" w:hAnsi="Asana Math" w:cs="Asana Math"/>
+          <w:highlight w:val="none"/>
+          <w:lang w:val="es-ES"/>
+        </w:rPr>
+      </w:r>
+    </w:p>
+    <w:p>
+      <w:pPr>
+        <w:pBdr/>
+        <w:spacing/>
+        <w:ind/>
+        <w:jc w:val="left"/>
+        <w:rPr>
+          <w:rFonts w:ascii="Asana Math" w:hAnsi="Asana Math" w:cs="Asana Math"/>
+          <w:highlight w:val="none"/>
+          <w:lang w:val="es-ES"/>
+        </w:rPr>
+      </w:pPr>
+      <w:r>
+        <w:rPr>
+          <w:rFonts w:ascii="Asana Math" w:hAnsi="Asana Math" w:cs="Asana Math"/>
+          <w:highlight w:val="none"/>
+          <w:lang w:val="es-ES"/>
+        </w:rPr>
+      </w:r>
+      <w:r>
+        <w:rPr>
+          <w:rFonts w:ascii="Asana Math" w:hAnsi="Asana Math" w:cs="Asana Math"/>
+          <w:highlight w:val="none"/>
+          <w:lang w:val="es-ES"/>
+        </w:rPr>
+      </w:r>
+      <w:r>
+        <w:rPr>
+          <w:rFonts w:ascii="Asana Math" w:hAnsi="Asana Math" w:cs="Asana Math"/>
+          <w:highlight w:val="none"/>
+          <w:lang w:val="es-ES"/>
+        </w:rPr>
+      </w:r>
+    </w:p>
+    <w:p>
+      <w:pPr>
+        <w:pBdr/>
+        <w:spacing/>
+        <w:ind/>
+        <w:jc w:val="center"/>
+        <w:rPr>
+          <w:rFonts w:ascii="Asana Math" w:hAnsi="Asana Math" w:cs="Asana Math"/>
+          <w:highlight w:val="none"/>
+          <w:lang w:val="es-ES"/>
+        </w:rPr>
+      </w:pPr>
+      <w:r>
+        <w:rPr>
+          <w:rFonts w:ascii="Asana Math" w:hAnsi="Asana Math" w:cs="Asana Math"/>
+          <w:highlight w:val="none"/>
+          <w:lang w:val="es-ES"/>
+        </w:rPr>
+      </w:r>
+      <w:r>
+        <w:rPr>
+          <w:rFonts w:ascii="Asana Math" w:hAnsi="Asana Math" w:cs="Asana Math"/>
           <w:highlight w:val="none"/>
           <w:lang w:val="es-ES"/>
         </w:rPr>

</xml_diff>

<commit_message>
Seguimiento y pausa de documentación, empezare a codificar tablero y movimientos básicos de mi tetris
</commit_message>
<xml_diff>
--- a/Documentacion_Desafio1.docx
+++ b/Documentacion_Desafio1.docx
@@ -805,7 +805,7 @@
           <w:sz w:val="40"/>
           <w:szCs w:val="40"/>
           <w:highlight w:val="none"/>
-          <w:lang w:val="es-ES" w:bidi="es-ES"/>
+          <w:lang w:val="es-ES"/>
         </w:rPr>
       </w:r>
       <w:r>
@@ -894,6 +894,15 @@
           <w:lang w:val="es-ES"/>
         </w:rPr>
       </w:r>
+      <w:r>
+        <w:rPr>
+          <w:rFonts w:ascii="Asana Math" w:hAnsi="Asana Math" w:eastAsia="Asana Math" w:cs="Asana Math"/>
+          <w:sz w:val="40"/>
+          <w:szCs w:val="40"/>
+          <w:highlight w:val="none"/>
+          <w:lang w:val="es-ES"/>
+        </w:rPr>
+      </w:r>
     </w:p>
     <w:p>
       <w:pPr>
@@ -1104,34 +1113,33 @@
           <w:sz w:val="24"/>
           <w:szCs w:val="24"/>
           <w:highlight w:val="none"/>
-          <w:lang w:val="es-ES"/>
-        </w:rPr>
-      </w:r>
-    </w:p>
-    <w:p>
-      <w:pPr>
-        <w:pBdr/>
-        <w:spacing/>
-        <w:ind/>
-        <w:jc w:val="left"/>
+          <w:lang w:val="es-ES" w:bidi="es-ES"/>
+        </w:rPr>
+      </w:r>
+      <w:r>
         <w:rPr>
           <w:rFonts w:ascii="Asana Math" w:hAnsi="Asana Math" w:eastAsia="Asana Math" w:cs="Asana Math"/>
           <w:sz w:val="24"/>
           <w:szCs w:val="24"/>
           <w:highlight w:val="none"/>
-          <w:lang w:val="es-ES"/>
-        </w:rPr>
-      </w:pPr>
-      <w:r>
+          <w:lang w:val="es-ES" w:bidi="es-ES"/>
+        </w:rPr>
+      </w:r>
+    </w:p>
+    <w:p>
+      <w:pPr>
+        <w:pBdr/>
+        <w:spacing/>
+        <w:ind/>
+        <w:jc w:val="left"/>
         <w:rPr>
           <w:rFonts w:ascii="Asana Math" w:hAnsi="Asana Math" w:eastAsia="Asana Math" w:cs="Asana Math"/>
           <w:sz w:val="24"/>
           <w:szCs w:val="24"/>
           <w:highlight w:val="none"/>
-          <w:lang w:val="es-ES" w:bidi="es-ES"/>
-        </w:rPr>
-        <w:t xml:space="preserve">2.2.USO DE MEMORIA DINAMICA.......................................................................................</w:t>
-      </w:r>
+          <w:lang w:val="es-ES"/>
+        </w:rPr>
+      </w:pPr>
       <w:r>
         <w:rPr>
           <w:rFonts w:ascii="Asana Math" w:hAnsi="Asana Math" w:eastAsia="Asana Math" w:cs="Asana Math"/>
@@ -1140,6 +1148,7 @@
           <w:highlight w:val="none"/>
           <w:lang w:val="es-ES" w:bidi="es-ES"/>
         </w:rPr>
+        <w:t xml:space="preserve">2.2.USO DE MEMORIA DINAMICA.......................................................................................</w:t>
       </w:r>
       <w:r>
         <w:rPr>
@@ -1147,16 +1156,10 @@
           <w:sz w:val="24"/>
           <w:szCs w:val="24"/>
           <w:highlight w:val="none"/>
-          <w:lang w:val="es-ES" w:bidi="es-ES"/>
-        </w:rPr>
-      </w:r>
-    </w:p>
-    <w:p>
-      <w:pPr>
-        <w:pBdr/>
-        <w:spacing/>
-        <w:ind/>
-        <w:jc w:val="left"/>
+          <w:lang w:val="es-ES"/>
+        </w:rPr>
+      </w:r>
+      <w:r>
         <w:rPr>
           <w:rFonts w:ascii="Asana Math" w:hAnsi="Asana Math" w:eastAsia="Asana Math" w:cs="Asana Math"/>
           <w:sz w:val="24"/>
@@ -1164,17 +1167,22 @@
           <w:highlight w:val="none"/>
           <w:lang w:val="es-ES"/>
         </w:rPr>
-      </w:pPr>
-      <w:r>
+      </w:r>
+    </w:p>
+    <w:p>
+      <w:pPr>
+        <w:pBdr/>
+        <w:spacing/>
+        <w:ind/>
+        <w:jc w:val="left"/>
         <w:rPr>
           <w:rFonts w:ascii="Asana Math" w:hAnsi="Asana Math" w:eastAsia="Asana Math" w:cs="Asana Math"/>
           <w:sz w:val="24"/>
           <w:szCs w:val="24"/>
           <w:highlight w:val="none"/>
-          <w:lang w:val="es-ES" w:bidi="es-ES"/>
-        </w:rPr>
-        <w:t xml:space="preserve">3. PIEZAS Y SU REPRESENTACI</w:t>
-      </w:r>
+          <w:lang w:val="es-ES"/>
+        </w:rPr>
+      </w:pPr>
       <w:r>
         <w:rPr>
           <w:rFonts w:ascii="Asana Math" w:hAnsi="Asana Math" w:eastAsia="Asana Math" w:cs="Asana Math"/>
@@ -1183,7 +1191,7 @@
           <w:highlight w:val="none"/>
           <w:lang w:val="es-ES" w:bidi="es-ES"/>
         </w:rPr>
-        <w:t xml:space="preserve">ÓN.......................................................................................</w:t>
+        <w:t xml:space="preserve">3. PIEZAS Y SU REPRESENTACI</w:t>
       </w:r>
       <w:r>
         <w:rPr>
@@ -1193,6 +1201,7 @@
           <w:highlight w:val="none"/>
           <w:lang w:val="es-ES" w:bidi="es-ES"/>
         </w:rPr>
+        <w:t xml:space="preserve">ÓN.......................................................................................</w:t>
       </w:r>
       <w:r>
         <w:rPr>
@@ -1203,6 +1212,302 @@
           <w:lang w:val="es-ES"/>
         </w:rPr>
       </w:r>
+      <w:r>
+        <w:rPr>
+          <w:rFonts w:ascii="Asana Math" w:hAnsi="Asana Math" w:eastAsia="Asana Math" w:cs="Asana Math"/>
+          <w:sz w:val="24"/>
+          <w:szCs w:val="24"/>
+          <w:highlight w:val="none"/>
+          <w:lang w:val="es-ES"/>
+        </w:rPr>
+      </w:r>
+      <w:r>
+        <w:rPr>
+          <w:rFonts w:ascii="Asana Math" w:hAnsi="Asana Math" w:eastAsia="Asana Math" w:cs="Asana Math"/>
+          <w:sz w:val="24"/>
+          <w:szCs w:val="24"/>
+          <w:highlight w:val="none"/>
+          <w:lang w:val="es-ES"/>
+        </w:rPr>
+      </w:r>
+    </w:p>
+    <w:p>
+      <w:pPr>
+        <w:pBdr/>
+        <w:spacing/>
+        <w:ind/>
+        <w:jc w:val="left"/>
+        <w:rPr>
+          <w:rFonts w:ascii="Asana Math" w:hAnsi="Asana Math" w:cs="Asana Math"/>
+          <w:b w:val="0"/>
+          <w:bCs w:val="0"/>
+          <w:color w:val="000000" w:themeColor="text1"/>
+          <w:sz w:val="24"/>
+          <w:szCs w:val="24"/>
+          <w:highlight w:val="none"/>
+          <w:lang w:val="es-ES" w:bidi="es-ES"/>
+        </w:rPr>
+      </w:pPr>
+      <w:r>
+        <w:rPr>
+          <w:rFonts w:ascii="Asana Math" w:hAnsi="Asana Math" w:eastAsia="Asana Math" w:cs="Asana Math"/>
+          <w:sz w:val="24"/>
+          <w:szCs w:val="24"/>
+          <w:highlight w:val="none"/>
+          <w:lang w:val="es-ES" w:bidi="es-ES"/>
+        </w:rPr>
+        <w:t xml:space="preserve">3.1 </w:t>
+      </w:r>
+      <w:r>
+        <w:rPr>
+          <w:rFonts w:ascii="Asana Math" w:hAnsi="Asana Math" w:cs="Asana Math"/>
+          <w:b w:val="0"/>
+          <w:bCs w:val="0"/>
+          <w:color w:val="000000" w:themeColor="text1"/>
+          <w:sz w:val="24"/>
+          <w:szCs w:val="24"/>
+          <w:highlight w:val="none"/>
+          <w:lang w:val="es-ES" w:bidi="es-ES"/>
+        </w:rPr>
+        <w:t xml:space="preserve">INDEXACION Y BIT MASKING.</w:t>
+      </w:r>
+      <w:r>
+        <w:rPr>
+          <w:rFonts w:ascii="Asana Math" w:hAnsi="Asana Math" w:cs="Asana Math"/>
+          <w:b w:val="0"/>
+          <w:bCs w:val="0"/>
+          <w:color w:val="000000" w:themeColor="text1"/>
+          <w:sz w:val="24"/>
+          <w:szCs w:val="24"/>
+          <w:highlight w:val="none"/>
+          <w:lang w:val="es-ES" w:bidi="es-ES"/>
+        </w:rPr>
+        <w:t xml:space="preserve">.......................................................................................</w:t>
+      </w:r>
+      <w:r>
+        <w:rPr>
+          <w:rFonts w:ascii="Asana Math" w:hAnsi="Asana Math" w:cs="Asana Math"/>
+          <w:b w:val="0"/>
+          <w:bCs w:val="0"/>
+          <w:color w:val="000000" w:themeColor="text1"/>
+          <w:sz w:val="24"/>
+          <w:szCs w:val="24"/>
+          <w:highlight w:val="none"/>
+          <w:lang w:val="es-ES" w:bidi="es-ES"/>
+        </w:rPr>
+      </w:r>
+    </w:p>
+    <w:p>
+      <w:pPr>
+        <w:pBdr/>
+        <w:spacing/>
+        <w:ind/>
+        <w:jc w:val="left"/>
+        <w:rPr>
+          <w:rFonts w:ascii="Asana Math" w:hAnsi="Asana Math" w:cs="Asana Math"/>
+          <w:b w:val="0"/>
+          <w:bCs w:val="0"/>
+          <w:color w:val="000000" w:themeColor="text1"/>
+          <w:sz w:val="24"/>
+          <w:szCs w:val="24"/>
+          <w:highlight w:val="none"/>
+          <w:lang w:val="es-ES" w:bidi="es-ES"/>
+        </w:rPr>
+      </w:pPr>
+      <w:r>
+        <w:rPr>
+          <w:rFonts w:ascii="Asana Math" w:hAnsi="Asana Math" w:cs="Asana Math"/>
+          <w:b w:val="0"/>
+          <w:bCs w:val="0"/>
+          <w:color w:val="000000" w:themeColor="text1"/>
+          <w:sz w:val="24"/>
+          <w:szCs w:val="24"/>
+          <w:highlight w:val="none"/>
+          <w:lang w:val="es-ES" w:bidi="es-ES"/>
+        </w:rPr>
+        <w:t xml:space="preserve">3.2 ROTACI</w:t>
+      </w:r>
+      <w:r>
+        <w:rPr>
+          <w:rFonts w:ascii="Asana Math" w:hAnsi="Asana Math" w:cs="Asana Math"/>
+          <w:b w:val="0"/>
+          <w:bCs w:val="0"/>
+          <w:color w:val="000000" w:themeColor="text1"/>
+          <w:sz w:val="24"/>
+          <w:szCs w:val="24"/>
+          <w:highlight w:val="none"/>
+          <w:lang w:val="es-ES" w:bidi="es-ES"/>
+        </w:rPr>
+        <w:t xml:space="preserve">ÓN DE FICHAS......................................................................................................</w:t>
+      </w:r>
+      <w:r>
+        <w:rPr>
+          <w:rFonts w:ascii="Asana Math" w:hAnsi="Asana Math" w:cs="Asana Math"/>
+          <w:b w:val="0"/>
+          <w:bCs w:val="0"/>
+          <w:color w:val="000000" w:themeColor="text1"/>
+          <w:sz w:val="24"/>
+          <w:szCs w:val="24"/>
+          <w:highlight w:val="none"/>
+          <w:lang w:val="es-ES" w:bidi="es-ES"/>
+        </w:rPr>
+      </w:r>
+      <w:r>
+        <w:rPr>
+          <w:rFonts w:ascii="Asana Math" w:hAnsi="Asana Math" w:cs="Asana Math"/>
+          <w:b w:val="0"/>
+          <w:bCs w:val="0"/>
+          <w:color w:val="000000" w:themeColor="text1"/>
+          <w:sz w:val="24"/>
+          <w:szCs w:val="24"/>
+          <w:highlight w:val="none"/>
+          <w:lang w:val="es-ES" w:bidi="es-ES"/>
+        </w:rPr>
+      </w:r>
+    </w:p>
+    <w:p>
+      <w:pPr>
+        <w:pBdr/>
+        <w:spacing/>
+        <w:ind/>
+        <w:jc w:val="left"/>
+        <w:rPr>
+          <w:rFonts w:ascii="Asana Math" w:hAnsi="Asana Math" w:cs="Asana Math"/>
+          <w:b w:val="0"/>
+          <w:bCs w:val="0"/>
+          <w:color w:val="000000" w:themeColor="text1"/>
+          <w:sz w:val="24"/>
+          <w:szCs w:val="24"/>
+          <w:highlight w:val="none"/>
+          <w:lang w:val="es-ES" w:bidi="es-ES"/>
+        </w:rPr>
+      </w:pPr>
+      <w:r>
+        <w:rPr>
+          <w:rFonts w:ascii="Asana Math" w:hAnsi="Asana Math" w:cs="Asana Math"/>
+          <w:b w:val="0"/>
+          <w:bCs w:val="0"/>
+          <w:color w:val="000000" w:themeColor="text1"/>
+          <w:sz w:val="24"/>
+          <w:szCs w:val="24"/>
+          <w:highlight w:val="none"/>
+          <w:lang w:val="es-ES" w:bidi="es-ES"/>
+        </w:rPr>
+        <w:t xml:space="preserve">3.3 MEMORIA DINAMICA.......................................................................................................</w:t>
+      </w:r>
+      <w:r>
+        <w:rPr>
+          <w:rFonts w:ascii="Asana Math" w:hAnsi="Asana Math" w:cs="Asana Math"/>
+          <w:b w:val="0"/>
+          <w:bCs w:val="0"/>
+          <w:color w:val="000000" w:themeColor="text1"/>
+          <w:sz w:val="24"/>
+          <w:szCs w:val="24"/>
+          <w:highlight w:val="none"/>
+          <w:lang w:val="es-ES" w:bidi="es-ES"/>
+        </w:rPr>
+      </w:r>
+      <w:r>
+        <w:rPr>
+          <w:rFonts w:ascii="Asana Math" w:hAnsi="Asana Math" w:cs="Asana Math"/>
+          <w:b w:val="0"/>
+          <w:bCs w:val="0"/>
+          <w:color w:val="000000" w:themeColor="text1"/>
+          <w:sz w:val="24"/>
+          <w:szCs w:val="24"/>
+          <w:highlight w:val="none"/>
+          <w:lang w:val="es-ES" w:bidi="es-ES"/>
+        </w:rPr>
+      </w:r>
+    </w:p>
+    <w:p>
+      <w:pPr>
+        <w:pBdr/>
+        <w:spacing/>
+        <w:ind/>
+        <w:jc w:val="left"/>
+        <w:rPr>
+          <w:rFonts w:ascii="Asana Math" w:hAnsi="Asana Math" w:cs="Asana Math"/>
+          <w:b w:val="0"/>
+          <w:bCs w:val="0"/>
+          <w:color w:val="000000" w:themeColor="text1"/>
+          <w:sz w:val="24"/>
+          <w:szCs w:val="24"/>
+          <w:highlight w:val="none"/>
+          <w:lang w:val="es-ES" w:bidi="es-ES"/>
+        </w:rPr>
+      </w:pPr>
+      <w:r>
+        <w:rPr>
+          <w:rFonts w:ascii="Asana Math" w:hAnsi="Asana Math" w:cs="Asana Math"/>
+          <w:b w:val="0"/>
+          <w:bCs w:val="0"/>
+          <w:color w:val="000000" w:themeColor="text1"/>
+          <w:sz w:val="24"/>
+          <w:szCs w:val="24"/>
+          <w:highlight w:val="none"/>
+          <w:lang w:val="es-ES" w:bidi="es-ES"/>
+        </w:rPr>
+        <w:t xml:space="preserve">4. MOVIMIENTOS......................................................................................................................</w:t>
+      </w:r>
+      <w:r>
+        <w:rPr>
+          <w:rFonts w:ascii="Asana Math" w:hAnsi="Asana Math" w:cs="Asana Math"/>
+          <w:b w:val="0"/>
+          <w:bCs w:val="0"/>
+          <w:color w:val="000000" w:themeColor="text1"/>
+          <w:sz w:val="24"/>
+          <w:szCs w:val="24"/>
+          <w:highlight w:val="none"/>
+          <w:lang w:val="es-ES" w:bidi="es-ES"/>
+        </w:rPr>
+      </w:r>
+      <w:r>
+        <w:rPr>
+          <w:rFonts w:ascii="Asana Math" w:hAnsi="Asana Math" w:cs="Asana Math"/>
+          <w:b w:val="0"/>
+          <w:bCs w:val="0"/>
+          <w:color w:val="000000" w:themeColor="text1"/>
+          <w:sz w:val="24"/>
+          <w:szCs w:val="24"/>
+          <w:highlight w:val="none"/>
+          <w:lang w:val="es-ES" w:bidi="es-ES"/>
+        </w:rPr>
+      </w:r>
+    </w:p>
+    <w:p>
+      <w:pPr>
+        <w:pBdr/>
+        <w:spacing/>
+        <w:ind/>
+        <w:jc w:val="left"/>
+        <w:rPr>
+          <w:rFonts w:ascii="Asana Math" w:hAnsi="Asana Math" w:eastAsia="Asana Math" w:cs="Asana Math"/>
+          <w:sz w:val="24"/>
+          <w:szCs w:val="24"/>
+          <w:highlight w:val="none"/>
+          <w:lang w:val="es-ES"/>
+        </w:rPr>
+      </w:pPr>
+      <w:r>
+        <w:rPr>
+          <w:rFonts w:ascii="Asana Math" w:hAnsi="Asana Math" w:eastAsia="Asana Math" w:cs="Asana Math"/>
+          <w:sz w:val="24"/>
+          <w:szCs w:val="24"/>
+          <w:highlight w:val="none"/>
+          <w:lang w:val="es-ES" w:bidi="es-ES"/>
+        </w:rPr>
+      </w:r>
+      <w:r>
+        <w:rPr>
+          <w:rFonts w:ascii="Asana Math" w:hAnsi="Asana Math" w:eastAsia="Asana Math" w:cs="Asana Math"/>
+          <w:sz w:val="24"/>
+          <w:szCs w:val="24"/>
+          <w:highlight w:val="none"/>
+          <w:lang w:val="es-ES"/>
+        </w:rPr>
+      </w:r>
+      <w:r/>
     </w:p>
     <w:p>
       <w:pPr>
@@ -1759,13 +2064,7 @@
           <w:lang w:val="es-ES"/>
         </w:rPr>
       </w:r>
-    </w:p>
-    <w:p>
-      <w:pPr>
-        <w:pBdr/>
-        <w:spacing/>
-        <w:ind/>
-        <w:jc w:val="center"/>
+      <w:r>
         <w:rPr>
           <w:rFonts w:ascii="Asana Math" w:hAnsi="Asana Math" w:eastAsia="Asana Math" w:cs="Asana Math"/>
           <w:sz w:val="28"/>
@@ -1773,23 +2072,29 @@
           <w:highlight w:val="none"/>
           <w:lang w:val="es-ES"/>
         </w:rPr>
-      </w:pPr>
-      <w:r>
+      </w:r>
+    </w:p>
+    <w:p>
+      <w:pPr>
+        <w:pBdr/>
+        <w:spacing/>
+        <w:ind/>
+        <w:jc w:val="center"/>
         <w:rPr>
           <w:rFonts w:ascii="Asana Math" w:hAnsi="Asana Math" w:eastAsia="Asana Math" w:cs="Asana Math"/>
           <w:sz w:val="28"/>
           <w:szCs w:val="28"/>
           <w:highlight w:val="none"/>
-          <w:lang w:val="es-ES" w:bidi="es-ES"/>
-        </w:rPr>
-      </w:r>
+          <w:lang w:val="es-ES"/>
+        </w:rPr>
+      </w:pPr>
       <w:r>
         <w:rPr>
           <w:rFonts w:ascii="Asana Math" w:hAnsi="Asana Math" w:eastAsia="Asana Math" w:cs="Asana Math"/>
           <w:sz w:val="28"/>
           <w:szCs w:val="28"/>
           <w:highlight w:val="none"/>
-          <w:lang w:val="es-ES"/>
+          <w:lang w:val="es-ES" w:bidi="es-ES"/>
         </w:rPr>
       </w:r>
       <w:r>
@@ -1801,13 +2106,7 @@
           <w:lang w:val="es-ES"/>
         </w:rPr>
       </w:r>
-    </w:p>
-    <w:p>
-      <w:pPr>
-        <w:pBdr/>
-        <w:spacing/>
-        <w:ind/>
-        <w:jc w:val="center"/>
+      <w:r>
         <w:rPr>
           <w:rFonts w:ascii="Asana Math" w:hAnsi="Asana Math" w:eastAsia="Asana Math" w:cs="Asana Math"/>
           <w:sz w:val="28"/>
@@ -1815,17 +2114,22 @@
           <w:highlight w:val="none"/>
           <w:lang w:val="es-ES"/>
         </w:rPr>
-      </w:pPr>
-      <w:r>
+      </w:r>
+    </w:p>
+    <w:p>
+      <w:pPr>
+        <w:pBdr/>
+        <w:spacing/>
+        <w:ind/>
+        <w:jc w:val="center"/>
         <w:rPr>
           <w:rFonts w:ascii="Asana Math" w:hAnsi="Asana Math" w:eastAsia="Asana Math" w:cs="Asana Math"/>
           <w:sz w:val="28"/>
           <w:szCs w:val="28"/>
           <w:highlight w:val="none"/>
-          <w:lang w:val="es-ES" w:bidi="es-ES"/>
-        </w:rPr>
-        <w:t xml:space="preserve">¿C</w:t>
-      </w:r>
+          <w:lang w:val="es-ES"/>
+        </w:rPr>
+      </w:pPr>
       <w:r>
         <w:rPr>
           <w:rFonts w:ascii="Asana Math" w:hAnsi="Asana Math" w:eastAsia="Asana Math" w:cs="Asana Math"/>
@@ -1834,7 +2138,7 @@
           <w:highlight w:val="none"/>
           <w:lang w:val="es-ES" w:bidi="es-ES"/>
         </w:rPr>
-        <w:t xml:space="preserve">ómo puedo hacer y representar al trablero mediante caracteres “.” y “#” cumpliendo las condiciones dadas?</w:t>
+        <w:t xml:space="preserve">¿C</w:t>
       </w:r>
       <w:r>
         <w:rPr>
@@ -1844,7 +2148,7 @@
           <w:highlight w:val="none"/>
           <w:lang w:val="es-ES" w:bidi="es-ES"/>
         </w:rPr>
-        <w:t xml:space="preserve">   </w:t>
+        <w:t xml:space="preserve">ómo puedo hacer y representar al trablero mediante caracteres “.” y “#” cumpliendo las condiciones dadas?</w:t>
       </w:r>
       <w:r>
         <w:rPr>
@@ -1854,6 +2158,7 @@
           <w:highlight w:val="none"/>
           <w:lang w:val="es-ES" w:bidi="es-ES"/>
         </w:rPr>
+        <w:t xml:space="preserve">   </w:t>
       </w:r>
       <w:r>
         <w:rPr>
@@ -1864,6 +2169,15 @@
           <w:lang w:val="es-ES"/>
         </w:rPr>
       </w:r>
+      <w:r>
+        <w:rPr>
+          <w:rFonts w:ascii="Asana Math" w:hAnsi="Asana Math" w:eastAsia="Asana Math" w:cs="Asana Math"/>
+          <w:sz w:val="28"/>
+          <w:szCs w:val="28"/>
+          <w:highlight w:val="none"/>
+          <w:lang w:val="es-ES"/>
+        </w:rPr>
+      </w:r>
     </w:p>
     <w:p>
       <w:pPr>
@@ -1905,7 +2219,7 @@
           <w:sz w:val="22"/>
           <w:szCs w:val="22"/>
           <w:highlight w:val="none"/>
-          <w:lang w:val="es-ES" w:bidi="es-ES"/>
+          <w:lang w:val="es-ES"/>
         </w:rPr>
       </w:r>
       <w:r>
@@ -2292,7 +2606,9 @@
       </w:r>
       <w:r>
         <w:rPr>
-          <w:rFonts w:ascii="Asana Math" w:hAnsi="Asana Math" w:cs="Asana Math"/>
+          <w:rFonts w:ascii="Asana Math" w:hAnsi="Asana Math" w:eastAsia="Asana Math" w:cs="Asana Math"/>
+          <w:highlight w:val="none"/>
+          <w:lang w:val="es-ES"/>
         </w:rPr>
       </w:r>
       <w:r>
@@ -2391,9 +2707,7 @@
       </w:r>
       <w:r>
         <w:rPr>
-          <w:rFonts w:ascii="Asana Math" w:hAnsi="Asana Math" w:eastAsia="Asana Math" w:cs="Asana Math"/>
-          <w:highlight w:val="none"/>
-          <w:lang w:val="es-ES"/>
+          <w:rFonts w:ascii="Asana Math" w:hAnsi="Asana Math" w:cs="Asana Math"/>
         </w:rPr>
       </w:r>
       <w:r>
@@ -2479,8 +2793,9 @@
       </w:r>
       <w:r>
         <w:rPr>
-          <w:rFonts w:ascii="Asana Math" w:hAnsi="Asana Math" w:cs="Asana Math"/>
-          <w:highlight w:val="none"/>
+          <w:rFonts w:ascii="Asana Math" w:hAnsi="Asana Math" w:eastAsia="Asana Math" w:cs="Asana Math"/>
+          <w:highlight w:val="none"/>
+          <w:lang w:val="es-ES"/>
         </w:rPr>
       </w:r>
       <w:r>
@@ -2531,9 +2846,8 @@
       </w:r>
       <w:r>
         <w:rPr>
-          <w:rFonts w:ascii="Asana Math" w:hAnsi="Asana Math" w:eastAsia="Asana Math" w:cs="Asana Math"/>
-          <w:highlight w:val="none"/>
-          <w:lang w:val="es-ES"/>
+          <w:rFonts w:ascii="Asana Math" w:hAnsi="Asana Math" w:cs="Asana Math"/>
+          <w:highlight w:val="none"/>
         </w:rPr>
       </w:r>
       <w:r>
@@ -2564,7 +2878,9 @@
       </w:r>
       <w:r>
         <w:rPr>
-          <w:rFonts w:ascii="Asana Math" w:hAnsi="Asana Math" w:cs="Asana Math"/>
+          <w:rFonts w:ascii="Asana Math" w:hAnsi="Asana Math" w:eastAsia="Asana Math" w:cs="Asana Math"/>
+          <w:highlight w:val="none"/>
+          <w:lang w:val="es-ES"/>
         </w:rPr>
       </w:r>
       <w:r>
@@ -2606,6 +2922,8 @@
       <w:r>
         <w:rPr>
           <w:rFonts w:ascii="Asana Math" w:hAnsi="Asana Math" w:cs="Asana Math"/>
+          <w:highlight w:val="none"/>
+          <w:lang w:val="es-ES"/>
         </w:rPr>
       </w:r>
       <w:r>
@@ -2705,8 +3023,6 @@
       <w:r>
         <w:rPr>
           <w:rFonts w:ascii="Asana Math" w:hAnsi="Asana Math" w:cs="Asana Math"/>
-          <w:highlight w:val="none"/>
-          <w:lang w:val="es-ES"/>
         </w:rPr>
       </w:r>
       <w:r>
@@ -2790,7 +3106,9 @@
       </w:r>
       <w:r>
         <w:rPr>
-          <w:rFonts w:ascii="Asana Math" w:hAnsi="Asana Math" w:cs="Asana Math"/>
+          <w:rFonts w:ascii="Asana Math" w:hAnsi="Asana Math" w:eastAsia="Asana Math" w:cs="Asana Math"/>
+          <w:highlight w:val="none"/>
+          <w:lang w:val="es-ES"/>
         </w:rPr>
       </w:r>
       <w:r>
@@ -2831,7 +3149,9 @@
       </w:r>
       <w:r>
         <w:rPr>
-          <w:rFonts w:ascii="Asana Math" w:hAnsi="Asana Math" w:cs="Asana Math"/>
+          <w:rFonts w:ascii="Asana Math" w:hAnsi="Asana Math" w:eastAsia="Asana Math" w:cs="Asana Math"/>
+          <w:highlight w:val="none"/>
+          <w:lang w:val="es-ES"/>
         </w:rPr>
       </w:r>
       <w:r>
@@ -2882,9 +3202,7 @@
       </m:oMath>
       <w:r>
         <w:rPr>
-          <w:rFonts w:ascii="Asana Math" w:hAnsi="Asana Math" w:eastAsia="Asana Math" w:cs="Asana Math"/>
-          <w:highlight w:val="none"/>
-          <w:lang w:val="es-ES"/>
+          <w:rFonts w:ascii="Asana Math" w:hAnsi="Asana Math" w:cs="Asana Math"/>
         </w:rPr>
       </w:r>
       <w:r>
@@ -2901,8 +3219,8 @@
         <w:jc w:val="center"/>
         <w:rPr>
           <w:rFonts w:ascii="Asana Math" w:hAnsi="Asana Math" w:eastAsia="Asana Math" w:cs="Asana Math"/>
-          <w:sz w:val="28"/>
-          <w:szCs w:val="28"/>
+          <w:sz w:val="24"/>
+          <w:szCs w:val="24"/>
           <w:highlight w:val="none"/>
           <w:lang w:val="es-ES" w:bidi="es-ES"/>
         </w:rPr>
@@ -2910,8 +3228,8 @@
       <w:r>
         <w:rPr>
           <w:rFonts w:ascii="Asana Math" w:hAnsi="Asana Math" w:eastAsia="Asana Math" w:cs="Asana Math"/>
-          <w:sz w:val="28"/>
-          <w:szCs w:val="28"/>
+          <w:sz w:val="24"/>
+          <w:szCs w:val="24"/>
           <w:highlight w:val="none"/>
           <w:lang w:val="es-ES" w:bidi="es-ES"/>
         </w:rPr>
@@ -2920,8 +3238,8 @@
       <w:r>
         <w:rPr>
           <w:rFonts w:ascii="Asana Math" w:hAnsi="Asana Math" w:eastAsia="Asana Math" w:cs="Asana Math"/>
-          <w:sz w:val="28"/>
-          <w:szCs w:val="28"/>
+          <w:sz w:val="24"/>
+          <w:szCs w:val="24"/>
           <w:highlight w:val="none"/>
           <w:lang w:val="es-ES" w:bidi="es-ES"/>
         </w:rPr>
@@ -2930,17 +3248,17 @@
       <w:r>
         <w:rPr>
           <w:rFonts w:ascii="Asana Math" w:hAnsi="Asana Math" w:eastAsia="Asana Math" w:cs="Asana Math"/>
-          <w:sz w:val="28"/>
-          <w:szCs w:val="28"/>
-          <w:highlight w:val="none"/>
-          <w:lang w:val="es-ES"/>
+          <w:sz w:val="24"/>
+          <w:szCs w:val="24"/>
+          <w:highlight w:val="none"/>
+          <w:lang w:val="es-ES" w:bidi="es-ES"/>
         </w:rPr>
       </w:r>
       <w:r>
         <w:rPr>
           <w:rFonts w:ascii="Asana Math" w:hAnsi="Asana Math" w:eastAsia="Asana Math" w:cs="Asana Math"/>
-          <w:sz w:val="28"/>
-          <w:szCs w:val="28"/>
+          <w:sz w:val="24"/>
+          <w:szCs w:val="24"/>
           <w:highlight w:val="none"/>
           <w:lang w:val="es-ES" w:bidi="es-ES"/>
         </w:rPr>
@@ -3129,7 +3447,6 @@
           <w:sz w:val="22"/>
           <w:szCs w:val="22"/>
           <w:highlight w:val="none"/>
-          <w:lang w:val="es-ES" w:bidi="es-ES"/>
         </w:rPr>
       </w:r>
       <w:r>
@@ -3244,11 +3561,10 @@
       </m:oMathPara>
       <w:r>
         <w:rPr>
-          <w:rFonts w:ascii="Asana Math" w:hAnsi="Asana Math" w:eastAsia="Asana Math" w:cs="Asana Math"/>
+          <w:rFonts w:ascii="Cambria Math" w:hAnsi="Cambria Math" w:eastAsia="Cambria Math" w:cs="Cambria Math"/>
           <w:sz w:val="22"/>
           <w:szCs w:val="22"/>
           <w:highlight w:val="none"/>
-          <w:lang w:val="es-ES"/>
         </w:rPr>
       </w:r>
       <w:r>
@@ -3463,7 +3779,7 @@
           <w:sz w:val="22"/>
           <w:szCs w:val="22"/>
           <w:highlight w:val="none"/>
-          <w:lang w:val="es-ES"/>
+          <w:lang w:val="es-ES" w:bidi="es-ES"/>
         </w:rPr>
       </w:r>
       <w:r>
@@ -3522,8 +3838,8 @@
         <w:jc w:val="center"/>
         <w:rPr>
           <w:rFonts w:ascii="Asana Math" w:hAnsi="Asana Math" w:eastAsia="Asana Math" w:cs="Asana Math"/>
-          <w:sz w:val="28"/>
-          <w:szCs w:val="28"/>
+          <w:sz w:val="24"/>
+          <w:szCs w:val="24"/>
           <w:highlight w:val="none"/>
           <w:lang w:val="es-ES"/>
         </w:rPr>
@@ -3531,8 +3847,8 @@
       <w:r>
         <w:rPr>
           <w:rFonts w:ascii="Asana Math" w:hAnsi="Asana Math" w:eastAsia="Asana Math" w:cs="Asana Math"/>
-          <w:sz w:val="28"/>
-          <w:szCs w:val="28"/>
+          <w:sz w:val="24"/>
+          <w:szCs w:val="24"/>
           <w:lang w:val="es-ES"/>
         </w:rPr>
         <w:t xml:space="preserve">USO DE MEMORIA DINAMICA</w:t>
@@ -3540,8 +3856,8 @@
       <w:r>
         <w:rPr>
           <w:rFonts w:ascii="Asana Math" w:hAnsi="Asana Math" w:cs="Asana Math"/>
-          <w:sz w:val="28"/>
-          <w:szCs w:val="28"/>
+          <w:sz w:val="24"/>
+          <w:szCs w:val="24"/>
           <w:lang w:val="es-ES"/>
         </w:rPr>
         <w:t xml:space="preserve">.</w:t>
@@ -3549,8 +3865,17 @@
       <w:r>
         <w:rPr>
           <w:rFonts w:ascii="Asana Math" w:hAnsi="Asana Math" w:eastAsia="Asana Math" w:cs="Asana Math"/>
-          <w:sz w:val="28"/>
-          <w:szCs w:val="28"/>
+          <w:sz w:val="24"/>
+          <w:szCs w:val="24"/>
+          <w:highlight w:val="none"/>
+          <w:lang w:val="es-ES"/>
+        </w:rPr>
+      </w:r>
+      <w:r>
+        <w:rPr>
+          <w:rFonts w:ascii="Asana Math" w:hAnsi="Asana Math" w:eastAsia="Asana Math" w:cs="Asana Math"/>
+          <w:sz w:val="24"/>
+          <w:szCs w:val="24"/>
           <w:highlight w:val="none"/>
           <w:lang w:val="es-ES"/>
         </w:rPr>
@@ -3629,7 +3954,7 @@
           <w:sz w:val="22"/>
           <w:szCs w:val="22"/>
           <w:highlight w:val="none"/>
-          <w:lang w:val="es-ES"/>
+          <w:lang w:val="es-ES" w:bidi="es-ES"/>
         </w:rPr>
       </w:r>
       <w:r>
@@ -3798,35 +4123,27 @@
       </m:oMathPara>
       <w:r>
         <w:rPr>
-          <w:rFonts w:ascii="Asana Math" w:hAnsi="Asana Math" w:cs="Asana Math"/>
-          <w:sz w:val="18"/>
-          <w:szCs w:val="18"/>
-        </w:rPr>
-      </w:r>
-      <w:r>
-        <w:rPr>
           <w:rFonts w:ascii="Asana Math" w:hAnsi="Asana Math" w:eastAsia="Asana Math" w:cs="Asana Math"/>
           <w:sz w:val="22"/>
           <w:szCs w:val="22"/>
           <w:highlight w:val="none"/>
         </w:rPr>
       </w:r>
-    </w:p>
-    <w:p>
-      <w:pPr>
-        <w:pBdr/>
-        <w:spacing/>
-        <w:ind/>
-        <w:jc w:val="center"/>
+      <w:r>
         <w:rPr>
           <w:rFonts w:ascii="Asana Math" w:hAnsi="Asana Math" w:eastAsia="Asana Math" w:cs="Asana Math"/>
           <w:sz w:val="22"/>
           <w:szCs w:val="22"/>
           <w:highlight w:val="none"/>
-          <w:lang w:val="es-ES"/>
-        </w:rPr>
-      </w:pPr>
-      <w:r>
+        </w:rPr>
+      </w:r>
+    </w:p>
+    <w:p>
+      <w:pPr>
+        <w:pBdr/>
+        <w:spacing/>
+        <w:ind/>
+        <w:jc w:val="center"/>
         <w:rPr>
           <w:rFonts w:ascii="Asana Math" w:hAnsi="Asana Math" w:eastAsia="Asana Math" w:cs="Asana Math"/>
           <w:sz w:val="22"/>
@@ -3834,13 +4151,24 @@
           <w:highlight w:val="none"/>
           <w:lang w:val="es-ES"/>
         </w:rPr>
+      </w:pPr>
+      <w:r>
+        <w:rPr>
+          <w:rFonts w:ascii="Asana Math" w:hAnsi="Asana Math" w:eastAsia="Asana Math" w:cs="Asana Math"/>
+          <w:sz w:val="22"/>
+          <w:szCs w:val="22"/>
+          <w:highlight w:val="none"/>
+          <w:lang w:val="es-ES"/>
+        </w:rPr>
         <w:t xml:space="preserve">Luego reservo los bis que utilizare para cada fila </w:t>
       </w:r>
       <w:r>
         <w:rPr>
-          <w:rFonts w:ascii="Asana Math" w:hAnsi="Asana Math" w:cs="Asana Math"/>
-          <w:sz w:val="18"/>
-          <w:szCs w:val="18"/>
+          <w:rFonts w:ascii="Asana Math" w:hAnsi="Asana Math" w:eastAsia="Asana Math" w:cs="Asana Math"/>
+          <w:sz w:val="22"/>
+          <w:szCs w:val="22"/>
+          <w:highlight w:val="none"/>
+          <w:lang w:val="es-ES"/>
         </w:rPr>
       </w:r>
       <w:r>
@@ -4007,6 +4335,7 @@
           <w:sz w:val="22"/>
           <w:szCs w:val="22"/>
           <w:highlight w:val="none"/>
+          <w:lang w:val="es-ES"/>
         </w:rPr>
       </w:r>
       <w:r>
@@ -4123,7 +4452,6 @@
           <w:sz w:val="22"/>
           <w:szCs w:val="22"/>
           <w:highlight w:val="none"/>
-          <w:lang w:val="es-ES"/>
         </w:rPr>
       </w:r>
       <w:r>
@@ -4407,6 +4735,15 @@
           <w:lang w:val="es-ES"/>
         </w:rPr>
       </w:r>
+      <w:r>
+        <w:rPr>
+          <w:rFonts w:ascii="Asana Math" w:hAnsi="Asana Math" w:eastAsia="Asana Math" w:cs="Asana Math"/>
+          <w:sz w:val="28"/>
+          <w:szCs w:val="28"/>
+          <w:highlight w:val="none"/>
+          <w:lang w:val="es-ES"/>
+        </w:rPr>
+      </w:r>
     </w:p>
     <w:p>
       <w:pPr>
@@ -4497,10 +4834,19 @@
       <w:r>
         <w:rPr>
           <w:rFonts w:ascii="Asana Math" w:hAnsi="Asana Math" w:eastAsia="Asana Math" w:cs="Asana Math"/>
-          <w:sz w:val="18"/>
-          <w:szCs w:val="18"/>
-          <w:highlight w:val="none"/>
-          <w:lang w:val="es-ES"/>
+          <w:sz w:val="22"/>
+          <w:szCs w:val="22"/>
+          <w:highlight w:val="none"/>
+          <w:lang w:val="es-ES" w:bidi="es-ES"/>
+        </w:rPr>
+      </w:r>
+      <w:r>
+        <w:rPr>
+          <w:rFonts w:ascii="Asana Math" w:hAnsi="Asana Math" w:eastAsia="Asana Math" w:cs="Asana Math"/>
+          <w:sz w:val="22"/>
+          <w:szCs w:val="22"/>
+          <w:highlight w:val="none"/>
+          <w:lang w:val="es-ES" w:bidi="es-ES"/>
         </w:rPr>
       </w:r>
     </w:p>
@@ -4581,6 +4927,19 @@
       <w:r>
         <w:rPr>
           <w:rFonts w:ascii="Asana Math" w:hAnsi="Asana Math" w:eastAsia="Asana Math" w:cs="Asana Math"/>
+          <w:b w:val="0"/>
+          <w:bCs w:val="0"/>
+          <w:sz w:val="22"/>
+          <w:szCs w:val="22"/>
+          <w:highlight w:val="none"/>
+          <w:lang w:val="es-ES" w:bidi="es-ES"/>
+        </w:rPr>
+      </w:r>
+      <w:r>
+        <w:rPr>
+          <w:rFonts w:ascii="Asana Math" w:hAnsi="Asana Math" w:eastAsia="Asana Math" w:cs="Asana Math"/>
+          <w:b w:val="0"/>
+          <w:bCs w:val="0"/>
           <w:sz w:val="22"/>
           <w:szCs w:val="22"/>
           <w:highlight w:val="none"/>
@@ -4685,8 +5044,6 @@
       <w:r>
         <w:rPr>
           <w:rFonts w:ascii="Asana Math" w:hAnsi="Asana Math" w:eastAsia="Asana Math" w:cs="Asana Math"/>
-          <w:b w:val="0"/>
-          <w:bCs w:val="0"/>
           <w:sz w:val="22"/>
           <w:szCs w:val="22"/>
           <w:highlight w:val="none"/>
@@ -4696,19 +5053,6 @@
       <w:r>
         <w:rPr>
           <w:rFonts w:ascii="Asana Math" w:hAnsi="Asana Math" w:eastAsia="Asana Math" w:cs="Asana Math"/>
-          <w:b w:val="0"/>
-          <w:bCs w:val="0"/>
-          <w:sz w:val="22"/>
-          <w:szCs w:val="22"/>
-          <w:highlight w:val="none"/>
-          <w:lang w:val="es-ES" w:bidi="es-ES"/>
-        </w:rPr>
-      </w:r>
-      <w:r>
-        <w:rPr>
-          <w:rFonts w:ascii="Asana Math" w:hAnsi="Asana Math" w:eastAsia="Asana Math" w:cs="Asana Math"/>
-          <w:b w:val="0"/>
-          <w:bCs w:val="0"/>
           <w:sz w:val="22"/>
           <w:szCs w:val="22"/>
           <w:highlight w:val="none"/>
@@ -4800,6 +5144,13 @@
           <w:lang w:val="es-ES"/>
         </w:rPr>
         <w:t xml:space="preserve">.</w:t>
+      </w:r>
+      <w:r>
+        <w:rPr>
+          <w:rFonts w:ascii="Asana Math" w:hAnsi="Asana Math" w:cs="Asana Math"/>
+          <w:highlight w:val="none"/>
+          <w:lang w:val="es-ES"/>
+        </w:rPr>
       </w:r>
       <w:r>
         <w:rPr>
@@ -4879,13 +5230,30 @@
                             <w:r>
                               <w:rPr>
                                 <w:rFonts w:ascii="Asana Math" w:hAnsi="Asana Math" w:eastAsia="Asana Math" w:cs="Asana Math"/>
+                                <w:highlight w:val="yellow"/>
                                 <w:lang w:val="es-ES"/>
                               </w:rPr>
-                              <w:t xml:space="preserve">0000  - 0010</w:t>
+                              <w:t xml:space="preserve">0000</w:t>
                             </w:r>
                             <w:r>
                               <w:rPr>
-                                <w:rFonts w:ascii="Asana Math" w:hAnsi="Asana Math" w:cs="Asana Math"/>
+                                <w:rFonts w:ascii="Asana Math" w:hAnsi="Asana Math" w:eastAsia="Asana Math" w:cs="Asana Math"/>
+                                <w:lang w:val="es-ES"/>
+                              </w:rPr>
+                              <w:t xml:space="preserve">  - 0010</w:t>
+                            </w:r>
+                            <w:r>
+                              <w:rPr>
+                                <w:rFonts w:ascii="Asana Math" w:hAnsi="Asana Math" w:eastAsia="Asana Math" w:cs="Asana Math"/>
+                                <w:highlight w:val="none"/>
+                                <w:lang w:val="es-ES"/>
+                              </w:rPr>
+                            </w:r>
+                            <w:r>
+                              <w:rPr>
+                                <w:rFonts w:ascii="Asana Math" w:hAnsi="Asana Math" w:eastAsia="Asana Math" w:cs="Asana Math"/>
+                                <w:highlight w:val="none"/>
+                                <w:lang w:val="es-ES"/>
                               </w:rPr>
                             </w:r>
                           </w:p>
@@ -4903,14 +5271,31 @@
                             <w:r>
                               <w:rPr>
                                 <w:rFonts w:ascii="Asana Math" w:hAnsi="Asana Math" w:eastAsia="Asana Math" w:cs="Asana Math"/>
+                                <w:highlight w:val="yellow"/>
+                                <w:lang w:val="es-ES"/>
+                              </w:rPr>
+                              <w:t xml:space="preserve">1111</w:t>
+                            </w:r>
+                            <w:r>
+                              <w:rPr>
+                                <w:rFonts w:ascii="Asana Math" w:hAnsi="Asana Math" w:eastAsia="Asana Math" w:cs="Asana Math"/>
                                 <w:highlight w:val="none"/>
                                 <w:lang w:val="es-ES"/>
                               </w:rPr>
-                              <w:t xml:space="preserve">1111  - 0010</w:t>
+                              <w:t xml:space="preserve">  - 0010</w:t>
                             </w:r>
                             <w:r>
                               <w:rPr>
-                                <w:rFonts w:ascii="Asana Math" w:hAnsi="Asana Math" w:cs="Asana Math"/>
+                                <w:rFonts w:ascii="Asana Math" w:hAnsi="Asana Math" w:eastAsia="Asana Math" w:cs="Asana Math"/>
+                                <w:highlight w:val="none"/>
+                                <w:lang w:val="es-ES"/>
+                              </w:rPr>
+                            </w:r>
+                            <w:r>
+                              <w:rPr>
+                                <w:rFonts w:ascii="Asana Math" w:hAnsi="Asana Math" w:eastAsia="Asana Math" w:cs="Asana Math"/>
+                                <w:highlight w:val="none"/>
+                                <w:lang w:val="es-ES"/>
                               </w:rPr>
                             </w:r>
                           </w:p>
@@ -4928,14 +5313,31 @@
                             <w:r>
                               <w:rPr>
                                 <w:rFonts w:ascii="Asana Math" w:hAnsi="Asana Math" w:eastAsia="Asana Math" w:cs="Asana Math"/>
+                                <w:highlight w:val="yellow"/>
+                                <w:lang w:val="es-ES"/>
+                              </w:rPr>
+                              <w:t xml:space="preserve">0000</w:t>
+                            </w:r>
+                            <w:r>
+                              <w:rPr>
+                                <w:rFonts w:ascii="Asana Math" w:hAnsi="Asana Math" w:eastAsia="Asana Math" w:cs="Asana Math"/>
                                 <w:highlight w:val="none"/>
                                 <w:lang w:val="es-ES"/>
                               </w:rPr>
-                              <w:t xml:space="preserve">0000  - 0010</w:t>
+                              <w:t xml:space="preserve">  - 0010</w:t>
                             </w:r>
                             <w:r>
                               <w:rPr>
-                                <w:rFonts w:ascii="Asana Math" w:hAnsi="Asana Math" w:cs="Asana Math"/>
+                                <w:rFonts w:ascii="Asana Math" w:hAnsi="Asana Math" w:eastAsia="Asana Math" w:cs="Asana Math"/>
+                                <w:highlight w:val="none"/>
+                                <w:lang w:val="es-ES"/>
+                              </w:rPr>
+                            </w:r>
+                            <w:r>
+                              <w:rPr>
+                                <w:rFonts w:ascii="Asana Math" w:hAnsi="Asana Math" w:eastAsia="Asana Math" w:cs="Asana Math"/>
+                                <w:highlight w:val="none"/>
+                                <w:lang w:val="es-ES"/>
                               </w:rPr>
                             </w:r>
                           </w:p>
@@ -4951,16 +5353,27 @@
                             <w:r>
                               <w:rPr>
                                 <w:rFonts w:ascii="Asana Math" w:hAnsi="Asana Math" w:eastAsia="Asana Math" w:cs="Asana Math"/>
-                                <w:highlight w:val="none"/>
+                                <w:highlight w:val="yellow"/>
                                 <w:lang w:val="es-ES"/>
                               </w:rPr>
-                              <w:t xml:space="preserve">0000  - 0010</w:t>
+                              <w:t xml:space="preserve">0000</w:t>
                             </w:r>
                             <w:r>
                               <w:rPr>
                                 <w:rFonts w:ascii="Asana Math" w:hAnsi="Asana Math" w:eastAsia="Asana Math" w:cs="Asana Math"/>
                                 <w:highlight w:val="none"/>
                                 <w:lang w:val="es-ES"/>
+                              </w:rPr>
+                              <w:t xml:space="preserve">  - 0010</w:t>
+                            </w:r>
+                            <w:r>
+                              <w:rPr>
+                                <w:rFonts w:ascii="Asana Math" w:hAnsi="Asana Math" w:cs="Asana Math"/>
+                              </w:rPr>
+                            </w:r>
+                            <w:r>
+                              <w:rPr>
+                                <w:rFonts w:ascii="Asana Math" w:hAnsi="Asana Math" w:cs="Asana Math"/>
                               </w:rPr>
                             </w:r>
                           </w:p>
@@ -4992,13 +5405,30 @@
                       <w:r>
                         <w:rPr>
                           <w:rFonts w:ascii="Asana Math" w:hAnsi="Asana Math" w:eastAsia="Asana Math" w:cs="Asana Math"/>
+                          <w:highlight w:val="yellow"/>
                           <w:lang w:val="es-ES"/>
                         </w:rPr>
-                        <w:t xml:space="preserve">0000  - 0010</w:t>
+                        <w:t xml:space="preserve">0000</w:t>
                       </w:r>
                       <w:r>
                         <w:rPr>
-                          <w:rFonts w:ascii="Asana Math" w:hAnsi="Asana Math" w:cs="Asana Math"/>
+                          <w:rFonts w:ascii="Asana Math" w:hAnsi="Asana Math" w:eastAsia="Asana Math" w:cs="Asana Math"/>
+                          <w:lang w:val="es-ES"/>
+                        </w:rPr>
+                        <w:t xml:space="preserve">  - 0010</w:t>
+                      </w:r>
+                      <w:r>
+                        <w:rPr>
+                          <w:rFonts w:ascii="Asana Math" w:hAnsi="Asana Math" w:eastAsia="Asana Math" w:cs="Asana Math"/>
+                          <w:highlight w:val="none"/>
+                          <w:lang w:val="es-ES"/>
+                        </w:rPr>
+                      </w:r>
+                      <w:r>
+                        <w:rPr>
+                          <w:rFonts w:ascii="Asana Math" w:hAnsi="Asana Math" w:eastAsia="Asana Math" w:cs="Asana Math"/>
+                          <w:highlight w:val="none"/>
+                          <w:lang w:val="es-ES"/>
                         </w:rPr>
                       </w:r>
                     </w:p>
@@ -5016,14 +5446,31 @@
                       <w:r>
                         <w:rPr>
                           <w:rFonts w:ascii="Asana Math" w:hAnsi="Asana Math" w:eastAsia="Asana Math" w:cs="Asana Math"/>
+                          <w:highlight w:val="yellow"/>
+                          <w:lang w:val="es-ES"/>
+                        </w:rPr>
+                        <w:t xml:space="preserve">1111</w:t>
+                      </w:r>
+                      <w:r>
+                        <w:rPr>
+                          <w:rFonts w:ascii="Asana Math" w:hAnsi="Asana Math" w:eastAsia="Asana Math" w:cs="Asana Math"/>
                           <w:highlight w:val="none"/>
                           <w:lang w:val="es-ES"/>
                         </w:rPr>
-                        <w:t xml:space="preserve">1111  - 0010</w:t>
+                        <w:t xml:space="preserve">  - 0010</w:t>
                       </w:r>
                       <w:r>
                         <w:rPr>
-                          <w:rFonts w:ascii="Asana Math" w:hAnsi="Asana Math" w:cs="Asana Math"/>
+                          <w:rFonts w:ascii="Asana Math" w:hAnsi="Asana Math" w:eastAsia="Asana Math" w:cs="Asana Math"/>
+                          <w:highlight w:val="none"/>
+                          <w:lang w:val="es-ES"/>
+                        </w:rPr>
+                      </w:r>
+                      <w:r>
+                        <w:rPr>
+                          <w:rFonts w:ascii="Asana Math" w:hAnsi="Asana Math" w:eastAsia="Asana Math" w:cs="Asana Math"/>
+                          <w:highlight w:val="none"/>
+                          <w:lang w:val="es-ES"/>
                         </w:rPr>
                       </w:r>
                     </w:p>
@@ -5041,14 +5488,31 @@
                       <w:r>
                         <w:rPr>
                           <w:rFonts w:ascii="Asana Math" w:hAnsi="Asana Math" w:eastAsia="Asana Math" w:cs="Asana Math"/>
+                          <w:highlight w:val="yellow"/>
+                          <w:lang w:val="es-ES"/>
+                        </w:rPr>
+                        <w:t xml:space="preserve">0000</w:t>
+                      </w:r>
+                      <w:r>
+                        <w:rPr>
+                          <w:rFonts w:ascii="Asana Math" w:hAnsi="Asana Math" w:eastAsia="Asana Math" w:cs="Asana Math"/>
                           <w:highlight w:val="none"/>
                           <w:lang w:val="es-ES"/>
                         </w:rPr>
-                        <w:t xml:space="preserve">0000  - 0010</w:t>
+                        <w:t xml:space="preserve">  - 0010</w:t>
                       </w:r>
                       <w:r>
                         <w:rPr>
-                          <w:rFonts w:ascii="Asana Math" w:hAnsi="Asana Math" w:cs="Asana Math"/>
+                          <w:rFonts w:ascii="Asana Math" w:hAnsi="Asana Math" w:eastAsia="Asana Math" w:cs="Asana Math"/>
+                          <w:highlight w:val="none"/>
+                          <w:lang w:val="es-ES"/>
+                        </w:rPr>
+                      </w:r>
+                      <w:r>
+                        <w:rPr>
+                          <w:rFonts w:ascii="Asana Math" w:hAnsi="Asana Math" w:eastAsia="Asana Math" w:cs="Asana Math"/>
+                          <w:highlight w:val="none"/>
+                          <w:lang w:val="es-ES"/>
                         </w:rPr>
                       </w:r>
                     </w:p>
@@ -5064,16 +5528,27 @@
                       <w:r>
                         <w:rPr>
                           <w:rFonts w:ascii="Asana Math" w:hAnsi="Asana Math" w:eastAsia="Asana Math" w:cs="Asana Math"/>
-                          <w:highlight w:val="none"/>
+                          <w:highlight w:val="yellow"/>
                           <w:lang w:val="es-ES"/>
                         </w:rPr>
-                        <w:t xml:space="preserve">0000  - 0010</w:t>
+                        <w:t xml:space="preserve">0000</w:t>
                       </w:r>
                       <w:r>
                         <w:rPr>
                           <w:rFonts w:ascii="Asana Math" w:hAnsi="Asana Math" w:eastAsia="Asana Math" w:cs="Asana Math"/>
                           <w:highlight w:val="none"/>
                           <w:lang w:val="es-ES"/>
+                        </w:rPr>
+                        <w:t xml:space="preserve">  - 0010</w:t>
+                      </w:r>
+                      <w:r>
+                        <w:rPr>
+                          <w:rFonts w:ascii="Asana Math" w:hAnsi="Asana Math" w:cs="Asana Math"/>
+                        </w:rPr>
+                      </w:r>
+                      <w:r>
+                        <w:rPr>
+                          <w:rFonts w:ascii="Asana Math" w:hAnsi="Asana Math" w:cs="Asana Math"/>
                         </w:rPr>
                       </w:r>
                     </w:p>
@@ -5106,9 +5581,27 @@
           <w:lang w:val="es-ES" w:bidi="es-ES"/>
         </w:rPr>
       </w:pPr>
-      <w:r/>
-      <w:r/>
-      <w:r/>
+      <w:r>
+        <w:rPr>
+          <w:rFonts w:ascii="Asana Math" w:hAnsi="Asana Math" w:cs="Asana Math"/>
+          <w:highlight w:val="none"/>
+          <w:lang w:val="es-ES" w:bidi="es-ES"/>
+        </w:rPr>
+      </w:r>
+      <w:r>
+        <w:rPr>
+          <w:rFonts w:ascii="Asana Math" w:hAnsi="Asana Math" w:cs="Asana Math"/>
+          <w:highlight w:val="none"/>
+          <w:lang w:val="es-ES" w:bidi="es-ES"/>
+        </w:rPr>
+      </w:r>
+      <w:r>
+        <w:rPr>
+          <w:rFonts w:ascii="Asana Math" w:hAnsi="Asana Math" w:cs="Asana Math"/>
+          <w:highlight w:val="none"/>
+          <w:lang w:val="es-ES" w:bidi="es-ES"/>
+        </w:rPr>
+      </w:r>
     </w:p>
     <w:p>
       <w:pPr>
@@ -5212,20 +5705,28 @@
                               <w:ind/>
                               <w:rPr>
                                 <w:rFonts w:ascii="Asana Math" w:hAnsi="Asana Math" w:eastAsia="Asana Math" w:cs="Asana Math"/>
-                                <w:highlight w:val="none"/>
-                                <w:lang w:val="es-ES"/>
+                                <w:highlight w:val="yellow"/>
                               </w:rPr>
                             </w:pPr>
                             <w:r>
                               <w:rPr>
                                 <w:rFonts w:ascii="Asana Math" w:hAnsi="Asana Math" w:eastAsia="Asana Math" w:cs="Asana Math"/>
+                                <w:highlight w:val="yellow"/>
                                 <w:lang w:val="es-ES"/>
                               </w:rPr>
                               <w:t xml:space="preserve"> 11</w:t>
                             </w:r>
                             <w:r>
                               <w:rPr>
-                                <w:rFonts w:ascii="Asana Math" w:hAnsi="Asana Math" w:cs="Asana Math"/>
+                                <w:rFonts w:ascii="Asana Math" w:hAnsi="Asana Math" w:eastAsia="Asana Math" w:cs="Asana Math"/>
+                                <w:highlight w:val="yellow"/>
+                                <w:lang w:val="es-ES"/>
+                              </w:rPr>
+                            </w:r>
+                            <w:r>
+                              <w:rPr>
+                                <w:rFonts w:ascii="Asana Math" w:hAnsi="Asana Math" w:eastAsia="Asana Math" w:cs="Asana Math"/>
+                                <w:highlight w:val="yellow"/>
                               </w:rPr>
                             </w:r>
                           </w:p>
@@ -5236,28 +5737,27 @@
                               <w:ind/>
                               <w:rPr>
                                 <w:rFonts w:ascii="Asana Math" w:hAnsi="Asana Math" w:cs="Asana Math"/>
+                                <w:highlight w:val="yellow"/>
                               </w:rPr>
                             </w:pPr>
                             <w:r>
                               <w:rPr>
                                 <w:rFonts w:ascii="Asana Math" w:hAnsi="Asana Math" w:eastAsia="Asana Math" w:cs="Asana Math"/>
-                                <w:highlight w:val="none"/>
+                                <w:highlight w:val="yellow"/>
                                 <w:lang w:val="es-ES"/>
                               </w:rPr>
                               <w:t xml:space="preserve"> 11</w:t>
                             </w:r>
                             <w:r>
                               <w:rPr>
-                                <w:rFonts w:ascii="Asana Math" w:hAnsi="Asana Math" w:eastAsia="Asana Math" w:cs="Asana Math"/>
-                                <w:highlight w:val="none"/>
-                                <w:lang w:val="es-ES"/>
+                                <w:rFonts w:ascii="Asana Math" w:hAnsi="Asana Math" w:cs="Asana Math"/>
+                                <w:highlight w:val="yellow"/>
                               </w:rPr>
                             </w:r>
                             <w:r>
                               <w:rPr>
-                                <w:rFonts w:ascii="Asana Math" w:hAnsi="Asana Math" w:eastAsia="Asana Math" w:cs="Asana Math"/>
-                                <w:highlight w:val="none"/>
-                                <w:lang w:val="es-ES"/>
+                                <w:rFonts w:ascii="Asana Math" w:hAnsi="Asana Math" w:cs="Asana Math"/>
+                                <w:highlight w:val="yellow"/>
                               </w:rPr>
                             </w:r>
                           </w:p>
@@ -5282,20 +5782,28 @@
                         <w:ind/>
                         <w:rPr>
                           <w:rFonts w:ascii="Asana Math" w:hAnsi="Asana Math" w:eastAsia="Asana Math" w:cs="Asana Math"/>
-                          <w:highlight w:val="none"/>
-                          <w:lang w:val="es-ES"/>
+                          <w:highlight w:val="yellow"/>
                         </w:rPr>
                       </w:pPr>
                       <w:r>
                         <w:rPr>
                           <w:rFonts w:ascii="Asana Math" w:hAnsi="Asana Math" w:eastAsia="Asana Math" w:cs="Asana Math"/>
+                          <w:highlight w:val="yellow"/>
                           <w:lang w:val="es-ES"/>
                         </w:rPr>
                         <w:t xml:space="preserve"> 11</w:t>
                       </w:r>
                       <w:r>
                         <w:rPr>
-                          <w:rFonts w:ascii="Asana Math" w:hAnsi="Asana Math" w:cs="Asana Math"/>
+                          <w:rFonts w:ascii="Asana Math" w:hAnsi="Asana Math" w:eastAsia="Asana Math" w:cs="Asana Math"/>
+                          <w:highlight w:val="yellow"/>
+                          <w:lang w:val="es-ES"/>
+                        </w:rPr>
+                      </w:r>
+                      <w:r>
+                        <w:rPr>
+                          <w:rFonts w:ascii="Asana Math" w:hAnsi="Asana Math" w:eastAsia="Asana Math" w:cs="Asana Math"/>
+                          <w:highlight w:val="yellow"/>
                         </w:rPr>
                       </w:r>
                     </w:p>
@@ -5306,28 +5814,27 @@
                         <w:ind/>
                         <w:rPr>
                           <w:rFonts w:ascii="Asana Math" w:hAnsi="Asana Math" w:cs="Asana Math"/>
+                          <w:highlight w:val="yellow"/>
                         </w:rPr>
                       </w:pPr>
                       <w:r>
                         <w:rPr>
                           <w:rFonts w:ascii="Asana Math" w:hAnsi="Asana Math" w:eastAsia="Asana Math" w:cs="Asana Math"/>
-                          <w:highlight w:val="none"/>
+                          <w:highlight w:val="yellow"/>
                           <w:lang w:val="es-ES"/>
                         </w:rPr>
                         <w:t xml:space="preserve"> 11</w:t>
                       </w:r>
                       <w:r>
                         <w:rPr>
-                          <w:rFonts w:ascii="Asana Math" w:hAnsi="Asana Math" w:eastAsia="Asana Math" w:cs="Asana Math"/>
-                          <w:highlight w:val="none"/>
-                          <w:lang w:val="es-ES"/>
+                          <w:rFonts w:ascii="Asana Math" w:hAnsi="Asana Math" w:cs="Asana Math"/>
+                          <w:highlight w:val="yellow"/>
                         </w:rPr>
                       </w:r>
                       <w:r>
                         <w:rPr>
-                          <w:rFonts w:ascii="Asana Math" w:hAnsi="Asana Math" w:eastAsia="Asana Math" w:cs="Asana Math"/>
-                          <w:highlight w:val="none"/>
-                          <w:lang w:val="es-ES"/>
+                          <w:rFonts w:ascii="Asana Math" w:hAnsi="Asana Math" w:cs="Asana Math"/>
+                          <w:highlight w:val="yellow"/>
                         </w:rPr>
                       </w:r>
                     </w:p>
@@ -5353,6 +5860,13 @@
           <w:lang w:val="es-ES" w:bidi="es-ES"/>
         </w:rPr>
       </w:r>
+      <w:r>
+        <w:rPr>
+          <w:rFonts w:ascii="Asana Math" w:hAnsi="Asana Math" w:cs="Asana Math"/>
+          <w:highlight w:val="none"/>
+          <w:lang w:val="es-ES" w:bidi="es-ES"/>
+        </w:rPr>
+      </w:r>
     </w:p>
     <w:p>
       <w:pPr>
@@ -5459,6 +5973,13 @@
           <w:lang w:val="es-ES" w:bidi="es-ES"/>
         </w:rPr>
         <w:t xml:space="preserve"> T (Pieza T): Forma de T. Versátil para encajar en espacios irregulares (3x2).</w:t>
+      </w:r>
+      <w:r>
+        <w:rPr>
+          <w:rFonts w:ascii="Asana Math" w:hAnsi="Asana Math" w:cs="Asana Math"/>
+          <w:highlight w:val="none"/>
+          <w:lang w:val="es-ES" w:bidi="es-ES"/>
+        </w:rPr>
       </w:r>
       <w:r>
         <w:rPr>
@@ -5542,9 +6063,17 @@
                             <w:r>
                               <w:rPr>
                                 <w:rFonts w:ascii="Asana Math" w:hAnsi="Asana Math" w:eastAsia="Asana Math" w:cs="Asana Math"/>
+                                <w:highlight w:val="yellow"/>
                                 <w:lang w:val="es-ES"/>
                               </w:rPr>
-                              <w:t xml:space="preserve">000  - 010</w:t>
+                              <w:t xml:space="preserve">000</w:t>
+                            </w:r>
+                            <w:r>
+                              <w:rPr>
+                                <w:rFonts w:ascii="Asana Math" w:hAnsi="Asana Math" w:eastAsia="Asana Math" w:cs="Asana Math"/>
+                                <w:lang w:val="es-ES"/>
+                              </w:rPr>
+                              <w:t xml:space="preserve">  - 010</w:t>
                             </w:r>
                             <w:r>
                               <w:rPr>
@@ -5555,7 +6084,16 @@
                             </w:r>
                             <w:r>
                               <w:rPr>
-                                <w:rFonts w:ascii="Asana Math" w:hAnsi="Asana Math" w:cs="Asana Math"/>
+                                <w:rFonts w:ascii="Asana Math" w:hAnsi="Asana Math" w:eastAsia="Asana Math" w:cs="Asana Math"/>
+                                <w:highlight w:val="none"/>
+                                <w:lang w:val="es-ES"/>
+                              </w:rPr>
+                            </w:r>
+                            <w:r>
+                              <w:rPr>
+                                <w:rFonts w:ascii="Asana Math" w:hAnsi="Asana Math" w:eastAsia="Asana Math" w:cs="Asana Math"/>
+                                <w:highlight w:val="none"/>
+                                <w:lang w:val="es-ES"/>
                               </w:rPr>
                             </w:r>
                           </w:p>
@@ -5573,10 +6111,18 @@
                             <w:r>
                               <w:rPr>
                                 <w:rFonts w:ascii="Asana Math" w:hAnsi="Asana Math" w:eastAsia="Asana Math" w:cs="Asana Math"/>
+                                <w:highlight w:val="yellow"/>
+                                <w:lang w:val="es-ES"/>
+                              </w:rPr>
+                              <w:t xml:space="preserve">111</w:t>
+                            </w:r>
+                            <w:r>
+                              <w:rPr>
+                                <w:rFonts w:ascii="Asana Math" w:hAnsi="Asana Math" w:eastAsia="Asana Math" w:cs="Asana Math"/>
                                 <w:highlight w:val="none"/>
                                 <w:lang w:val="es-ES"/>
                               </w:rPr>
-                              <w:t xml:space="preserve">010  - 110  - 010 -</w:t>
+                              <w:t xml:space="preserve">  - 110  - 010 -</w:t>
                             </w:r>
                             <w:r>
                               <w:rPr>
@@ -5587,7 +6133,16 @@
                             </w:r>
                             <w:r>
                               <w:rPr>
-                                <w:rFonts w:ascii="Asana Math" w:hAnsi="Asana Math" w:cs="Asana Math"/>
+                                <w:rFonts w:ascii="Asana Math" w:hAnsi="Asana Math" w:eastAsia="Asana Math" w:cs="Asana Math"/>
+                                <w:highlight w:val="none"/>
+                                <w:lang w:val="es-ES"/>
+                              </w:rPr>
+                            </w:r>
+                            <w:r>
+                              <w:rPr>
+                                <w:rFonts w:ascii="Asana Math" w:hAnsi="Asana Math" w:eastAsia="Asana Math" w:cs="Asana Math"/>
+                                <w:highlight w:val="none"/>
+                                <w:lang w:val="es-ES"/>
                               </w:rPr>
                             </w:r>
                           </w:p>
@@ -5603,16 +6158,27 @@
                             <w:r>
                               <w:rPr>
                                 <w:rFonts w:ascii="Asana Math" w:hAnsi="Asana Math" w:eastAsia="Asana Math" w:cs="Asana Math"/>
-                                <w:highlight w:val="none"/>
+                                <w:highlight w:val="yellow"/>
                                 <w:lang w:val="es-ES"/>
                               </w:rPr>
-                              <w:t xml:space="preserve">111  - 010  - 111 - 010</w:t>
+                              <w:t xml:space="preserve">010</w:t>
                             </w:r>
                             <w:r>
                               <w:rPr>
                                 <w:rFonts w:ascii="Asana Math" w:hAnsi="Asana Math" w:eastAsia="Asana Math" w:cs="Asana Math"/>
                                 <w:highlight w:val="none"/>
                                 <w:lang w:val="es-ES"/>
+                              </w:rPr>
+                              <w:t xml:space="preserve">  - 010  - 111 - 010</w:t>
+                            </w:r>
+                            <w:r>
+                              <w:rPr>
+                                <w:rFonts w:ascii="Asana Math" w:hAnsi="Asana Math" w:cs="Asana Math"/>
+                              </w:rPr>
+                            </w:r>
+                            <w:r>
+                              <w:rPr>
+                                <w:rFonts w:ascii="Asana Math" w:hAnsi="Asana Math" w:cs="Asana Math"/>
                               </w:rPr>
                             </w:r>
                           </w:p>
@@ -5644,9 +6210,17 @@
                       <w:r>
                         <w:rPr>
                           <w:rFonts w:ascii="Asana Math" w:hAnsi="Asana Math" w:eastAsia="Asana Math" w:cs="Asana Math"/>
+                          <w:highlight w:val="yellow"/>
                           <w:lang w:val="es-ES"/>
                         </w:rPr>
-                        <w:t xml:space="preserve">000  - 010</w:t>
+                        <w:t xml:space="preserve">000</w:t>
+                      </w:r>
+                      <w:r>
+                        <w:rPr>
+                          <w:rFonts w:ascii="Asana Math" w:hAnsi="Asana Math" w:eastAsia="Asana Math" w:cs="Asana Math"/>
+                          <w:lang w:val="es-ES"/>
+                        </w:rPr>
+                        <w:t xml:space="preserve">  - 010</w:t>
                       </w:r>
                       <w:r>
                         <w:rPr>
@@ -5657,7 +6231,16 @@
                       </w:r>
                       <w:r>
                         <w:rPr>
-                          <w:rFonts w:ascii="Asana Math" w:hAnsi="Asana Math" w:cs="Asana Math"/>
+                          <w:rFonts w:ascii="Asana Math" w:hAnsi="Asana Math" w:eastAsia="Asana Math" w:cs="Asana Math"/>
+                          <w:highlight w:val="none"/>
+                          <w:lang w:val="es-ES"/>
+                        </w:rPr>
+                      </w:r>
+                      <w:r>
+                        <w:rPr>
+                          <w:rFonts w:ascii="Asana Math" w:hAnsi="Asana Math" w:eastAsia="Asana Math" w:cs="Asana Math"/>
+                          <w:highlight w:val="none"/>
+                          <w:lang w:val="es-ES"/>
                         </w:rPr>
                       </w:r>
                     </w:p>
@@ -5675,10 +6258,18 @@
                       <w:r>
                         <w:rPr>
                           <w:rFonts w:ascii="Asana Math" w:hAnsi="Asana Math" w:eastAsia="Asana Math" w:cs="Asana Math"/>
+                          <w:highlight w:val="yellow"/>
+                          <w:lang w:val="es-ES"/>
+                        </w:rPr>
+                        <w:t xml:space="preserve">111</w:t>
+                      </w:r>
+                      <w:r>
+                        <w:rPr>
+                          <w:rFonts w:ascii="Asana Math" w:hAnsi="Asana Math" w:eastAsia="Asana Math" w:cs="Asana Math"/>
                           <w:highlight w:val="none"/>
                           <w:lang w:val="es-ES"/>
                         </w:rPr>
-                        <w:t xml:space="preserve">010  - 110  - 010 -</w:t>
+                        <w:t xml:space="preserve">  - 110  - 010 -</w:t>
                       </w:r>
                       <w:r>
                         <w:rPr>
@@ -5689,7 +6280,16 @@
                       </w:r>
                       <w:r>
                         <w:rPr>
-                          <w:rFonts w:ascii="Asana Math" w:hAnsi="Asana Math" w:cs="Asana Math"/>
+                          <w:rFonts w:ascii="Asana Math" w:hAnsi="Asana Math" w:eastAsia="Asana Math" w:cs="Asana Math"/>
+                          <w:highlight w:val="none"/>
+                          <w:lang w:val="es-ES"/>
+                        </w:rPr>
+                      </w:r>
+                      <w:r>
+                        <w:rPr>
+                          <w:rFonts w:ascii="Asana Math" w:hAnsi="Asana Math" w:eastAsia="Asana Math" w:cs="Asana Math"/>
+                          <w:highlight w:val="none"/>
+                          <w:lang w:val="es-ES"/>
                         </w:rPr>
                       </w:r>
                     </w:p>
@@ -5705,16 +6305,27 @@
                       <w:r>
                         <w:rPr>
                           <w:rFonts w:ascii="Asana Math" w:hAnsi="Asana Math" w:eastAsia="Asana Math" w:cs="Asana Math"/>
-                          <w:highlight w:val="none"/>
+                          <w:highlight w:val="yellow"/>
                           <w:lang w:val="es-ES"/>
                         </w:rPr>
-                        <w:t xml:space="preserve">111  - 010  - 111 - 010</w:t>
+                        <w:t xml:space="preserve">010</w:t>
                       </w:r>
                       <w:r>
                         <w:rPr>
                           <w:rFonts w:ascii="Asana Math" w:hAnsi="Asana Math" w:eastAsia="Asana Math" w:cs="Asana Math"/>
                           <w:highlight w:val="none"/>
                           <w:lang w:val="es-ES"/>
+                        </w:rPr>
+                        <w:t xml:space="preserve">  - 010  - 111 - 010</w:t>
+                      </w:r>
+                      <w:r>
+                        <w:rPr>
+                          <w:rFonts w:ascii="Asana Math" w:hAnsi="Asana Math" w:cs="Asana Math"/>
+                        </w:rPr>
+                      </w:r>
+                      <w:r>
+                        <w:rPr>
+                          <w:rFonts w:ascii="Asana Math" w:hAnsi="Asana Math" w:cs="Asana Math"/>
                         </w:rPr>
                       </w:r>
                     </w:p>
@@ -5739,13 +6350,6 @@
           <w:lang w:val="es-ES" w:bidi="es-ES"/>
         </w:rPr>
       </w:r>
-      <w:r>
-        <w:rPr>
-          <w:rFonts w:ascii="Asana Math" w:hAnsi="Asana Math" w:cs="Asana Math"/>
-          <w:highlight w:val="none"/>
-          <w:lang w:val="es-ES" w:bidi="es-ES"/>
-        </w:rPr>
-      </w:r>
     </w:p>
     <w:p>
       <w:pPr>
@@ -5885,12 +6489,14 @@
         </w:rPr>
         <w:t xml:space="preserve"> S (Pieza S): Forma de S, se orienta hacia la derecha (3x2).</w:t>
       </w:r>
-      <w:r/>
-      <w:r>
-        <w:rPr>
-          <w:rFonts w:ascii="Asana Math" w:hAnsi="Asana Math" w:cs="Asana Math"/>
-          <w:highlight w:val="none"/>
-          <w:lang w:val="es-ES" w:bidi="es-ES"/>
+      <w:r>
+        <w:rPr>
+          <w:highlight w:val="none"/>
+        </w:rPr>
+      </w:r>
+      <w:r>
+        <w:rPr>
+          <w:highlight w:val="none"/>
         </w:rPr>
       </w:r>
     </w:p>
@@ -5968,13 +6574,30 @@
                             <w:r>
                               <w:rPr>
                                 <w:rFonts w:ascii="Asana Math" w:hAnsi="Asana Math" w:eastAsia="Asana Math" w:cs="Asana Math"/>
+                                <w:highlight w:val="yellow"/>
                                 <w:lang w:val="es-ES"/>
                               </w:rPr>
-                              <w:t xml:space="preserve">000  - 100  </w:t>
+                              <w:t xml:space="preserve">000</w:t>
                             </w:r>
                             <w:r>
                               <w:rPr>
-                                <w:rFonts w:ascii="Asana Math" w:hAnsi="Asana Math" w:cs="Asana Math"/>
+                                <w:rFonts w:ascii="Asana Math" w:hAnsi="Asana Math" w:eastAsia="Asana Math" w:cs="Asana Math"/>
+                                <w:lang w:val="es-ES"/>
+                              </w:rPr>
+                              <w:t xml:space="preserve">  - 100  </w:t>
+                            </w:r>
+                            <w:r>
+                              <w:rPr>
+                                <w:rFonts w:ascii="Asana Math" w:hAnsi="Asana Math" w:eastAsia="Asana Math" w:cs="Asana Math"/>
+                                <w:highlight w:val="none"/>
+                                <w:lang w:val="es-ES"/>
+                              </w:rPr>
+                            </w:r>
+                            <w:r>
+                              <w:rPr>
+                                <w:rFonts w:ascii="Asana Math" w:hAnsi="Asana Math" w:eastAsia="Asana Math" w:cs="Asana Math"/>
+                                <w:highlight w:val="none"/>
+                                <w:lang w:val="es-ES"/>
                               </w:rPr>
                             </w:r>
                           </w:p>
@@ -5992,14 +6615,31 @@
                             <w:r>
                               <w:rPr>
                                 <w:rFonts w:ascii="Asana Math" w:hAnsi="Asana Math" w:eastAsia="Asana Math" w:cs="Asana Math"/>
+                                <w:highlight w:val="yellow"/>
+                                <w:lang w:val="es-ES"/>
+                              </w:rPr>
+                              <w:t xml:space="preserve">011</w:t>
+                            </w:r>
+                            <w:r>
+                              <w:rPr>
+                                <w:rFonts w:ascii="Asana Math" w:hAnsi="Asana Math" w:eastAsia="Asana Math" w:cs="Asana Math"/>
                                 <w:highlight w:val="none"/>
                                 <w:lang w:val="es-ES"/>
                               </w:rPr>
-                              <w:t xml:space="preserve">011  - 110</w:t>
+                              <w:t xml:space="preserve">  - 110</w:t>
                             </w:r>
                             <w:r>
                               <w:rPr>
-                                <w:rFonts w:ascii="Asana Math" w:hAnsi="Asana Math" w:cs="Asana Math"/>
+                                <w:rFonts w:ascii="Asana Math" w:hAnsi="Asana Math" w:eastAsia="Asana Math" w:cs="Asana Math"/>
+                                <w:highlight w:val="none"/>
+                                <w:lang w:val="es-ES"/>
+                              </w:rPr>
+                            </w:r>
+                            <w:r>
+                              <w:rPr>
+                                <w:rFonts w:ascii="Asana Math" w:hAnsi="Asana Math" w:eastAsia="Asana Math" w:cs="Asana Math"/>
+                                <w:highlight w:val="none"/>
+                                <w:lang w:val="es-ES"/>
                               </w:rPr>
                             </w:r>
                           </w:p>
@@ -6015,7 +6655,7 @@
                             <w:r>
                               <w:rPr>
                                 <w:rFonts w:ascii="Asana Math" w:hAnsi="Asana Math" w:eastAsia="Asana Math" w:cs="Asana Math"/>
-                                <w:highlight w:val="none"/>
+                                <w:highlight w:val="yellow"/>
                                 <w:lang w:val="es-ES"/>
                               </w:rPr>
                               <w:t xml:space="preserve">110</w:t>
@@ -6030,9 +6670,12 @@
                             </w:r>
                             <w:r>
                               <w:rPr>
-                                <w:rFonts w:ascii="Asana Math" w:hAnsi="Asana Math" w:eastAsia="Asana Math" w:cs="Asana Math"/>
-                                <w:highlight w:val="none"/>
-                                <w:lang w:val="es-ES"/>
+                                <w:rFonts w:ascii="Asana Math" w:hAnsi="Asana Math" w:cs="Asana Math"/>
+                              </w:rPr>
+                            </w:r>
+                            <w:r>
+                              <w:rPr>
+                                <w:rFonts w:ascii="Asana Math" w:hAnsi="Asana Math" w:cs="Asana Math"/>
                               </w:rPr>
                             </w:r>
                           </w:p>
@@ -6064,13 +6707,30 @@
                       <w:r>
                         <w:rPr>
                           <w:rFonts w:ascii="Asana Math" w:hAnsi="Asana Math" w:eastAsia="Asana Math" w:cs="Asana Math"/>
+                          <w:highlight w:val="yellow"/>
                           <w:lang w:val="es-ES"/>
                         </w:rPr>
-                        <w:t xml:space="preserve">000  - 100  </w:t>
+                        <w:t xml:space="preserve">000</w:t>
                       </w:r>
                       <w:r>
                         <w:rPr>
-                          <w:rFonts w:ascii="Asana Math" w:hAnsi="Asana Math" w:cs="Asana Math"/>
+                          <w:rFonts w:ascii="Asana Math" w:hAnsi="Asana Math" w:eastAsia="Asana Math" w:cs="Asana Math"/>
+                          <w:lang w:val="es-ES"/>
+                        </w:rPr>
+                        <w:t xml:space="preserve">  - 100  </w:t>
+                      </w:r>
+                      <w:r>
+                        <w:rPr>
+                          <w:rFonts w:ascii="Asana Math" w:hAnsi="Asana Math" w:eastAsia="Asana Math" w:cs="Asana Math"/>
+                          <w:highlight w:val="none"/>
+                          <w:lang w:val="es-ES"/>
+                        </w:rPr>
+                      </w:r>
+                      <w:r>
+                        <w:rPr>
+                          <w:rFonts w:ascii="Asana Math" w:hAnsi="Asana Math" w:eastAsia="Asana Math" w:cs="Asana Math"/>
+                          <w:highlight w:val="none"/>
+                          <w:lang w:val="es-ES"/>
                         </w:rPr>
                       </w:r>
                     </w:p>
@@ -6088,14 +6748,31 @@
                       <w:r>
                         <w:rPr>
                           <w:rFonts w:ascii="Asana Math" w:hAnsi="Asana Math" w:eastAsia="Asana Math" w:cs="Asana Math"/>
+                          <w:highlight w:val="yellow"/>
+                          <w:lang w:val="es-ES"/>
+                        </w:rPr>
+                        <w:t xml:space="preserve">011</w:t>
+                      </w:r>
+                      <w:r>
+                        <w:rPr>
+                          <w:rFonts w:ascii="Asana Math" w:hAnsi="Asana Math" w:eastAsia="Asana Math" w:cs="Asana Math"/>
                           <w:highlight w:val="none"/>
                           <w:lang w:val="es-ES"/>
                         </w:rPr>
-                        <w:t xml:space="preserve">011  - 110</w:t>
+                        <w:t xml:space="preserve">  - 110</w:t>
                       </w:r>
                       <w:r>
                         <w:rPr>
-                          <w:rFonts w:ascii="Asana Math" w:hAnsi="Asana Math" w:cs="Asana Math"/>
+                          <w:rFonts w:ascii="Asana Math" w:hAnsi="Asana Math" w:eastAsia="Asana Math" w:cs="Asana Math"/>
+                          <w:highlight w:val="none"/>
+                          <w:lang w:val="es-ES"/>
+                        </w:rPr>
+                      </w:r>
+                      <w:r>
+                        <w:rPr>
+                          <w:rFonts w:ascii="Asana Math" w:hAnsi="Asana Math" w:eastAsia="Asana Math" w:cs="Asana Math"/>
+                          <w:highlight w:val="none"/>
+                          <w:lang w:val="es-ES"/>
                         </w:rPr>
                       </w:r>
                     </w:p>
@@ -6111,7 +6788,7 @@
                       <w:r>
                         <w:rPr>
                           <w:rFonts w:ascii="Asana Math" w:hAnsi="Asana Math" w:eastAsia="Asana Math" w:cs="Asana Math"/>
-                          <w:highlight w:val="none"/>
+                          <w:highlight w:val="yellow"/>
                           <w:lang w:val="es-ES"/>
                         </w:rPr>
                         <w:t xml:space="preserve">110</w:t>
@@ -6126,9 +6803,12 @@
                       </w:r>
                       <w:r>
                         <w:rPr>
-                          <w:rFonts w:ascii="Asana Math" w:hAnsi="Asana Math" w:eastAsia="Asana Math" w:cs="Asana Math"/>
-                          <w:highlight w:val="none"/>
-                          <w:lang w:val="es-ES"/>
+                          <w:rFonts w:ascii="Asana Math" w:hAnsi="Asana Math" w:cs="Asana Math"/>
+                        </w:rPr>
+                      </w:r>
+                      <w:r>
+                        <w:rPr>
+                          <w:rFonts w:ascii="Asana Math" w:hAnsi="Asana Math" w:cs="Asana Math"/>
                         </w:rPr>
                       </w:r>
                     </w:p>
@@ -6153,13 +6833,6 @@
           <w:lang w:val="es-ES" w:bidi="es-ES"/>
         </w:rPr>
       </w:r>
-      <w:r>
-        <w:rPr>
-          <w:rFonts w:ascii="Asana Math" w:hAnsi="Asana Math" w:cs="Asana Math"/>
-          <w:highlight w:val="none"/>
-          <w:lang w:val="es-ES" w:bidi="es-ES"/>
-        </w:rPr>
-      </w:r>
     </w:p>
     <w:p>
       <w:pPr>
@@ -6249,14 +6922,16 @@
       </w:r>
       <w:r>
         <w:rPr>
+          <w:rFonts w:ascii="Asana Math" w:hAnsi="Asana Math" w:cs="Asana Math"/>
           <w:highlight w:val="none"/>
           <w:lang w:val="es-ES" w:bidi="es-ES"/>
         </w:rPr>
       </w:r>
       <w:r>
         <w:rPr>
-          <w:highlight w:val="none"/>
-          <w:lang w:val="es-ES"/>
+          <w:rFonts w:ascii="Asana Math" w:hAnsi="Asana Math" w:cs="Asana Math"/>
+          <w:highlight w:val="none"/>
+          <w:lang w:val="es-ES" w:bidi="es-ES"/>
         </w:rPr>
       </w:r>
     </w:p>
@@ -6352,9 +7027,17 @@
                             <w:r>
                               <w:rPr>
                                 <w:rFonts w:ascii="Asana Math" w:hAnsi="Asana Math" w:eastAsia="Asana Math" w:cs="Asana Math"/>
+                                <w:highlight w:val="yellow"/>
                                 <w:lang w:val="es-ES"/>
                               </w:rPr>
-                              <w:t xml:space="preserve">000  - 001  </w:t>
+                              <w:t xml:space="preserve">000</w:t>
+                            </w:r>
+                            <w:r>
+                              <w:rPr>
+                                <w:rFonts w:ascii="Asana Math" w:hAnsi="Asana Math" w:eastAsia="Asana Math" w:cs="Asana Math"/>
+                                <w:lang w:val="es-ES"/>
+                              </w:rPr>
+                              <w:t xml:space="preserve">  - 001  </w:t>
                             </w:r>
                             <w:r>
                               <w:rPr>
@@ -6385,10 +7068,18 @@
                             <w:r>
                               <w:rPr>
                                 <w:rFonts w:ascii="Asana Math" w:hAnsi="Asana Math" w:eastAsia="Asana Math" w:cs="Asana Math"/>
+                                <w:highlight w:val="yellow"/>
+                                <w:lang w:val="es-ES"/>
+                              </w:rPr>
+                              <w:t xml:space="preserve">110</w:t>
+                            </w:r>
+                            <w:r>
+                              <w:rPr>
+                                <w:rFonts w:ascii="Asana Math" w:hAnsi="Asana Math" w:eastAsia="Asana Math" w:cs="Asana Math"/>
                                 <w:highlight w:val="none"/>
                                 <w:lang w:val="es-ES"/>
                               </w:rPr>
-                              <w:t xml:space="preserve">110  - 011</w:t>
+                              <w:t xml:space="preserve">  - 011</w:t>
                             </w:r>
                             <w:r>
                               <w:rPr>
@@ -6417,7 +7108,7 @@
                             <w:r>
                               <w:rPr>
                                 <w:rFonts w:ascii="Asana Math" w:hAnsi="Asana Math" w:eastAsia="Asana Math" w:cs="Asana Math"/>
-                                <w:highlight w:val="none"/>
+                                <w:highlight w:val="yellow"/>
                                 <w:lang w:val="es-ES"/>
                               </w:rPr>
                               <w:t xml:space="preserve">011</w:t>
@@ -6479,9 +7170,17 @@
                       <w:r>
                         <w:rPr>
                           <w:rFonts w:ascii="Asana Math" w:hAnsi="Asana Math" w:eastAsia="Asana Math" w:cs="Asana Math"/>
+                          <w:highlight w:val="yellow"/>
                           <w:lang w:val="es-ES"/>
                         </w:rPr>
-                        <w:t xml:space="preserve">000  - 001  </w:t>
+                        <w:t xml:space="preserve">000</w:t>
+                      </w:r>
+                      <w:r>
+                        <w:rPr>
+                          <w:rFonts w:ascii="Asana Math" w:hAnsi="Asana Math" w:eastAsia="Asana Math" w:cs="Asana Math"/>
+                          <w:lang w:val="es-ES"/>
+                        </w:rPr>
+                        <w:t xml:space="preserve">  - 001  </w:t>
                       </w:r>
                       <w:r>
                         <w:rPr>
@@ -6512,10 +7211,18 @@
                       <w:r>
                         <w:rPr>
                           <w:rFonts w:ascii="Asana Math" w:hAnsi="Asana Math" w:eastAsia="Asana Math" w:cs="Asana Math"/>
+                          <w:highlight w:val="yellow"/>
+                          <w:lang w:val="es-ES"/>
+                        </w:rPr>
+                        <w:t xml:space="preserve">110</w:t>
+                      </w:r>
+                      <w:r>
+                        <w:rPr>
+                          <w:rFonts w:ascii="Asana Math" w:hAnsi="Asana Math" w:eastAsia="Asana Math" w:cs="Asana Math"/>
                           <w:highlight w:val="none"/>
                           <w:lang w:val="es-ES"/>
                         </w:rPr>
-                        <w:t xml:space="preserve">110  - 011</w:t>
+                        <w:t xml:space="preserve">  - 011</w:t>
                       </w:r>
                       <w:r>
                         <w:rPr>
@@ -6544,7 +7251,7 @@
                       <w:r>
                         <w:rPr>
                           <w:rFonts w:ascii="Asana Math" w:hAnsi="Asana Math" w:eastAsia="Asana Math" w:cs="Asana Math"/>
-                          <w:highlight w:val="none"/>
+                          <w:highlight w:val="yellow"/>
                           <w:lang w:val="es-ES"/>
                         </w:rPr>
                         <w:t xml:space="preserve">011</w:t>
@@ -6600,6 +7307,13 @@
           <w:lang w:val="es-ES" w:bidi="es-ES"/>
         </w:rPr>
       </w:r>
+      <w:r>
+        <w:rPr>
+          <w:rFonts w:ascii="Asana Math" w:hAnsi="Asana Math" w:cs="Asana Math"/>
+          <w:highlight w:val="none"/>
+          <w:lang w:val="es-ES" w:bidi="es-ES"/>
+        </w:rPr>
+      </w:r>
     </w:p>
     <w:p>
       <w:pPr>
@@ -6723,7 +7437,20 @@
         </w:rPr>
         <w:t xml:space="preserve">−</w:t>
       </w:r>
-      <w:r/>
+      <w:r>
+        <w:rPr>
+          <w:rFonts w:ascii="Asana Math" w:hAnsi="Asana Math" w:cs="Asana Math"/>
+          <w:highlight w:val="none"/>
+          <w:lang w:val="es-ES" w:bidi="es-ES"/>
+        </w:rPr>
+      </w:r>
+      <w:r>
+        <w:rPr>
+          <w:rFonts w:ascii="Asana Math" w:hAnsi="Asana Math" w:cs="Asana Math"/>
+          <w:highlight w:val="none"/>
+          <w:lang w:val="es-ES" w:bidi="es-ES"/>
+        </w:rPr>
+      </w:r>
     </w:p>
     <w:p>
       <w:pPr>
@@ -6744,6 +7471,13 @@
           <w:lang w:val="es-ES" w:bidi="es-ES"/>
         </w:rPr>
         <w:t xml:space="preserve"> J (Pieza J): Forma de L invertida o con gancho a la izquierda (2x3).</w:t>
+      </w:r>
+      <w:r>
+        <w:rPr>
+          <w:rFonts w:ascii="Asana Math" w:hAnsi="Asana Math" w:cs="Asana Math"/>
+          <w:highlight w:val="none"/>
+          <w:lang w:val="es-ES" w:bidi="es-ES"/>
+        </w:rPr>
       </w:r>
       <w:r>
         <w:rPr>
@@ -6827,6 +7561,7 @@
                             <w:r>
                               <w:rPr>
                                 <w:rFonts w:ascii="Asana Math" w:hAnsi="Asana Math" w:eastAsia="Asana Math" w:cs="Asana Math"/>
+                                <w:highlight w:val="yellow"/>
                                 <w:lang w:val="es-ES"/>
                               </w:rPr>
                               <w:t xml:space="preserve">010</w:t>
@@ -6840,7 +7575,16 @@
                             </w:r>
                             <w:r>
                               <w:rPr>
-                                <w:rFonts w:ascii="Asana Math" w:hAnsi="Asana Math" w:cs="Asana Math"/>
+                                <w:rFonts w:ascii="Asana Math" w:hAnsi="Asana Math" w:eastAsia="Asana Math" w:cs="Asana Math"/>
+                                <w:highlight w:val="none"/>
+                                <w:lang w:val="es-ES"/>
+                              </w:rPr>
+                            </w:r>
+                            <w:r>
+                              <w:rPr>
+                                <w:rFonts w:ascii="Asana Math" w:hAnsi="Asana Math" w:eastAsia="Asana Math" w:cs="Asana Math"/>
+                                <w:highlight w:val="none"/>
+                                <w:lang w:val="es-ES"/>
                               </w:rPr>
                             </w:r>
                           </w:p>
@@ -6858,14 +7602,31 @@
                             <w:r>
                               <w:rPr>
                                 <w:rFonts w:ascii="Asana Math" w:hAnsi="Asana Math" w:eastAsia="Asana Math" w:cs="Asana Math"/>
+                                <w:highlight w:val="yellow"/>
+                                <w:lang w:val="es-ES"/>
+                              </w:rPr>
+                              <w:t xml:space="preserve">010</w:t>
+                            </w:r>
+                            <w:r>
+                              <w:rPr>
+                                <w:rFonts w:ascii="Asana Math" w:hAnsi="Asana Math" w:eastAsia="Asana Math" w:cs="Asana Math"/>
                                 <w:highlight w:val="none"/>
                                 <w:lang w:val="es-ES"/>
                               </w:rPr>
-                              <w:t xml:space="preserve">010  - 111  - 100  - 010</w:t>
+                              <w:t xml:space="preserve">  - 111  - 100  - 010</w:t>
                             </w:r>
                             <w:r>
                               <w:rPr>
-                                <w:rFonts w:ascii="Asana Math" w:hAnsi="Asana Math" w:cs="Asana Math"/>
+                                <w:rFonts w:ascii="Asana Math" w:hAnsi="Asana Math" w:eastAsia="Asana Math" w:cs="Asana Math"/>
+                                <w:highlight w:val="none"/>
+                                <w:lang w:val="es-ES"/>
+                              </w:rPr>
+                            </w:r>
+                            <w:r>
+                              <w:rPr>
+                                <w:rFonts w:ascii="Asana Math" w:hAnsi="Asana Math" w:eastAsia="Asana Math" w:cs="Asana Math"/>
+                                <w:highlight w:val="none"/>
+                                <w:lang w:val="es-ES"/>
                               </w:rPr>
                             </w:r>
                           </w:p>
@@ -6881,7 +7642,7 @@
                             <w:r>
                               <w:rPr>
                                 <w:rFonts w:ascii="Asana Math" w:hAnsi="Asana Math" w:eastAsia="Asana Math" w:cs="Asana Math"/>
-                                <w:highlight w:val="none"/>
+                                <w:highlight w:val="yellow"/>
                                 <w:lang w:val="es-ES"/>
                               </w:rPr>
                               <w:t xml:space="preserve">110</w:t>
@@ -6904,9 +7665,12 @@
                             </w:r>
                             <w:r>
                               <w:rPr>
-                                <w:rFonts w:ascii="Asana Math" w:hAnsi="Asana Math" w:eastAsia="Asana Math" w:cs="Asana Math"/>
-                                <w:highlight w:val="none"/>
-                                <w:lang w:val="es-ES"/>
+                                <w:rFonts w:ascii="Asana Math" w:hAnsi="Asana Math" w:cs="Asana Math"/>
+                              </w:rPr>
+                            </w:r>
+                            <w:r>
+                              <w:rPr>
+                                <w:rFonts w:ascii="Asana Math" w:hAnsi="Asana Math" w:cs="Asana Math"/>
                               </w:rPr>
                             </w:r>
                           </w:p>
@@ -6938,6 +7702,7 @@
                       <w:r>
                         <w:rPr>
                           <w:rFonts w:ascii="Asana Math" w:hAnsi="Asana Math" w:eastAsia="Asana Math" w:cs="Asana Math"/>
+                          <w:highlight w:val="yellow"/>
                           <w:lang w:val="es-ES"/>
                         </w:rPr>
                         <w:t xml:space="preserve">010</w:t>
@@ -6951,7 +7716,16 @@
                       </w:r>
                       <w:r>
                         <w:rPr>
-                          <w:rFonts w:ascii="Asana Math" w:hAnsi="Asana Math" w:cs="Asana Math"/>
+                          <w:rFonts w:ascii="Asana Math" w:hAnsi="Asana Math" w:eastAsia="Asana Math" w:cs="Asana Math"/>
+                          <w:highlight w:val="none"/>
+                          <w:lang w:val="es-ES"/>
+                        </w:rPr>
+                      </w:r>
+                      <w:r>
+                        <w:rPr>
+                          <w:rFonts w:ascii="Asana Math" w:hAnsi="Asana Math" w:eastAsia="Asana Math" w:cs="Asana Math"/>
+                          <w:highlight w:val="none"/>
+                          <w:lang w:val="es-ES"/>
                         </w:rPr>
                       </w:r>
                     </w:p>
@@ -6969,14 +7743,31 @@
                       <w:r>
                         <w:rPr>
                           <w:rFonts w:ascii="Asana Math" w:hAnsi="Asana Math" w:eastAsia="Asana Math" w:cs="Asana Math"/>
+                          <w:highlight w:val="yellow"/>
+                          <w:lang w:val="es-ES"/>
+                        </w:rPr>
+                        <w:t xml:space="preserve">010</w:t>
+                      </w:r>
+                      <w:r>
+                        <w:rPr>
+                          <w:rFonts w:ascii="Asana Math" w:hAnsi="Asana Math" w:eastAsia="Asana Math" w:cs="Asana Math"/>
                           <w:highlight w:val="none"/>
                           <w:lang w:val="es-ES"/>
                         </w:rPr>
-                        <w:t xml:space="preserve">010  - 111  - 100  - 010</w:t>
+                        <w:t xml:space="preserve">  - 111  - 100  - 010</w:t>
                       </w:r>
                       <w:r>
                         <w:rPr>
-                          <w:rFonts w:ascii="Asana Math" w:hAnsi="Asana Math" w:cs="Asana Math"/>
+                          <w:rFonts w:ascii="Asana Math" w:hAnsi="Asana Math" w:eastAsia="Asana Math" w:cs="Asana Math"/>
+                          <w:highlight w:val="none"/>
+                          <w:lang w:val="es-ES"/>
+                        </w:rPr>
+                      </w:r>
+                      <w:r>
+                        <w:rPr>
+                          <w:rFonts w:ascii="Asana Math" w:hAnsi="Asana Math" w:eastAsia="Asana Math" w:cs="Asana Math"/>
+                          <w:highlight w:val="none"/>
+                          <w:lang w:val="es-ES"/>
                         </w:rPr>
                       </w:r>
                     </w:p>
@@ -6992,7 +7783,7 @@
                       <w:r>
                         <w:rPr>
                           <w:rFonts w:ascii="Asana Math" w:hAnsi="Asana Math" w:eastAsia="Asana Math" w:cs="Asana Math"/>
-                          <w:highlight w:val="none"/>
+                          <w:highlight w:val="yellow"/>
                           <w:lang w:val="es-ES"/>
                         </w:rPr>
                         <w:t xml:space="preserve">110</w:t>
@@ -7015,9 +7806,12 @@
                       </w:r>
                       <w:r>
                         <w:rPr>
-                          <w:rFonts w:ascii="Asana Math" w:hAnsi="Asana Math" w:eastAsia="Asana Math" w:cs="Asana Math"/>
-                          <w:highlight w:val="none"/>
-                          <w:lang w:val="es-ES"/>
+                          <w:rFonts w:ascii="Asana Math" w:hAnsi="Asana Math" w:cs="Asana Math"/>
+                        </w:rPr>
+                      </w:r>
+                      <w:r>
+                        <w:rPr>
+                          <w:rFonts w:ascii="Asana Math" w:hAnsi="Asana Math" w:cs="Asana Math"/>
                         </w:rPr>
                       </w:r>
                     </w:p>
@@ -7042,13 +7836,6 @@
           <w:lang w:val="es-ES" w:bidi="es-ES"/>
         </w:rPr>
       </w:r>
-      <w:r>
-        <w:rPr>
-          <w:rFonts w:ascii="Asana Math" w:hAnsi="Asana Math" w:cs="Asana Math"/>
-          <w:highlight w:val="none"/>
-          <w:lang w:val="es-ES" w:bidi="es-ES"/>
-        </w:rPr>
-      </w:r>
     </w:p>
     <w:p>
       <w:pPr>
@@ -7130,6 +7917,13 @@
           <w:lang w:val="es-ES" w:bidi="es-ES"/>
         </w:rPr>
       </w:pPr>
+      <w:r>
+        <w:rPr>
+          <w:rFonts w:ascii="Asana Math" w:hAnsi="Asana Math" w:cs="Asana Math"/>
+          <w:highlight w:val="none"/>
+          <w:lang w:val="es-ES" w:bidi="es-ES"/>
+        </w:rPr>
+      </w:r>
       <w:r>
         <w:rPr>
           <w:rFonts w:ascii="Asana Math" w:hAnsi="Asana Math" w:cs="Asana Math"/>
@@ -7186,14 +7980,14 @@
         <w:rPr>
           <w:rFonts w:ascii="Asana Math" w:hAnsi="Asana Math" w:cs="Asana Math"/>
           <w:highlight w:val="none"/>
-          <w:lang w:val="es-ES" w:bidi="es-ES"/>
+          <w:lang w:val="es-ES"/>
         </w:rPr>
       </w:r>
       <w:r>
         <w:rPr>
           <w:rFonts w:ascii="Asana Math" w:hAnsi="Asana Math" w:cs="Asana Math"/>
           <w:highlight w:val="none"/>
-          <w:lang w:val="es-ES" w:bidi="es-ES"/>
+          <w:lang w:val="es-ES"/>
         </w:rPr>
       </w:r>
     </w:p>
@@ -7217,7 +8011,6 @@
         </w:rPr>
         <w:t xml:space="preserve"> L (Pieza L): Forma d</w:t>
       </w:r>
-      <w:r/>
       <w:r>
         <w:rPr>
           <w:rFonts w:ascii="Asana Math" w:hAnsi="Asana Math" w:cs="Asana Math"/>
@@ -7226,7 +8019,6 @@
         </w:rPr>
         <w:t xml:space="preserve">e L estándar o con gancho a la derecha(2x3).</w:t>
       </w:r>
-      <w:r/>
       <w:r>
         <w:rPr>
           <w:rFonts w:ascii="Asana Math" w:hAnsi="Asana Math" w:cs="Asana Math"/>
@@ -7239,13 +8031,6 @@
           <w:rFonts w:ascii="Asana Math" w:hAnsi="Asana Math" w:cs="Asana Math"/>
           <w:highlight w:val="none"/>
           <w:lang w:val="es-ES" w:bidi="es-ES"/>
-        </w:rPr>
-      </w:r>
-      <w:r>
-        <w:rPr>
-          <w:rFonts w:ascii="Asana Math" w:hAnsi="Asana Math" w:cs="Asana Math"/>
-          <w:highlight w:val="none"/>
-          <w:lang w:val="es-ES"/>
         </w:rPr>
       </w:r>
     </w:p>
@@ -7319,6 +8104,7 @@
                             <w:r>
                               <w:rPr>
                                 <w:rFonts w:ascii="Asana Math" w:hAnsi="Asana Math" w:eastAsia="Asana Math" w:cs="Asana Math"/>
+                                <w:highlight w:val="yellow"/>
                                 <w:lang w:val="es-ES"/>
                               </w:rPr>
                               <w:t xml:space="preserve">010</w:t>
@@ -7329,11 +8115,6 @@
                                 <w:lang w:val="es-ES"/>
                               </w:rPr>
                               <w:t xml:space="preserve">  - 000  - 110  - 000</w:t>
-                            </w:r>
-                            <w:r>
-                              <w:rPr>
-                                <w:rFonts w:ascii="Asana Math" w:hAnsi="Asana Math" w:cs="Asana Math"/>
-                              </w:rPr>
                             </w:r>
                             <w:r>
                               <w:rPr>
@@ -7364,15 +8145,18 @@
                             <w:r>
                               <w:rPr>
                                 <w:rFonts w:ascii="Asana Math" w:hAnsi="Asana Math" w:eastAsia="Asana Math" w:cs="Asana Math"/>
+                                <w:highlight w:val="yellow"/>
+                                <w:lang w:val="es-ES"/>
+                              </w:rPr>
+                              <w:t xml:space="preserve">010</w:t>
+                            </w:r>
+                            <w:r>
+                              <w:rPr>
+                                <w:rFonts w:ascii="Asana Math" w:hAnsi="Asana Math" w:eastAsia="Asana Math" w:cs="Asana Math"/>
                                 <w:highlight w:val="none"/>
                                 <w:lang w:val="es-ES"/>
                               </w:rPr>
-                              <w:t xml:space="preserve">010  - 111  - 010  - 001</w:t>
-                            </w:r>
-                            <w:r>
-                              <w:rPr>
-                                <w:rFonts w:ascii="Asana Math" w:hAnsi="Asana Math" w:cs="Asana Math"/>
-                              </w:rPr>
+                              <w:t xml:space="preserve">  - 111  - 010  - 001</w:t>
                             </w:r>
                             <w:r>
                               <w:rPr>
@@ -7401,7 +8185,7 @@
                             <w:r>
                               <w:rPr>
                                 <w:rFonts w:ascii="Asana Math" w:hAnsi="Asana Math" w:eastAsia="Asana Math" w:cs="Asana Math"/>
-                                <w:highlight w:val="none"/>
+                                <w:highlight w:val="yellow"/>
                                 <w:lang w:val="es-ES"/>
                               </w:rPr>
                               <w:t xml:space="preserve">011</w:t>
@@ -7413,13 +8197,6 @@
                                 <w:lang w:val="es-ES"/>
                               </w:rPr>
                               <w:t xml:space="preserve">  - 100  - 010  - 111</w:t>
-                            </w:r>
-                            <w:r>
-                              <w:rPr>
-                                <w:rFonts w:ascii="Asana Math" w:hAnsi="Asana Math" w:eastAsia="Asana Math" w:cs="Asana Math"/>
-                                <w:highlight w:val="none"/>
-                                <w:lang w:val="es-ES"/>
-                              </w:rPr>
                             </w:r>
                             <w:r>
                               <w:rPr>
@@ -7460,6 +8237,7 @@
                       <w:r>
                         <w:rPr>
                           <w:rFonts w:ascii="Asana Math" w:hAnsi="Asana Math" w:eastAsia="Asana Math" w:cs="Asana Math"/>
+                          <w:highlight w:val="yellow"/>
                           <w:lang w:val="es-ES"/>
                         </w:rPr>
                         <w:t xml:space="preserve">010</w:t>
@@ -7470,11 +8248,6 @@
                           <w:lang w:val="es-ES"/>
                         </w:rPr>
                         <w:t xml:space="preserve">  - 000  - 110  - 000</w:t>
-                      </w:r>
-                      <w:r>
-                        <w:rPr>
-                          <w:rFonts w:ascii="Asana Math" w:hAnsi="Asana Math" w:cs="Asana Math"/>
-                        </w:rPr>
                       </w:r>
                       <w:r>
                         <w:rPr>
@@ -7505,15 +8278,18 @@
                       <w:r>
                         <w:rPr>
                           <w:rFonts w:ascii="Asana Math" w:hAnsi="Asana Math" w:eastAsia="Asana Math" w:cs="Asana Math"/>
+                          <w:highlight w:val="yellow"/>
+                          <w:lang w:val="es-ES"/>
+                        </w:rPr>
+                        <w:t xml:space="preserve">010</w:t>
+                      </w:r>
+                      <w:r>
+                        <w:rPr>
+                          <w:rFonts w:ascii="Asana Math" w:hAnsi="Asana Math" w:eastAsia="Asana Math" w:cs="Asana Math"/>
                           <w:highlight w:val="none"/>
                           <w:lang w:val="es-ES"/>
                         </w:rPr>
-                        <w:t xml:space="preserve">010  - 111  - 010  - 001</w:t>
-                      </w:r>
-                      <w:r>
-                        <w:rPr>
-                          <w:rFonts w:ascii="Asana Math" w:hAnsi="Asana Math" w:cs="Asana Math"/>
-                        </w:rPr>
+                        <w:t xml:space="preserve">  - 111  - 010  - 001</w:t>
                       </w:r>
                       <w:r>
                         <w:rPr>
@@ -7542,7 +8318,7 @@
                       <w:r>
                         <w:rPr>
                           <w:rFonts w:ascii="Asana Math" w:hAnsi="Asana Math" w:eastAsia="Asana Math" w:cs="Asana Math"/>
-                          <w:highlight w:val="none"/>
+                          <w:highlight w:val="yellow"/>
                           <w:lang w:val="es-ES"/>
                         </w:rPr>
                         <w:t xml:space="preserve">011</w:t>
@@ -7554,13 +8330,6 @@
                           <w:lang w:val="es-ES"/>
                         </w:rPr>
                         <w:t xml:space="preserve">  - 100  - 010  - 111</w:t>
-                      </w:r>
-                      <w:r>
-                        <w:rPr>
-                          <w:rFonts w:ascii="Asana Math" w:hAnsi="Asana Math" w:eastAsia="Asana Math" w:cs="Asana Math"/>
-                          <w:highlight w:val="none"/>
-                          <w:lang w:val="es-ES"/>
-                        </w:rPr>
                       </w:r>
                       <w:r>
                         <w:rPr>
@@ -7590,11 +8359,6 @@
           <w:rFonts w:ascii="Asana Math" w:hAnsi="Asana Math" w:cs="Asana Math"/>
         </w:rPr>
       </w:r>
-      <w:r>
-        <w:rPr>
-          <w:rFonts w:ascii="Asana Math" w:hAnsi="Asana Math" w:cs="Asana Math"/>
-        </w:rPr>
-      </w:r>
     </w:p>
     <w:p>
       <w:pPr>
@@ -7642,15 +8406,11 @@
       <w:r>
         <w:rPr>
           <w:rFonts w:ascii="Asana Math" w:hAnsi="Asana Math" w:cs="Asana Math"/>
-          <w:highlight w:val="none"/>
-          <w:lang w:val="es-ES"/>
         </w:rPr>
       </w:r>
       <w:r>
         <w:rPr>
           <w:rFonts w:ascii="Asana Math" w:hAnsi="Asana Math" w:cs="Asana Math"/>
-          <w:highlight w:val="none"/>
-          <w:lang w:val="es-ES"/>
         </w:rPr>
       </w:r>
     </w:p>
@@ -7706,10 +8466,2228 @@
           <w:highlight w:val="none"/>
           <w:lang w:val="es-ES"/>
         </w:rPr>
+        <w:t xml:space="preserve">Ahora </w:t>
       </w:r>
       <w:r>
         <w:rPr>
           <w:rFonts w:ascii="Asana Math" w:hAnsi="Asana Math" w:cs="Asana Math"/>
+          <w:highlight w:val="none"/>
+          <w:lang w:val="es-ES"/>
+        </w:rPr>
+      </w:r>
+      <w:r>
+        <w:rPr>
+          <w:rFonts w:ascii="Asana Math" w:hAnsi="Asana Math" w:cs="Asana Math"/>
+          <w:highlight w:val="none"/>
+          <w:lang w:val="es-ES"/>
+        </w:rPr>
+      </w:r>
+    </w:p>
+    <w:p>
+      <w:pPr>
+        <w:pBdr/>
+        <w:spacing/>
+        <w:ind/>
+        <w:jc w:val="center"/>
+        <w:rPr>
+          <w:rFonts w:ascii="Asana Math" w:hAnsi="Asana Math" w:cs="Asana Math"/>
+          <w:highlight w:val="none"/>
+          <w:lang w:val="es-ES"/>
+        </w:rPr>
+      </w:pPr>
+      <w:r>
+        <w:rPr>
+          <w:rFonts w:ascii="Asana Math" w:hAnsi="Asana Math" w:cs="Asana Math"/>
+          <w:highlight w:val="none"/>
+          <w:lang w:val="es-ES"/>
+        </w:rPr>
+      </w:r>
+      <w:r>
+        <w:rPr>
+          <w:rFonts w:ascii="Asana Math" w:hAnsi="Asana Math" w:cs="Asana Math"/>
+          <w:highlight w:val="none"/>
+          <w:lang w:val="es-ES"/>
+        </w:rPr>
+        <w:t xml:space="preserve">En los ejemplos anteriores vemos su representaci</w:t>
+      </w:r>
+      <w:r>
+        <w:rPr>
+          <w:rFonts w:ascii="Asana Math" w:hAnsi="Asana Math" w:cs="Asana Math"/>
+          <w:highlight w:val="none"/>
+          <w:lang w:val="es-ES"/>
+        </w:rPr>
+        <w:t xml:space="preserve">ón binaria y aparte las rotaciones que ciertos tetriminos hacen, ahora seguimos con la siguiente cuestion.</w:t>
+      </w:r>
+      <w:r>
+        <w:rPr>
+          <w:rFonts w:ascii="Asana Math" w:hAnsi="Asana Math" w:cs="Asana Math"/>
+          <w:highlight w:val="none"/>
+          <w:lang w:val="es-ES"/>
+        </w:rPr>
+      </w:r>
+      <w:r>
+        <w:rPr>
+          <w:rFonts w:ascii="Asana Math" w:hAnsi="Asana Math" w:cs="Asana Math"/>
+          <w:highlight w:val="none"/>
+          <w:lang w:val="es-ES"/>
+        </w:rPr>
+      </w:r>
+    </w:p>
+    <w:p>
+      <w:pPr>
+        <w:pBdr/>
+        <w:spacing/>
+        <w:ind/>
+        <w:jc w:val="center"/>
+        <w:rPr>
+          <w:rFonts w:ascii="Asana Math" w:hAnsi="Asana Math" w:cs="Asana Math"/>
+          <w:highlight w:val="none"/>
+          <w:lang w:val="es-ES" w:bidi="es-ES"/>
+        </w:rPr>
+      </w:pPr>
+      <w:r>
+        <w:rPr>
+          <w:rFonts w:ascii="Asana Math" w:hAnsi="Asana Math" w:cs="Asana Math"/>
+          <w:highlight w:val="none"/>
+          <w:lang w:val="es-ES" w:bidi="es-ES"/>
+        </w:rPr>
+        <w:t xml:space="preserve">Ya tenemos nuestro tablero pero,</w:t>
+      </w:r>
+      <w:r>
+        <w:rPr>
+          <w:rFonts w:ascii="Asana Math" w:hAnsi="Asana Math" w:cs="Asana Math"/>
+          <w:highlight w:val="none"/>
+          <w:lang w:val="es-ES" w:bidi="es-ES"/>
+        </w:rPr>
+        <w:t xml:space="preserve"> ¿ c</w:t>
+      </w:r>
+      <w:r>
+        <w:rPr>
+          <w:rFonts w:ascii="Asana Math" w:hAnsi="Asana Math" w:cs="Asana Math"/>
+          <w:highlight w:val="none"/>
+          <w:lang w:val="es-ES" w:bidi="es-ES"/>
+        </w:rPr>
+        <w:t xml:space="preserve">ómo añado mis piezas a mi tablero ? </w:t>
+      </w:r>
+      <w:r>
+        <w:rPr>
+          <w:rFonts w:ascii="Asana Math" w:hAnsi="Asana Math" w:cs="Asana Math"/>
+          <w:highlight w:val="none"/>
+          <w:lang w:val="es-ES"/>
+        </w:rPr>
+      </w:r>
+      <w:r>
+        <w:rPr>
+          <w:rFonts w:ascii="Asana Math" w:hAnsi="Asana Math" w:cs="Asana Math"/>
+          <w:highlight w:val="none"/>
+          <w:lang w:val="es-ES" w:bidi="es-ES"/>
+        </w:rPr>
+      </w:r>
+    </w:p>
+    <w:p>
+      <w:pPr>
+        <w:pBdr/>
+        <w:spacing/>
+        <w:ind/>
+        <w:jc w:val="center"/>
+        <w:rPr>
+          <w:rFonts w:ascii="Asana Math" w:hAnsi="Asana Math" w:cs="Asana Math"/>
+          <w:b w:val="0"/>
+          <w:bCs w:val="0"/>
+          <w:color w:val="000000" w:themeColor="text1"/>
+          <w:highlight w:val="none"/>
+          <w:lang w:val="es-ES" w:bidi="es-ES"/>
+        </w:rPr>
+      </w:pPr>
+      <w:r>
+        <w:rPr>
+          <w:rFonts w:ascii="Asana Math" w:hAnsi="Asana Math" w:cs="Asana Math"/>
+          <w:highlight w:val="none"/>
+          <w:lang w:val="es-ES" w:bidi="es-ES"/>
+        </w:rPr>
+        <w:t xml:space="preserve">Es aqui en donde utilizamos otra mecanica del programa el </w:t>
+      </w:r>
+      <w:r>
+        <w:rPr>
+          <w:rFonts w:ascii="Asana Math" w:hAnsi="Asana Math" w:cs="Asana Math"/>
+          <w:b/>
+          <w:bCs/>
+          <w:color w:val="000000" w:themeColor="text1"/>
+          <w:highlight w:val="none"/>
+          <w:lang w:val="es-ES" w:bidi="es-ES"/>
+        </w:rPr>
+        <w:t xml:space="preserve">bits masking, </w:t>
+      </w:r>
+      <w:r>
+        <w:rPr>
+          <w:rFonts w:ascii="Asana Math" w:hAnsi="Asana Math" w:cs="Asana Math"/>
+          <w:b w:val="0"/>
+          <w:bCs w:val="0"/>
+          <w:color w:val="000000" w:themeColor="text1"/>
+          <w:highlight w:val="none"/>
+          <w:lang w:val="es-ES" w:bidi="es-ES"/>
+        </w:rPr>
+        <w:t xml:space="preserve">pero antes de utilizar el bit masking la verdadera pregunta es, como me indexo para que el bit masking sea ejecutado correctamente y es aqui en donde nos enfrentamos a otro gran problema</w:t>
+      </w:r>
+      <w:r>
+        <w:rPr>
+          <w:rFonts w:ascii="Asana Math" w:hAnsi="Asana Math" w:cs="Asana Math"/>
+          <w:b w:val="0"/>
+          <w:bCs w:val="0"/>
+          <w:highlight w:val="none"/>
+        </w:rPr>
+      </w:r>
+      <w:r>
+        <w:rPr>
+          <w:rFonts w:ascii="Asana Math" w:hAnsi="Asana Math" w:cs="Asana Math"/>
+          <w:b w:val="0"/>
+          <w:bCs w:val="0"/>
+          <w:color w:val="000000" w:themeColor="text1"/>
+          <w:highlight w:val="none"/>
+          <w:lang w:val="es-ES" w:bidi="es-ES"/>
+        </w:rPr>
+      </w:r>
+    </w:p>
+    <w:p>
+      <w:pPr>
+        <w:pBdr/>
+        <w:spacing/>
+        <w:ind/>
+        <w:jc w:val="center"/>
+        <w:rPr>
+          <w:rFonts w:ascii="Asana Math" w:hAnsi="Asana Math" w:cs="Asana Math"/>
+          <w:b w:val="0"/>
+          <w:bCs w:val="0"/>
+          <w:color w:val="000000" w:themeColor="text1"/>
+          <w:sz w:val="24"/>
+          <w:szCs w:val="24"/>
+          <w:highlight w:val="none"/>
+          <w:lang w:val="es-ES" w:bidi="es-ES"/>
+        </w:rPr>
+      </w:pPr>
+      <w:r>
+        <w:rPr>
+          <w:rFonts w:ascii="Asana Math" w:hAnsi="Asana Math" w:cs="Asana Math"/>
+          <w:b w:val="0"/>
+          <w:bCs w:val="0"/>
+          <w:color w:val="000000" w:themeColor="text1"/>
+          <w:sz w:val="24"/>
+          <w:szCs w:val="24"/>
+          <w:highlight w:val="none"/>
+          <w:lang w:val="es-ES" w:bidi="es-ES"/>
+        </w:rPr>
+        <w:t xml:space="preserve">INDEXACION Y BIT MASKING.</w:t>
+      </w:r>
+      <w:r>
+        <w:rPr>
+          <w:rFonts w:ascii="Asana Math" w:hAnsi="Asana Math" w:cs="Asana Math"/>
+          <w:b w:val="0"/>
+          <w:bCs w:val="0"/>
+          <w:sz w:val="24"/>
+          <w:szCs w:val="24"/>
+          <w:highlight w:val="none"/>
+        </w:rPr>
+      </w:r>
+      <w:r>
+        <w:rPr>
+          <w:rFonts w:ascii="Asana Math" w:hAnsi="Asana Math" w:cs="Asana Math"/>
+          <w:b w:val="0"/>
+          <w:bCs w:val="0"/>
+          <w:color w:val="000000" w:themeColor="text1"/>
+          <w:sz w:val="24"/>
+          <w:szCs w:val="24"/>
+          <w:highlight w:val="none"/>
+          <w:lang w:val="es-ES" w:bidi="es-ES"/>
+        </w:rPr>
+      </w:r>
+    </w:p>
+    <w:p>
+      <w:pPr>
+        <w:pBdr/>
+        <w:spacing/>
+        <w:ind/>
+        <w:jc w:val="center"/>
+        <w:rPr>
+          <w:rFonts w:ascii="Asana Math" w:hAnsi="Asana Math" w:cs="Asana Math"/>
+          <w:b w:val="0"/>
+          <w:bCs w:val="0"/>
+          <w:color w:val="000000" w:themeColor="text1"/>
+          <w:sz w:val="22"/>
+          <w:szCs w:val="22"/>
+          <w:highlight w:val="none"/>
+          <w:lang w:val="es-ES" w:bidi="es-ES"/>
+        </w:rPr>
+      </w:pPr>
+      <w:r>
+        <w:rPr>
+          <w:rFonts w:ascii="Asana Math" w:hAnsi="Asana Math" w:cs="Asana Math"/>
+          <w:b w:val="0"/>
+          <w:bCs w:val="0"/>
+          <w:color w:val="000000" w:themeColor="text1"/>
+          <w:sz w:val="22"/>
+          <w:szCs w:val="22"/>
+          <w:highlight w:val="none"/>
+          <w:lang w:val="es-ES" w:bidi="es-ES"/>
+        </w:rPr>
+        <w:t xml:space="preserve">Como mi opcion principal, toda pieza ingresara en la mitad de nuestro tablero y de alli podemos hacer la indexacion.</w:t>
+      </w:r>
+      <w:r>
+        <w:rPr>
+          <w:rFonts w:ascii="Asana Math" w:hAnsi="Asana Math" w:cs="Asana Math"/>
+          <w:b w:val="0"/>
+          <w:bCs w:val="0"/>
+          <w:sz w:val="18"/>
+          <w:szCs w:val="18"/>
+          <w:highlight w:val="none"/>
+        </w:rPr>
+      </w:r>
+      <w:r>
+        <w:rPr>
+          <w:rFonts w:ascii="Asana Math" w:hAnsi="Asana Math" w:cs="Asana Math"/>
+          <w:b w:val="0"/>
+          <w:bCs w:val="0"/>
+          <w:color w:val="000000" w:themeColor="text1"/>
+          <w:sz w:val="22"/>
+          <w:szCs w:val="22"/>
+          <w:highlight w:val="none"/>
+          <w:lang w:val="es-ES" w:bidi="es-ES"/>
+        </w:rPr>
+      </w:r>
+    </w:p>
+    <w:p>
+      <w:pPr>
+        <w:pBdr/>
+        <w:spacing/>
+        <w:ind/>
+        <w:jc w:val="center"/>
+        <w:rPr>
+          <w:rFonts w:ascii="Asana Math" w:hAnsi="Asana Math" w:cs="Asana Math"/>
+          <w:b w:val="0"/>
+          <w:bCs w:val="0"/>
+          <w:color w:val="000000" w:themeColor="text1"/>
+          <w:sz w:val="22"/>
+          <w:szCs w:val="22"/>
+          <w:highlight w:val="none"/>
+          <w:lang w:val="es-ES" w:bidi="es-ES"/>
+        </w:rPr>
+      </w:pPr>
+      <w:r>
+        <w:rPr>
+          <w:rFonts w:ascii="Asana Math" w:hAnsi="Asana Math" w:cs="Asana Math"/>
+          <w:b w:val="0"/>
+          <w:bCs w:val="0"/>
+          <w:color w:val="000000" w:themeColor="text1"/>
+          <w:sz w:val="22"/>
+          <w:szCs w:val="22"/>
+          <w:highlight w:val="none"/>
+          <w:lang w:val="es-ES" w:bidi="es-ES"/>
+        </w:rPr>
+        <w:t xml:space="preserve">Sabiendo que nuestro tablero tiene tamaño</w:t>
+      </w:r>
+      <w:r>
+        <w:rPr>
+          <w:rFonts w:ascii="Asana Math" w:hAnsi="Asana Math" w:cs="Asana Math"/>
+          <w:b w:val="0"/>
+          <w:bCs w:val="0"/>
+          <w:sz w:val="18"/>
+          <w:szCs w:val="18"/>
+          <w:highlight w:val="none"/>
+        </w:rPr>
+      </w:r>
+      <w:r>
+        <w:rPr>
+          <w:rFonts w:ascii="Asana Math" w:hAnsi="Asana Math" w:cs="Asana Math"/>
+          <w:b w:val="0"/>
+          <w:bCs w:val="0"/>
+          <w:color w:val="000000" w:themeColor="text1"/>
+          <w:sz w:val="22"/>
+          <w:szCs w:val="22"/>
+          <w:highlight w:val="none"/>
+          <w:lang w:val="es-ES" w:bidi="es-ES"/>
+        </w:rPr>
+      </w:r>
+    </w:p>
+    <w:p>
+      <w:pPr>
+        <w:suppressLineNumbers w:val="false"/>
+        <w:pBdr>
+          <w:top w:val="single" w:color="000000" w:sz="4" w:space="0"/>
+          <w:left w:val="single" w:color="000000" w:sz="4" w:space="0"/>
+          <w:bottom w:val="single" w:color="000000" w:sz="4" w:space="0"/>
+          <w:right w:val="single" w:color="000000" w:sz="4" w:space="0"/>
+          <w:between w:val="none" w:color="000000" w:sz="4" w:space="0"/>
+        </w:pBdr>
+        <w:spacing/>
+        <w:ind/>
+        <w:jc w:val="center"/>
+        <w:rPr>
+          <w:rFonts w:ascii="Asana Math" w:hAnsi="Asana Math" w:cs="Asana Math"/>
+          <w:b w:val="0"/>
+          <w:bCs w:val="0"/>
+          <w:color w:val="000000" w:themeColor="text1"/>
+          <w:sz w:val="22"/>
+          <w:szCs w:val="22"/>
+          <w:highlight w:val="none"/>
+        </w:rPr>
+      </w:pPr>
+      <w:r>
+        <w:rPr>
+          <w:rFonts w:ascii="Asana Math" w:hAnsi="Asana Math" w:cs="Asana Math"/>
+          <w:b w:val="0"/>
+          <w:bCs w:val="0"/>
+          <w:color w:val="000000" w:themeColor="text1"/>
+          <w:sz w:val="22"/>
+          <w:szCs w:val="22"/>
+          <w:highlight w:val="none"/>
+          <w:lang w:val="es-ES" w:bidi="es-ES"/>
+        </w:rPr>
+      </w:r>
+      <m:oMathPara>
+        <m:oMathParaPr/>
+        <m:oMath>
+          <m:r>
+            <w:rPr>
+              <w:rFonts w:hint="default" w:ascii="Cambria Math" w:hAnsi="Cambria Math" w:eastAsia="Cambria Math" w:cs="Cambria Math"/>
+              <w:color w:val="000000" w:themeColor="text1"/>
+              <w:sz w:val="22"/>
+              <w:szCs w:val="22"/>
+              <w:highlight w:val="none"/>
+              <w:lang w:val="es-ES" w:bidi="es-ES"/>
+            </w:rPr>
+            <m:rPr>
+              <m:sty m:val="i"/>
+            </m:rPr>
+            <m:t>tablero[alto][byte por fila]</m:t>
+          </m:r>
+        </m:oMath>
+      </m:oMathPara>
+      <w:r>
+        <w:rPr>
+          <w:rFonts w:ascii="Asana Math" w:hAnsi="Asana Math" w:cs="Asana Math"/>
+          <w:b w:val="0"/>
+          <w:bCs w:val="0"/>
+          <w:sz w:val="18"/>
+          <w:szCs w:val="18"/>
+          <w:highlight w:val="none"/>
+        </w:rPr>
+      </w:r>
+      <w:r>
+        <w:rPr>
+          <w:rFonts w:ascii="Asana Math" w:hAnsi="Asana Math" w:cs="Asana Math"/>
+          <w:b w:val="0"/>
+          <w:bCs w:val="0"/>
+          <w:color w:val="000000" w:themeColor="text1"/>
+          <w:sz w:val="22"/>
+          <w:szCs w:val="22"/>
+          <w:highlight w:val="none"/>
+        </w:rPr>
+      </w:r>
+    </w:p>
+    <w:p>
+      <w:pPr>
+        <w:pBdr/>
+        <w:spacing/>
+        <w:ind/>
+        <w:jc w:val="center"/>
+        <w:rPr>
+          <w:rFonts w:ascii="Asana Math" w:hAnsi="Asana Math" w:cs="Asana Math"/>
+          <w:b w:val="0"/>
+          <w:bCs w:val="0"/>
+          <w:color w:val="000000" w:themeColor="text1"/>
+          <w:sz w:val="22"/>
+          <w:szCs w:val="22"/>
+          <w:highlight w:val="none"/>
+          <w:lang w:val="es-ES" w:bidi="es-ES"/>
+        </w:rPr>
+      </w:pPr>
+      <w:r>
+        <w:rPr>
+          <w:rFonts w:ascii="Asana Math" w:hAnsi="Asana Math" w:cs="Asana Math"/>
+          <w:b w:val="0"/>
+          <w:bCs w:val="0"/>
+          <w:color w:val="000000" w:themeColor="text1"/>
+          <w:sz w:val="22"/>
+          <w:szCs w:val="22"/>
+          <w:highlight w:val="none"/>
+          <w:lang w:val="es-ES" w:bidi="es-ES"/>
+        </w:rPr>
+      </w:r>
+      <w:r>
+        <w:rPr>
+          <w:rFonts w:ascii="Asana Math" w:hAnsi="Asana Math" w:cs="Asana Math"/>
+          <w:b w:val="0"/>
+          <w:bCs w:val="0"/>
+          <w:color w:val="000000" w:themeColor="text1"/>
+          <w:sz w:val="22"/>
+          <w:szCs w:val="22"/>
+          <w:highlight w:val="none"/>
+          <w:lang w:val="es-ES" w:bidi="es-ES"/>
+        </w:rPr>
+        <w:t xml:space="preserve">Tenemos que la mitad de nuestro tablero ser</w:t>
+      </w:r>
+      <w:r>
+        <w:rPr>
+          <w:rFonts w:ascii="Asana Math" w:hAnsi="Asana Math" w:cs="Asana Math"/>
+          <w:b w:val="0"/>
+          <w:bCs w:val="0"/>
+          <w:color w:val="000000" w:themeColor="text1"/>
+          <w:sz w:val="22"/>
+          <w:szCs w:val="22"/>
+          <w:highlight w:val="none"/>
+          <w:lang w:val="es-ES" w:bidi="es-ES"/>
+        </w:rPr>
+        <w:t xml:space="preserve">á</w:t>
+      </w:r>
+      <w:r>
+        <w:rPr>
+          <w:rFonts w:ascii="Asana Math" w:hAnsi="Asana Math" w:cs="Asana Math"/>
+          <w:b w:val="0"/>
+          <w:bCs w:val="0"/>
+          <w:sz w:val="18"/>
+          <w:szCs w:val="18"/>
+          <w:highlight w:val="none"/>
+        </w:rPr>
+      </w:r>
+      <w:r>
+        <w:rPr>
+          <w:rFonts w:ascii="Asana Math" w:hAnsi="Asana Math" w:cs="Asana Math"/>
+          <w:b w:val="0"/>
+          <w:bCs w:val="0"/>
+          <w:color w:val="000000" w:themeColor="text1"/>
+          <w:sz w:val="22"/>
+          <w:szCs w:val="22"/>
+          <w:highlight w:val="none"/>
+          <w:lang w:val="es-ES" w:bidi="es-ES"/>
+        </w:rPr>
+      </w:r>
+    </w:p>
+    <w:p>
+      <w:pPr>
+        <w:pBdr/>
+        <w:spacing/>
+        <w:ind/>
+        <w:jc w:val="center"/>
+        <w:rPr>
+          <w:rFonts w:ascii="Asana Math" w:hAnsi="Asana Math" w:cs="Asana Math"/>
+          <w:b w:val="0"/>
+          <w:bCs w:val="0"/>
+          <w:sz w:val="18"/>
+          <w:szCs w:val="18"/>
+          <w:highlight w:val="none"/>
+        </w:rPr>
+      </w:pPr>
+      <w:r>
+        <w:rPr>
+          <w:rFonts w:ascii="Asana Math" w:hAnsi="Asana Math" w:cs="Asana Math"/>
+          <w:b w:val="0"/>
+          <w:bCs w:val="0"/>
+          <w:color w:val="000000" w:themeColor="text1"/>
+          <w:sz w:val="22"/>
+          <w:szCs w:val="22"/>
+          <w:highlight w:val="none"/>
+          <w:lang w:val="es-ES" w:bidi="es-ES"/>
+        </w:rPr>
+      </w:r>
+      <w:r>
+        <mc:AlternateContent>
+          <mc:Choice Requires="wpg">
+            <w:drawing>
+              <wp:inline xmlns:wp="http://schemas.openxmlformats.org/drawingml/2006/wordprocessingDrawing" distT="0" distB="0" distL="0" distR="0">
+                <wp:extent cx="4175130" cy="2838090"/>
+                <wp:effectExtent l="0" t="0" r="0" b="0"/>
+                <wp:docPr id="16" name=""/>
+                <wp:cNvGraphicFramePr>
+                  <a:graphicFrameLocks xmlns:a="http://schemas.openxmlformats.org/drawingml/2006/main" noChangeAspect="1"/>
+                </wp:cNvGraphicFramePr>
+                <a:graphic xmlns:a="http://schemas.openxmlformats.org/drawingml/2006/main">
+                  <a:graphicData uri="http://schemas.openxmlformats.org/drawingml/2006/picture">
+                    <pic:pic xmlns:pic="http://schemas.openxmlformats.org/drawingml/2006/picture">
+                      <pic:nvPicPr>
+                        <pic:cNvPr id="987690603" name=""/>
+                        <pic:cNvPicPr>
+                          <a:picLocks noChangeAspect="1"/>
+                        </pic:cNvPicPr>
+                        <pic:nvPr/>
+                      </pic:nvPicPr>
+                      <pic:blipFill rotWithShape="1">
+                        <a:blip r:embed="rId18"/>
+                        <a:stretch/>
+                      </pic:blipFill>
+                      <pic:spPr bwMode="auto">
+                        <a:xfrm flipH="0" flipV="0">
+                          <a:off x="0" y="0"/>
+                          <a:ext cx="4175129" cy="2838089"/>
+                        </a:xfrm>
+                        <a:prstGeom prst="rect">
+                          <a:avLst/>
+                        </a:prstGeom>
+                      </pic:spPr>
+                    </pic:pic>
+                  </a:graphicData>
+                </a:graphic>
+              </wp:inline>
+            </w:drawing>
+          </mc:Choice>
+          <mc:Fallback>
+            <w:pict>
+              <v:shapetype id="_x0000_t75" coordsize="21600,21600" o:spt="75" o:preferrelative="t" path="m@4@5l@4@11@9@11@9@5xe" filled="f" stroked="f">
+                <v:stroke joinstyle="miter"/>
+                <v:formulas>
+                  <v:f eqn="if lineDrawn pixelLineWidth 0"/>
+                  <v:f eqn="sum @0 1 0"/>
+                  <v:f eqn="sum 0 0 @1"/>
+                  <v:f eqn="prod @2 1 2"/>
+                  <v:f eqn="prod @3 21600 pixelWidth"/>
+                  <v:f eqn="prod @3 21600 pixelHeight"/>
+                  <v:f eqn="sum @0 0 1"/>
+                  <v:f eqn="prod @6 1 2"/>
+                  <v:f eqn="prod @7 21600 pixelWidth"/>
+                  <v:f eqn="sum @8 21600 0"/>
+                  <v:f eqn="prod @7 21600 pixelHeight"/>
+                  <v:f eqn="sum @10 21600 0"/>
+                </v:formulas>
+                <v:path o:extrusionok="f" gradientshapeok="t" o:connecttype="rect"/>
+                <o:lock v:ext="edit" aspectratio="t"/>
+              </v:shapetype>
+              <v:shape id="_x0000_i15" o:spid="_x0000_s15" type="#_x0000_t75" style="width:328.75pt;height:223.47pt;mso-wrap-distance-left:0.00pt;mso-wrap-distance-top:0.00pt;mso-wrap-distance-right:0.00pt;mso-wrap-distance-bottom:0.00pt;z-index:1;" stroked="false">
+                <v:imagedata r:id="rId18" o:title=""/>
+                <o:lock v:ext="edit" rotation="t"/>
+              </v:shape>
+            </w:pict>
+          </mc:Fallback>
+        </mc:AlternateContent>
+      </w:r>
+      <w:r>
+        <w:rPr>
+          <w:rFonts w:ascii="Asana Math" w:hAnsi="Asana Math" w:cs="Asana Math"/>
+          <w:b w:val="0"/>
+          <w:bCs w:val="0"/>
+          <w:color w:val="000000" w:themeColor="text1"/>
+          <w:sz w:val="22"/>
+          <w:szCs w:val="22"/>
+          <w:highlight w:val="none"/>
+          <w:lang w:val="es-ES" w:bidi="es-ES"/>
+        </w:rPr>
+      </w:r>
+      <w:r>
+        <w:rPr>
+          <w:rFonts w:ascii="Asana Math" w:hAnsi="Asana Math" w:cs="Asana Math"/>
+          <w:b w:val="0"/>
+          <w:bCs w:val="0"/>
+          <w:sz w:val="18"/>
+          <w:szCs w:val="18"/>
+          <w:highlight w:val="none"/>
+        </w:rPr>
+      </w:r>
+    </w:p>
+    <w:p>
+      <w:pPr>
+        <w:pStyle w:val="883"/>
+        <w:pBdr/>
+        <w:spacing/>
+        <w:ind/>
+        <w:jc w:val="center"/>
+        <w:rPr/>
+      </w:pPr>
+      <w:r>
+        <w:t xml:space="preserve">Figure </w:t>
+      </w:r>
+      <w:r>
+        <w:fldChar w:fldCharType="begin"/>
+        <w:instrText xml:space="preserve"> SEQ Figure \* Arabic </w:instrText>
+        <w:fldChar w:fldCharType="separate"/>
+      </w:r>
+      <w:r>
+        <w:t xml:space="preserve">8</w:t>
+      </w:r>
+      <w:r/>
+      <w:r>
+        <w:fldChar w:fldCharType="end"/>
+      </w:r>
+      <w:r>
+        <w:t xml:space="preserve">.Esquema propio de indexación de tetriminos </w:t>
+      </w:r>
+      <w:r/>
+    </w:p>
+    <w:p>
+      <w:pPr>
+        <w:pBdr/>
+        <w:spacing/>
+        <w:ind/>
+        <w:jc w:val="center"/>
+        <w:rPr>
+          <w:rFonts w:ascii="Asana Math" w:hAnsi="Asana Math" w:eastAsia="Asana Math" w:cs="Asana Math"/>
+          <w:highlight w:val="none"/>
+          <w:lang w:val="es-ES"/>
+        </w:rPr>
+      </w:pPr>
+      <w:r>
+        <w:rPr>
+          <w:rFonts w:ascii="Asana Math" w:hAnsi="Asana Math" w:eastAsia="Asana Math" w:cs="Asana Math"/>
+          <w:lang w:val="es-ES"/>
+        </w:rPr>
+        <w:t xml:space="preserve">Utilizo que mis figuras tengan dimensiones fijas y cuadradas para mejorar las mecanicas en </w:t>
+      </w:r>
+      <w:r>
+        <w:rPr>
+          <w:rFonts w:ascii="Asana Math" w:hAnsi="Asana Math" w:eastAsia="Asana Math" w:cs="Asana Math"/>
+          <w:lang w:val="es-ES"/>
+        </w:rPr>
+        <w:t xml:space="preserve">el bit masking, y ya  con esto estoy indexado; Ahora unicamente me toca utilizar la mecanica de bit masking pero no sin antes hacer lo siguiente tengo que apuntar bien debido a que si unicamente utilizo bit masking me rellenara la columna de manera lineal.</w:t>
+      </w:r>
+      <w:r>
+        <w:rPr>
+          <w:rFonts w:ascii="Asana Math" w:hAnsi="Asana Math" w:eastAsia="Asana Math" w:cs="Asana Math"/>
+          <w:highlight w:val="none"/>
+          <w:lang w:val="es-ES"/>
+        </w:rPr>
+      </w:r>
+      <w:r>
+        <w:rPr>
+          <w:rFonts w:ascii="Asana Math" w:hAnsi="Asana Math" w:eastAsia="Asana Math" w:cs="Asana Math"/>
+          <w:highlight w:val="none"/>
+          <w:lang w:val="es-ES"/>
+        </w:rPr>
+      </w:r>
+    </w:p>
+    <w:p>
+      <w:pPr>
+        <w:pBdr/>
+        <w:spacing/>
+        <w:ind/>
+        <w:jc w:val="center"/>
+        <w:rPr>
+          <w:rFonts w:ascii="Asana Math" w:hAnsi="Asana Math" w:eastAsia="Asana Math" w:cs="Asana Math"/>
+          <w:highlight w:val="none"/>
+          <w:lang w:val="es-ES" w:bidi="es-ES"/>
+        </w:rPr>
+      </w:pPr>
+      <w:r>
+        <w:rPr>
+          <w:rFonts w:ascii="Asana Math" w:hAnsi="Asana Math" w:eastAsia="Asana Math" w:cs="Asana Math"/>
+          <w:highlight w:val="none"/>
+          <w:lang w:val="es-ES" w:bidi="es-ES"/>
+        </w:rPr>
+        <w:t xml:space="preserve">Nuestra mecanica para indexarnos es la siguiente:</w:t>
+      </w:r>
+      <w:r>
+        <w:rPr>
+          <w:rFonts w:ascii="Asana Math" w:hAnsi="Asana Math" w:eastAsia="Asana Math" w:cs="Asana Math"/>
+          <w:highlight w:val="none"/>
+          <w:lang w:val="es-ES"/>
+        </w:rPr>
+      </w:r>
+      <w:r>
+        <w:rPr>
+          <w:rFonts w:ascii="Asana Math" w:hAnsi="Asana Math" w:eastAsia="Asana Math" w:cs="Asana Math"/>
+          <w:highlight w:val="none"/>
+          <w:lang w:val="es-ES" w:bidi="es-ES"/>
+        </w:rPr>
+      </w:r>
+    </w:p>
+    <w:p>
+      <w:pPr>
+        <w:pBdr/>
+        <w:spacing/>
+        <w:ind/>
+        <w:jc w:val="center"/>
+        <w:rPr>
+          <w:rFonts w:ascii="Asana Math" w:hAnsi="Asana Math" w:eastAsia="Asana Math" w:cs="Asana Math"/>
+          <w:highlight w:val="none"/>
+          <w:lang w:val="es-ES" w:bidi="es-ES"/>
+        </w:rPr>
+      </w:pPr>
+      <w:r>
+        <w:rPr>
+          <w:rFonts w:ascii="Asana Math" w:hAnsi="Asana Math" w:eastAsia="Asana Math" w:cs="Asana Math"/>
+          <w:highlight w:val="none"/>
+          <w:lang w:val="es-ES" w:bidi="es-ES"/>
+        </w:rPr>
+        <w:t xml:space="preserve">“Para cada fila de la pieza apuntar a la fila del tablero</w:t>
+      </w:r>
+      <w:r>
+        <w:rPr>
+          <w:rFonts w:ascii="Asana Math" w:hAnsi="Asana Math" w:eastAsia="Asana Math" w:cs="Asana Math"/>
+          <w:highlight w:val="none"/>
+          <w:lang w:val="es-ES" w:bidi="es-ES"/>
+        </w:rPr>
+        <w:t xml:space="preserve">”</w:t>
+      </w:r>
+      <w:r>
+        <w:rPr>
+          <w:rFonts w:ascii="Asana Math" w:hAnsi="Asana Math" w:eastAsia="Asana Math" w:cs="Asana Math"/>
+          <w:highlight w:val="none"/>
+          <w:lang w:val="es-ES"/>
+        </w:rPr>
+      </w:r>
+      <w:r>
+        <w:rPr>
+          <w:rFonts w:ascii="Asana Math" w:hAnsi="Asana Math" w:eastAsia="Asana Math" w:cs="Asana Math"/>
+          <w:highlight w:val="none"/>
+          <w:lang w:val="es-ES" w:bidi="es-ES"/>
+        </w:rPr>
+      </w:r>
+    </w:p>
+    <w:p>
+      <w:pPr>
+        <w:pBdr/>
+        <w:spacing/>
+        <w:ind/>
+        <w:jc w:val="center"/>
+        <w:rPr>
+          <w:rFonts w:ascii="Asana Math" w:hAnsi="Asana Math" w:eastAsia="Asana Math" w:cs="Asana Math"/>
+          <w:highlight w:val="none"/>
+          <w:lang w:val="es-ES" w:bidi="es-ES"/>
+        </w:rPr>
+      </w:pPr>
+      <w:r>
+        <w:rPr>
+          <w:rFonts w:ascii="Asana Math" w:hAnsi="Asana Math" w:eastAsia="Asana Math" w:cs="Asana Math"/>
+          <w:highlight w:val="none"/>
+          <w:lang w:val="es-ES" w:bidi="es-ES"/>
+        </w:rPr>
+        <w:t xml:space="preserve">“para cada columna de la pieza utilizar el bitmasking”</w:t>
+      </w:r>
+      <w:r>
+        <w:rPr>
+          <w:rFonts w:ascii="Asana Math" w:hAnsi="Asana Math" w:eastAsia="Asana Math" w:cs="Asana Math"/>
+          <w:highlight w:val="none"/>
+          <w:lang w:val="es-ES"/>
+        </w:rPr>
+      </w:r>
+      <w:r>
+        <w:rPr>
+          <w:rFonts w:ascii="Asana Math" w:hAnsi="Asana Math" w:eastAsia="Asana Math" w:cs="Asana Math"/>
+          <w:highlight w:val="none"/>
+          <w:lang w:val="es-ES" w:bidi="es-ES"/>
+        </w:rPr>
+      </w:r>
+    </w:p>
+    <w:p>
+      <w:pPr>
+        <w:pBdr/>
+        <w:spacing/>
+        <w:ind/>
+        <w:jc w:val="center"/>
+        <w:rPr>
+          <w:rFonts w:ascii="Asana Math" w:hAnsi="Asana Math" w:eastAsia="Asana Math" w:cs="Asana Math"/>
+          <w:highlight w:val="none"/>
+          <w:lang w:val="es-ES" w:bidi="es-ES"/>
+        </w:rPr>
+      </w:pPr>
+      <w:r>
+        <w:rPr>
+          <w:rFonts w:ascii="Asana Math" w:hAnsi="Asana Math" w:eastAsia="Asana Math" w:cs="Asana Math"/>
+          <w:highlight w:val="none"/>
+          <w:lang w:val="es-ES" w:bidi="es-ES"/>
+        </w:rPr>
+        <w:t xml:space="preserve">Eso se hace utilizando unicamente ciclos e indexadores.</w:t>
+      </w:r>
+      <w:r>
+        <w:rPr>
+          <w:rFonts w:ascii="Asana Math" w:hAnsi="Asana Math" w:eastAsia="Asana Math" w:cs="Asana Math"/>
+          <w:highlight w:val="none"/>
+          <w:lang w:val="es-ES"/>
+        </w:rPr>
+      </w:r>
+      <w:r>
+        <w:rPr>
+          <w:rFonts w:ascii="Asana Math" w:hAnsi="Asana Math" w:eastAsia="Asana Math" w:cs="Asana Math"/>
+          <w:highlight w:val="none"/>
+          <w:lang w:val="es-ES" w:bidi="es-ES"/>
+        </w:rPr>
+      </w:r>
+    </w:p>
+    <w:p>
+      <w:pPr>
+        <w:pBdr/>
+        <w:spacing/>
+        <w:ind/>
+        <w:jc w:val="center"/>
+        <w:rPr>
+          <w:rFonts w:ascii="Asana Math" w:hAnsi="Asana Math" w:eastAsia="Asana Math" w:cs="Asana Math"/>
+          <w:highlight w:val="none"/>
+          <w:lang w:val="es-ES" w:bidi="es-ES"/>
+        </w:rPr>
+      </w:pPr>
+      <w:r>
+        <w:rPr>
+          <w:rFonts w:ascii="Asana Math" w:hAnsi="Asana Math" w:eastAsia="Asana Math" w:cs="Asana Math"/>
+          <w:highlight w:val="none"/>
+          <w:lang w:val="es-ES" w:bidi="es-ES"/>
+        </w:rPr>
+      </w:r>
+      <w:r>
+        <w:rPr>
+          <w:rFonts w:ascii="Asana Math" w:hAnsi="Asana Math" w:eastAsia="Asana Math" w:cs="Asana Math"/>
+          <w:highlight w:val="none"/>
+          <w:lang w:val="es-ES" w:bidi="es-ES"/>
+        </w:rPr>
+        <w:t xml:space="preserve">A</w:t>
+      </w:r>
+      <w:r>
+        <w:rPr>
+          <w:rFonts w:ascii="Asana Math" w:hAnsi="Asana Math" w:eastAsia="Asana Math" w:cs="Asana Math"/>
+          <w:highlight w:val="none"/>
+          <w:lang w:val="es-ES" w:bidi="es-ES"/>
+        </w:rPr>
+        <w:t xml:space="preserve">qui tenemos que hacer algo sumamente importante y eso es el bit masking, pero que en realidad se debe de hacer, primero tenemos nuestro tablero, nuestro tablero esta lleno de 0 y nuestras fichas son matrices que tienen bits activos(1’s) y bits inactivos (0</w:t>
+      </w:r>
+      <w:r>
+        <w:rPr>
+          <w:rFonts w:ascii="Asana Math" w:hAnsi="Asana Math" w:eastAsia="Asana Math" w:cs="Asana Math"/>
+          <w:highlight w:val="none"/>
+          <w:lang w:val="es-ES" w:bidi="es-ES"/>
+        </w:rPr>
+        <w:t xml:space="preserve">’s) asi que lo que tenemos que hacer es recorrer y comparar esos bits utilizando el operador “|” el cual nos dice si uno de los bits est</w:t>
+      </w:r>
+      <w:r>
+        <w:rPr>
+          <w:rFonts w:ascii="Asana Math" w:hAnsi="Asana Math" w:eastAsia="Asana Math" w:cs="Asana Math"/>
+          <w:highlight w:val="none"/>
+          <w:lang w:val="es-ES" w:bidi="es-ES"/>
+        </w:rPr>
+        <w:t xml:space="preserve">á activo entonces el resultado ser</w:t>
+      </w:r>
+      <w:r>
+        <w:rPr>
+          <w:rFonts w:ascii="Asana Math" w:hAnsi="Asana Math" w:eastAsia="Asana Math" w:cs="Asana Math"/>
+          <w:highlight w:val="none"/>
+          <w:lang w:val="es-ES" w:bidi="es-ES"/>
+        </w:rPr>
+        <w:t xml:space="preserve">á un bit activo, pero lo primordial es que tenemos que movernos dentro de las columnas y eso lo hacemos con los operadores shift</w:t>
+      </w:r>
+      <w:r>
+        <w:rPr>
+          <w:rFonts w:ascii="Asana Math" w:hAnsi="Asana Math" w:eastAsia="Asana Math" w:cs="Asana Math"/>
+          <w:highlight w:val="none"/>
+          <w:lang w:val="es-ES" w:bidi="es-ES"/>
+        </w:rPr>
+      </w:r>
+    </w:p>
+    <w:p>
+      <w:pPr>
+        <w:pBdr/>
+        <w:spacing/>
+        <w:ind/>
+        <w:jc w:val="center"/>
+        <w:rPr>
+          <w:rFonts w:ascii="Asana Math" w:hAnsi="Asana Math" w:eastAsia="Asana Math" w:cs="Asana Math"/>
+          <w:highlight w:val="none"/>
+          <w:lang w:val="es-ES" w:bidi="es-ES"/>
+        </w:rPr>
+      </w:pPr>
+      <w:r>
+        <w:rPr>
+          <w:rFonts w:ascii="Asana Math" w:hAnsi="Asana Math" w:eastAsia="Asana Math" w:cs="Asana Math"/>
+          <w:highlight w:val="none"/>
+          <w:lang w:val="es-ES" w:bidi="es-ES"/>
+        </w:rPr>
+        <w:t xml:space="preserve"> “&lt;&lt; , &gt;&gt;”  </w:t>
+      </w:r>
+      <w:r>
+        <w:rPr>
+          <w:rFonts w:ascii="Asana Math" w:hAnsi="Asana Math" w:eastAsia="Asana Math" w:cs="Asana Math"/>
+          <w:highlight w:val="none"/>
+          <w:lang w:val="es-ES" w:bidi="es-ES"/>
+        </w:rPr>
+      </w:r>
+    </w:p>
+    <w:p>
+      <w:pPr>
+        <w:pBdr/>
+        <w:spacing/>
+        <w:ind/>
+        <w:jc w:val="center"/>
+        <w:rPr>
+          <w:rFonts w:ascii="Asana Math" w:hAnsi="Asana Math" w:eastAsia="Asana Math" w:cs="Asana Math"/>
+          <w:highlight w:val="none"/>
+          <w:lang w:val="es-ES" w:bidi="es-ES"/>
+        </w:rPr>
+      </w:pPr>
+      <w:r>
+        <w:rPr>
+          <w:rFonts w:ascii="Asana Math" w:hAnsi="Asana Math" w:eastAsia="Asana Math" w:cs="Asana Math"/>
+          <w:highlight w:val="none"/>
+          <w:lang w:val="es-ES" w:bidi="es-ES"/>
+        </w:rPr>
+        <w:t xml:space="preserve">cuando nos movemos y comparamos estamos indexando nuestra ficha completa.</w:t>
+      </w:r>
+      <w:r/>
+      <w:r/>
+    </w:p>
+    <w:p>
+      <w:pPr>
+        <w:pBdr/>
+        <w:spacing/>
+        <w:ind/>
+        <w:jc w:val="left"/>
+        <w:rPr>
+          <w:rFonts w:ascii="Asana Math" w:hAnsi="Asana Math" w:eastAsia="Asana Math" w:cs="Asana Math"/>
+          <w:highlight w:val="none"/>
+          <w:lang w:val="es-ES" w:bidi="es-ES"/>
+        </w:rPr>
+      </w:pPr>
+      <w:r>
+        <w:rPr>
+          <w:rFonts w:ascii="Asana Math" w:hAnsi="Asana Math" w:eastAsia="Asana Math" w:cs="Asana Math"/>
+          <w:highlight w:val="none"/>
+          <w:lang w:val="es-ES" w:bidi="es-ES"/>
+        </w:rPr>
+      </w:r>
+      <w:r>
+        <w:rPr>
+          <w:rFonts w:ascii="Asana Math" w:hAnsi="Asana Math" w:eastAsia="Asana Math" w:cs="Asana Math"/>
+          <w:highlight w:val="none"/>
+          <w:lang w:val="es-ES" w:bidi="es-ES"/>
+        </w:rPr>
+      </w:r>
+      <w:r>
+        <w:rPr>
+          <w:rFonts w:ascii="Asana Math" w:hAnsi="Asana Math" w:eastAsia="Asana Math" w:cs="Asana Math"/>
+          <w:highlight w:val="none"/>
+          <w:lang w:val="es-ES" w:bidi="es-ES"/>
+        </w:rPr>
+      </w:r>
+    </w:p>
+    <w:p>
+      <w:pPr>
+        <w:pBdr/>
+        <w:spacing/>
+        <w:ind/>
+        <w:jc w:val="center"/>
+        <w:rPr>
+          <w:rFonts w:ascii="Asana Math" w:hAnsi="Asana Math" w:eastAsia="Asana Math" w:cs="Asana Math"/>
+          <w:highlight w:val="none"/>
+          <w:lang w:val="es-ES"/>
+        </w:rPr>
+      </w:pPr>
+      <w:r>
+        <w:rPr>
+          <w:rFonts w:ascii="Asana Math" w:hAnsi="Asana Math" w:eastAsia="Asana Math" w:cs="Asana Math"/>
+          <w:highlight w:val="none"/>
+          <w:lang w:val="es-ES" w:bidi="es-ES"/>
+        </w:rPr>
+      </w:r>
+      <w:r>
+        <mc:AlternateContent>
+          <mc:Choice Requires="wpg">
+            <w:drawing>
+              <wp:anchor xmlns:wp="http://schemas.openxmlformats.org/drawingml/2006/wordprocessingDrawing" xmlns:wp14="http://schemas.microsoft.com/office/word/2010/wordprocessingDrawing" distT="0" distB="0" distL="115200" distR="115200" simplePos="0" relativeHeight="22528" behindDoc="0" locked="0" layoutInCell="1" allowOverlap="1">
+                <wp:simplePos x="0" y="0"/>
+                <wp:positionH relativeFrom="column">
+                  <wp:posOffset>2189093</wp:posOffset>
+                </wp:positionH>
+                <wp:positionV relativeFrom="paragraph">
+                  <wp:posOffset>15542</wp:posOffset>
+                </wp:positionV>
+                <wp:extent cx="1565413" cy="1681370"/>
+                <wp:effectExtent l="3175" t="3175" r="3175" b="3175"/>
+                <wp:wrapNone/>
+                <wp:docPr id="17" name=""/>
+                <wp:cNvGraphicFramePr/>
+                <a:graphic xmlns:a="http://schemas.openxmlformats.org/drawingml/2006/main">
+                  <a:graphicData uri="http://schemas.microsoft.com/office/word/2010/wordprocessingShape">
+                    <wps:wsp>
+                      <wps:cNvPr id="0" name=""/>
+                      <wps:cNvSpPr txBox="1"/>
+                      <wps:spPr bwMode="auto">
+                        <a:xfrm rot="0" flipH="0" flipV="0">
+                          <a:off x="0" y="0"/>
+                          <a:ext cx="1565411" cy="1681368"/>
+                        </a:xfrm>
+                        <a:prstGeom prst="rect">
+                          <a:avLst/>
+                        </a:prstGeom>
+                        <a:solidFill>
+                          <a:schemeClr val="lt1"/>
+                        </a:solidFill>
+                        <a:ln w="6350">
+                          <a:solidFill>
+                            <a:prstClr val="black"/>
+                          </a:solidFill>
+                        </a:ln>
+                      </wps:spPr>
+                      <wps:txbx>
+                        <w:txbxContent>
+                          <w:p>
+                            <w:pPr>
+                              <w:pBdr/>
+                              <w:spacing/>
+                              <w:ind/>
+                              <w:rPr/>
+                            </w:pPr>
+                            <w:r>
+                              <w:t xml:space="preserve">1 &lt;&lt; 0 → 00000001</w:t>
+                            </w:r>
+                            <w:r/>
+                            <w:r/>
+                          </w:p>
+                          <w:p>
+                            <w:pPr>
+                              <w:pBdr/>
+                              <w:spacing/>
+                              <w:ind/>
+                              <w:rPr/>
+                            </w:pPr>
+                            <w:r>
+                              <w:t xml:space="preserve">1 &lt;&lt; 1 → 00000010</w:t>
+                            </w:r>
+                            <w:r/>
+                            <w:r/>
+                          </w:p>
+                          <w:p>
+                            <w:pPr>
+                              <w:pBdr/>
+                              <w:spacing/>
+                              <w:ind/>
+                              <w:rPr/>
+                            </w:pPr>
+                            <w:r>
+                              <w:t xml:space="preserve">1 &lt;&lt; 2 → 00000100</w:t>
+                            </w:r>
+                            <w:r/>
+                            <w:r/>
+                          </w:p>
+                          <w:p>
+                            <w:pPr>
+                              <w:pBdr/>
+                              <w:spacing/>
+                              <w:ind/>
+                              <w:rPr/>
+                            </w:pPr>
+                            <w:r>
+                              <w:t xml:space="preserve">1 &lt;&lt; 3 → 00001000</w:t>
+                            </w:r>
+                            <w:r/>
+                            <w:r/>
+                          </w:p>
+                          <w:p>
+                            <w:pPr>
+                              <w:pBdr/>
+                              <w:spacing/>
+                              <w:ind/>
+                              <w:rPr/>
+                            </w:pPr>
+                            <w:r>
+                              <w:t xml:space="preserve">1 &lt;&lt; 4 → 00010000</w:t>
+                            </w:r>
+                            <w:r/>
+                            <w:r/>
+                          </w:p>
+                        </w:txbxContent>
+                      </wps:txbx>
+                      <wps:bodyPr vertOverflow="overflow" horzOverflow="overflow" vert="horz" wrap="square" lIns="91440" tIns="45720" rIns="91440" bIns="45720" numCol="1" spcCol="0" rtlCol="0" fromWordArt="0" anchor="t" anchorCtr="0" forceAA="0" upright="0" compatLnSpc="0"/>
+                    </wps:wsp>
+                  </a:graphicData>
+                </a:graphic>
+              </wp:anchor>
+            </w:drawing>
+          </mc:Choice>
+          <mc:Fallback>
+            <w:pict>
+              <v:shape id="shape 16" o:spid="_x0000_s16" o:spt="202" type="#_x0000_t202" style="position:absolute;z-index:22528;o:allowoverlap:true;o:allowincell:true;mso-position-horizontal-relative:text;margin-left:172.37pt;mso-position-horizontal:absolute;mso-position-vertical-relative:text;margin-top:1.22pt;mso-position-vertical:absolute;width:123.26pt;height:132.39pt;mso-wrap-distance-left:9.07pt;mso-wrap-distance-top:0.00pt;mso-wrap-distance-right:9.07pt;mso-wrap-distance-bottom:0.00pt;rotation:0;v-text-anchor:top;visibility:visible;" fillcolor="#FFFFFF" strokecolor="#000000" strokeweight="0.50pt">
+                <v:textbox inset="0,0,0,0">
+                  <w:txbxContent>
+                    <w:p>
+                      <w:pPr>
+                        <w:pBdr/>
+                        <w:spacing/>
+                        <w:ind/>
+                        <w:rPr/>
+                      </w:pPr>
+                      <w:r>
+                        <w:t xml:space="preserve">1 &lt;&lt; 0 → 00000001</w:t>
+                      </w:r>
+                      <w:r/>
+                      <w:r/>
+                    </w:p>
+                    <w:p>
+                      <w:pPr>
+                        <w:pBdr/>
+                        <w:spacing/>
+                        <w:ind/>
+                        <w:rPr/>
+                      </w:pPr>
+                      <w:r>
+                        <w:t xml:space="preserve">1 &lt;&lt; 1 → 00000010</w:t>
+                      </w:r>
+                      <w:r/>
+                      <w:r/>
+                    </w:p>
+                    <w:p>
+                      <w:pPr>
+                        <w:pBdr/>
+                        <w:spacing/>
+                        <w:ind/>
+                        <w:rPr/>
+                      </w:pPr>
+                      <w:r>
+                        <w:t xml:space="preserve">1 &lt;&lt; 2 → 00000100</w:t>
+                      </w:r>
+                      <w:r/>
+                      <w:r/>
+                    </w:p>
+                    <w:p>
+                      <w:pPr>
+                        <w:pBdr/>
+                        <w:spacing/>
+                        <w:ind/>
+                        <w:rPr/>
+                      </w:pPr>
+                      <w:r>
+                        <w:t xml:space="preserve">1 &lt;&lt; 3 → 00001000</w:t>
+                      </w:r>
+                      <w:r/>
+                      <w:r/>
+                    </w:p>
+                    <w:p>
+                      <w:pPr>
+                        <w:pBdr/>
+                        <w:spacing/>
+                        <w:ind/>
+                        <w:rPr/>
+                      </w:pPr>
+                      <w:r>
+                        <w:t xml:space="preserve">1 &lt;&lt; 4 → 00010000</w:t>
+                      </w:r>
+                      <w:r/>
+                      <w:r/>
+                    </w:p>
+                  </w:txbxContent>
+                </v:textbox>
+              </v:shape>
+            </w:pict>
+          </mc:Fallback>
+        </mc:AlternateContent>
+      </w:r>
+      <w:r>
+        <w:rPr>
+          <w:rFonts w:ascii="Asana Math" w:hAnsi="Asana Math" w:eastAsia="Asana Math" w:cs="Asana Math"/>
+          <w:highlight w:val="none"/>
+          <w:lang w:val="es-ES" w:bidi="es-ES"/>
+        </w:rPr>
+      </w:r>
+      <w:r>
+        <w:rPr>
+          <w:rFonts w:ascii="Asana Math" w:hAnsi="Asana Math" w:eastAsia="Asana Math" w:cs="Asana Math"/>
+          <w:highlight w:val="none"/>
+          <w:lang w:val="es-ES" w:bidi="es-ES"/>
+        </w:rPr>
+      </w:r>
+      <w:r>
+        <w:rPr>
+          <w:rFonts w:ascii="Asana Math" w:hAnsi="Asana Math" w:eastAsia="Asana Math" w:cs="Asana Math"/>
+          <w:highlight w:val="none"/>
+          <w:lang w:val="es-ES"/>
+        </w:rPr>
+      </w:r>
+    </w:p>
+    <w:p>
+      <w:pPr>
+        <w:pBdr/>
+        <w:spacing/>
+        <w:ind/>
+        <w:jc w:val="center"/>
+        <w:rPr>
+          <w:rFonts w:ascii="Asana Math" w:hAnsi="Asana Math" w:eastAsia="Asana Math" w:cs="Asana Math"/>
+          <w:highlight w:val="none"/>
+          <w:lang w:val="es-ES"/>
+        </w:rPr>
+      </w:pPr>
+      <w:r>
+        <w:rPr>
+          <w:rFonts w:ascii="Asana Math" w:hAnsi="Asana Math" w:eastAsia="Asana Math" w:cs="Asana Math"/>
+          <w:highlight w:val="none"/>
+          <w:lang w:val="es-ES" w:bidi="es-ES"/>
+        </w:rPr>
+      </w:r>
+      <w:r>
+        <w:rPr>
+          <w:rFonts w:ascii="Asana Math" w:hAnsi="Asana Math" w:eastAsia="Asana Math" w:cs="Asana Math"/>
+          <w:highlight w:val="none"/>
+          <w:lang w:val="es-ES"/>
+        </w:rPr>
+      </w:r>
+      <w:r>
+        <w:rPr>
+          <w:rFonts w:ascii="Asana Math" w:hAnsi="Asana Math" w:eastAsia="Asana Math" w:cs="Asana Math"/>
+          <w:highlight w:val="none"/>
+          <w:lang w:val="es-ES"/>
+        </w:rPr>
+      </w:r>
+    </w:p>
+    <w:p>
+      <w:pPr>
+        <w:pBdr/>
+        <w:spacing/>
+        <w:ind/>
+        <w:jc w:val="center"/>
+        <w:rPr>
+          <w:rFonts w:ascii="Asana Math" w:hAnsi="Asana Math" w:cs="Asana Math"/>
+        </w:rPr>
+      </w:pPr>
+      <w:r>
+        <w:rPr>
+          <w:rFonts w:ascii="Asana Math" w:hAnsi="Asana Math" w:cs="Asana Math"/>
+        </w:rPr>
+      </w:r>
+      <w:r>
+        <w:rPr>
+          <w:rFonts w:ascii="Asana Math" w:hAnsi="Asana Math" w:cs="Asana Math"/>
+        </w:rPr>
+      </w:r>
+      <w:r>
+        <w:rPr>
+          <w:rFonts w:ascii="Asana Math" w:hAnsi="Asana Math" w:cs="Asana Math"/>
+        </w:rPr>
+      </w:r>
+    </w:p>
+    <w:p>
+      <w:pPr>
+        <w:pBdr/>
+        <w:spacing/>
+        <w:ind/>
+        <w:jc w:val="center"/>
+        <w:rPr>
+          <w:rFonts w:ascii="Asana Math" w:hAnsi="Asana Math" w:cs="Asana Math"/>
+        </w:rPr>
+      </w:pPr>
+      <w:r>
+        <w:rPr>
+          <w:rFonts w:ascii="Asana Math" w:hAnsi="Asana Math" w:cs="Asana Math"/>
+        </w:rPr>
+      </w:r>
+      <w:r>
+        <w:rPr>
+          <w:rFonts w:ascii="Asana Math" w:hAnsi="Asana Math" w:cs="Asana Math"/>
+        </w:rPr>
+      </w:r>
+      <w:r>
+        <w:rPr>
+          <w:rFonts w:ascii="Asana Math" w:hAnsi="Asana Math" w:cs="Asana Math"/>
+        </w:rPr>
+      </w:r>
+    </w:p>
+    <w:p>
+      <w:pPr>
+        <w:pBdr/>
+        <w:spacing/>
+        <w:ind/>
+        <w:jc w:val="center"/>
+        <w:rPr>
+          <w:rFonts w:ascii="Asana Math" w:hAnsi="Asana Math" w:cs="Asana Math"/>
+        </w:rPr>
+      </w:pPr>
+      <w:r>
+        <w:rPr>
+          <w:rFonts w:ascii="Asana Math" w:hAnsi="Asana Math" w:cs="Asana Math"/>
+        </w:rPr>
+      </w:r>
+      <w:r>
+        <w:rPr>
+          <w:rFonts w:ascii="Asana Math" w:hAnsi="Asana Math" w:cs="Asana Math"/>
+        </w:rPr>
+      </w:r>
+      <w:r>
+        <w:rPr>
+          <w:rFonts w:ascii="Asana Math" w:hAnsi="Asana Math" w:cs="Asana Math"/>
+        </w:rPr>
+      </w:r>
+    </w:p>
+    <w:p>
+      <w:pPr>
+        <w:pBdr/>
+        <w:spacing/>
+        <w:ind/>
+        <w:jc w:val="center"/>
+        <w:rPr>
+          <w:rFonts w:ascii="Asana Math" w:hAnsi="Asana Math" w:eastAsia="Asana Math" w:cs="Asana Math"/>
+          <w:highlight w:val="none"/>
+          <w:lang w:val="es-ES"/>
+        </w:rPr>
+      </w:pPr>
+      <w:r>
+        <w:rPr>
+          <w:rFonts w:ascii="Asana Math" w:hAnsi="Asana Math" w:eastAsia="Asana Math" w:cs="Asana Math"/>
+          <w:highlight w:val="none"/>
+          <w:lang w:val="es-ES"/>
+        </w:rPr>
+        <w:t xml:space="preserve"> </w:t>
+      </w:r>
+      <w:r>
+        <w:rPr>
+          <w:rFonts w:ascii="Asana Math" w:hAnsi="Asana Math" w:eastAsia="Asana Math" w:cs="Asana Math"/>
+          <w:highlight w:val="none"/>
+          <w:lang w:val="es-ES"/>
+        </w:rPr>
+      </w:r>
+    </w:p>
+    <w:p>
+      <w:pPr>
+        <w:pBdr/>
+        <w:spacing/>
+        <w:ind/>
+        <w:jc w:val="center"/>
+        <w:rPr>
+          <w:rFonts w:ascii="Asana Math" w:hAnsi="Asana Math" w:eastAsia="Asana Math" w:cs="Asana Math"/>
+          <w:highlight w:val="none"/>
+          <w:lang w:val="es-ES"/>
+        </w:rPr>
+      </w:pPr>
+      <w:r>
+        <w:rPr>
+          <w:rFonts w:ascii="Asana Math" w:hAnsi="Asana Math" w:eastAsia="Asana Math" w:cs="Asana Math"/>
+          <w:highlight w:val="none"/>
+          <w:lang w:val="es-ES" w:bidi="es-ES"/>
+        </w:rPr>
+      </w:r>
+      <w:r>
+        <w:rPr>
+          <w:rFonts w:ascii="Asana Math" w:hAnsi="Asana Math" w:eastAsia="Asana Math" w:cs="Asana Math"/>
+          <w:highlight w:val="none"/>
+          <w:lang w:val="es-ES" w:bidi="es-ES"/>
+        </w:rPr>
+      </w:r>
+      <w:r>
+        <w:rPr>
+          <w:rFonts w:ascii="Asana Math" w:hAnsi="Asana Math" w:eastAsia="Asana Math" w:cs="Asana Math"/>
+          <w:highlight w:val="none"/>
+          <w:lang w:val="es-ES"/>
+        </w:rPr>
+      </w:r>
+    </w:p>
+    <w:p>
+      <w:pPr>
+        <w:pBdr/>
+        <w:spacing/>
+        <w:ind/>
+        <w:jc w:val="center"/>
+        <w:rPr>
+          <w:rFonts w:ascii="Asana Math" w:hAnsi="Asana Math" w:cs="Asana Math"/>
+        </w:rPr>
+      </w:pPr>
+      <w:r>
+        <w:rPr>
+          <w:rFonts w:ascii="Asana Math" w:hAnsi="Asana Math" w:cs="Asana Math"/>
+        </w:rPr>
+      </w:r>
+      <w:r>
+        <w:rPr>
+          <w:rFonts w:ascii="Asana Math" w:hAnsi="Asana Math" w:cs="Asana Math"/>
+        </w:rPr>
+      </w:r>
+      <w:r>
+        <w:rPr>
+          <w:rFonts w:ascii="Asana Math" w:hAnsi="Asana Math" w:cs="Asana Math"/>
+        </w:rPr>
+      </w:r>
+    </w:p>
+    <w:p>
+      <w:pPr>
+        <w:pBdr/>
+        <w:spacing/>
+        <w:ind/>
+        <w:jc w:val="center"/>
+        <w:rPr>
+          <w:rFonts w:ascii="Asana Math" w:hAnsi="Asana Math" w:cs="Asana Math"/>
+        </w:rPr>
+      </w:pPr>
+      <w:r>
+        <w:rPr>
+          <w:rFonts w:ascii="Asana Math" w:hAnsi="Asana Math" w:cs="Asana Math"/>
+        </w:rPr>
+      </w:r>
+      <w:r>
+        <w:rPr>
+          <w:rFonts w:ascii="Asana Math" w:hAnsi="Asana Math" w:cs="Asana Math"/>
+        </w:rPr>
+      </w:r>
+      <w:r>
+        <w:rPr>
+          <w:rFonts w:ascii="Asana Math" w:hAnsi="Asana Math" w:cs="Asana Math"/>
+        </w:rPr>
+      </w:r>
+    </w:p>
+    <w:p>
+      <w:pPr>
+        <w:pBdr/>
+        <w:spacing/>
+        <w:ind/>
+        <w:jc w:val="center"/>
+        <w:rPr>
+          <w:rFonts w:ascii="Asana Math" w:hAnsi="Asana Math" w:cs="Asana Math"/>
+        </w:rPr>
+      </w:pPr>
+      <w:r>
+        <w:rPr>
+          <w:rFonts w:ascii="Asana Math" w:hAnsi="Asana Math" w:cs="Asana Math"/>
+        </w:rPr>
+      </w:r>
+      <w:r>
+        <w:rPr>
+          <w:rFonts w:ascii="Asana Math" w:hAnsi="Asana Math" w:cs="Asana Math"/>
+        </w:rPr>
+      </w:r>
+      <w:r>
+        <w:rPr>
+          <w:rFonts w:ascii="Asana Math" w:hAnsi="Asana Math" w:cs="Asana Math"/>
+        </w:rPr>
+      </w:r>
+    </w:p>
+    <w:p>
+      <w:pPr>
+        <w:pBdr/>
+        <w:spacing/>
+        <w:ind/>
+        <w:jc w:val="center"/>
+        <w:rPr>
+          <w:rFonts w:ascii="Asana Math" w:hAnsi="Asana Math" w:cs="Asana Math"/>
+        </w:rPr>
+      </w:pPr>
+      <w:r>
+        <w:rPr>
+          <w:rFonts w:ascii="Asana Math" w:hAnsi="Asana Math" w:cs="Asana Math"/>
+        </w:rPr>
+      </w:r>
+      <w:r>
+        <w:rPr>
+          <w:rFonts w:ascii="Asana Math" w:hAnsi="Asana Math" w:cs="Asana Math"/>
+        </w:rPr>
+      </w:r>
+      <w:r>
+        <w:rPr>
+          <w:rFonts w:ascii="Asana Math" w:hAnsi="Asana Math" w:cs="Asana Math"/>
+        </w:rPr>
+      </w:r>
+    </w:p>
+    <w:p>
+      <w:pPr>
+        <w:pBdr/>
+        <w:spacing/>
+        <w:ind/>
+        <w:jc w:val="center"/>
+        <w:rPr>
+          <w:rFonts w:ascii="Asana Math" w:hAnsi="Asana Math" w:cs="Asana Math"/>
+        </w:rPr>
+      </w:pPr>
+      <w:r>
+        <w:rPr>
+          <w:rFonts w:ascii="Asana Math" w:hAnsi="Asana Math" w:cs="Asana Math"/>
+        </w:rPr>
+      </w:r>
+      <w:r>
+        <w:rPr>
+          <w:rFonts w:ascii="Asana Math" w:hAnsi="Asana Math" w:cs="Asana Math"/>
+        </w:rPr>
+      </w:r>
+      <w:r>
+        <w:rPr>
+          <w:rFonts w:ascii="Asana Math" w:hAnsi="Asana Math" w:cs="Asana Math"/>
+        </w:rPr>
+      </w:r>
+    </w:p>
+    <w:p>
+      <w:pPr>
+        <w:pBdr/>
+        <w:spacing/>
+        <w:ind/>
+        <w:jc w:val="center"/>
+        <w:rPr>
+          <w:rFonts w:ascii="Asana Math" w:hAnsi="Asana Math" w:cs="Asana Math"/>
+        </w:rPr>
+      </w:pPr>
+      <w:r>
+        <w:rPr>
+          <w:rFonts w:ascii="Asana Math" w:hAnsi="Asana Math" w:cs="Asana Math"/>
+        </w:rPr>
+      </w:r>
+      <w:r>
+        <w:rPr>
+          <w:rFonts w:ascii="Asana Math" w:hAnsi="Asana Math" w:cs="Asana Math"/>
+        </w:rPr>
+      </w:r>
+      <w:r>
+        <w:rPr>
+          <w:rFonts w:ascii="Asana Math" w:hAnsi="Asana Math" w:cs="Asana Math"/>
+        </w:rPr>
+      </w:r>
+    </w:p>
+    <w:p>
+      <w:pPr>
+        <w:pBdr/>
+        <w:spacing/>
+        <w:ind/>
+        <w:jc w:val="center"/>
+        <w:rPr>
+          <w:rFonts w:ascii="Asana Math" w:hAnsi="Asana Math" w:cs="Asana Math"/>
+        </w:rPr>
+      </w:pPr>
+      <w:r>
+        <w:rPr>
+          <w:rFonts w:ascii="Asana Math" w:hAnsi="Asana Math" w:cs="Asana Math"/>
+        </w:rPr>
+      </w:r>
+      <w:r>
+        <w:rPr>
+          <w:rFonts w:ascii="Asana Math" w:hAnsi="Asana Math" w:cs="Asana Math"/>
+        </w:rPr>
+      </w:r>
+      <w:r>
+        <w:rPr>
+          <w:rFonts w:ascii="Asana Math" w:hAnsi="Asana Math" w:cs="Asana Math"/>
+        </w:rPr>
+      </w:r>
+    </w:p>
+    <w:p>
+      <w:pPr>
+        <w:pBdr/>
+        <w:spacing/>
+        <w:ind/>
+        <w:jc w:val="center"/>
+        <w:rPr>
+          <w:rFonts w:ascii="Asana Math" w:hAnsi="Asana Math" w:cs="Asana Math"/>
+          <w:sz w:val="24"/>
+          <w:szCs w:val="24"/>
+        </w:rPr>
+      </w:pPr>
+      <w:r>
+        <w:rPr>
+          <w:rFonts w:ascii="Asana Math" w:hAnsi="Asana Math" w:cs="Asana Math"/>
+          <w:sz w:val="24"/>
+          <w:szCs w:val="24"/>
+          <w:lang w:val="es-ES"/>
+        </w:rPr>
+        <w:t xml:space="preserve">ROTACI</w:t>
+      </w:r>
+      <w:r>
+        <w:rPr>
+          <w:rFonts w:ascii="Asana Math" w:hAnsi="Asana Math" w:cs="Asana Math"/>
+          <w:sz w:val="24"/>
+          <w:szCs w:val="24"/>
+          <w:lang w:val="es-ES"/>
+        </w:rPr>
+        <w:t xml:space="preserve">ÓN DE FICHAS.</w:t>
+      </w:r>
+      <w:r>
+        <w:rPr>
+          <w:rFonts w:ascii="Asana Math" w:hAnsi="Asana Math" w:cs="Asana Math"/>
+          <w:sz w:val="24"/>
+          <w:szCs w:val="24"/>
+        </w:rPr>
+      </w:r>
+      <w:r>
+        <w:rPr>
+          <w:rFonts w:ascii="Asana Math" w:hAnsi="Asana Math" w:cs="Asana Math"/>
+          <w:sz w:val="24"/>
+          <w:szCs w:val="24"/>
+        </w:rPr>
+      </w:r>
+    </w:p>
+    <w:p>
+      <w:pPr>
+        <w:pBdr/>
+        <w:spacing/>
+        <w:ind/>
+        <w:jc w:val="center"/>
+        <w:rPr>
+          <w:rFonts w:ascii="Asana Math" w:hAnsi="Asana Math" w:eastAsia="Asana Math" w:cs="Asana Math"/>
+          <w:highlight w:val="none"/>
+          <w:lang w:val="es-ES"/>
+        </w:rPr>
+      </w:pPr>
+      <w:r>
+        <w:rPr>
+          <w:rFonts w:ascii="Asana Math" w:hAnsi="Asana Math" w:eastAsia="Asana Math" w:cs="Asana Math"/>
+          <w:highlight w:val="none"/>
+          <w:lang w:val="es-ES"/>
+        </w:rPr>
+        <w:t xml:space="preserve">Nuestras fichas de tetris seran un array y por ende lo unico que yo necesito es rotar una matriz y luego aplicarle el bit masking y eso lo haremos de la siguiente y con el siguiente ejemplo que es rotar una matriz 4x4.</w:t>
+      </w:r>
+      <w:r>
+        <w:rPr>
+          <w:rFonts w:ascii="Asana Math" w:hAnsi="Asana Math" w:cs="Asana Math"/>
+        </w:rPr>
+      </w:r>
+    </w:p>
+    <w:p>
+      <w:pPr>
+        <w:pStyle w:val="908"/>
+        <w:numPr>
+          <w:ilvl w:val="0"/>
+          <w:numId w:val="2"/>
+        </w:numPr>
+        <w:pBdr/>
+        <w:spacing/>
+        <w:ind/>
+        <w:jc w:val="center"/>
+        <w:rPr>
+          <w:rFonts w:ascii="Asana Math" w:hAnsi="Asana Math" w:cs="Asana Math"/>
+        </w:rPr>
+      </w:pPr>
+      <w:r>
+        <w:rPr>
+          <w:rFonts w:ascii="Asana Math" w:hAnsi="Asana Math" w:eastAsia="Asana Math" w:cs="Asana Math"/>
+          <w:highlight w:val="none"/>
+          <w:lang w:val="es-ES"/>
+        </w:rPr>
+        <w:t xml:space="preserve">Primero utilizamos los valores indexados de la matriz y los rotamos 90 grados.</w:t>
+      </w:r>
+      <w:r>
+        <w:rPr>
+          <w:rFonts w:ascii="Asana Math" w:hAnsi="Asana Math" w:cs="Asana Math"/>
+        </w:rPr>
+      </w:r>
+    </w:p>
+    <w:p>
+      <w:pPr>
+        <w:pBdr/>
+        <w:spacing/>
+        <w:ind w:firstLine="0" w:left="709"/>
+        <w:jc w:val="center"/>
+        <w:rPr>
+          <w:rFonts w:ascii="Asana Math" w:hAnsi="Asana Math" w:cs="Asana Math"/>
+        </w:rPr>
+      </w:pPr>
+      <w:r>
+        <w:rPr>
+          <w:rFonts w:ascii="Asana Math" w:hAnsi="Asana Math" w:eastAsia="Asana Math" w:cs="Asana Math"/>
+          <w:highlight w:val="none"/>
+          <w:lang w:val="es-ES"/>
+        </w:rPr>
+      </w:r>
+      <w:r>
+        <mc:AlternateContent>
+          <mc:Choice Requires="wpg">
+            <w:drawing>
+              <wp:inline xmlns:wp="http://schemas.openxmlformats.org/drawingml/2006/wordprocessingDrawing" distT="0" distB="0" distL="0" distR="0">
+                <wp:extent cx="3573518" cy="1962102"/>
+                <wp:effectExtent l="0" t="0" r="0" b="0"/>
+                <wp:docPr id="18" name=""/>
+                <wp:cNvGraphicFramePr>
+                  <a:graphicFrameLocks xmlns:a="http://schemas.openxmlformats.org/drawingml/2006/main" noChangeAspect="1"/>
+                </wp:cNvGraphicFramePr>
+                <a:graphic xmlns:a="http://schemas.openxmlformats.org/drawingml/2006/main">
+                  <a:graphicData uri="http://schemas.openxmlformats.org/drawingml/2006/picture">
+                    <pic:pic xmlns:pic="http://schemas.openxmlformats.org/drawingml/2006/picture">
+                      <pic:nvPicPr>
+                        <pic:cNvPr id="215351432" name=""/>
+                        <pic:cNvPicPr>
+                          <a:picLocks noChangeAspect="1"/>
+                        </pic:cNvPicPr>
+                        <pic:nvPr/>
+                      </pic:nvPicPr>
+                      <pic:blipFill rotWithShape="1">
+                        <a:blip r:embed="rId19"/>
+                        <a:stretch/>
+                      </pic:blipFill>
+                      <pic:spPr bwMode="auto">
+                        <a:xfrm flipH="0" flipV="0">
+                          <a:off x="0" y="0"/>
+                          <a:ext cx="3573518" cy="1962101"/>
+                        </a:xfrm>
+                        <a:prstGeom prst="rect">
+                          <a:avLst/>
+                        </a:prstGeom>
+                      </pic:spPr>
+                    </pic:pic>
+                  </a:graphicData>
+                </a:graphic>
+              </wp:inline>
+            </w:drawing>
+          </mc:Choice>
+          <mc:Fallback>
+            <w:pict>
+              <v:shapetype id="_x0000_t75" coordsize="21600,21600" o:spt="75" o:preferrelative="t" path="m@4@5l@4@11@9@11@9@5xe" filled="f" stroked="f">
+                <v:stroke joinstyle="miter"/>
+                <v:formulas>
+                  <v:f eqn="if lineDrawn pixelLineWidth 0"/>
+                  <v:f eqn="sum @0 1 0"/>
+                  <v:f eqn="sum 0 0 @1"/>
+                  <v:f eqn="prod @2 1 2"/>
+                  <v:f eqn="prod @3 21600 pixelWidth"/>
+                  <v:f eqn="prod @3 21600 pixelHeight"/>
+                  <v:f eqn="sum @0 0 1"/>
+                  <v:f eqn="prod @6 1 2"/>
+                  <v:f eqn="prod @7 21600 pixelWidth"/>
+                  <v:f eqn="sum @8 21600 0"/>
+                  <v:f eqn="prod @7 21600 pixelHeight"/>
+                  <v:f eqn="sum @10 21600 0"/>
+                </v:formulas>
+                <v:path o:extrusionok="f" gradientshapeok="t" o:connecttype="rect"/>
+                <o:lock v:ext="edit" aspectratio="t"/>
+              </v:shapetype>
+              <v:shape id="_x0000_i17" o:spid="_x0000_s17" type="#_x0000_t75" style="width:281.38pt;height:154.50pt;mso-wrap-distance-left:0.00pt;mso-wrap-distance-top:0.00pt;mso-wrap-distance-right:0.00pt;mso-wrap-distance-bottom:0.00pt;z-index:1;" stroked="false">
+                <v:imagedata r:id="rId19" o:title=""/>
+                <o:lock v:ext="edit" rotation="t"/>
+              </v:shape>
+            </w:pict>
+          </mc:Fallback>
+        </mc:AlternateContent>
+      </w:r>
+      <w:r>
+        <w:rPr>
+          <w:rFonts w:ascii="Asana Math" w:hAnsi="Asana Math" w:eastAsia="Asana Math" w:cs="Asana Math"/>
+          <w:highlight w:val="none"/>
+          <w:lang w:val="es-ES"/>
+        </w:rPr>
+      </w:r>
+      <w:r>
+        <w:rPr>
+          <w:rFonts w:ascii="Asana Math" w:hAnsi="Asana Math" w:eastAsia="Asana Math" w:cs="Asana Math"/>
+          <w:highlight w:val="none"/>
+          <w:lang w:val="es-ES"/>
+        </w:rPr>
+      </w:r>
+      <w:r>
+        <w:rPr>
+          <w:rFonts w:ascii="Asana Math" w:hAnsi="Asana Math" w:eastAsia="Asana Math" w:cs="Asana Math"/>
+          <w:highlight w:val="none"/>
+          <w:lang w:val="es-ES"/>
+        </w:rPr>
+      </w:r>
+    </w:p>
+    <w:p>
+      <w:pPr>
+        <w:pStyle w:val="883"/>
+        <w:pBdr/>
+        <w:spacing/>
+        <w:ind/>
+        <w:jc w:val="center"/>
+        <w:rPr/>
+      </w:pPr>
+      <w:r>
+        <w:t xml:space="preserve">Figure </w:t>
+      </w:r>
+      <w:r>
+        <w:fldChar w:fldCharType="begin"/>
+        <w:instrText xml:space="preserve"> SEQ Figure \* Arabic </w:instrText>
+        <w:fldChar w:fldCharType="separate"/>
+      </w:r>
+      <w:r>
+        <w:t xml:space="preserve">9</w:t>
+      </w:r>
+      <w:r/>
+      <w:r>
+        <w:fldChar w:fldCharType="end"/>
+      </w:r>
+      <w:r>
+        <w:t xml:space="preserve">. Rotación de matriz</w:t>
+      </w:r>
+      <w:r>
+        <w:rPr>
+          <w:lang w:val="es-ES"/>
+        </w:rPr>
+        <w:t xml:space="preserve"> 90°</w:t>
+      </w:r>
+      <w:r>
+        <w:rPr>
+          <w:lang w:val="es-ES"/>
+        </w:rPr>
+        <w:t xml:space="preserve">.</w:t>
+      </w:r>
+      <w:r/>
+    </w:p>
+    <w:p>
+      <w:pPr>
+        <w:pBdr/>
+        <w:spacing/>
+        <w:ind/>
+        <w:jc w:val="center"/>
+        <w:rPr>
+          <w:rFonts w:ascii="Asana Math" w:hAnsi="Asana Math" w:eastAsia="Asana Math" w:cs="Asana Math"/>
+          <w:highlight w:val="none"/>
+          <w:lang w:val="es-ES"/>
+        </w:rPr>
+      </w:pPr>
+      <w:r>
+        <w:rPr>
+          <w:lang w:val="es-ES"/>
+        </w:rPr>
+      </w:r>
+      <w:r>
+        <w:rPr>
+          <w:rFonts w:ascii="Asana Math" w:hAnsi="Asana Math" w:eastAsia="Asana Math" w:cs="Asana Math"/>
+          <w:lang w:val="es-ES"/>
+        </w:rPr>
+        <w:t xml:space="preserve">Las rotaciones de matriz por indexaci</w:t>
+      </w:r>
+      <w:r>
+        <w:rPr>
+          <w:rFonts w:ascii="Asana Math" w:hAnsi="Asana Math" w:eastAsia="Asana Math" w:cs="Asana Math"/>
+          <w:lang w:val="es-ES"/>
+        </w:rPr>
+        <w:t xml:space="preserve">ón sigue una regla que es la siguiente </w:t>
+      </w:r>
+      <w:r>
+        <w:rPr>
+          <w:rFonts w:ascii="Asana Math" w:hAnsi="Asana Math" w:cs="Asana Math"/>
+        </w:rPr>
+      </w:r>
+    </w:p>
+    <w:p>
+      <w:pPr>
+        <w:suppressLineNumbers w:val="false"/>
+        <w:pBdr>
+          <w:top w:val="single" w:color="000000" w:sz="4" w:space="0"/>
+          <w:left w:val="single" w:color="000000" w:sz="4" w:space="0"/>
+          <w:bottom w:val="single" w:color="000000" w:sz="4" w:space="0"/>
+          <w:right w:val="single" w:color="000000" w:sz="4" w:space="0"/>
+          <w:between w:val="none" w:color="000000" w:sz="4" w:space="0"/>
+        </w:pBdr>
+        <w:spacing/>
+        <w:ind/>
+        <w:jc w:val="center"/>
+        <w:rPr>
+          <w:rFonts w:ascii="Asana Math" w:hAnsi="Asana Math" w:eastAsia="Asana Math" w:cs="Asana Math"/>
+          <w:highlight w:val="none"/>
+        </w:rPr>
+      </w:pPr>
+      <w:r>
+        <w:rPr>
+          <w:rFonts w:ascii="Asana Math" w:hAnsi="Asana Math" w:eastAsia="Asana Math" w:cs="Asana Math"/>
+          <w:highlight w:val="none"/>
+          <w:lang w:val="es-ES"/>
+        </w:rPr>
+      </w:r>
+      <m:oMathPara>
+        <m:oMathParaPr/>
+        <m:oMath>
+          <m:r>
+            <w:rPr>
+              <w:rFonts w:hint="default" w:ascii="Cambria Math" w:hAnsi="Cambria Math" w:eastAsia="Cambria Math" w:cs="Cambria Math"/>
+              <w:highlight w:val="none"/>
+              <w:lang w:val="es-ES" w:bidi="es-ES"/>
+            </w:rPr>
+            <m:rPr>
+              <m:sty m:val="i"/>
+            </m:rPr>
+            <m:t>para cada elemento </m:t>
+          </m:r>
+          <m:d>
+            <m:dPr>
+              <m:begChr m:val="("/>
+              <m:endChr m:val=")"/>
+              <m:ctrlPr>
+                <w:rPr>
+                  <w:rFonts w:hint="default" w:ascii="Cambria Math" w:hAnsi="Cambria Math" w:eastAsia="Cambria Math" w:cs="Cambria Math"/>
+                  <w:highlight w:val="none"/>
+                  <w:lang w:val="es-ES" w:bidi="es-ES"/>
+                </w:rPr>
+              </m:ctrlPr>
+            </m:dPr>
+            <m:e>
+              <m:r>
+                <w:rPr>
+                  <w:rFonts w:hint="default" w:ascii="Cambria Math" w:hAnsi="Cambria Math" w:eastAsia="Cambria Math" w:cs="Cambria Math"/>
+                  <w:highlight w:val="none"/>
+                  <w:lang w:val="es-ES" w:bidi="es-ES"/>
+                </w:rPr>
+                <m:rPr>
+                  <m:sty m:val="i"/>
+                </m:rPr>
+                <m:t>i,j</m:t>
+              </m:r>
+            </m:e>
+          </m:d>
+          <m:r>
+            <w:rPr>
+              <w:rFonts w:hint="default" w:ascii="Cambria Math" w:hAnsi="Cambria Math" w:eastAsia="Cambria Math" w:cs="Cambria Math"/>
+              <w:highlight w:val="none"/>
+              <w:lang w:val="es-ES" w:bidi="es-ES"/>
+            </w:rPr>
+            <m:rPr>
+              <m:sty m:val="i"/>
+            </m:rPr>
+            <m:t>→ se rotara (j, n-1-i)</m:t>
+          </m:r>
+        </m:oMath>
+      </m:oMathPara>
+      <w:r>
+        <w:rPr>
+          <w:rFonts w:ascii="Asana Math" w:hAnsi="Asana Math" w:eastAsia="Asana Math" w:cs="Asana Math"/>
+          <w:highlight w:val="none"/>
+          <w:lang w:val="es-ES"/>
+        </w:rPr>
+      </w:r>
+      <w:r>
+        <w:rPr>
+          <w:rFonts w:ascii="Asana Math" w:hAnsi="Asana Math" w:cs="Asana Math"/>
+        </w:rPr>
+      </w:r>
+    </w:p>
+    <w:p>
+      <w:pPr>
+        <w:pBdr/>
+        <w:spacing/>
+        <w:ind/>
+        <w:jc w:val="center"/>
+        <w:rPr>
+          <w:rFonts w:ascii="Asana Math" w:hAnsi="Asana Math" w:eastAsia="Asana Math" w:cs="Asana Math"/>
+          <w:highlight w:val="none"/>
+          <w:lang w:val="es-ES"/>
+        </w:rPr>
+      </w:pPr>
+      <w:r>
+        <w:rPr>
+          <w:rFonts w:ascii="Asana Math" w:hAnsi="Asana Math" w:eastAsia="Asana Math" w:cs="Asana Math"/>
+          <w:highlight w:val="none"/>
+          <w:lang w:val="es-ES"/>
+        </w:rPr>
+      </w:r>
+      <w:r>
+        <w:rPr>
+          <w:rFonts w:ascii="Asana Math" w:hAnsi="Asana Math" w:eastAsia="Asana Math" w:cs="Asana Math"/>
+          <w:highlight w:val="none"/>
+          <w:lang w:val="es-ES"/>
+        </w:rPr>
+        <w:t xml:space="preserve">Donde n es el tamaño de la matriz, asi que nuestra idea principal es recorrer toda la matriz de la ficha, aplicar la rotaci</w:t>
+      </w:r>
+      <w:r>
+        <w:rPr>
+          <w:rFonts w:ascii="Asana Math" w:hAnsi="Asana Math" w:eastAsia="Asana Math" w:cs="Asana Math"/>
+          <w:highlight w:val="none"/>
+          <w:lang w:val="es-ES"/>
+        </w:rPr>
+        <w:t xml:space="preserve">ón vista anteriormente y aplicar la mascara de bitwise</w:t>
+      </w:r>
+      <w:r>
+        <w:rPr>
+          <w:rFonts w:ascii="Asana Math" w:hAnsi="Asana Math" w:cs="Asana Math"/>
+        </w:rPr>
+      </w:r>
+    </w:p>
+    <w:p>
+      <w:pPr>
+        <w:pBdr/>
+        <w:spacing/>
+        <w:ind/>
+        <w:jc w:val="center"/>
+        <w:rPr>
+          <w:rFonts w:ascii="Asana Math" w:hAnsi="Asana Math" w:eastAsia="Asana Math" w:cs="Asana Math"/>
+          <w:highlight w:val="none"/>
+          <w:lang w:val="es-ES"/>
+        </w:rPr>
+      </w:pPr>
+      <w:r>
+        <w:rPr>
+          <w:rFonts w:ascii="Asana Math" w:hAnsi="Asana Math" w:eastAsia="Asana Math" w:cs="Asana Math"/>
+          <w:highlight w:val="none"/>
+          <w:lang w:val="es-ES"/>
+        </w:rPr>
+        <w:t xml:space="preserve">Pero no sin antes ver algo sumamente Importante.</w:t>
+      </w:r>
+      <w:r>
+        <w:rPr>
+          <w:rFonts w:ascii="Asana Math" w:hAnsi="Asana Math" w:cs="Asana Math"/>
+        </w:rPr>
+      </w:r>
+    </w:p>
+    <w:p>
+      <w:pPr>
+        <w:pBdr/>
+        <w:spacing/>
+        <w:ind/>
+        <w:jc w:val="center"/>
+        <w:rPr>
+          <w:rFonts w:ascii="Asana Math" w:hAnsi="Asana Math" w:eastAsia="Asana Math" w:cs="Asana Math"/>
+          <w:sz w:val="24"/>
+          <w:szCs w:val="24"/>
+          <w:highlight w:val="none"/>
+          <w:lang w:val="es-ES"/>
+        </w:rPr>
+      </w:pPr>
+      <w:r>
+        <w:rPr>
+          <w:rFonts w:ascii="Asana Math" w:hAnsi="Asana Math" w:eastAsia="Asana Math" w:cs="Asana Math"/>
+          <w:sz w:val="24"/>
+          <w:szCs w:val="24"/>
+          <w:highlight w:val="none"/>
+          <w:lang w:val="es-ES"/>
+        </w:rPr>
+        <w:t xml:space="preserve">MEMORIA DINAMICA.</w:t>
+      </w:r>
+      <w:r>
+        <w:rPr>
+          <w:rFonts w:ascii="Asana Math" w:hAnsi="Asana Math" w:cs="Asana Math"/>
+          <w:sz w:val="20"/>
+          <w:szCs w:val="20"/>
+        </w:rPr>
+      </w:r>
+    </w:p>
+    <w:p>
+      <w:pPr>
+        <w:pBdr/>
+        <w:spacing/>
+        <w:ind/>
+        <w:jc w:val="center"/>
+        <w:rPr>
+          <w:b/>
+          <w:bCs/>
+          <w:highlight w:val="none"/>
+        </w:rPr>
+      </w:pPr>
+      <w:r>
+        <w:rPr>
+          <w:rFonts w:ascii="Asana Math" w:hAnsi="Asana Math" w:eastAsia="Asana Math" w:cs="Asana Math"/>
+          <w:highlight w:val="none"/>
+          <w:lang w:val="es-ES"/>
+        </w:rPr>
+        <w:t xml:space="preserve">Realmente no trabajaremos con nuestra matriz original , ella unicamente nos serivira como base y copia para las rotaciones ya que al rotar , los valores cambien y es aqui donde entra la memoria dinamica, haremos una copia de nuestras fichas a las cuales si les podremos hacer las rotaci</w:t>
+      </w:r>
+      <w:r>
+        <w:rPr>
+          <w:rFonts w:ascii="Asana Math" w:hAnsi="Asana Math" w:eastAsia="Asana Math" w:cs="Asana Math"/>
+          <w:highlight w:val="none"/>
+          <w:lang w:val="es-ES"/>
+        </w:rPr>
+        <w:t xml:space="preserve">ónes correspondientes , esa copia de fichas se hara hasta que lleguemos a la base de nuestro tablero y hagamos el bitmasking cuando hacemos el bitmasking inmediatamente esa copia se borrar</w:t>
+      </w:r>
+      <w:r>
+        <w:rPr>
+          <w:rFonts w:ascii="Asana Math" w:hAnsi="Asana Math" w:eastAsia="Asana Math" w:cs="Asana Math"/>
+          <w:highlight w:val="none"/>
+          <w:lang w:val="es-ES"/>
+        </w:rPr>
+        <w:t xml:space="preserve">á de la </w:t>
+      </w:r>
+      <w:r>
+        <w:rPr>
+          <w:rFonts w:ascii="Asana Math" w:hAnsi="Asana Math" w:eastAsia="Asana Math" w:cs="Asana Math"/>
+          <w:b/>
+          <w:bCs/>
+          <w:highlight w:val="none"/>
+          <w:lang w:val="es-ES"/>
+        </w:rPr>
+        <w:t xml:space="preserve">dinamic memory.</w:t>
+      </w:r>
+      <w:r>
+        <w:rPr>
+          <w:rFonts w:ascii="Asana Math" w:hAnsi="Asana Math" w:eastAsia="Asana Math" w:cs="Asana Math"/>
+          <w:b/>
+          <w:bCs/>
+          <w:highlight w:val="none"/>
+          <w:lang w:val="es-ES"/>
+        </w:rPr>
+        <w:t xml:space="preserve"> </w:t>
+      </w:r>
+      <w:r>
+        <w:rPr>
+          <w:b/>
+          <w:bCs/>
+        </w:rPr>
+      </w:r>
+      <w:r>
+        <w:rPr>
+          <w:rFonts w:ascii="Asana Math" w:hAnsi="Asana Math" w:cs="Asana Math"/>
+        </w:rPr>
+      </w:r>
+    </w:p>
+    <w:p>
+      <w:pPr>
+        <w:pBdr/>
+        <w:spacing/>
+        <w:ind/>
+        <w:jc w:val="center"/>
+        <w:rPr>
+          <w:rFonts w:ascii="Asana Math" w:hAnsi="Asana Math" w:cs="Asana Math"/>
+        </w:rPr>
+      </w:pPr>
+      <w:r>
+        <w:rPr>
+          <w:rFonts w:ascii="Asana Math" w:hAnsi="Asana Math" w:cs="Asana Math"/>
+        </w:rPr>
+      </w:r>
+      <w:r>
+        <w:rPr>
+          <w:rFonts w:ascii="Asana Math" w:hAnsi="Asana Math" w:cs="Asana Math"/>
+        </w:rPr>
+      </w:r>
+      <w:r>
+        <w:rPr>
+          <w:rFonts w:ascii="Asana Math" w:hAnsi="Asana Math" w:cs="Asana Math"/>
+        </w:rPr>
+      </w:r>
+    </w:p>
+    <w:p>
+      <w:pPr>
+        <w:pBdr/>
+        <w:spacing/>
+        <w:ind/>
+        <w:jc w:val="center"/>
+        <w:rPr>
+          <w:rFonts w:ascii="Asana Math" w:hAnsi="Asana Math" w:cs="Asana Math"/>
+          <w:b w:val="0"/>
+          <w:bCs w:val="0"/>
+          <w:sz w:val="36"/>
+          <w:szCs w:val="36"/>
+        </w:rPr>
+      </w:pPr>
+      <w:r>
+        <w:rPr>
+          <w:rFonts w:ascii="Asana Math" w:hAnsi="Asana Math" w:eastAsia="Asana Math" w:cs="Asana Math"/>
+          <w:b w:val="0"/>
+          <w:bCs w:val="0"/>
+          <w:sz w:val="28"/>
+          <w:szCs w:val="28"/>
+          <w:highlight w:val="none"/>
+          <w:lang w:val="es-ES"/>
+        </w:rPr>
+        <w:t xml:space="preserve">MOVIMIENTOS.</w:t>
+      </w:r>
+      <w:r>
+        <w:rPr>
+          <w:rFonts w:ascii="Asana Math" w:hAnsi="Asana Math" w:cs="Asana Math"/>
+          <w:b w:val="0"/>
+          <w:bCs w:val="0"/>
+          <w:sz w:val="36"/>
+          <w:szCs w:val="36"/>
+        </w:rPr>
+      </w:r>
+    </w:p>
+    <w:p>
+      <w:pPr>
+        <w:pBdr/>
+        <w:spacing/>
+        <w:ind/>
+        <w:jc w:val="center"/>
+        <w:rPr/>
+      </w:pPr>
+      <w:r>
+        <w:rPr>
+          <w:lang w:val="es-ES"/>
+        </w:rPr>
+      </w:r>
+      <w:r/>
+      <w:r/>
+    </w:p>
+    <w:p>
+      <w:pPr>
+        <w:pBdr/>
+        <w:spacing/>
+        <w:ind w:firstLine="0" w:left="709"/>
+        <w:jc w:val="center"/>
+        <w:rPr>
+          <w:rFonts w:ascii="Asana Math" w:hAnsi="Asana Math" w:cs="Asana Math"/>
+        </w:rPr>
+      </w:pPr>
+      <w:r>
+        <w:rPr>
+          <w:rFonts w:ascii="Asana Math" w:hAnsi="Asana Math" w:eastAsia="Asana Math" w:cs="Asana Math"/>
+          <w:highlight w:val="none"/>
+          <w:lang w:val="es-ES"/>
+        </w:rPr>
+      </w:r>
+      <w:r>
+        <w:rPr>
+          <w:rFonts w:ascii="Asana Math" w:hAnsi="Asana Math" w:eastAsia="Asana Math" w:cs="Asana Math"/>
+          <w:highlight w:val="none"/>
+          <w:lang w:val="es-ES"/>
+        </w:rPr>
+      </w:r>
+      <w:r>
+        <w:rPr>
+          <w:rFonts w:ascii="Asana Math" w:hAnsi="Asana Math" w:eastAsia="Asana Math" w:cs="Asana Math"/>
           <w:highlight w:val="none"/>
           <w:lang w:val="es-ES"/>
         </w:rPr>
@@ -7958,8 +10936,140 @@
       <w:suff w:val="tab"/>
     </w:lvl>
   </w:abstractNum>
+  <w:abstractNum w:abstractNumId="1">
+    <w:nsid w:val="27E49775"/>
+    <w:lvl w:ilvl="0">
+      <w:isLgl w:val="false"/>
+      <w:lvlJc w:val="left"/>
+      <w:lvlText w:val="%1)"/>
+      <w:numFmt w:val="upperLetter"/>
+      <w:pPr>
+        <w:pBdr/>
+        <w:spacing/>
+        <w:ind w:hanging="360" w:left="709"/>
+      </w:pPr>
+      <w:rPr/>
+      <w:start w:val="1"/>
+      <w:suff w:val="tab"/>
+    </w:lvl>
+    <w:lvl w:ilvl="1">
+      <w:isLgl w:val="false"/>
+      <w:lvlJc w:val="left"/>
+      <w:lvlText w:val="%2."/>
+      <w:numFmt w:val="lowerLetter"/>
+      <w:pPr>
+        <w:pBdr/>
+        <w:spacing/>
+        <w:ind w:hanging="360" w:left="1429"/>
+      </w:pPr>
+      <w:rPr/>
+      <w:start w:val="1"/>
+      <w:suff w:val="tab"/>
+    </w:lvl>
+    <w:lvl w:ilvl="2">
+      <w:isLgl w:val="false"/>
+      <w:lvlJc w:val="right"/>
+      <w:lvlText w:val="%3."/>
+      <w:numFmt w:val="lowerRoman"/>
+      <w:pPr>
+        <w:pBdr/>
+        <w:spacing/>
+        <w:ind w:hanging="180" w:left="2149"/>
+      </w:pPr>
+      <w:rPr/>
+      <w:start w:val="1"/>
+      <w:suff w:val="tab"/>
+    </w:lvl>
+    <w:lvl w:ilvl="3">
+      <w:isLgl w:val="false"/>
+      <w:lvlJc w:val="left"/>
+      <w:lvlText w:val="%4."/>
+      <w:numFmt w:val="decimal"/>
+      <w:pPr>
+        <w:pBdr/>
+        <w:spacing/>
+        <w:ind w:hanging="360" w:left="2869"/>
+      </w:pPr>
+      <w:rPr/>
+      <w:start w:val="1"/>
+      <w:suff w:val="tab"/>
+    </w:lvl>
+    <w:lvl w:ilvl="4">
+      <w:isLgl w:val="false"/>
+      <w:lvlJc w:val="left"/>
+      <w:lvlText w:val="%5."/>
+      <w:numFmt w:val="lowerLetter"/>
+      <w:pPr>
+        <w:pBdr/>
+        <w:spacing/>
+        <w:ind w:hanging="360" w:left="3589"/>
+      </w:pPr>
+      <w:rPr/>
+      <w:start w:val="1"/>
+      <w:suff w:val="tab"/>
+    </w:lvl>
+    <w:lvl w:ilvl="5">
+      <w:isLgl w:val="false"/>
+      <w:lvlJc w:val="right"/>
+      <w:lvlText w:val="%6."/>
+      <w:numFmt w:val="lowerRoman"/>
+      <w:pPr>
+        <w:pBdr/>
+        <w:spacing/>
+        <w:ind w:hanging="180" w:left="4309"/>
+      </w:pPr>
+      <w:rPr/>
+      <w:start w:val="1"/>
+      <w:suff w:val="tab"/>
+    </w:lvl>
+    <w:lvl w:ilvl="6">
+      <w:isLgl w:val="false"/>
+      <w:lvlJc w:val="left"/>
+      <w:lvlText w:val="%7."/>
+      <w:numFmt w:val="decimal"/>
+      <w:pPr>
+        <w:pBdr/>
+        <w:spacing/>
+        <w:ind w:hanging="360" w:left="5029"/>
+      </w:pPr>
+      <w:rPr/>
+      <w:start w:val="1"/>
+      <w:suff w:val="tab"/>
+    </w:lvl>
+    <w:lvl w:ilvl="7">
+      <w:isLgl w:val="false"/>
+      <w:lvlJc w:val="left"/>
+      <w:lvlText w:val="%8."/>
+      <w:numFmt w:val="lowerLetter"/>
+      <w:pPr>
+        <w:pBdr/>
+        <w:spacing/>
+        <w:ind w:hanging="360" w:left="5749"/>
+      </w:pPr>
+      <w:rPr/>
+      <w:start w:val="1"/>
+      <w:suff w:val="tab"/>
+    </w:lvl>
+    <w:lvl w:ilvl="8">
+      <w:isLgl w:val="false"/>
+      <w:lvlJc w:val="right"/>
+      <w:lvlText w:val="%9."/>
+      <w:numFmt w:val="lowerRoman"/>
+      <w:pPr>
+        <w:pBdr/>
+        <w:spacing/>
+        <w:ind w:hanging="180" w:left="6469"/>
+      </w:pPr>
+      <w:rPr/>
+      <w:start w:val="1"/>
+      <w:suff w:val="tab"/>
+    </w:lvl>
+  </w:abstractNum>
   <w:num w:numId="1">
     <w:abstractNumId w:val="0"/>
+  </w:num>
+  <w:num w:numId="2">
+    <w:abstractNumId w:val="1"/>
   </w:num>
 </w:numbering>
 </file>

</xml_diff>

<commit_message>
Creación del archivo de codigo, asi como los diferentes archivos a seguir, a continuacion se crearán ramas en el proyecto
</commit_message>
<xml_diff>
--- a/Documentacion_Desafio1.docx
+++ b/Documentacion_Desafio1.docx
@@ -1221,15 +1221,6 @@
           <w:lang w:val="es-ES"/>
         </w:rPr>
       </w:r>
-      <w:r>
-        <w:rPr>
-          <w:rFonts w:ascii="Asana Math" w:hAnsi="Asana Math" w:eastAsia="Asana Math" w:cs="Asana Math"/>
-          <w:sz w:val="24"/>
-          <w:szCs w:val="24"/>
-          <w:highlight w:val="none"/>
-          <w:lang w:val="es-ES"/>
-        </w:rPr>
-      </w:r>
     </w:p>
     <w:p>
       <w:pPr>
@@ -1296,13 +1287,7 @@
           <w:lang w:val="es-ES" w:bidi="es-ES"/>
         </w:rPr>
       </w:r>
-    </w:p>
-    <w:p>
-      <w:pPr>
-        <w:pBdr/>
-        <w:spacing/>
-        <w:ind/>
-        <w:jc w:val="left"/>
+      <w:r>
         <w:rPr>
           <w:rFonts w:ascii="Asana Math" w:hAnsi="Asana Math" w:cs="Asana Math"/>
           <w:b w:val="0"/>
@@ -1313,8 +1298,14 @@
           <w:highlight w:val="none"/>
           <w:lang w:val="es-ES" w:bidi="es-ES"/>
         </w:rPr>
-      </w:pPr>
-      <w:r>
+      </w:r>
+    </w:p>
+    <w:p>
+      <w:pPr>
+        <w:pBdr/>
+        <w:spacing/>
+        <w:ind/>
+        <w:jc w:val="left"/>
         <w:rPr>
           <w:rFonts w:ascii="Asana Math" w:hAnsi="Asana Math" w:cs="Asana Math"/>
           <w:b w:val="0"/>
@@ -1325,8 +1316,7 @@
           <w:highlight w:val="none"/>
           <w:lang w:val="es-ES" w:bidi="es-ES"/>
         </w:rPr>
-        <w:t xml:space="preserve">3.2 ROTACI</w:t>
-      </w:r>
+      </w:pPr>
       <w:r>
         <w:rPr>
           <w:rFonts w:ascii="Asana Math" w:hAnsi="Asana Math" w:cs="Asana Math"/>
@@ -1338,7 +1328,7 @@
           <w:highlight w:val="none"/>
           <w:lang w:val="es-ES" w:bidi="es-ES"/>
         </w:rPr>
-        <w:t xml:space="preserve">ÓN DE FICHAS......................................................................................................</w:t>
+        <w:t xml:space="preserve">3.2 ROTACI</w:t>
       </w:r>
       <w:r>
         <w:rPr>
@@ -1351,6 +1341,7 @@
           <w:highlight w:val="none"/>
           <w:lang w:val="es-ES" w:bidi="es-ES"/>
         </w:rPr>
+        <w:t xml:space="preserve">ÓN DE FICHAS......................................................................................................</w:t>
       </w:r>
       <w:r>
         <w:rPr>
@@ -1364,13 +1355,7 @@
           <w:lang w:val="es-ES" w:bidi="es-ES"/>
         </w:rPr>
       </w:r>
-    </w:p>
-    <w:p>
-      <w:pPr>
-        <w:pBdr/>
-        <w:spacing/>
-        <w:ind/>
-        <w:jc w:val="left"/>
+      <w:r>
         <w:rPr>
           <w:rFonts w:ascii="Asana Math" w:hAnsi="Asana Math" w:cs="Asana Math"/>
           <w:b w:val="0"/>
@@ -1381,8 +1366,14 @@
           <w:highlight w:val="none"/>
           <w:lang w:val="es-ES" w:bidi="es-ES"/>
         </w:rPr>
-      </w:pPr>
-      <w:r>
+      </w:r>
+    </w:p>
+    <w:p>
+      <w:pPr>
+        <w:pBdr/>
+        <w:spacing/>
+        <w:ind/>
+        <w:jc w:val="left"/>
         <w:rPr>
           <w:rFonts w:ascii="Asana Math" w:hAnsi="Asana Math" w:cs="Asana Math"/>
           <w:b w:val="0"/>
@@ -1393,8 +1384,7 @@
           <w:highlight w:val="none"/>
           <w:lang w:val="es-ES" w:bidi="es-ES"/>
         </w:rPr>
-        <w:t xml:space="preserve">3.3 MEMORIA DINAMICA.......................................................................................................</w:t>
-      </w:r>
+      </w:pPr>
       <w:r>
         <w:rPr>
           <w:rFonts w:ascii="Asana Math" w:hAnsi="Asana Math" w:cs="Asana Math"/>
@@ -1406,6 +1396,7 @@
           <w:highlight w:val="none"/>
           <w:lang w:val="es-ES" w:bidi="es-ES"/>
         </w:rPr>
+        <w:t xml:space="preserve">3.3 MEMORIA DINAMICA.......................................................................................................</w:t>
       </w:r>
       <w:r>
         <w:rPr>
@@ -1419,13 +1410,7 @@
           <w:lang w:val="es-ES" w:bidi="es-ES"/>
         </w:rPr>
       </w:r>
-    </w:p>
-    <w:p>
-      <w:pPr>
-        <w:pBdr/>
-        <w:spacing/>
-        <w:ind/>
-        <w:jc w:val="left"/>
+      <w:r>
         <w:rPr>
           <w:rFonts w:ascii="Asana Math" w:hAnsi="Asana Math" w:cs="Asana Math"/>
           <w:b w:val="0"/>
@@ -1436,8 +1421,14 @@
           <w:highlight w:val="none"/>
           <w:lang w:val="es-ES" w:bidi="es-ES"/>
         </w:rPr>
-      </w:pPr>
-      <w:r>
+      </w:r>
+    </w:p>
+    <w:p>
+      <w:pPr>
+        <w:pBdr/>
+        <w:spacing/>
+        <w:ind/>
+        <w:jc w:val="left"/>
         <w:rPr>
           <w:rFonts w:ascii="Asana Math" w:hAnsi="Asana Math" w:cs="Asana Math"/>
           <w:b w:val="0"/>
@@ -1448,8 +1439,7 @@
           <w:highlight w:val="none"/>
           <w:lang w:val="es-ES" w:bidi="es-ES"/>
         </w:rPr>
-        <w:t xml:space="preserve">4. MOVIMIENTOS......................................................................................................................</w:t>
-      </w:r>
+      </w:pPr>
       <w:r>
         <w:rPr>
           <w:rFonts w:ascii="Asana Math" w:hAnsi="Asana Math" w:cs="Asana Math"/>
@@ -1461,6 +1451,7 @@
           <w:highlight w:val="none"/>
           <w:lang w:val="es-ES" w:bidi="es-ES"/>
         </w:rPr>
+        <w:t xml:space="preserve">4. MOVIMIENTOS......................................................................................................................</w:t>
       </w:r>
       <w:r>
         <w:rPr>
@@ -1474,6 +1465,18 @@
           <w:lang w:val="es-ES" w:bidi="es-ES"/>
         </w:rPr>
       </w:r>
+      <w:r>
+        <w:rPr>
+          <w:rFonts w:ascii="Asana Math" w:hAnsi="Asana Math" w:cs="Asana Math"/>
+          <w:b w:val="0"/>
+          <w:bCs w:val="0"/>
+          <w:color w:val="000000" w:themeColor="text1"/>
+          <w:sz w:val="24"/>
+          <w:szCs w:val="24"/>
+          <w:highlight w:val="none"/>
+          <w:lang w:val="es-ES" w:bidi="es-ES"/>
+        </w:rPr>
+      </w:r>
     </w:p>
     <w:p>
       <w:pPr>
@@ -1507,7 +1510,15 @@
           <w:lang w:val="es-ES"/>
         </w:rPr>
       </w:r>
-      <w:r/>
+      <w:r>
+        <w:rPr>
+          <w:rFonts w:ascii="Asana Math" w:hAnsi="Asana Math" w:eastAsia="Asana Math" w:cs="Asana Math"/>
+          <w:sz w:val="24"/>
+          <w:szCs w:val="24"/>
+          <w:highlight w:val="none"/>
+          <w:lang w:val="es-ES"/>
+        </w:rPr>
+      </w:r>
     </w:p>
     <w:p>
       <w:pPr>
@@ -2524,7 +2535,7 @@
     </w:p>
     <w:p>
       <w:pPr>
-        <w:pStyle w:val="883"/>
+        <w:pStyle w:val="885"/>
         <w:pBdr/>
         <w:spacing/>
         <w:ind/>
@@ -2548,7 +2559,6 @@
       <w:r>
         <w:t xml:space="preserve">1</w:t>
       </w:r>
-      <w:r/>
       <w:r>
         <w:fldChar w:fldCharType="end"/>
       </w:r>
@@ -2718,7 +2728,7 @@
     </w:p>
     <w:p>
       <w:pPr>
-        <w:pStyle w:val="883"/>
+        <w:pStyle w:val="885"/>
         <w:pBdr/>
         <w:spacing/>
         <w:ind/>
@@ -2745,7 +2755,6 @@
       <w:r>
         <w:t xml:space="preserve">2</w:t>
       </w:r>
-      <w:r/>
       <w:r>
         <w:fldChar w:fldCharType="end"/>
       </w:r>
@@ -3033,7 +3042,7 @@
     </w:p>
     <w:p>
       <w:pPr>
-        <w:pStyle w:val="883"/>
+        <w:pStyle w:val="885"/>
         <w:pBdr/>
         <w:spacing/>
         <w:ind/>
@@ -3051,7 +3060,6 @@
       <w:r>
         <w:t xml:space="preserve">3</w:t>
       </w:r>
-      <w:r/>
       <w:r>
         <w:fldChar w:fldCharType="end"/>
       </w:r>
@@ -3794,7 +3802,7 @@
     </w:p>
     <w:p>
       <w:pPr>
-        <w:pStyle w:val="883"/>
+        <w:pStyle w:val="885"/>
         <w:pBdr/>
         <w:spacing/>
         <w:ind/>
@@ -3812,7 +3820,6 @@
       <w:r>
         <w:t xml:space="preserve">4</w:t>
       </w:r>
-      <w:r/>
       <w:r>
         <w:fldChar w:fldCharType="end"/>
       </w:r>
@@ -4465,7 +4472,7 @@
     </w:p>
     <w:p>
       <w:pPr>
-        <w:pStyle w:val="883"/>
+        <w:pStyle w:val="885"/>
         <w:pBdr/>
         <w:spacing/>
         <w:ind/>
@@ -4483,7 +4490,6 @@
       <w:r>
         <w:t xml:space="preserve">5</w:t>
       </w:r>
-      <w:r/>
       <w:r>
         <w:fldChar w:fldCharType="end"/>
       </w:r>
@@ -4631,7 +4637,7 @@
     </w:p>
     <w:p>
       <w:pPr>
-        <w:pStyle w:val="883"/>
+        <w:pStyle w:val="885"/>
         <w:pBdr/>
         <w:spacing/>
         <w:ind/>
@@ -4649,7 +4655,6 @@
       <w:r>
         <w:t xml:space="preserve">6</w:t>
       </w:r>
-      <w:r/>
       <w:r>
         <w:fldChar w:fldCharType="end"/>
       </w:r>
@@ -5062,7 +5067,7 @@
     </w:p>
     <w:p>
       <w:pPr>
-        <w:pStyle w:val="883"/>
+        <w:pStyle w:val="885"/>
         <w:pBdr/>
         <w:spacing/>
         <w:ind/>
@@ -5080,7 +5085,6 @@
       <w:r>
         <w:t xml:space="preserve">7</w:t>
       </w:r>
-      <w:r/>
       <w:r>
         <w:fldChar w:fldCharType="end"/>
       </w:r>
@@ -5720,7 +5724,6 @@
                               <w:rPr>
                                 <w:rFonts w:ascii="Asana Math" w:hAnsi="Asana Math" w:eastAsia="Asana Math" w:cs="Asana Math"/>
                                 <w:highlight w:val="yellow"/>
-                                <w:lang w:val="es-ES"/>
                               </w:rPr>
                             </w:r>
                             <w:r>
@@ -5797,7 +5800,6 @@
                         <w:rPr>
                           <w:rFonts w:ascii="Asana Math" w:hAnsi="Asana Math" w:eastAsia="Asana Math" w:cs="Asana Math"/>
                           <w:highlight w:val="yellow"/>
-                          <w:lang w:val="es-ES"/>
                         </w:rPr>
                       </w:r>
                       <w:r>
@@ -8573,7 +8575,7 @@
         <w:rPr>
           <w:rFonts w:ascii="Asana Math" w:hAnsi="Asana Math" w:cs="Asana Math"/>
           <w:highlight w:val="none"/>
-          <w:lang w:val="es-ES"/>
+          <w:lang w:val="es-ES" w:bidi="es-ES"/>
         </w:rPr>
       </w:r>
       <w:r>
@@ -8634,7 +8636,9 @@
           <w:rFonts w:ascii="Asana Math" w:hAnsi="Asana Math" w:cs="Asana Math"/>
           <w:b w:val="0"/>
           <w:bCs w:val="0"/>
-          <w:highlight w:val="none"/>
+          <w:color w:val="000000" w:themeColor="text1"/>
+          <w:highlight w:val="none"/>
+          <w:lang w:val="es-ES" w:bidi="es-ES"/>
         </w:rPr>
       </w:r>
       <w:r>
@@ -8683,9 +8687,11 @@
           <w:rFonts w:ascii="Asana Math" w:hAnsi="Asana Math" w:cs="Asana Math"/>
           <w:b w:val="0"/>
           <w:bCs w:val="0"/>
+          <w:color w:val="000000" w:themeColor="text1"/>
           <w:sz w:val="24"/>
           <w:szCs w:val="24"/>
           <w:highlight w:val="none"/>
+          <w:lang w:val="es-ES" w:bidi="es-ES"/>
         </w:rPr>
       </w:r>
       <w:r>
@@ -8736,9 +8742,11 @@
           <w:rFonts w:ascii="Asana Math" w:hAnsi="Asana Math" w:cs="Asana Math"/>
           <w:b w:val="0"/>
           <w:bCs w:val="0"/>
-          <w:sz w:val="18"/>
-          <w:szCs w:val="18"/>
-          <w:highlight w:val="none"/>
+          <w:color w:val="000000" w:themeColor="text1"/>
+          <w:sz w:val="22"/>
+          <w:szCs w:val="22"/>
+          <w:highlight w:val="none"/>
+          <w:lang w:val="es-ES" w:bidi="es-ES"/>
         </w:rPr>
       </w:r>
       <w:r>
@@ -8789,9 +8797,11 @@
           <w:rFonts w:ascii="Asana Math" w:hAnsi="Asana Math" w:cs="Asana Math"/>
           <w:b w:val="0"/>
           <w:bCs w:val="0"/>
-          <w:sz w:val="18"/>
-          <w:szCs w:val="18"/>
-          <w:highlight w:val="none"/>
+          <w:color w:val="000000" w:themeColor="text1"/>
+          <w:sz w:val="22"/>
+          <w:szCs w:val="22"/>
+          <w:highlight w:val="none"/>
+          <w:lang w:val="es-ES" w:bidi="es-ES"/>
         </w:rPr>
       </w:r>
       <w:r>
@@ -8866,8 +8876,9 @@
           <w:rFonts w:ascii="Asana Math" w:hAnsi="Asana Math" w:cs="Asana Math"/>
           <w:b w:val="0"/>
           <w:bCs w:val="0"/>
-          <w:sz w:val="18"/>
-          <w:szCs w:val="18"/>
+          <w:color w:val="000000" w:themeColor="text1"/>
+          <w:sz w:val="22"/>
+          <w:szCs w:val="22"/>
           <w:highlight w:val="none"/>
         </w:rPr>
       </w:r>
@@ -8943,9 +8954,11 @@
           <w:rFonts w:ascii="Asana Math" w:hAnsi="Asana Math" w:cs="Asana Math"/>
           <w:b w:val="0"/>
           <w:bCs w:val="0"/>
-          <w:sz w:val="18"/>
-          <w:szCs w:val="18"/>
-          <w:highlight w:val="none"/>
+          <w:color w:val="000000" w:themeColor="text1"/>
+          <w:sz w:val="22"/>
+          <w:szCs w:val="22"/>
+          <w:highlight w:val="none"/>
+          <w:lang w:val="es-ES" w:bidi="es-ES"/>
         </w:rPr>
       </w:r>
       <w:r>
@@ -9062,11 +9075,9 @@
           <w:rFonts w:ascii="Asana Math" w:hAnsi="Asana Math" w:cs="Asana Math"/>
           <w:b w:val="0"/>
           <w:bCs w:val="0"/>
-          <w:color w:val="000000" w:themeColor="text1"/>
-          <w:sz w:val="22"/>
-          <w:szCs w:val="22"/>
-          <w:highlight w:val="none"/>
-          <w:lang w:val="es-ES" w:bidi="es-ES"/>
+          <w:sz w:val="18"/>
+          <w:szCs w:val="18"/>
+          <w:highlight w:val="none"/>
         </w:rPr>
       </w:r>
       <w:r>
@@ -9082,7 +9093,7 @@
     </w:p>
     <w:p>
       <w:pPr>
-        <w:pStyle w:val="883"/>
+        <w:pStyle w:val="885"/>
         <w:pBdr/>
         <w:spacing/>
         <w:ind/>
@@ -9100,7 +9111,6 @@
       <w:r>
         <w:t xml:space="preserve">8</w:t>
       </w:r>
-      <w:r/>
       <w:r>
         <w:fldChar w:fldCharType="end"/>
       </w:r>
@@ -9117,7 +9127,6 @@
         <w:jc w:val="center"/>
         <w:rPr>
           <w:rFonts w:ascii="Asana Math" w:hAnsi="Asana Math" w:eastAsia="Asana Math" w:cs="Asana Math"/>
-          <w:highlight w:val="none"/>
           <w:lang w:val="es-ES"/>
         </w:rPr>
       </w:pPr>
@@ -9133,14 +9142,7 @@
           <w:rFonts w:ascii="Asana Math" w:hAnsi="Asana Math" w:eastAsia="Asana Math" w:cs="Asana Math"/>
           <w:lang w:val="es-ES"/>
         </w:rPr>
-        <w:t xml:space="preserve">el bit masking, y ya  con esto estoy indexado; Ahora unicamente me toca utilizar la mecanica de bit masking pero no sin antes hacer lo siguiente tengo que apuntar bien debido a que si unicamente utilizo bit masking me rellenara la columna de manera lineal.</w:t>
-      </w:r>
-      <w:r>
-        <w:rPr>
-          <w:rFonts w:ascii="Asana Math" w:hAnsi="Asana Math" w:eastAsia="Asana Math" w:cs="Asana Math"/>
-          <w:highlight w:val="none"/>
-          <w:lang w:val="es-ES"/>
-        </w:rPr>
+        <w:t xml:space="preserve">el bit masking por ejemplo 2x2, 3x3 , 4x4, y ya  con esto estoy indexado</w:t>
       </w:r>
       <w:r>
         <w:rPr>
@@ -9159,16 +9161,16 @@
         <w:rPr>
           <w:rFonts w:ascii="Asana Math" w:hAnsi="Asana Math" w:eastAsia="Asana Math" w:cs="Asana Math"/>
           <w:highlight w:val="none"/>
-          <w:lang w:val="es-ES" w:bidi="es-ES"/>
+          <w:lang w:val="es-ES"/>
         </w:rPr>
       </w:pPr>
       <w:r>
         <w:rPr>
           <w:rFonts w:ascii="Asana Math" w:hAnsi="Asana Math" w:eastAsia="Asana Math" w:cs="Asana Math"/>
           <w:highlight w:val="none"/>
-          <w:lang w:val="es-ES" w:bidi="es-ES"/>
-        </w:rPr>
-        <w:t xml:space="preserve">Nuestra mecanica para indexarnos es la siguiente:</w:t>
+          <w:lang w:val="es-ES"/>
+        </w:rPr>
+        <w:t xml:space="preserve">Pero para mejorar considerablemente mi indexaci</w:t>
       </w:r>
       <w:r>
         <w:rPr>
@@ -9176,55 +9178,132 @@
           <w:highlight w:val="none"/>
           <w:lang w:val="es-ES"/>
         </w:rPr>
+        <w:t xml:space="preserve">ón puedo utilizar variables de posicion como por ejemplo:</w:t>
       </w:r>
       <w:r>
         <w:rPr>
           <w:rFonts w:ascii="Asana Math" w:hAnsi="Asana Math" w:eastAsia="Asana Math" w:cs="Asana Math"/>
           <w:highlight w:val="none"/>
-          <w:lang w:val="es-ES" w:bidi="es-ES"/>
+          <w:lang w:val="es-ES"/>
         </w:rPr>
       </w:r>
     </w:p>
     <w:p>
       <w:pPr>
-        <w:pBdr/>
+        <w:suppressLineNumbers w:val="false"/>
+        <w:pBdr>
+          <w:top w:val="single" w:color="000000" w:sz="4" w:space="0"/>
+          <w:left w:val="single" w:color="000000" w:sz="4" w:space="0"/>
+          <w:bottom w:val="single" w:color="000000" w:sz="4" w:space="0"/>
+          <w:right w:val="single" w:color="000000" w:sz="4" w:space="0"/>
+          <w:between w:val="none" w:color="000000" w:sz="4" w:space="0"/>
+        </w:pBdr>
         <w:spacing/>
         <w:ind/>
         <w:jc w:val="center"/>
         <w:rPr>
           <w:rFonts w:ascii="Asana Math" w:hAnsi="Asana Math" w:eastAsia="Asana Math" w:cs="Asana Math"/>
           <w:highlight w:val="none"/>
+        </w:rPr>
+      </w:pPr>
+      <w:r>
+        <w:rPr>
+          <w:rFonts w:ascii="Asana Math" w:hAnsi="Asana Math" w:eastAsia="Asana Math" w:cs="Asana Math"/>
+          <w:highlight w:val="none"/>
           <w:lang w:val="es-ES" w:bidi="es-ES"/>
         </w:rPr>
-      </w:pPr>
+      </w:r>
+      <m:oMathPara>
+        <m:oMathParaPr/>
+        <m:oMath>
+          <m:r>
+            <w:rPr>
+              <w:rFonts w:hint="default" w:ascii="Cambria Math" w:hAnsi="Cambria Math" w:eastAsia="Cambria Math" w:cs="Cambria Math"/>
+              <w:highlight w:val="none"/>
+              <w:lang w:val="es-ES" w:bidi="es-ES"/>
+            </w:rPr>
+            <m:rPr>
+              <m:sty m:val="i"/>
+            </m:rPr>
+            <m:t>x =</m:t>
+          </m:r>
+          <m:d>
+            <m:dPr>
+              <m:begChr m:val="("/>
+              <m:endChr m:val=")"/>
+              <m:ctrlPr>
+                <w:rPr>
+                  <w:rFonts w:hint="default" w:ascii="Cambria Math" w:hAnsi="Cambria Math" w:eastAsia="Cambria Math" w:cs="Cambria Math"/>
+                  <w:highlight w:val="none"/>
+                  <w:lang w:val="es-ES" w:bidi="es-ES"/>
+                </w:rPr>
+              </m:ctrlPr>
+            </m:dPr>
+            <m:e>
+              <m:f>
+                <m:fPr>
+                  <m:ctrlPr>
+                    <w:rPr>
+                      <w:rFonts w:hint="default" w:ascii="Cambria Math" w:hAnsi="Cambria Math" w:eastAsia="Cambria Math" w:cs="Cambria Math"/>
+                      <w:highlight w:val="none"/>
+                      <w:lang w:val="es-ES" w:bidi="es-ES"/>
+                    </w:rPr>
+                  </m:ctrlPr>
+                </m:fPr>
+                <m:num>
+                  <m:r>
+                    <w:rPr>
+                      <w:rFonts w:hint="default" w:ascii="Cambria Math" w:hAnsi="Cambria Math" w:eastAsia="Cambria Math" w:cs="Cambria Math"/>
+                      <w:highlight w:val="none"/>
+                      <w:lang w:val="es-ES" w:bidi="es-ES"/>
+                    </w:rPr>
+                    <m:rPr>
+                      <m:sty m:val="i"/>
+                    </m:rPr>
+                    <m:t>byte</m:t>
+                  </m:r>
+                </m:num>
+                <m:den>
+                  <m:r>
+                    <w:rPr>
+                      <w:rFonts w:hint="default" w:ascii="Cambria Math" w:hAnsi="Cambria Math" w:eastAsia="Cambria Math" w:cs="Cambria Math"/>
+                      <w:highlight w:val="none"/>
+                      <w:lang w:val="es-ES" w:bidi="es-ES"/>
+                    </w:rPr>
+                    <m:rPr>
+                      <m:sty m:val="i"/>
+                    </m:rPr>
+                    <m:t>2</m:t>
+                  </m:r>
+                </m:den>
+              </m:f>
+            </m:e>
+          </m:d>
+          <m:r>
+            <w:rPr>
+              <w:rFonts w:hint="default" w:ascii="Cambria Math" w:hAnsi="Cambria Math" w:eastAsia="Cambria Math" w:cs="Cambria Math"/>
+              <w:highlight w:val="none"/>
+              <w:lang w:val="es-ES" w:bidi="es-ES"/>
+            </w:rPr>
+            <m:rPr>
+              <m:sty m:val="i"/>
+            </m:rPr>
+            <m:t>-1 , y = 0;</m:t>
+          </m:r>
+        </m:oMath>
+      </m:oMathPara>
       <w:r>
         <w:rPr>
           <w:rFonts w:ascii="Asana Math" w:hAnsi="Asana Math" w:eastAsia="Asana Math" w:cs="Asana Math"/>
           <w:highlight w:val="none"/>
           <w:lang w:val="es-ES" w:bidi="es-ES"/>
         </w:rPr>
-        <w:t xml:space="preserve">“Para cada fila de la pieza apuntar a la fila del tablero</w:t>
       </w:r>
       <w:r>
         <w:rPr>
           <w:rFonts w:ascii="Asana Math" w:hAnsi="Asana Math" w:eastAsia="Asana Math" w:cs="Asana Math"/>
           <w:highlight w:val="none"/>
-          <w:lang w:val="es-ES" w:bidi="es-ES"/>
-        </w:rPr>
-        <w:t xml:space="preserve">”</w:t>
-      </w:r>
-      <w:r>
-        <w:rPr>
-          <w:rFonts w:ascii="Asana Math" w:hAnsi="Asana Math" w:eastAsia="Asana Math" w:cs="Asana Math"/>
-          <w:highlight w:val="none"/>
           <w:lang w:val="es-ES"/>
-        </w:rPr>
-      </w:r>
-      <w:r>
-        <w:rPr>
-          <w:rFonts w:ascii="Asana Math" w:hAnsi="Asana Math" w:eastAsia="Asana Math" w:cs="Asana Math"/>
-          <w:highlight w:val="none"/>
-          <w:lang w:val="es-ES" w:bidi="es-ES"/>
         </w:rPr>
       </w:r>
     </w:p>
@@ -9237,16 +9316,15 @@
         <w:rPr>
           <w:rFonts w:ascii="Asana Math" w:hAnsi="Asana Math" w:eastAsia="Asana Math" w:cs="Asana Math"/>
           <w:highlight w:val="none"/>
-          <w:lang w:val="es-ES" w:bidi="es-ES"/>
+          <w:lang w:val="es-ES"/>
         </w:rPr>
       </w:pPr>
       <w:r>
         <w:rPr>
           <w:rFonts w:ascii="Asana Math" w:hAnsi="Asana Math" w:eastAsia="Asana Math" w:cs="Asana Math"/>
-          <w:highlight w:val="none"/>
-          <w:lang w:val="es-ES" w:bidi="es-ES"/>
-        </w:rPr>
-        <w:t xml:space="preserve">“para cada columna de la pieza utilizar el bitmasking”</w:t>
+          <w:lang w:val="es-ES"/>
+        </w:rPr>
+        <w:t xml:space="preserve"> Ahora unicamente me toca utilizar la mecanica de bit masking pero no sin antes hacer lo siguiente tengo que apuntar bien debido a que si unicamente utilizo bit masking me rellenara la columna de manera lineal.</w:t>
       </w:r>
       <w:r>
         <w:rPr>
@@ -9255,13 +9333,7 @@
           <w:lang w:val="es-ES"/>
         </w:rPr>
       </w:r>
-      <w:r>
-        <w:rPr>
-          <w:rFonts w:ascii="Asana Math" w:hAnsi="Asana Math" w:eastAsia="Asana Math" w:cs="Asana Math"/>
-          <w:highlight w:val="none"/>
-          <w:lang w:val="es-ES" w:bidi="es-ES"/>
-        </w:rPr>
-      </w:r>
+      <w:r/>
     </w:p>
     <w:p>
       <w:pPr>
@@ -9281,13 +9353,13 @@
           <w:highlight w:val="none"/>
           <w:lang w:val="es-ES" w:bidi="es-ES"/>
         </w:rPr>
-        <w:t xml:space="preserve">Eso se hace utilizando unicamente ciclos e indexadores.</w:t>
+        <w:t xml:space="preserve">Nuestra mecanica para indexarnos es la siguiente:</w:t>
       </w:r>
       <w:r>
         <w:rPr>
           <w:rFonts w:ascii="Asana Math" w:hAnsi="Asana Math" w:eastAsia="Asana Math" w:cs="Asana Math"/>
           <w:highlight w:val="none"/>
-          <w:lang w:val="es-ES"/>
+          <w:lang w:val="es-ES" w:bidi="es-ES"/>
         </w:rPr>
       </w:r>
       <w:r>
@@ -9316,6 +9388,7 @@
           <w:highlight w:val="none"/>
           <w:lang w:val="es-ES" w:bidi="es-ES"/>
         </w:rPr>
+        <w:t xml:space="preserve">“Para cada fila de la pieza apuntar a la fila del tablero</w:t>
       </w:r>
       <w:r>
         <w:rPr>
@@ -9323,7 +9396,7 @@
           <w:highlight w:val="none"/>
           <w:lang w:val="es-ES" w:bidi="es-ES"/>
         </w:rPr>
-        <w:t xml:space="preserve">A</w:t>
+        <w:t xml:space="preserve">”</w:t>
       </w:r>
       <w:r>
         <w:rPr>
@@ -9331,31 +9404,6 @@
           <w:highlight w:val="none"/>
           <w:lang w:val="es-ES" w:bidi="es-ES"/>
         </w:rPr>
-        <w:t xml:space="preserve">qui tenemos que hacer algo sumamente importante y eso es el bit masking, pero que en realidad se debe de hacer, primero tenemos nuestro tablero, nuestro tablero esta lleno de 0 y nuestras fichas son matrices que tienen bits activos(1’s) y bits inactivos (0</w:t>
-      </w:r>
-      <w:r>
-        <w:rPr>
-          <w:rFonts w:ascii="Asana Math" w:hAnsi="Asana Math" w:eastAsia="Asana Math" w:cs="Asana Math"/>
-          <w:highlight w:val="none"/>
-          <w:lang w:val="es-ES" w:bidi="es-ES"/>
-        </w:rPr>
-        <w:t xml:space="preserve">’s) asi que lo que tenemos que hacer es recorrer y comparar esos bits utilizando el operador “|” el cual nos dice si uno de los bits est</w:t>
-      </w:r>
-      <w:r>
-        <w:rPr>
-          <w:rFonts w:ascii="Asana Math" w:hAnsi="Asana Math" w:eastAsia="Asana Math" w:cs="Asana Math"/>
-          <w:highlight w:val="none"/>
-          <w:lang w:val="es-ES" w:bidi="es-ES"/>
-        </w:rPr>
-        <w:t xml:space="preserve">á activo entonces el resultado ser</w:t>
-      </w:r>
-      <w:r>
-        <w:rPr>
-          <w:rFonts w:ascii="Asana Math" w:hAnsi="Asana Math" w:eastAsia="Asana Math" w:cs="Asana Math"/>
-          <w:highlight w:val="none"/>
-          <w:lang w:val="es-ES" w:bidi="es-ES"/>
-        </w:rPr>
-        <w:t xml:space="preserve">á un bit activo, pero lo primordial es que tenemos que movernos dentro de las columnas y eso lo hacemos con los operadores shift</w:t>
       </w:r>
       <w:r>
         <w:rPr>
@@ -9383,7 +9431,14 @@
           <w:highlight w:val="none"/>
           <w:lang w:val="es-ES" w:bidi="es-ES"/>
         </w:rPr>
-        <w:t xml:space="preserve"> “&lt;&lt; , &gt;&gt;”  </w:t>
+        <w:t xml:space="preserve">“para cada columna de la pieza utilizar el bitmasking”</w:t>
+      </w:r>
+      <w:r>
+        <w:rPr>
+          <w:rFonts w:ascii="Asana Math" w:hAnsi="Asana Math" w:eastAsia="Asana Math" w:cs="Asana Math"/>
+          <w:highlight w:val="none"/>
+          <w:lang w:val="es-ES" w:bidi="es-ES"/>
+        </w:rPr>
       </w:r>
       <w:r>
         <w:rPr>
@@ -9411,10 +9466,159 @@
           <w:highlight w:val="none"/>
           <w:lang w:val="es-ES" w:bidi="es-ES"/>
         </w:rPr>
+        <w:t xml:space="preserve">Eso se hace utilizando unicamente ciclos e indexadores.</w:t>
+      </w:r>
+      <w:r>
+        <w:rPr>
+          <w:rFonts w:ascii="Asana Math" w:hAnsi="Asana Math" w:eastAsia="Asana Math" w:cs="Asana Math"/>
+          <w:highlight w:val="none"/>
+          <w:lang w:val="es-ES" w:bidi="es-ES"/>
+        </w:rPr>
+      </w:r>
+      <w:r>
+        <w:rPr>
+          <w:rFonts w:ascii="Asana Math" w:hAnsi="Asana Math" w:eastAsia="Asana Math" w:cs="Asana Math"/>
+          <w:highlight w:val="none"/>
+          <w:lang w:val="es-ES" w:bidi="es-ES"/>
+        </w:rPr>
+      </w:r>
+    </w:p>
+    <w:p>
+      <w:pPr>
+        <w:pBdr/>
+        <w:spacing/>
+        <w:ind/>
+        <w:jc w:val="center"/>
+        <w:rPr>
+          <w:rFonts w:ascii="Asana Math" w:hAnsi="Asana Math" w:eastAsia="Asana Math" w:cs="Asana Math"/>
+          <w:highlight w:val="none"/>
+          <w:lang w:val="es-ES" w:bidi="es-ES"/>
+        </w:rPr>
+      </w:pPr>
+      <w:r>
+        <w:rPr>
+          <w:rFonts w:ascii="Asana Math" w:hAnsi="Asana Math" w:eastAsia="Asana Math" w:cs="Asana Math"/>
+          <w:highlight w:val="none"/>
+          <w:lang w:val="es-ES" w:bidi="es-ES"/>
+        </w:rPr>
+      </w:r>
+      <w:r>
+        <w:rPr>
+          <w:rFonts w:ascii="Asana Math" w:hAnsi="Asana Math" w:eastAsia="Asana Math" w:cs="Asana Math"/>
+          <w:highlight w:val="none"/>
+          <w:lang w:val="es-ES" w:bidi="es-ES"/>
+        </w:rPr>
+        <w:t xml:space="preserve">A</w:t>
+      </w:r>
+      <w:r>
+        <w:rPr>
+          <w:rFonts w:ascii="Asana Math" w:hAnsi="Asana Math" w:eastAsia="Asana Math" w:cs="Asana Math"/>
+          <w:highlight w:val="none"/>
+          <w:lang w:val="es-ES" w:bidi="es-ES"/>
+        </w:rPr>
+        <w:t xml:space="preserve">qui tenemos que hacer algo sumamente importante y eso es el bit masking, pero que en realidad se debe de hacer, primero tenemos nuestro tablero, nuestro tablero esta lleno de 0 y nuestras fichas son matrices que tienen bits activos(1’s) y bits inactivos (0</w:t>
+      </w:r>
+      <w:r>
+        <w:rPr>
+          <w:rFonts w:ascii="Asana Math" w:hAnsi="Asana Math" w:eastAsia="Asana Math" w:cs="Asana Math"/>
+          <w:highlight w:val="none"/>
+          <w:lang w:val="es-ES" w:bidi="es-ES"/>
+        </w:rPr>
+        <w:t xml:space="preserve">’s) asi que lo que tenemos que hacer es recorrer y comparar esos bits utilizando el operador “ | ” el cual nos dice si uno de los bits est</w:t>
+      </w:r>
+      <w:r>
+        <w:rPr>
+          <w:rFonts w:ascii="Asana Math" w:hAnsi="Asana Math" w:eastAsia="Asana Math" w:cs="Asana Math"/>
+          <w:highlight w:val="none"/>
+          <w:lang w:val="es-ES" w:bidi="es-ES"/>
+        </w:rPr>
+        <w:t xml:space="preserve">á activo entonces el resultado ser</w:t>
+      </w:r>
+      <w:r>
+        <w:rPr>
+          <w:rFonts w:ascii="Asana Math" w:hAnsi="Asana Math" w:eastAsia="Asana Math" w:cs="Asana Math"/>
+          <w:highlight w:val="none"/>
+          <w:lang w:val="es-ES" w:bidi="es-ES"/>
+        </w:rPr>
+        <w:t xml:space="preserve">á un bit activo, pero lo primordial es que tenemos que movernos dentro de las columnas y eso lo hacemos con los operadores shift</w:t>
+      </w:r>
+      <w:r>
+        <w:rPr>
+          <w:rFonts w:ascii="Asana Math" w:hAnsi="Asana Math" w:eastAsia="Asana Math" w:cs="Asana Math"/>
+          <w:highlight w:val="none"/>
+          <w:lang w:val="es-ES" w:bidi="es-ES"/>
+        </w:rPr>
+      </w:r>
+      <w:r>
+        <w:rPr>
+          <w:rFonts w:ascii="Asana Math" w:hAnsi="Asana Math" w:eastAsia="Asana Math" w:cs="Asana Math"/>
+          <w:highlight w:val="none"/>
+          <w:lang w:val="es-ES" w:bidi="es-ES"/>
+        </w:rPr>
+      </w:r>
+    </w:p>
+    <w:p>
+      <w:pPr>
+        <w:pBdr/>
+        <w:spacing/>
+        <w:ind/>
+        <w:jc w:val="center"/>
+        <w:rPr>
+          <w:rFonts w:ascii="Asana Math" w:hAnsi="Asana Math" w:eastAsia="Asana Math" w:cs="Asana Math"/>
+          <w:highlight w:val="none"/>
+          <w:lang w:val="es-ES" w:bidi="es-ES"/>
+        </w:rPr>
+      </w:pPr>
+      <w:r>
+        <w:rPr>
+          <w:rFonts w:ascii="Asana Math" w:hAnsi="Asana Math" w:eastAsia="Asana Math" w:cs="Asana Math"/>
+          <w:highlight w:val="none"/>
+          <w:lang w:val="es-ES" w:bidi="es-ES"/>
+        </w:rPr>
+        <w:t xml:space="preserve"> “&lt;&lt; , &gt;&gt;”  </w:t>
+      </w:r>
+      <w:r>
+        <w:rPr>
+          <w:rFonts w:ascii="Asana Math" w:hAnsi="Asana Math" w:eastAsia="Asana Math" w:cs="Asana Math"/>
+          <w:highlight w:val="none"/>
+          <w:lang w:val="es-ES" w:bidi="es-ES"/>
+        </w:rPr>
+      </w:r>
+      <w:r>
+        <w:rPr>
+          <w:rFonts w:ascii="Asana Math" w:hAnsi="Asana Math" w:eastAsia="Asana Math" w:cs="Asana Math"/>
+          <w:highlight w:val="none"/>
+          <w:lang w:val="es-ES" w:bidi="es-ES"/>
+        </w:rPr>
+      </w:r>
+    </w:p>
+    <w:p>
+      <w:pPr>
+        <w:pBdr/>
+        <w:spacing/>
+        <w:ind/>
+        <w:jc w:val="center"/>
+        <w:rPr>
+          <w:rFonts w:ascii="Asana Math" w:hAnsi="Asana Math" w:eastAsia="Asana Math" w:cs="Asana Math"/>
+          <w:highlight w:val="none"/>
+          <w:lang w:val="es-ES" w:bidi="es-ES"/>
+        </w:rPr>
+      </w:pPr>
+      <w:r>
+        <w:rPr>
+          <w:rFonts w:ascii="Asana Math" w:hAnsi="Asana Math" w:eastAsia="Asana Math" w:cs="Asana Math"/>
+          <w:highlight w:val="none"/>
+          <w:lang w:val="es-ES" w:bidi="es-ES"/>
+        </w:rPr>
         <w:t xml:space="preserve">cuando nos movemos y comparamos estamos indexando nuestra ficha completa.</w:t>
       </w:r>
-      <w:r/>
-      <w:r/>
+      <w:r>
+        <w:rPr>
+          <w:rFonts w:ascii="Asana Math" w:hAnsi="Asana Math" w:eastAsia="Asana Math" w:cs="Asana Math"/>
+          <w:highlight w:val="none"/>
+          <w:lang w:val="es-ES" w:bidi="es-ES"/>
+        </w:rPr>
+      </w:r>
     </w:p>
     <w:p>
       <w:pPr>
@@ -9521,7 +9725,6 @@
                               <w:t xml:space="preserve">1 &lt;&lt; 0 → 00000001</w:t>
                             </w:r>
                             <w:r/>
-                            <w:r/>
                           </w:p>
                           <w:p>
                             <w:pPr>
@@ -9533,7 +9736,6 @@
                             <w:r>
                               <w:t xml:space="preserve">1 &lt;&lt; 1 → 00000010</w:t>
                             </w:r>
-                            <w:r/>
                             <w:r/>
                           </w:p>
                           <w:p>
@@ -9547,7 +9749,6 @@
                               <w:t xml:space="preserve">1 &lt;&lt; 2 → 00000100</w:t>
                             </w:r>
                             <w:r/>
-                            <w:r/>
                           </w:p>
                           <w:p>
                             <w:pPr>
@@ -9560,7 +9761,6 @@
                               <w:t xml:space="preserve">1 &lt;&lt; 3 → 00001000</w:t>
                             </w:r>
                             <w:r/>
-                            <w:r/>
                           </w:p>
                           <w:p>
                             <w:pPr>
@@ -9572,7 +9772,6 @@
                             <w:r>
                               <w:t xml:space="preserve">1 &lt;&lt; 4 → 00010000</w:t>
                             </w:r>
-                            <w:r/>
                             <w:r/>
                           </w:p>
                         </w:txbxContent>
@@ -9600,7 +9799,6 @@
                         <w:t xml:space="preserve">1 &lt;&lt; 0 → 00000001</w:t>
                       </w:r>
                       <w:r/>
-                      <w:r/>
                     </w:p>
                     <w:p>
                       <w:pPr>
@@ -9612,7 +9810,6 @@
                       <w:r>
                         <w:t xml:space="preserve">1 &lt;&lt; 1 → 00000010</w:t>
                       </w:r>
-                      <w:r/>
                       <w:r/>
                     </w:p>
                     <w:p>
@@ -9626,7 +9823,6 @@
                         <w:t xml:space="preserve">1 &lt;&lt; 2 → 00000100</w:t>
                       </w:r>
                       <w:r/>
-                      <w:r/>
                     </w:p>
                     <w:p>
                       <w:pPr>
@@ -9638,7 +9834,6 @@
                       <w:r>
                         <w:t xml:space="preserve">1 &lt;&lt; 3 → 00001000</w:t>
                       </w:r>
-                      <w:r/>
                       <w:r/>
                     </w:p>
                     <w:p>
@@ -9652,7 +9847,6 @@
                         <w:t xml:space="preserve">1 &lt;&lt; 4 → 00010000</w:t>
                       </w:r>
                       <w:r/>
-                      <w:r/>
                     </w:p>
                   </w:txbxContent>
                 </v:textbox>
@@ -9665,14 +9859,7 @@
         <w:rPr>
           <w:rFonts w:ascii="Asana Math" w:hAnsi="Asana Math" w:eastAsia="Asana Math" w:cs="Asana Math"/>
           <w:highlight w:val="none"/>
-          <w:lang w:val="es-ES" w:bidi="es-ES"/>
-        </w:rPr>
-      </w:r>
-      <w:r>
-        <w:rPr>
-          <w:rFonts w:ascii="Asana Math" w:hAnsi="Asana Math" w:eastAsia="Asana Math" w:cs="Asana Math"/>
-          <w:highlight w:val="none"/>
-          <w:lang w:val="es-ES" w:bidi="es-ES"/>
+          <w:lang w:val="es-ES"/>
         </w:rPr>
       </w:r>
       <w:r>
@@ -9822,6 +10009,13 @@
           <w:lang w:val="es-ES"/>
         </w:rPr>
       </w:r>
+      <w:r>
+        <w:rPr>
+          <w:rFonts w:ascii="Asana Math" w:hAnsi="Asana Math" w:eastAsia="Asana Math" w:cs="Asana Math"/>
+          <w:highlight w:val="none"/>
+          <w:lang w:val="es-ES"/>
+        </w:rPr>
+      </w:r>
     </w:p>
     <w:p>
       <w:pPr>
@@ -9846,7 +10040,7 @@
         <w:rPr>
           <w:rFonts w:ascii="Asana Math" w:hAnsi="Asana Math" w:eastAsia="Asana Math" w:cs="Asana Math"/>
           <w:highlight w:val="none"/>
-          <w:lang w:val="es-ES" w:bidi="es-ES"/>
+          <w:lang w:val="es-ES"/>
         </w:rPr>
       </w:r>
       <w:r>
@@ -10109,10 +10303,17 @@
           <w:rFonts w:ascii="Asana Math" w:hAnsi="Asana Math" w:cs="Asana Math"/>
         </w:rPr>
       </w:r>
+      <w:r>
+        <w:rPr>
+          <w:rFonts w:ascii="Asana Math" w:hAnsi="Asana Math" w:eastAsia="Asana Math" w:cs="Asana Math"/>
+          <w:highlight w:val="none"/>
+          <w:lang w:val="es-ES"/>
+        </w:rPr>
+      </w:r>
     </w:p>
     <w:p>
       <w:pPr>
-        <w:pStyle w:val="908"/>
+        <w:pStyle w:val="910"/>
         <w:numPr>
           <w:ilvl w:val="0"/>
           <w:numId w:val="2"/>
@@ -10132,6 +10333,11 @@
           <w:lang w:val="es-ES"/>
         </w:rPr>
         <w:t xml:space="preserve">Primero utilizamos los valores indexados de la matriz y los rotamos 90 grados.</w:t>
+      </w:r>
+      <w:r>
+        <w:rPr>
+          <w:rFonts w:ascii="Asana Math" w:hAnsi="Asana Math" w:cs="Asana Math"/>
+        </w:rPr>
       </w:r>
       <w:r>
         <w:rPr>
@@ -10234,22 +10440,13 @@
       </w:r>
       <w:r>
         <w:rPr>
-          <w:rFonts w:ascii="Asana Math" w:hAnsi="Asana Math" w:eastAsia="Asana Math" w:cs="Asana Math"/>
-          <w:highlight w:val="none"/>
-          <w:lang w:val="es-ES"/>
-        </w:rPr>
-      </w:r>
-      <w:r>
-        <w:rPr>
-          <w:rFonts w:ascii="Asana Math" w:hAnsi="Asana Math" w:eastAsia="Asana Math" w:cs="Asana Math"/>
-          <w:highlight w:val="none"/>
-          <w:lang w:val="es-ES"/>
+          <w:rFonts w:ascii="Asana Math" w:hAnsi="Asana Math" w:cs="Asana Math"/>
         </w:rPr>
       </w:r>
     </w:p>
     <w:p>
       <w:pPr>
-        <w:pStyle w:val="883"/>
+        <w:pStyle w:val="885"/>
         <w:pBdr/>
         <w:spacing/>
         <w:ind/>
@@ -10267,7 +10464,6 @@
       <w:r>
         <w:t xml:space="preserve">9</w:t>
       </w:r>
-      <w:r/>
       <w:r>
         <w:fldChar w:fldCharType="end"/>
       </w:r>
@@ -10322,6 +10518,13 @@
       <w:r>
         <w:rPr>
           <w:rFonts w:ascii="Asana Math" w:hAnsi="Asana Math" w:cs="Asana Math"/>
+        </w:rPr>
+      </w:r>
+      <w:r>
+        <w:rPr>
+          <w:rFonts w:ascii="Asana Math" w:hAnsi="Asana Math" w:eastAsia="Asana Math" w:cs="Asana Math"/>
+          <w:highlight w:val="none"/>
+          <w:lang w:val="es-ES"/>
         </w:rPr>
       </w:r>
     </w:p>
@@ -10370,7 +10573,7 @@
               <m:endChr m:val=")"/>
               <m:ctrlPr>
                 <w:rPr>
-                  <w:rFonts w:hint="default" w:ascii="Cambria Math" w:hAnsi="Cambria Math" w:eastAsia="Cambria Math" w:cs="Cambria Math"/>
+                  <w:rFonts w:ascii="Cambria Math" w:hAnsi="Cambria Math" w:eastAsia="Cambria Math" w:cs="Cambria Math"/>
                   <w:highlight w:val="none"/>
                   <w:lang w:val="es-ES" w:bidi="es-ES"/>
                 </w:rPr>
@@ -10405,14 +10608,13 @@
       </m:oMathPara>
       <w:r>
         <w:rPr>
+          <w:rFonts w:ascii="Asana Math" w:hAnsi="Asana Math" w:cs="Asana Math"/>
+        </w:rPr>
+      </w:r>
+      <w:r>
+        <w:rPr>
           <w:rFonts w:ascii="Asana Math" w:hAnsi="Asana Math" w:eastAsia="Asana Math" w:cs="Asana Math"/>
           <w:highlight w:val="none"/>
-          <w:lang w:val="es-ES"/>
-        </w:rPr>
-      </w:r>
-      <w:r>
-        <w:rPr>
-          <w:rFonts w:ascii="Asana Math" w:hAnsi="Asana Math" w:cs="Asana Math"/>
         </w:rPr>
       </w:r>
     </w:p>
@@ -10456,6 +10658,13 @@
           <w:rFonts w:ascii="Asana Math" w:hAnsi="Asana Math" w:cs="Asana Math"/>
         </w:rPr>
       </w:r>
+      <w:r>
+        <w:rPr>
+          <w:rFonts w:ascii="Asana Math" w:hAnsi="Asana Math" w:eastAsia="Asana Math" w:cs="Asana Math"/>
+          <w:highlight w:val="none"/>
+          <w:lang w:val="es-ES"/>
+        </w:rPr>
+      </w:r>
     </w:p>
     <w:p>
       <w:pPr>
@@ -10480,6 +10689,13 @@
       <w:r>
         <w:rPr>
           <w:rFonts w:ascii="Asana Math" w:hAnsi="Asana Math" w:cs="Asana Math"/>
+        </w:rPr>
+      </w:r>
+      <w:r>
+        <w:rPr>
+          <w:rFonts w:ascii="Asana Math" w:hAnsi="Asana Math" w:eastAsia="Asana Math" w:cs="Asana Math"/>
+          <w:highlight w:val="none"/>
+          <w:lang w:val="es-ES"/>
         </w:rPr>
       </w:r>
     </w:p>
@@ -10514,6 +10730,15 @@
           <w:szCs w:val="20"/>
         </w:rPr>
       </w:r>
+      <w:r>
+        <w:rPr>
+          <w:rFonts w:ascii="Asana Math" w:hAnsi="Asana Math" w:eastAsia="Asana Math" w:cs="Asana Math"/>
+          <w:sz w:val="24"/>
+          <w:szCs w:val="24"/>
+          <w:highlight w:val="none"/>
+          <w:lang w:val="es-ES"/>
+        </w:rPr>
+      </w:r>
     </w:p>
     <w:p>
       <w:pPr>
@@ -10533,7 +10758,15 @@
           <w:highlight w:val="none"/>
           <w:lang w:val="es-ES"/>
         </w:rPr>
-        <w:t xml:space="preserve">Realmente no trabajaremos con nuestra matriz original , ella unicamente nos serivira como base y copia para las rotaciones ya que al rotar , los valores cambien y es aqui donde entra la memoria dinamica, haremos una copia de nuestras fichas a las cuales si les podremos hacer las rotaci</w:t>
+        <w:t xml:space="preserve">Realmente no trabajaremos con </w:t>
+      </w:r>
+      <w:r>
+        <w:rPr>
+          <w:rFonts w:ascii="Asana Math" w:hAnsi="Asana Math" w:eastAsia="Asana Math" w:cs="Asana Math"/>
+          <w:highlight w:val="none"/>
+          <w:lang w:val="es-ES"/>
+        </w:rPr>
+        <w:t xml:space="preserve">nuestra matriz original , ella unicamente nos serivira como base y copia para las rotaciones ya que al rotar , los valores cambien y es aqui donde entra la memoria dinamica, haremos una copia de nuestras fichas a las cuales si les podremos hacer las rotaci</w:t>
       </w:r>
       <w:r>
         <w:rPr>
@@ -10573,13 +10806,14 @@
       </w:r>
       <w:r>
         <w:rPr>
+          <w:rFonts w:ascii="Asana Math" w:hAnsi="Asana Math" w:cs="Asana Math"/>
+        </w:rPr>
+      </w:r>
+      <w:r>
+        <w:rPr>
           <w:b/>
           <w:bCs/>
-        </w:rPr>
-      </w:r>
-      <w:r>
-        <w:rPr>
-          <w:rFonts w:ascii="Asana Math" w:hAnsi="Asana Math" w:cs="Asana Math"/>
+          <w:highlight w:val="none"/>
         </w:rPr>
       </w:r>
     </w:p>
@@ -10644,52 +10878,156 @@
           <w:szCs w:val="36"/>
         </w:rPr>
       </w:r>
+      <w:r>
+        <w:rPr>
+          <w:rFonts w:ascii="Asana Math" w:hAnsi="Asana Math" w:cs="Asana Math"/>
+          <w:b w:val="0"/>
+          <w:bCs w:val="0"/>
+          <w:sz w:val="36"/>
+          <w:szCs w:val="36"/>
+        </w:rPr>
+      </w:r>
     </w:p>
     <w:p>
       <w:pPr>
         <w:pBdr/>
         <w:spacing/>
-        <w:ind/>
+        <w:ind w:firstLine="0" w:left="0"/>
         <w:jc w:val="center"/>
-        <w:rPr/>
-      </w:pPr>
-      <w:r>
-        <w:rPr>
+        <w:rPr>
+          <w:rFonts w:ascii="Asana Math" w:hAnsi="Asana Math" w:cs="Asana Math"/>
+        </w:rPr>
+      </w:pPr>
+      <w:r>
+        <w:rPr>
+          <w:rFonts w:ascii="Asana Math" w:hAnsi="Asana Math" w:eastAsia="Asana Math" w:cs="Asana Math"/>
+          <w:highlight w:val="none"/>
           <w:lang w:val="es-ES"/>
         </w:rPr>
-      </w:r>
-      <w:r/>
-      <w:r/>
-    </w:p>
-    <w:p>
-      <w:pPr>
-        <w:pBdr/>
-        <w:spacing/>
-        <w:ind w:firstLine="0" w:left="709"/>
-        <w:jc w:val="center"/>
+        <w:t xml:space="preserve">Ahora nos centraremos en los movimientos b</w:t>
+      </w:r>
+      <w:r>
+        <w:rPr>
+          <w:rFonts w:ascii="Asana Math" w:hAnsi="Asana Math" w:eastAsia="Asana Math" w:cs="Asana Math"/>
+          <w:highlight w:val="none"/>
+          <w:lang w:val="es-ES"/>
+        </w:rPr>
+        <w:t xml:space="preserve">ásicos que tendra nuestro tetris que son derecha-izquierda y abajo, nuestra idea principal ser</w:t>
+      </w:r>
+      <w:r>
+        <w:rPr>
+          <w:rFonts w:ascii="Asana Math" w:hAnsi="Asana Math" w:eastAsia="Asana Math" w:cs="Asana Math"/>
+          <w:highlight w:val="none"/>
+          <w:lang w:val="es-ES"/>
+        </w:rPr>
+        <w:t xml:space="preserve">á no mover la ficha o modificar alguien valor binario, lo unico que haremos ser</w:t>
+      </w:r>
+      <w:r>
+        <w:rPr>
+          <w:rFonts w:ascii="Asana Math" w:hAnsi="Asana Math" w:eastAsia="Asana Math" w:cs="Asana Math"/>
+          <w:highlight w:val="none"/>
+          <w:lang w:val="es-ES"/>
+        </w:rPr>
+        <w:t xml:space="preserve">á mover la posici</w:t>
+      </w:r>
+      <w:r>
+        <w:rPr>
+          <w:rFonts w:ascii="Asana Math" w:hAnsi="Asana Math" w:eastAsia="Asana Math" w:cs="Asana Math"/>
+          <w:highlight w:val="none"/>
+          <w:lang w:val="es-ES"/>
+        </w:rPr>
+        <w:t xml:space="preserve">ón en donde se coloca la matriz de la pieza que en este caso esta en valores de posicion x y y, entonces si queremos que la ficha este mas a la derecha lo unico que haremos ser</w:t>
+      </w:r>
+      <w:r>
+        <w:rPr>
+          <w:rFonts w:ascii="Asana Math" w:hAnsi="Asana Math" w:eastAsia="Asana Math" w:cs="Asana Math"/>
+          <w:highlight w:val="none"/>
+          <w:lang w:val="es-ES"/>
+        </w:rPr>
+        <w:t xml:space="preserve">á un </w:t>
+      </w:r>
+      <m:oMath>
+        <m:r>
+          <w:rPr>
+            <w:rFonts w:hint="default" w:ascii="Cambria Math" w:hAnsi="Cambria Math" w:eastAsia="Cambria Math" w:cs="Cambria Math"/>
+            <w:highlight w:val="none"/>
+            <w:lang w:val="es-ES" w:bidi="es-ES"/>
+          </w:rPr>
+          <m:rPr>
+            <m:sty m:val="i"/>
+          </m:rPr>
+          <m:t>x++</m:t>
+        </m:r>
+      </m:oMath>
+      <w:r>
+        <w:rPr>
+          <w:rFonts w:ascii="Asana Math" w:hAnsi="Asana Math" w:eastAsia="Asana Math" w:cs="Asana Math"/>
+          <w:highlight w:val="none"/>
+          <w:lang w:val="es-ES"/>
+        </w:rPr>
+        <w:t xml:space="preserve"> o si quieremos que la ficha esta mas a la izquierda utilizamos un </w:t>
+      </w:r>
+      <m:oMath>
+        <m:r>
+          <w:rPr>
+            <w:rFonts w:hint="default" w:ascii="Cambria Math" w:hAnsi="Cambria Math" w:eastAsia="Cambria Math" w:cs="Cambria Math"/>
+            <w:highlight w:val="none"/>
+            <w:lang w:val="es-ES" w:bidi="es-ES"/>
+          </w:rPr>
+          <m:rPr>
+            <m:sty m:val="i"/>
+          </m:rPr>
+          <m:t>x--</m:t>
+        </m:r>
+      </m:oMath>
+      <w:r>
+        <w:rPr>
+          <w:rFonts w:ascii="Asana Math" w:hAnsi="Asana Math" w:eastAsia="Asana Math" w:cs="Asana Math"/>
+          <w:highlight w:val="none"/>
+          <w:lang w:val="es-ES"/>
+        </w:rPr>
+        <w:t xml:space="preserve">, despues que colocamos la nueva posicion inmediatamente se har</w:t>
+      </w:r>
+      <w:r>
+        <w:rPr>
+          <w:rFonts w:ascii="Asana Math" w:hAnsi="Asana Math" w:eastAsia="Asana Math" w:cs="Asana Math"/>
+          <w:highlight w:val="none"/>
+          <w:lang w:val="es-ES"/>
+        </w:rPr>
+        <w:t xml:space="preserve">á el bitmasking , para moverle para abajo lo unico que haremos ser</w:t>
+      </w:r>
+      <w:r>
+        <w:rPr>
+          <w:rFonts w:ascii="Asana Math" w:hAnsi="Asana Math" w:eastAsia="Asana Math" w:cs="Asana Math"/>
+          <w:highlight w:val="none"/>
+          <w:lang w:val="es-ES"/>
+        </w:rPr>
+        <w:t xml:space="preserve">á sumar el eje y en </w:t>
+      </w:r>
+      <m:oMath>
+        <m:r>
+          <w:rPr>
+            <w:rFonts w:hint="default" w:ascii="Cambria Math" w:hAnsi="Cambria Math" w:eastAsia="Cambria Math" w:cs="Cambria Math"/>
+            <w:highlight w:val="none"/>
+            <w:lang w:val="es-ES" w:bidi="es-ES"/>
+          </w:rPr>
+          <m:rPr>
+            <m:sty m:val="i"/>
+          </m:rPr>
+          <m:t>y++</m:t>
+        </m:r>
+      </m:oMath>
+      <w:r>
+        <w:rPr>
+          <w:rFonts w:ascii="Asana Math" w:hAnsi="Asana Math" w:eastAsia="Asana Math" w:cs="Asana Math"/>
+          <w:highlight w:val="none"/>
+          <w:lang w:val="es-ES"/>
+        </w:rPr>
+        <w:t xml:space="preserve"> esto inmediatamente me movera las fichas.</w:t>
+      </w:r>
+      <w:r>
         <w:rPr>
           <w:rFonts w:ascii="Asana Math" w:hAnsi="Asana Math" w:cs="Asana Math"/>
-        </w:rPr>
-      </w:pPr>
-      <w:r>
-        <w:rPr>
-          <w:rFonts w:ascii="Asana Math" w:hAnsi="Asana Math" w:eastAsia="Asana Math" w:cs="Asana Math"/>
-          <w:highlight w:val="none"/>
-          <w:lang w:val="es-ES"/>
-        </w:rPr>
-      </w:r>
-      <w:r>
-        <w:rPr>
-          <w:rFonts w:ascii="Asana Math" w:hAnsi="Asana Math" w:eastAsia="Asana Math" w:cs="Asana Math"/>
-          <w:highlight w:val="none"/>
-          <w:lang w:val="es-ES"/>
-        </w:rPr>
-      </w:r>
-      <w:r>
-        <w:rPr>
-          <w:rFonts w:ascii="Asana Math" w:hAnsi="Asana Math" w:eastAsia="Asana Math" w:cs="Asana Math"/>
-          <w:highlight w:val="none"/>
-          <w:lang w:val="es-ES"/>
         </w:rPr>
       </w:r>
     </w:p>
@@ -10743,7 +11081,7 @@
 <w:ftr xmlns:wpc="http://schemas.microsoft.com/office/word/2010/wordprocessingCanvas" xmlns:mc="http://schemas.openxmlformats.org/markup-compatibility/2006" xmlns:o="urn:schemas-microsoft-com:office:office" xmlns:r="http://schemas.openxmlformats.org/officeDocument/2006/relationships" xmlns:m="http://schemas.openxmlformats.org/officeDocument/2006/math" xmlns:v="urn:schemas-microsoft-com:vml" xmlns:wp14="http://schemas.microsoft.com/office/word/2010/wordprocessingDrawing" xmlns:wp="http://schemas.openxmlformats.org/drawingml/2006/wordprocessingDrawing" xmlns:w10="urn:schemas-microsoft-com:office:word" xmlns:w="http://schemas.openxmlformats.org/wordprocessingml/2006/main" xmlns:w14="http://schemas.microsoft.com/office/word/2010/wordml" xmlns:w15="http://schemas.microsoft.com/office/word/2012/wordml" xmlns:wpg="http://schemas.microsoft.com/office/word/2010/wordprocessingGroup" xmlns:wpi="http://schemas.microsoft.com/office/word/2010/wordprocessingInk" xmlns:wne="http://schemas.microsoft.com/office/word/2006/wordml" xmlns:a="http://schemas.openxmlformats.org/drawingml/2006/main" xmlns:wps="http://schemas.microsoft.com/office/word/2010/wordprocessingShape" mc:Ignorable="w14 w15 wp14">
   <w:p>
     <w:pPr>
-      <w:pStyle w:val="881"/>
+      <w:pStyle w:val="883"/>
       <w:pBdr/>
       <w:spacing/>
       <w:ind/>
@@ -10760,7 +11098,7 @@
   </w:p>
   <w:p>
     <w:pPr>
-      <w:pStyle w:val="881"/>
+      <w:pStyle w:val="883"/>
       <w:pBdr/>
       <w:spacing/>
       <w:ind/>
@@ -11232,9 +11570,9 @@
     <w:lsdException w:name="Bibliography" w:uiPriority="37"/>
     <w:lsdException w:name="TOC Heading" w:uiPriority="39" w:qFormat="1"/>
   </w:latentStyles>
-  <w:style w:type="table" w:styleId="719">
+  <w:style w:type="table" w:styleId="721">
     <w:name w:val="Table Grid"/>
-    <w:basedOn w:val="905"/>
+    <w:basedOn w:val="907"/>
     <w:uiPriority w:val="59"/>
     <w:pPr>
       <w:pBdr/>
@@ -11431,9 +11769,9 @@
       </w:tcPr>
     </w:tblStylePr>
   </w:style>
-  <w:style w:type="table" w:styleId="720">
+  <w:style w:type="table" w:styleId="722">
     <w:name w:val="Table Grid Light"/>
-    <w:basedOn w:val="905"/>
+    <w:basedOn w:val="907"/>
     <w:uiPriority w:val="59"/>
     <w:pPr>
       <w:pBdr/>
@@ -11630,9 +11968,9 @@
       </w:tcPr>
     </w:tblStylePr>
   </w:style>
-  <w:style w:type="table" w:styleId="721">
+  <w:style w:type="table" w:styleId="723">
     <w:name w:val="Plain Table 1"/>
-    <w:basedOn w:val="905"/>
+    <w:basedOn w:val="907"/>
     <w:uiPriority w:val="59"/>
     <w:pPr>
       <w:pBdr/>
@@ -11855,9 +12193,9 @@
       </w:tcPr>
     </w:tblStylePr>
   </w:style>
-  <w:style w:type="table" w:styleId="722">
+  <w:style w:type="table" w:styleId="724">
     <w:name w:val="Plain Table 2"/>
-    <w:basedOn w:val="905"/>
+    <w:basedOn w:val="907"/>
     <w:uiPriority w:val="59"/>
     <w:pPr>
       <w:pBdr/>
@@ -12088,9 +12426,9 @@
       </w:tcPr>
     </w:tblStylePr>
   </w:style>
-  <w:style w:type="table" w:styleId="723">
+  <w:style w:type="table" w:styleId="725">
     <w:name w:val="Plain Table 3"/>
-    <w:basedOn w:val="905"/>
+    <w:basedOn w:val="907"/>
     <w:uiPriority w:val="99"/>
     <w:pPr>
       <w:pBdr/>
@@ -12318,9 +12656,9 @@
       </w:tcPr>
     </w:tblStylePr>
   </w:style>
-  <w:style w:type="table" w:styleId="724">
+  <w:style w:type="table" w:styleId="726">
     <w:name w:val="Plain Table 4"/>
-    <w:basedOn w:val="905"/>
+    <w:basedOn w:val="907"/>
     <w:uiPriority w:val="99"/>
     <w:pPr>
       <w:pBdr/>
@@ -12534,9 +12872,9 @@
       </w:tcPr>
     </w:tblStylePr>
   </w:style>
-  <w:style w:type="table" w:styleId="725">
+  <w:style w:type="table" w:styleId="727">
     <w:name w:val="Plain Table 5"/>
-    <w:basedOn w:val="905"/>
+    <w:basedOn w:val="907"/>
     <w:uiPriority w:val="99"/>
     <w:pPr>
       <w:pBdr/>
@@ -12767,9 +13105,9 @@
       </w:tcPr>
     </w:tblStylePr>
   </w:style>
-  <w:style w:type="table" w:styleId="726">
+  <w:style w:type="table" w:styleId="728">
     <w:name w:val="Grid Table 1 Light"/>
-    <w:basedOn w:val="905"/>
+    <w:basedOn w:val="907"/>
     <w:uiPriority w:val="99"/>
     <w:pPr>
       <w:pBdr/>
@@ -12990,9 +13328,9 @@
       </w:tcPr>
     </w:tblStylePr>
   </w:style>
-  <w:style w:type="table" w:styleId="727">
+  <w:style w:type="table" w:styleId="729">
     <w:name w:val="Grid Table 1 Light - Accent 1"/>
-    <w:basedOn w:val="905"/>
+    <w:basedOn w:val="907"/>
     <w:uiPriority w:val="99"/>
     <w:pPr>
       <w:pBdr/>
@@ -13213,9 +13551,9 @@
       </w:tcPr>
     </w:tblStylePr>
   </w:style>
-  <w:style w:type="table" w:styleId="728">
+  <w:style w:type="table" w:styleId="730">
     <w:name w:val="Grid Table 1 Light - Accent 2"/>
-    <w:basedOn w:val="905"/>
+    <w:basedOn w:val="907"/>
     <w:uiPriority w:val="99"/>
     <w:pPr>
       <w:pBdr/>
@@ -13436,9 +13774,9 @@
       </w:tcPr>
     </w:tblStylePr>
   </w:style>
-  <w:style w:type="table" w:styleId="729">
+  <w:style w:type="table" w:styleId="731">
     <w:name w:val="Grid Table 1 Light - Accent 3"/>
-    <w:basedOn w:val="905"/>
+    <w:basedOn w:val="907"/>
     <w:uiPriority w:val="99"/>
     <w:pPr>
       <w:pBdr/>
@@ -13659,9 +13997,9 @@
       </w:tcPr>
     </w:tblStylePr>
   </w:style>
-  <w:style w:type="table" w:styleId="730">
+  <w:style w:type="table" w:styleId="732">
     <w:name w:val="Grid Table 1 Light - Accent 4"/>
-    <w:basedOn w:val="905"/>
+    <w:basedOn w:val="907"/>
     <w:uiPriority w:val="99"/>
     <w:pPr>
       <w:pBdr/>
@@ -13882,9 +14220,9 @@
       </w:tcPr>
     </w:tblStylePr>
   </w:style>
-  <w:style w:type="table" w:styleId="731">
+  <w:style w:type="table" w:styleId="733">
     <w:name w:val="Grid Table 1 Light - Accent 5"/>
-    <w:basedOn w:val="905"/>
+    <w:basedOn w:val="907"/>
     <w:uiPriority w:val="99"/>
     <w:pPr>
       <w:pBdr/>
@@ -14105,9 +14443,9 @@
       </w:tcPr>
     </w:tblStylePr>
   </w:style>
-  <w:style w:type="table" w:styleId="732">
+  <w:style w:type="table" w:styleId="734">
     <w:name w:val="Grid Table 1 Light - Accent 6"/>
-    <w:basedOn w:val="905"/>
+    <w:basedOn w:val="907"/>
     <w:uiPriority w:val="99"/>
     <w:pPr>
       <w:pBdr/>
@@ -14328,9 +14666,9 @@
       </w:tcPr>
     </w:tblStylePr>
   </w:style>
-  <w:style w:type="table" w:styleId="733">
+  <w:style w:type="table" w:styleId="735">
     <w:name w:val="Grid Table 2"/>
-    <w:basedOn w:val="905"/>
+    <w:basedOn w:val="907"/>
     <w:uiPriority w:val="99"/>
     <w:pPr>
       <w:pBdr/>
@@ -14560,9 +14898,9 @@
       </w:tcPr>
     </w:tblStylePr>
   </w:style>
-  <w:style w:type="table" w:styleId="734">
+  <w:style w:type="table" w:styleId="736">
     <w:name w:val="Grid Table 2 - Accent 1"/>
-    <w:basedOn w:val="905"/>
+    <w:basedOn w:val="907"/>
     <w:uiPriority w:val="99"/>
     <w:pPr>
       <w:pBdr/>
@@ -14792,9 +15130,9 @@
       </w:tcPr>
     </w:tblStylePr>
   </w:style>
-  <w:style w:type="table" w:styleId="735">
+  <w:style w:type="table" w:styleId="737">
     <w:name w:val="Grid Table 2 - Accent 2"/>
-    <w:basedOn w:val="905"/>
+    <w:basedOn w:val="907"/>
     <w:uiPriority w:val="99"/>
     <w:pPr>
       <w:pBdr/>
@@ -15024,9 +15362,9 @@
       </w:tcPr>
     </w:tblStylePr>
   </w:style>
-  <w:style w:type="table" w:styleId="736">
+  <w:style w:type="table" w:styleId="738">
     <w:name w:val="Grid Table 2 - Accent 3"/>
-    <w:basedOn w:val="905"/>
+    <w:basedOn w:val="907"/>
     <w:uiPriority w:val="99"/>
     <w:pPr>
       <w:pBdr/>
@@ -15256,9 +15594,9 @@
       </w:tcPr>
     </w:tblStylePr>
   </w:style>
-  <w:style w:type="table" w:styleId="737">
+  <w:style w:type="table" w:styleId="739">
     <w:name w:val="Grid Table 2 - Accent 4"/>
-    <w:basedOn w:val="905"/>
+    <w:basedOn w:val="907"/>
     <w:uiPriority w:val="99"/>
     <w:pPr>
       <w:pBdr/>
@@ -15488,9 +15826,9 @@
       </w:tcPr>
     </w:tblStylePr>
   </w:style>
-  <w:style w:type="table" w:styleId="738">
+  <w:style w:type="table" w:styleId="740">
     <w:name w:val="Grid Table 2 - Accent 5"/>
-    <w:basedOn w:val="905"/>
+    <w:basedOn w:val="907"/>
     <w:uiPriority w:val="99"/>
     <w:pPr>
       <w:pBdr/>
@@ -15720,9 +16058,9 @@
       </w:tcPr>
     </w:tblStylePr>
   </w:style>
-  <w:style w:type="table" w:styleId="739">
+  <w:style w:type="table" w:styleId="741">
     <w:name w:val="Grid Table 2 - Accent 6"/>
-    <w:basedOn w:val="905"/>
+    <w:basedOn w:val="907"/>
     <w:uiPriority w:val="99"/>
     <w:pPr>
       <w:pBdr/>
@@ -15952,9 +16290,9 @@
       </w:tcPr>
     </w:tblStylePr>
   </w:style>
-  <w:style w:type="table" w:styleId="740">
+  <w:style w:type="table" w:styleId="742">
     <w:name w:val="Grid Table 3"/>
-    <w:basedOn w:val="905"/>
+    <w:basedOn w:val="907"/>
     <w:uiPriority w:val="99"/>
     <w:pPr>
       <w:pBdr/>
@@ -16197,9 +16535,9 @@
       </w:tcPr>
     </w:tblStylePr>
   </w:style>
-  <w:style w:type="table" w:styleId="741">
+  <w:style w:type="table" w:styleId="743">
     <w:name w:val="Grid Table 3 - Accent 1"/>
-    <w:basedOn w:val="905"/>
+    <w:basedOn w:val="907"/>
     <w:uiPriority w:val="99"/>
     <w:pPr>
       <w:pBdr/>
@@ -16442,9 +16780,9 @@
       </w:tcPr>
     </w:tblStylePr>
   </w:style>
-  <w:style w:type="table" w:styleId="742">
+  <w:style w:type="table" w:styleId="744">
     <w:name w:val="Grid Table 3 - Accent 2"/>
-    <w:basedOn w:val="905"/>
+    <w:basedOn w:val="907"/>
     <w:uiPriority w:val="99"/>
     <w:pPr>
       <w:pBdr/>
@@ -16687,9 +17025,9 @@
       </w:tcPr>
     </w:tblStylePr>
   </w:style>
-  <w:style w:type="table" w:styleId="743">
+  <w:style w:type="table" w:styleId="745">
     <w:name w:val="Grid Table 3 - Accent 3"/>
-    <w:basedOn w:val="905"/>
+    <w:basedOn w:val="907"/>
     <w:uiPriority w:val="99"/>
     <w:pPr>
       <w:pBdr/>
@@ -16932,9 +17270,9 @@
       </w:tcPr>
     </w:tblStylePr>
   </w:style>
-  <w:style w:type="table" w:styleId="744">
+  <w:style w:type="table" w:styleId="746">
     <w:name w:val="Grid Table 3 - Accent 4"/>
-    <w:basedOn w:val="905"/>
+    <w:basedOn w:val="907"/>
     <w:uiPriority w:val="99"/>
     <w:pPr>
       <w:pBdr/>
@@ -17177,9 +17515,9 @@
       </w:tcPr>
     </w:tblStylePr>
   </w:style>
-  <w:style w:type="table" w:styleId="745">
+  <w:style w:type="table" w:styleId="747">
     <w:name w:val="Grid Table 3 - Accent 5"/>
-    <w:basedOn w:val="905"/>
+    <w:basedOn w:val="907"/>
     <w:uiPriority w:val="99"/>
     <w:pPr>
       <w:pBdr/>
@@ -17422,9 +17760,9 @@
       </w:tcPr>
     </w:tblStylePr>
   </w:style>
-  <w:style w:type="table" w:styleId="746">
+  <w:style w:type="table" w:styleId="748">
     <w:name w:val="Grid Table 3 - Accent 6"/>
-    <w:basedOn w:val="905"/>
+    <w:basedOn w:val="907"/>
     <w:uiPriority w:val="99"/>
     <w:pPr>
       <w:pBdr/>
@@ -17667,9 +18005,9 @@
       </w:tcPr>
     </w:tblStylePr>
   </w:style>
-  <w:style w:type="table" w:styleId="747">
+  <w:style w:type="table" w:styleId="749">
     <w:name w:val="Grid Table 4"/>
-    <w:basedOn w:val="905"/>
+    <w:basedOn w:val="907"/>
     <w:uiPriority w:val="59"/>
     <w:pPr>
       <w:pBdr/>
@@ -17900,9 +18238,9 @@
       </w:tcPr>
     </w:tblStylePr>
   </w:style>
-  <w:style w:type="table" w:styleId="748">
+  <w:style w:type="table" w:styleId="750">
     <w:name w:val="Grid Table 4 - Accent 1"/>
-    <w:basedOn w:val="905"/>
+    <w:basedOn w:val="907"/>
     <w:uiPriority w:val="59"/>
     <w:pPr>
       <w:pBdr/>
@@ -18133,9 +18471,9 @@
       </w:tcPr>
     </w:tblStylePr>
   </w:style>
-  <w:style w:type="table" w:styleId="749">
+  <w:style w:type="table" w:styleId="751">
     <w:name w:val="Grid Table 4 - Accent 2"/>
-    <w:basedOn w:val="905"/>
+    <w:basedOn w:val="907"/>
     <w:uiPriority w:val="59"/>
     <w:pPr>
       <w:pBdr/>
@@ -18366,9 +18704,9 @@
       </w:tcPr>
     </w:tblStylePr>
   </w:style>
-  <w:style w:type="table" w:styleId="750">
+  <w:style w:type="table" w:styleId="752">
     <w:name w:val="Grid Table 4 - Accent 3"/>
-    <w:basedOn w:val="905"/>
+    <w:basedOn w:val="907"/>
     <w:uiPriority w:val="59"/>
     <w:pPr>
       <w:pBdr/>
@@ -18599,9 +18937,9 @@
       </w:tcPr>
     </w:tblStylePr>
   </w:style>
-  <w:style w:type="table" w:styleId="751">
+  <w:style w:type="table" w:styleId="753">
     <w:name w:val="Grid Table 4 - Accent 4"/>
-    <w:basedOn w:val="905"/>
+    <w:basedOn w:val="907"/>
     <w:uiPriority w:val="59"/>
     <w:pPr>
       <w:pBdr/>
@@ -18832,9 +19170,9 @@
       </w:tcPr>
     </w:tblStylePr>
   </w:style>
-  <w:style w:type="table" w:styleId="752">
+  <w:style w:type="table" w:styleId="754">
     <w:name w:val="Grid Table 4 - Accent 5"/>
-    <w:basedOn w:val="905"/>
+    <w:basedOn w:val="907"/>
     <w:uiPriority w:val="59"/>
     <w:pPr>
       <w:pBdr/>
@@ -19065,9 +19403,9 @@
       </w:tcPr>
     </w:tblStylePr>
   </w:style>
-  <w:style w:type="table" w:styleId="753">
+  <w:style w:type="table" w:styleId="755">
     <w:name w:val="Grid Table 4 - Accent 6"/>
-    <w:basedOn w:val="905"/>
+    <w:basedOn w:val="907"/>
     <w:uiPriority w:val="59"/>
     <w:pPr>
       <w:pBdr/>
@@ -19298,9 +19636,9 @@
       </w:tcPr>
     </w:tblStylePr>
   </w:style>
-  <w:style w:type="table" w:styleId="754">
+  <w:style w:type="table" w:styleId="756">
     <w:name w:val="Grid Table 5 Dark"/>
-    <w:basedOn w:val="905"/>
+    <w:basedOn w:val="907"/>
     <w:uiPriority w:val="99"/>
     <w:pPr>
       <w:pBdr/>
@@ -19526,9 +19864,9 @@
       </w:tcPr>
     </w:tblStylePr>
   </w:style>
-  <w:style w:type="table" w:styleId="755">
+  <w:style w:type="table" w:styleId="757">
     <w:name w:val="Grid Table 5 Dark- Accent 1"/>
-    <w:basedOn w:val="905"/>
+    <w:basedOn w:val="907"/>
     <w:uiPriority w:val="99"/>
     <w:pPr>
       <w:pBdr/>
@@ -19754,9 +20092,9 @@
       </w:tcPr>
     </w:tblStylePr>
   </w:style>
-  <w:style w:type="table" w:styleId="756">
+  <w:style w:type="table" w:styleId="758">
     <w:name w:val="Grid Table 5 Dark - Accent 2"/>
-    <w:basedOn w:val="905"/>
+    <w:basedOn w:val="907"/>
     <w:uiPriority w:val="99"/>
     <w:pPr>
       <w:pBdr/>
@@ -19982,9 +20320,9 @@
       </w:tcPr>
     </w:tblStylePr>
   </w:style>
-  <w:style w:type="table" w:styleId="757">
+  <w:style w:type="table" w:styleId="759">
     <w:name w:val="Grid Table 5 Dark - Accent 3"/>
-    <w:basedOn w:val="905"/>
+    <w:basedOn w:val="907"/>
     <w:uiPriority w:val="99"/>
     <w:pPr>
       <w:pBdr/>
@@ -20210,9 +20548,9 @@
       </w:tcPr>
     </w:tblStylePr>
   </w:style>
-  <w:style w:type="table" w:styleId="758">
+  <w:style w:type="table" w:styleId="760">
     <w:name w:val="Grid Table 5 Dark- Accent 4"/>
-    <w:basedOn w:val="905"/>
+    <w:basedOn w:val="907"/>
     <w:uiPriority w:val="99"/>
     <w:pPr>
       <w:pBdr/>
@@ -20438,9 +20776,9 @@
       </w:tcPr>
     </w:tblStylePr>
   </w:style>
-  <w:style w:type="table" w:styleId="759">
+  <w:style w:type="table" w:styleId="761">
     <w:name w:val="Grid Table 5 Dark - Accent 5"/>
-    <w:basedOn w:val="905"/>
+    <w:basedOn w:val="907"/>
     <w:uiPriority w:val="99"/>
     <w:pPr>
       <w:pBdr/>
@@ -20666,9 +21004,9 @@
       </w:tcPr>
     </w:tblStylePr>
   </w:style>
-  <w:style w:type="table" w:styleId="760">
+  <w:style w:type="table" w:styleId="762">
     <w:name w:val="Grid Table 5 Dark - Accent 6"/>
-    <w:basedOn w:val="905"/>
+    <w:basedOn w:val="907"/>
     <w:uiPriority w:val="99"/>
     <w:pPr>
       <w:pBdr/>
@@ -20894,9 +21232,9 @@
       </w:tcPr>
     </w:tblStylePr>
   </w:style>
-  <w:style w:type="table" w:styleId="761">
+  <w:style w:type="table" w:styleId="763">
     <w:name w:val="Grid Table 6 Colorful"/>
-    <w:basedOn w:val="905"/>
+    <w:basedOn w:val="907"/>
     <w:uiPriority w:val="99"/>
     <w:pPr>
       <w:pBdr/>
@@ -21124,9 +21462,9 @@
       </w:tcPr>
     </w:tblStylePr>
   </w:style>
-  <w:style w:type="table" w:styleId="762">
+  <w:style w:type="table" w:styleId="764">
     <w:name w:val="Grid Table 6 Colorful - Accent 1"/>
-    <w:basedOn w:val="905"/>
+    <w:basedOn w:val="907"/>
     <w:uiPriority w:val="99"/>
     <w:pPr>
       <w:pBdr/>
@@ -21354,9 +21692,9 @@
       </w:tcPr>
     </w:tblStylePr>
   </w:style>
-  <w:style w:type="table" w:styleId="763">
+  <w:style w:type="table" w:styleId="765">
     <w:name w:val="Grid Table 6 Colorful - Accent 2"/>
-    <w:basedOn w:val="905"/>
+    <w:basedOn w:val="907"/>
     <w:uiPriority w:val="99"/>
     <w:pPr>
       <w:pBdr/>
@@ -21584,9 +21922,9 @@
       </w:tcPr>
     </w:tblStylePr>
   </w:style>
-  <w:style w:type="table" w:styleId="764">
+  <w:style w:type="table" w:styleId="766">
     <w:name w:val="Grid Table 6 Colorful - Accent 3"/>
-    <w:basedOn w:val="905"/>
+    <w:basedOn w:val="907"/>
     <w:uiPriority w:val="99"/>
     <w:pPr>
       <w:pBdr/>
@@ -21814,9 +22152,9 @@
       </w:tcPr>
     </w:tblStylePr>
   </w:style>
-  <w:style w:type="table" w:styleId="765">
+  <w:style w:type="table" w:styleId="767">
     <w:name w:val="Grid Table 6 Colorful - Accent 4"/>
-    <w:basedOn w:val="905"/>
+    <w:basedOn w:val="907"/>
     <w:uiPriority w:val="99"/>
     <w:pPr>
       <w:pBdr/>
@@ -22044,9 +22382,9 @@
       </w:tcPr>
     </w:tblStylePr>
   </w:style>
-  <w:style w:type="table" w:styleId="766">
+  <w:style w:type="table" w:styleId="768">
     <w:name w:val="Grid Table 6 Colorful - Accent 5"/>
-    <w:basedOn w:val="905"/>
+    <w:basedOn w:val="907"/>
     <w:uiPriority w:val="99"/>
     <w:pPr>
       <w:pBdr/>
@@ -22274,9 +22612,9 @@
       </w:tcPr>
     </w:tblStylePr>
   </w:style>
-  <w:style w:type="table" w:styleId="767">
+  <w:style w:type="table" w:styleId="769">
     <w:name w:val="Grid Table 6 Colorful - Accent 6"/>
-    <w:basedOn w:val="905"/>
+    <w:basedOn w:val="907"/>
     <w:uiPriority w:val="99"/>
     <w:pPr>
       <w:pBdr/>
@@ -22504,9 +22842,9 @@
       </w:tcPr>
     </w:tblStylePr>
   </w:style>
-  <w:style w:type="table" w:styleId="768">
+  <w:style w:type="table" w:styleId="770">
     <w:name w:val="Grid Table 7 Colorful"/>
-    <w:basedOn w:val="905"/>
+    <w:basedOn w:val="907"/>
     <w:uiPriority w:val="99"/>
     <w:pPr>
       <w:pBdr/>
@@ -22758,9 +23096,9 @@
       </w:tcPr>
     </w:tblStylePr>
   </w:style>
-  <w:style w:type="table" w:styleId="769">
+  <w:style w:type="table" w:styleId="771">
     <w:name w:val="Grid Table 7 Colorful - Accent 1"/>
-    <w:basedOn w:val="905"/>
+    <w:basedOn w:val="907"/>
     <w:uiPriority w:val="99"/>
     <w:pPr>
       <w:pBdr/>
@@ -23012,9 +23350,9 @@
       </w:tcPr>
     </w:tblStylePr>
   </w:style>
-  <w:style w:type="table" w:styleId="770">
+  <w:style w:type="table" w:styleId="772">
     <w:name w:val="Grid Table 7 Colorful - Accent 2"/>
-    <w:basedOn w:val="905"/>
+    <w:basedOn w:val="907"/>
     <w:uiPriority w:val="99"/>
     <w:pPr>
       <w:pBdr/>
@@ -23266,9 +23604,9 @@
       </w:tcPr>
     </w:tblStylePr>
   </w:style>
-  <w:style w:type="table" w:styleId="771">
+  <w:style w:type="table" w:styleId="773">
     <w:name w:val="Grid Table 7 Colorful - Accent 3"/>
-    <w:basedOn w:val="905"/>
+    <w:basedOn w:val="907"/>
     <w:uiPriority w:val="99"/>
     <w:pPr>
       <w:pBdr/>
@@ -23520,9 +23858,9 @@
       </w:tcPr>
     </w:tblStylePr>
   </w:style>
-  <w:style w:type="table" w:styleId="772">
+  <w:style w:type="table" w:styleId="774">
     <w:name w:val="Grid Table 7 Colorful - Accent 4"/>
-    <w:basedOn w:val="905"/>
+    <w:basedOn w:val="907"/>
     <w:uiPriority w:val="99"/>
     <w:pPr>
       <w:pBdr/>
@@ -23774,9 +24112,9 @@
       </w:tcPr>
     </w:tblStylePr>
   </w:style>
-  <w:style w:type="table" w:styleId="773">
+  <w:style w:type="table" w:styleId="775">
     <w:name w:val="Grid Table 7 Colorful - Accent 5"/>
-    <w:basedOn w:val="905"/>
+    <w:basedOn w:val="907"/>
     <w:uiPriority w:val="99"/>
     <w:pPr>
       <w:pBdr/>
@@ -24028,9 +24366,9 @@
       </w:tcPr>
     </w:tblStylePr>
   </w:style>
-  <w:style w:type="table" w:styleId="774">
+  <w:style w:type="table" w:styleId="776">
     <w:name w:val="Grid Table 7 Colorful - Accent 6"/>
-    <w:basedOn w:val="905"/>
+    <w:basedOn w:val="907"/>
     <w:uiPriority w:val="99"/>
     <w:pPr>
       <w:pBdr/>
@@ -24282,9 +24620,9 @@
       </w:tcPr>
     </w:tblStylePr>
   </w:style>
-  <w:style w:type="table" w:styleId="775">
+  <w:style w:type="table" w:styleId="777">
     <w:name w:val="List Table 1 Light"/>
-    <w:basedOn w:val="905"/>
+    <w:basedOn w:val="907"/>
     <w:uiPriority w:val="99"/>
     <w:pPr>
       <w:pBdr/>
@@ -24498,9 +24836,9 @@
       </w:tcPr>
     </w:tblStylePr>
   </w:style>
-  <w:style w:type="table" w:styleId="776">
+  <w:style w:type="table" w:styleId="778">
     <w:name w:val="List Table 1 Light - Accent 1"/>
-    <w:basedOn w:val="905"/>
+    <w:basedOn w:val="907"/>
     <w:uiPriority w:val="99"/>
     <w:pPr>
       <w:pBdr/>
@@ -24714,9 +25052,9 @@
       </w:tcPr>
     </w:tblStylePr>
   </w:style>
-  <w:style w:type="table" w:styleId="777">
+  <w:style w:type="table" w:styleId="779">
     <w:name w:val="List Table 1 Light - Accent 2"/>
-    <w:basedOn w:val="905"/>
+    <w:basedOn w:val="907"/>
     <w:uiPriority w:val="99"/>
     <w:pPr>
       <w:pBdr/>
@@ -24930,9 +25268,9 @@
       </w:tcPr>
     </w:tblStylePr>
   </w:style>
-  <w:style w:type="table" w:styleId="778">
+  <w:style w:type="table" w:styleId="780">
     <w:name w:val="List Table 1 Light - Accent 3"/>
-    <w:basedOn w:val="905"/>
+    <w:basedOn w:val="907"/>
     <w:uiPriority w:val="99"/>
     <w:pPr>
       <w:pBdr/>
@@ -25146,9 +25484,9 @@
       </w:tcPr>
     </w:tblStylePr>
   </w:style>
-  <w:style w:type="table" w:styleId="779">
+  <w:style w:type="table" w:styleId="781">
     <w:name w:val="List Table 1 Light - Accent 4"/>
-    <w:basedOn w:val="905"/>
+    <w:basedOn w:val="907"/>
     <w:uiPriority w:val="99"/>
     <w:pPr>
       <w:pBdr/>
@@ -25362,9 +25700,9 @@
       </w:tcPr>
     </w:tblStylePr>
   </w:style>
-  <w:style w:type="table" w:styleId="780">
+  <w:style w:type="table" w:styleId="782">
     <w:name w:val="List Table 1 Light - Accent 5"/>
-    <w:basedOn w:val="905"/>
+    <w:basedOn w:val="907"/>
     <w:uiPriority w:val="99"/>
     <w:pPr>
       <w:pBdr/>
@@ -25578,9 +25916,9 @@
       </w:tcPr>
     </w:tblStylePr>
   </w:style>
-  <w:style w:type="table" w:styleId="781">
+  <w:style w:type="table" w:styleId="783">
     <w:name w:val="List Table 1 Light - Accent 6"/>
-    <w:basedOn w:val="905"/>
+    <w:basedOn w:val="907"/>
     <w:uiPriority w:val="99"/>
     <w:pPr>
       <w:pBdr/>
@@ -25794,9 +26132,9 @@
       </w:tcPr>
     </w:tblStylePr>
   </w:style>
-  <w:style w:type="table" w:styleId="782">
+  <w:style w:type="table" w:styleId="784">
     <w:name w:val="List Table 2"/>
-    <w:basedOn w:val="905"/>
+    <w:basedOn w:val="907"/>
     <w:uiPriority w:val="99"/>
     <w:pPr>
       <w:pBdr/>
@@ -26032,9 +26370,9 @@
       </w:tcPr>
     </w:tblStylePr>
   </w:style>
-  <w:style w:type="table" w:styleId="783">
+  <w:style w:type="table" w:styleId="785">
     <w:name w:val="List Table 2 - Accent 1"/>
-    <w:basedOn w:val="905"/>
+    <w:basedOn w:val="907"/>
     <w:uiPriority w:val="99"/>
     <w:pPr>
       <w:pBdr/>
@@ -26270,9 +26608,9 @@
       </w:tcPr>
     </w:tblStylePr>
   </w:style>
-  <w:style w:type="table" w:styleId="784">
+  <w:style w:type="table" w:styleId="786">
     <w:name w:val="List Table 2 - Accent 2"/>
-    <w:basedOn w:val="905"/>
+    <w:basedOn w:val="907"/>
     <w:uiPriority w:val="99"/>
     <w:pPr>
       <w:pBdr/>
@@ -26508,9 +26846,9 @@
       </w:tcPr>
     </w:tblStylePr>
   </w:style>
-  <w:style w:type="table" w:styleId="785">
+  <w:style w:type="table" w:styleId="787">
     <w:name w:val="List Table 2 - Accent 3"/>
-    <w:basedOn w:val="905"/>
+    <w:basedOn w:val="907"/>
     <w:uiPriority w:val="99"/>
     <w:pPr>
       <w:pBdr/>
@@ -26746,9 +27084,9 @@
       </w:tcPr>
     </w:tblStylePr>
   </w:style>
-  <w:style w:type="table" w:styleId="786">
+  <w:style w:type="table" w:styleId="788">
     <w:name w:val="List Table 2 - Accent 4"/>
-    <w:basedOn w:val="905"/>
+    <w:basedOn w:val="907"/>
     <w:uiPriority w:val="99"/>
     <w:pPr>
       <w:pBdr/>
@@ -26984,9 +27322,9 @@
       </w:tcPr>
     </w:tblStylePr>
   </w:style>
-  <w:style w:type="table" w:styleId="787">
+  <w:style w:type="table" w:styleId="789">
     <w:name w:val="List Table 2 - Accent 5"/>
-    <w:basedOn w:val="905"/>
+    <w:basedOn w:val="907"/>
     <w:uiPriority w:val="99"/>
     <w:pPr>
       <w:pBdr/>
@@ -27222,9 +27560,9 @@
       </w:tcPr>
     </w:tblStylePr>
   </w:style>
-  <w:style w:type="table" w:styleId="788">
+  <w:style w:type="table" w:styleId="790">
     <w:name w:val="List Table 2 - Accent 6"/>
-    <w:basedOn w:val="905"/>
+    <w:basedOn w:val="907"/>
     <w:uiPriority w:val="99"/>
     <w:pPr>
       <w:pBdr/>
@@ -27460,9 +27798,9 @@
       </w:tcPr>
     </w:tblStylePr>
   </w:style>
-  <w:style w:type="table" w:styleId="789">
+  <w:style w:type="table" w:styleId="791">
     <w:name w:val="List Table 3"/>
-    <w:basedOn w:val="905"/>
+    <w:basedOn w:val="907"/>
     <w:uiPriority w:val="99"/>
     <w:pPr>
       <w:pBdr/>
@@ -27688,9 +28026,9 @@
       </w:tcPr>
     </w:tblStylePr>
   </w:style>
-  <w:style w:type="table" w:styleId="790">
+  <w:style w:type="table" w:styleId="792">
     <w:name w:val="List Table 3 - Accent 1"/>
-    <w:basedOn w:val="905"/>
+    <w:basedOn w:val="907"/>
     <w:uiPriority w:val="99"/>
     <w:pPr>
       <w:pBdr/>
@@ -27916,9 +28254,9 @@
       </w:tcPr>
     </w:tblStylePr>
   </w:style>
-  <w:style w:type="table" w:styleId="791">
+  <w:style w:type="table" w:styleId="793">
     <w:name w:val="List Table 3 - Accent 2"/>
-    <w:basedOn w:val="905"/>
+    <w:basedOn w:val="907"/>
     <w:uiPriority w:val="99"/>
     <w:pPr>
       <w:pBdr/>
@@ -28144,9 +28482,9 @@
       </w:tcPr>
     </w:tblStylePr>
   </w:style>
-  <w:style w:type="table" w:styleId="792">
+  <w:style w:type="table" w:styleId="794">
     <w:name w:val="List Table 3 - Accent 3"/>
-    <w:basedOn w:val="905"/>
+    <w:basedOn w:val="907"/>
     <w:uiPriority w:val="99"/>
     <w:pPr>
       <w:pBdr/>
@@ -28372,9 +28710,9 @@
       </w:tcPr>
     </w:tblStylePr>
   </w:style>
-  <w:style w:type="table" w:styleId="793">
+  <w:style w:type="table" w:styleId="795">
     <w:name w:val="List Table 3 - Accent 4"/>
-    <w:basedOn w:val="905"/>
+    <w:basedOn w:val="907"/>
     <w:uiPriority w:val="99"/>
     <w:pPr>
       <w:pBdr/>
@@ -28600,9 +28938,9 @@
       </w:tcPr>
     </w:tblStylePr>
   </w:style>
-  <w:style w:type="table" w:styleId="794">
+  <w:style w:type="table" w:styleId="796">
     <w:name w:val="List Table 3 - Accent 5"/>
-    <w:basedOn w:val="905"/>
+    <w:basedOn w:val="907"/>
     <w:uiPriority w:val="99"/>
     <w:pPr>
       <w:pBdr/>
@@ -28828,9 +29166,9 @@
       </w:tcPr>
     </w:tblStylePr>
   </w:style>
-  <w:style w:type="table" w:styleId="795">
+  <w:style w:type="table" w:styleId="797">
     <w:name w:val="List Table 3 - Accent 6"/>
-    <w:basedOn w:val="905"/>
+    <w:basedOn w:val="907"/>
     <w:uiPriority w:val="99"/>
     <w:pPr>
       <w:pBdr/>
@@ -29056,9 +29394,9 @@
       </w:tcPr>
     </w:tblStylePr>
   </w:style>
-  <w:style w:type="table" w:styleId="796">
+  <w:style w:type="table" w:styleId="798">
     <w:name w:val="List Table 4"/>
-    <w:basedOn w:val="905"/>
+    <w:basedOn w:val="907"/>
     <w:uiPriority w:val="99"/>
     <w:pPr>
       <w:pBdr/>
@@ -29281,9 +29619,9 @@
       </w:tcPr>
     </w:tblStylePr>
   </w:style>
-  <w:style w:type="table" w:styleId="797">
+  <w:style w:type="table" w:styleId="799">
     <w:name w:val="List Table 4 - Accent 1"/>
-    <w:basedOn w:val="905"/>
+    <w:basedOn w:val="907"/>
     <w:uiPriority w:val="99"/>
     <w:pPr>
       <w:pBdr/>
@@ -29506,9 +29844,9 @@
       </w:tcPr>
     </w:tblStylePr>
   </w:style>
-  <w:style w:type="table" w:styleId="798">
+  <w:style w:type="table" w:styleId="800">
     <w:name w:val="List Table 4 - Accent 2"/>
-    <w:basedOn w:val="905"/>
+    <w:basedOn w:val="907"/>
     <w:uiPriority w:val="99"/>
     <w:pPr>
       <w:pBdr/>
@@ -29731,9 +30069,9 @@
       </w:tcPr>
     </w:tblStylePr>
   </w:style>
-  <w:style w:type="table" w:styleId="799">
+  <w:style w:type="table" w:styleId="801">
     <w:name w:val="List Table 4 - Accent 3"/>
-    <w:basedOn w:val="905"/>
+    <w:basedOn w:val="907"/>
     <w:uiPriority w:val="99"/>
     <w:pPr>
       <w:pBdr/>
@@ -29956,9 +30294,9 @@
       </w:tcPr>
     </w:tblStylePr>
   </w:style>
-  <w:style w:type="table" w:styleId="800">
+  <w:style w:type="table" w:styleId="802">
     <w:name w:val="List Table 4 - Accent 4"/>
-    <w:basedOn w:val="905"/>
+    <w:basedOn w:val="907"/>
     <w:uiPriority w:val="99"/>
     <w:pPr>
       <w:pBdr/>
@@ -30181,9 +30519,9 @@
       </w:tcPr>
     </w:tblStylePr>
   </w:style>
-  <w:style w:type="table" w:styleId="801">
+  <w:style w:type="table" w:styleId="803">
     <w:name w:val="List Table 4 - Accent 5"/>
-    <w:basedOn w:val="905"/>
+    <w:basedOn w:val="907"/>
     <w:uiPriority w:val="99"/>
     <w:pPr>
       <w:pBdr/>
@@ -30406,9 +30744,9 @@
       </w:tcPr>
     </w:tblStylePr>
   </w:style>
-  <w:style w:type="table" w:styleId="802">
+  <w:style w:type="table" w:styleId="804">
     <w:name w:val="List Table 4 - Accent 6"/>
-    <w:basedOn w:val="905"/>
+    <w:basedOn w:val="907"/>
     <w:uiPriority w:val="99"/>
     <w:pPr>
       <w:pBdr/>
@@ -30631,9 +30969,9 @@
       </w:tcPr>
     </w:tblStylePr>
   </w:style>
-  <w:style w:type="table" w:styleId="803">
+  <w:style w:type="table" w:styleId="805">
     <w:name w:val="List Table 5 Dark"/>
-    <w:basedOn w:val="905"/>
+    <w:basedOn w:val="907"/>
     <w:uiPriority w:val="99"/>
     <w:pPr>
       <w:pBdr/>
@@ -30873,9 +31211,9 @@
       </w:tcPr>
     </w:tblStylePr>
   </w:style>
-  <w:style w:type="table" w:styleId="804">
+  <w:style w:type="table" w:styleId="806">
     <w:name w:val="List Table 5 Dark - Accent 1"/>
-    <w:basedOn w:val="905"/>
+    <w:basedOn w:val="907"/>
     <w:uiPriority w:val="99"/>
     <w:pPr>
       <w:pBdr/>
@@ -31115,9 +31453,9 @@
       </w:tcPr>
     </w:tblStylePr>
   </w:style>
-  <w:style w:type="table" w:styleId="805">
+  <w:style w:type="table" w:styleId="807">
     <w:name w:val="List Table 5 Dark - Accent 2"/>
-    <w:basedOn w:val="905"/>
+    <w:basedOn w:val="907"/>
     <w:uiPriority w:val="99"/>
     <w:pPr>
       <w:pBdr/>
@@ -31357,9 +31695,9 @@
       </w:tcPr>
     </w:tblStylePr>
   </w:style>
-  <w:style w:type="table" w:styleId="806">
+  <w:style w:type="table" w:styleId="808">
     <w:name w:val="List Table 5 Dark - Accent 3"/>
-    <w:basedOn w:val="905"/>
+    <w:basedOn w:val="907"/>
     <w:uiPriority w:val="99"/>
     <w:pPr>
       <w:pBdr/>
@@ -31599,9 +31937,9 @@
       </w:tcPr>
     </w:tblStylePr>
   </w:style>
-  <w:style w:type="table" w:styleId="807">
+  <w:style w:type="table" w:styleId="809">
     <w:name w:val="List Table 5 Dark - Accent 4"/>
-    <w:basedOn w:val="905"/>
+    <w:basedOn w:val="907"/>
     <w:uiPriority w:val="99"/>
     <w:pPr>
       <w:pBdr/>
@@ -31841,9 +32179,9 @@
       </w:tcPr>
     </w:tblStylePr>
   </w:style>
-  <w:style w:type="table" w:styleId="808">
+  <w:style w:type="table" w:styleId="810">
     <w:name w:val="List Table 5 Dark - Accent 5"/>
-    <w:basedOn w:val="905"/>
+    <w:basedOn w:val="907"/>
     <w:uiPriority w:val="99"/>
     <w:pPr>
       <w:pBdr/>
@@ -32083,9 +32421,9 @@
       </w:tcPr>
     </w:tblStylePr>
   </w:style>
-  <w:style w:type="table" w:styleId="809">
+  <w:style w:type="table" w:styleId="811">
     <w:name w:val="List Table 5 Dark - Accent 6"/>
-    <w:basedOn w:val="905"/>
+    <w:basedOn w:val="907"/>
     <w:uiPriority w:val="99"/>
     <w:pPr>
       <w:pBdr/>
@@ -32325,9 +32663,9 @@
       </w:tcPr>
     </w:tblStylePr>
   </w:style>
-  <w:style w:type="table" w:styleId="810">
+  <w:style w:type="table" w:styleId="812">
     <w:name w:val="List Table 6 Colorful"/>
-    <w:basedOn w:val="905"/>
+    <w:basedOn w:val="907"/>
     <w:uiPriority w:val="99"/>
     <w:pPr>
       <w:pBdr/>
@@ -32548,9 +32886,9 @@
       </w:tcPr>
     </w:tblStylePr>
   </w:style>
-  <w:style w:type="table" w:styleId="811">
+  <w:style w:type="table" w:styleId="813">
     <w:name w:val="List Table 6 Colorful - Accent 1"/>
-    <w:basedOn w:val="905"/>
+    <w:basedOn w:val="907"/>
     <w:uiPriority w:val="99"/>
     <w:pPr>
       <w:pBdr/>
@@ -32771,9 +33109,9 @@
       </w:tcPr>
     </w:tblStylePr>
   </w:style>
-  <w:style w:type="table" w:styleId="812">
+  <w:style w:type="table" w:styleId="814">
     <w:name w:val="List Table 6 Colorful - Accent 2"/>
-    <w:basedOn w:val="905"/>
+    <w:basedOn w:val="907"/>
     <w:uiPriority w:val="99"/>
     <w:pPr>
       <w:pBdr/>
@@ -32994,9 +33332,9 @@
       </w:tcPr>
     </w:tblStylePr>
   </w:style>
-  <w:style w:type="table" w:styleId="813">
+  <w:style w:type="table" w:styleId="815">
     <w:name w:val="List Table 6 Colorful - Accent 3"/>
-    <w:basedOn w:val="905"/>
+    <w:basedOn w:val="907"/>
     <w:uiPriority w:val="99"/>
     <w:pPr>
       <w:pBdr/>
@@ -33217,9 +33555,9 @@
       </w:tcPr>
     </w:tblStylePr>
   </w:style>
-  <w:style w:type="table" w:styleId="814">
+  <w:style w:type="table" w:styleId="816">
     <w:name w:val="List Table 6 Colorful - Accent 4"/>
-    <w:basedOn w:val="905"/>
+    <w:basedOn w:val="907"/>
     <w:uiPriority w:val="99"/>
     <w:pPr>
       <w:pBdr/>
@@ -33440,9 +33778,9 @@
       </w:tcPr>
     </w:tblStylePr>
   </w:style>
-  <w:style w:type="table" w:styleId="815">
+  <w:style w:type="table" w:styleId="817">
     <w:name w:val="List Table 6 Colorful - Accent 5"/>
-    <w:basedOn w:val="905"/>
+    <w:basedOn w:val="907"/>
     <w:uiPriority w:val="99"/>
     <w:pPr>
       <w:pBdr/>
@@ -33663,9 +34001,9 @@
       </w:tcPr>
     </w:tblStylePr>
   </w:style>
-  <w:style w:type="table" w:styleId="816">
+  <w:style w:type="table" w:styleId="818">
     <w:name w:val="List Table 6 Colorful - Accent 6"/>
-    <w:basedOn w:val="905"/>
+    <w:basedOn w:val="907"/>
     <w:uiPriority w:val="99"/>
     <w:pPr>
       <w:pBdr/>
@@ -33886,9 +34224,9 @@
       </w:tcPr>
     </w:tblStylePr>
   </w:style>
-  <w:style w:type="table" w:styleId="817">
+  <w:style w:type="table" w:styleId="819">
     <w:name w:val="List Table 7 Colorful"/>
-    <w:basedOn w:val="905"/>
+    <w:basedOn w:val="907"/>
     <w:uiPriority w:val="99"/>
     <w:pPr>
       <w:pBdr/>
@@ -34142,9 +34480,9 @@
       </w:tcPr>
     </w:tblStylePr>
   </w:style>
-  <w:style w:type="table" w:styleId="818">
+  <w:style w:type="table" w:styleId="820">
     <w:name w:val="List Table 7 Colorful - Accent 1"/>
-    <w:basedOn w:val="905"/>
+    <w:basedOn w:val="907"/>
     <w:uiPriority w:val="99"/>
     <w:pPr>
       <w:pBdr/>
@@ -34398,9 +34736,9 @@
       </w:tcPr>
     </w:tblStylePr>
   </w:style>
-  <w:style w:type="table" w:styleId="819">
+  <w:style w:type="table" w:styleId="821">
     <w:name w:val="List Table 7 Colorful - Accent 2"/>
-    <w:basedOn w:val="905"/>
+    <w:basedOn w:val="907"/>
     <w:uiPriority w:val="99"/>
     <w:pPr>
       <w:pBdr/>
@@ -34654,9 +34992,9 @@
       </w:tcPr>
     </w:tblStylePr>
   </w:style>
-  <w:style w:type="table" w:styleId="820">
+  <w:style w:type="table" w:styleId="822">
     <w:name w:val="List Table 7 Colorful - Accent 3"/>
-    <w:basedOn w:val="905"/>
+    <w:basedOn w:val="907"/>
     <w:uiPriority w:val="99"/>
     <w:pPr>
       <w:pBdr/>
@@ -34910,9 +35248,9 @@
       </w:tcPr>
     </w:tblStylePr>
   </w:style>
-  <w:style w:type="table" w:styleId="821">
+  <w:style w:type="table" w:styleId="823">
     <w:name w:val="List Table 7 Colorful - Accent 4"/>
-    <w:basedOn w:val="905"/>
+    <w:basedOn w:val="907"/>
     <w:uiPriority w:val="99"/>
     <w:pPr>
       <w:pBdr/>
@@ -35166,9 +35504,9 @@
       </w:tcPr>
     </w:tblStylePr>
   </w:style>
-  <w:style w:type="table" w:styleId="822">
+  <w:style w:type="table" w:styleId="824">
     <w:name w:val="List Table 7 Colorful - Accent 5"/>
-    <w:basedOn w:val="905"/>
+    <w:basedOn w:val="907"/>
     <w:uiPriority w:val="99"/>
     <w:pPr>
       <w:pBdr/>
@@ -35422,9 +35760,9 @@
       </w:tcPr>
     </w:tblStylePr>
   </w:style>
-  <w:style w:type="table" w:styleId="823">
+  <w:style w:type="table" w:styleId="825">
     <w:name w:val="List Table 7 Colorful - Accent 6"/>
-    <w:basedOn w:val="905"/>
+    <w:basedOn w:val="907"/>
     <w:uiPriority w:val="99"/>
     <w:pPr>
       <w:pBdr/>
@@ -35678,9 +36016,9 @@
       </w:tcPr>
     </w:tblStylePr>
   </w:style>
-  <w:style w:type="table" w:styleId="824">
+  <w:style w:type="table" w:styleId="826">
     <w:name w:val="Lined - Accent"/>
-    <w:basedOn w:val="905"/>
+    <w:basedOn w:val="907"/>
     <w:uiPriority w:val="99"/>
     <w:pPr>
       <w:pBdr/>
@@ -35915,9 +36253,9 @@
       </w:tcPr>
     </w:tblStylePr>
   </w:style>
-  <w:style w:type="table" w:styleId="825">
+  <w:style w:type="table" w:styleId="827">
     <w:name w:val="Lined - Accent 1"/>
-    <w:basedOn w:val="905"/>
+    <w:basedOn w:val="907"/>
     <w:uiPriority w:val="99"/>
     <w:pPr>
       <w:pBdr/>
@@ -36152,9 +36490,9 @@
       </w:tcPr>
     </w:tblStylePr>
   </w:style>
-  <w:style w:type="table" w:styleId="826">
+  <w:style w:type="table" w:styleId="828">
     <w:name w:val="Lined - Accent 2"/>
-    <w:basedOn w:val="905"/>
+    <w:basedOn w:val="907"/>
     <w:uiPriority w:val="99"/>
     <w:pPr>
       <w:pBdr/>
@@ -36389,9 +36727,9 @@
       </w:tcPr>
     </w:tblStylePr>
   </w:style>
-  <w:style w:type="table" w:styleId="827">
+  <w:style w:type="table" w:styleId="829">
     <w:name w:val="Lined - Accent 3"/>
-    <w:basedOn w:val="905"/>
+    <w:basedOn w:val="907"/>
     <w:uiPriority w:val="99"/>
     <w:pPr>
       <w:pBdr/>
@@ -36626,9 +36964,9 @@
       </w:tcPr>
     </w:tblStylePr>
   </w:style>
-  <w:style w:type="table" w:styleId="828">
+  <w:style w:type="table" w:styleId="830">
     <w:name w:val="Lined - Accent 4"/>
-    <w:basedOn w:val="905"/>
+    <w:basedOn w:val="907"/>
     <w:uiPriority w:val="99"/>
     <w:pPr>
       <w:pBdr/>
@@ -36863,9 +37201,9 @@
       </w:tcPr>
     </w:tblStylePr>
   </w:style>
-  <w:style w:type="table" w:styleId="829">
+  <w:style w:type="table" w:styleId="831">
     <w:name w:val="Lined - Accent 5"/>
-    <w:basedOn w:val="905"/>
+    <w:basedOn w:val="907"/>
     <w:uiPriority w:val="99"/>
     <w:pPr>
       <w:pBdr/>
@@ -37100,9 +37438,9 @@
       </w:tcPr>
     </w:tblStylePr>
   </w:style>
-  <w:style w:type="table" w:styleId="830">
+  <w:style w:type="table" w:styleId="832">
     <w:name w:val="Lined - Accent 6"/>
-    <w:basedOn w:val="905"/>
+    <w:basedOn w:val="907"/>
     <w:uiPriority w:val="99"/>
     <w:pPr>
       <w:pBdr/>
@@ -37337,9 +37675,9 @@
       </w:tcPr>
     </w:tblStylePr>
   </w:style>
-  <w:style w:type="table" w:styleId="831">
+  <w:style w:type="table" w:styleId="833">
     <w:name w:val="Bordered &amp; Lined - Accent"/>
-    <w:basedOn w:val="905"/>
+    <w:basedOn w:val="907"/>
     <w:uiPriority w:val="99"/>
     <w:pPr>
       <w:pBdr/>
@@ -37581,9 +37919,9 @@
       </w:tcPr>
     </w:tblStylePr>
   </w:style>
-  <w:style w:type="table" w:styleId="832">
+  <w:style w:type="table" w:styleId="834">
     <w:name w:val="Bordered &amp; Lined - Accent 1"/>
-    <w:basedOn w:val="905"/>
+    <w:basedOn w:val="907"/>
     <w:uiPriority w:val="99"/>
     <w:pPr>
       <w:pBdr/>
@@ -37825,9 +38163,9 @@
       </w:tcPr>
     </w:tblStylePr>
   </w:style>
-  <w:style w:type="table" w:styleId="833">
+  <w:style w:type="table" w:styleId="835">
     <w:name w:val="Bordered &amp; Lined - Accent 2"/>
-    <w:basedOn w:val="905"/>
+    <w:basedOn w:val="907"/>
     <w:uiPriority w:val="99"/>
     <w:pPr>
       <w:pBdr/>
@@ -38069,9 +38407,9 @@
       </w:tcPr>
     </w:tblStylePr>
   </w:style>
-  <w:style w:type="table" w:styleId="834">
+  <w:style w:type="table" w:styleId="836">
     <w:name w:val="Bordered &amp; Lined - Accent 3"/>
-    <w:basedOn w:val="905"/>
+    <w:basedOn w:val="907"/>
     <w:uiPriority w:val="99"/>
     <w:pPr>
       <w:pBdr/>
@@ -38313,9 +38651,9 @@
       </w:tcPr>
     </w:tblStylePr>
   </w:style>
-  <w:style w:type="table" w:styleId="835">
+  <w:style w:type="table" w:styleId="837">
     <w:name w:val="Bordered &amp; Lined - Accent 4"/>
-    <w:basedOn w:val="905"/>
+    <w:basedOn w:val="907"/>
     <w:uiPriority w:val="99"/>
     <w:pPr>
       <w:pBdr/>
@@ -38557,9 +38895,9 @@
       </w:tcPr>
     </w:tblStylePr>
   </w:style>
-  <w:style w:type="table" w:styleId="836">
+  <w:style w:type="table" w:styleId="838">
     <w:name w:val="Bordered &amp; Lined - Accent 5"/>
-    <w:basedOn w:val="905"/>
+    <w:basedOn w:val="907"/>
     <w:uiPriority w:val="99"/>
     <w:pPr>
       <w:pBdr/>
@@ -38801,9 +39139,9 @@
       </w:tcPr>
     </w:tblStylePr>
   </w:style>
-  <w:style w:type="table" w:styleId="837">
+  <w:style w:type="table" w:styleId="839">
     <w:name w:val="Bordered &amp; Lined - Accent 6"/>
-    <w:basedOn w:val="905"/>
+    <w:basedOn w:val="907"/>
     <w:uiPriority w:val="99"/>
     <w:pPr>
       <w:pBdr/>
@@ -39045,9 +39383,9 @@
       </w:tcPr>
     </w:tblStylePr>
   </w:style>
-  <w:style w:type="table" w:styleId="838">
+  <w:style w:type="table" w:styleId="840">
     <w:name w:val="Bordered"/>
-    <w:basedOn w:val="905"/>
+    <w:basedOn w:val="907"/>
     <w:uiPriority w:val="99"/>
     <w:pPr>
       <w:pBdr/>
@@ -39276,9 +39614,9 @@
       </w:tcPr>
     </w:tblStylePr>
   </w:style>
-  <w:style w:type="table" w:styleId="839">
+  <w:style w:type="table" w:styleId="841">
     <w:name w:val="Bordered - Accent 1"/>
-    <w:basedOn w:val="905"/>
+    <w:basedOn w:val="907"/>
     <w:uiPriority w:val="99"/>
     <w:pPr>
       <w:pBdr/>
@@ -39507,9 +39845,9 @@
       </w:tcPr>
     </w:tblStylePr>
   </w:style>
-  <w:style w:type="table" w:styleId="840">
+  <w:style w:type="table" w:styleId="842">
     <w:name w:val="Bordered - Accent 2"/>
-    <w:basedOn w:val="905"/>
+    <w:basedOn w:val="907"/>
     <w:uiPriority w:val="99"/>
     <w:pPr>
       <w:pBdr/>
@@ -39738,9 +40076,9 @@
       </w:tcPr>
     </w:tblStylePr>
   </w:style>
-  <w:style w:type="table" w:styleId="841">
+  <w:style w:type="table" w:styleId="843">
     <w:name w:val="Bordered - Accent 3"/>
-    <w:basedOn w:val="905"/>
+    <w:basedOn w:val="907"/>
     <w:uiPriority w:val="99"/>
     <w:pPr>
       <w:pBdr/>
@@ -39969,9 +40307,9 @@
       </w:tcPr>
     </w:tblStylePr>
   </w:style>
-  <w:style w:type="table" w:styleId="842">
+  <w:style w:type="table" w:styleId="844">
     <w:name w:val="Bordered - Accent 4"/>
-    <w:basedOn w:val="905"/>
+    <w:basedOn w:val="907"/>
     <w:uiPriority w:val="99"/>
     <w:pPr>
       <w:pBdr/>
@@ -40200,9 +40538,9 @@
       </w:tcPr>
     </w:tblStylePr>
   </w:style>
-  <w:style w:type="table" w:styleId="843">
+  <w:style w:type="table" w:styleId="845">
     <w:name w:val="Bordered - Accent 5"/>
-    <w:basedOn w:val="905"/>
+    <w:basedOn w:val="907"/>
     <w:uiPriority w:val="99"/>
     <w:pPr>
       <w:pBdr/>
@@ -40431,9 +40769,9 @@
       </w:tcPr>
     </w:tblStylePr>
   </w:style>
-  <w:style w:type="table" w:styleId="844">
+  <w:style w:type="table" w:styleId="846">
     <w:name w:val="Bordered - Accent 6"/>
-    <w:basedOn w:val="905"/>
+    <w:basedOn w:val="907"/>
     <w:uiPriority w:val="99"/>
     <w:pPr>
       <w:pBdr/>
@@ -40662,11 +41000,11 @@
       </w:tcPr>
     </w:tblStylePr>
   </w:style>
-  <w:style w:type="paragraph" w:styleId="845">
+  <w:style w:type="paragraph" w:styleId="847">
     <w:name w:val="Heading 1"/>
-    <w:basedOn w:val="904"/>
-    <w:next w:val="904"/>
-    <w:link w:val="855"/>
+    <w:basedOn w:val="906"/>
+    <w:next w:val="906"/>
+    <w:link w:val="857"/>
     <w:uiPriority w:val="9"/>
     <w:qFormat/>
     <w:pPr>
@@ -40684,11 +41022,11 @@
       <w:szCs w:val="40"/>
     </w:rPr>
   </w:style>
-  <w:style w:type="paragraph" w:styleId="846">
+  <w:style w:type="paragraph" w:styleId="848">
     <w:name w:val="Heading 2"/>
-    <w:basedOn w:val="904"/>
-    <w:next w:val="904"/>
-    <w:link w:val="856"/>
+    <w:basedOn w:val="906"/>
+    <w:next w:val="906"/>
+    <w:link w:val="858"/>
     <w:uiPriority w:val="9"/>
     <w:unhideWhenUsed/>
     <w:qFormat/>
@@ -40707,11 +41045,11 @@
       <w:szCs w:val="32"/>
     </w:rPr>
   </w:style>
-  <w:style w:type="paragraph" w:styleId="847">
+  <w:style w:type="paragraph" w:styleId="849">
     <w:name w:val="Heading 3"/>
-    <w:basedOn w:val="904"/>
-    <w:next w:val="904"/>
-    <w:link w:val="857"/>
+    <w:basedOn w:val="906"/>
+    <w:next w:val="906"/>
+    <w:link w:val="859"/>
     <w:uiPriority w:val="9"/>
     <w:unhideWhenUsed/>
     <w:qFormat/>
@@ -40730,11 +41068,11 @@
       <w:szCs w:val="28"/>
     </w:rPr>
   </w:style>
-  <w:style w:type="paragraph" w:styleId="848">
+  <w:style w:type="paragraph" w:styleId="850">
     <w:name w:val="Heading 4"/>
-    <w:basedOn w:val="904"/>
-    <w:next w:val="904"/>
-    <w:link w:val="858"/>
+    <w:basedOn w:val="906"/>
+    <w:next w:val="906"/>
+    <w:link w:val="860"/>
     <w:uiPriority w:val="9"/>
     <w:unhideWhenUsed/>
     <w:qFormat/>
@@ -40753,11 +41091,11 @@
       <w:color w:val="0f4761" w:themeColor="accent1" w:themeShade="BF"/>
     </w:rPr>
   </w:style>
-  <w:style w:type="paragraph" w:styleId="849">
+  <w:style w:type="paragraph" w:styleId="851">
     <w:name w:val="Heading 5"/>
-    <w:basedOn w:val="904"/>
-    <w:next w:val="904"/>
-    <w:link w:val="859"/>
+    <w:basedOn w:val="906"/>
+    <w:next w:val="906"/>
+    <w:link w:val="861"/>
     <w:uiPriority w:val="9"/>
     <w:unhideWhenUsed/>
     <w:qFormat/>
@@ -40774,11 +41112,11 @@
       <w:color w:val="0f4761" w:themeColor="accent1" w:themeShade="BF"/>
     </w:rPr>
   </w:style>
-  <w:style w:type="paragraph" w:styleId="850">
+  <w:style w:type="paragraph" w:styleId="852">
     <w:name w:val="Heading 6"/>
-    <w:basedOn w:val="904"/>
-    <w:next w:val="904"/>
-    <w:link w:val="860"/>
+    <w:basedOn w:val="906"/>
+    <w:next w:val="906"/>
+    <w:link w:val="862"/>
     <w:uiPriority w:val="9"/>
     <w:unhideWhenUsed/>
     <w:qFormat/>
@@ -40797,11 +41135,11 @@
       <w:color w:val="595959" w:themeColor="text1" w:themeTint="A6"/>
     </w:rPr>
   </w:style>
-  <w:style w:type="paragraph" w:styleId="851">
+  <w:style w:type="paragraph" w:styleId="853">
     <w:name w:val="Heading 7"/>
-    <w:basedOn w:val="904"/>
-    <w:next w:val="904"/>
-    <w:link w:val="861"/>
+    <w:basedOn w:val="906"/>
+    <w:next w:val="906"/>
+    <w:link w:val="863"/>
     <w:uiPriority w:val="9"/>
     <w:unhideWhenUsed/>
     <w:qFormat/>
@@ -40818,11 +41156,11 @@
       <w:color w:val="595959" w:themeColor="text1" w:themeTint="A6"/>
     </w:rPr>
   </w:style>
-  <w:style w:type="paragraph" w:styleId="852">
+  <w:style w:type="paragraph" w:styleId="854">
     <w:name w:val="Heading 8"/>
-    <w:basedOn w:val="904"/>
-    <w:next w:val="904"/>
-    <w:link w:val="862"/>
+    <w:basedOn w:val="906"/>
+    <w:next w:val="906"/>
+    <w:link w:val="864"/>
     <w:uiPriority w:val="9"/>
     <w:unhideWhenUsed/>
     <w:qFormat/>
@@ -40841,11 +41179,11 @@
       <w:color w:val="272727" w:themeColor="text1" w:themeTint="D8"/>
     </w:rPr>
   </w:style>
-  <w:style w:type="paragraph" w:styleId="853">
+  <w:style w:type="paragraph" w:styleId="855">
     <w:name w:val="Heading 9"/>
-    <w:basedOn w:val="904"/>
-    <w:next w:val="904"/>
-    <w:link w:val="863"/>
+    <w:basedOn w:val="906"/>
+    <w:next w:val="906"/>
+    <w:link w:val="865"/>
     <w:uiPriority w:val="9"/>
     <w:unhideWhenUsed/>
     <w:qFormat/>
@@ -40864,7 +41202,7 @@
       <w:color w:val="272727" w:themeColor="text1" w:themeTint="D8"/>
     </w:rPr>
   </w:style>
-  <w:style w:type="character" w:styleId="854" w:default="1">
+  <w:style w:type="character" w:styleId="856" w:default="1">
     <w:name w:val="Default Paragraph Font"/>
     <w:uiPriority w:val="1"/>
     <w:semiHidden/>
@@ -40875,10 +41213,10 @@
       <w:ind/>
     </w:pPr>
   </w:style>
-  <w:style w:type="character" w:styleId="855">
+  <w:style w:type="character" w:styleId="857">
     <w:name w:val="Heading 1 Char"/>
-    <w:basedOn w:val="854"/>
-    <w:link w:val="845"/>
+    <w:basedOn w:val="856"/>
+    <w:link w:val="847"/>
     <w:uiPriority w:val="9"/>
     <w:pPr>
       <w:pBdr/>
@@ -40892,10 +41230,10 @@
       <w:szCs w:val="40"/>
     </w:rPr>
   </w:style>
-  <w:style w:type="character" w:styleId="856">
+  <w:style w:type="character" w:styleId="858">
     <w:name w:val="Heading 2 Char"/>
-    <w:basedOn w:val="854"/>
-    <w:link w:val="846"/>
+    <w:basedOn w:val="856"/>
+    <w:link w:val="848"/>
     <w:uiPriority w:val="9"/>
     <w:pPr>
       <w:pBdr/>
@@ -40909,10 +41247,10 @@
       <w:szCs w:val="32"/>
     </w:rPr>
   </w:style>
-  <w:style w:type="character" w:styleId="857">
+  <w:style w:type="character" w:styleId="859">
     <w:name w:val="Heading 3 Char"/>
-    <w:basedOn w:val="854"/>
-    <w:link w:val="847"/>
+    <w:basedOn w:val="856"/>
+    <w:link w:val="849"/>
     <w:uiPriority w:val="9"/>
     <w:pPr>
       <w:pBdr/>
@@ -40926,10 +41264,10 @@
       <w:szCs w:val="28"/>
     </w:rPr>
   </w:style>
-  <w:style w:type="character" w:styleId="858">
+  <w:style w:type="character" w:styleId="860">
     <w:name w:val="Heading 4 Char"/>
-    <w:basedOn w:val="854"/>
-    <w:link w:val="848"/>
+    <w:basedOn w:val="856"/>
+    <w:link w:val="850"/>
     <w:uiPriority w:val="9"/>
     <w:pPr>
       <w:pBdr/>
@@ -40943,10 +41281,10 @@
       <w:color w:val="0f4761" w:themeColor="accent1" w:themeShade="BF"/>
     </w:rPr>
   </w:style>
-  <w:style w:type="character" w:styleId="859">
+  <w:style w:type="character" w:styleId="861">
     <w:name w:val="Heading 5 Char"/>
-    <w:basedOn w:val="854"/>
-    <w:link w:val="849"/>
+    <w:basedOn w:val="856"/>
+    <w:link w:val="851"/>
     <w:uiPriority w:val="9"/>
     <w:pPr>
       <w:pBdr/>
@@ -40958,10 +41296,10 @@
       <w:color w:val="0f4761" w:themeColor="accent1" w:themeShade="BF"/>
     </w:rPr>
   </w:style>
-  <w:style w:type="character" w:styleId="860">
+  <w:style w:type="character" w:styleId="862">
     <w:name w:val="Heading 6 Char"/>
-    <w:basedOn w:val="854"/>
-    <w:link w:val="850"/>
+    <w:basedOn w:val="856"/>
+    <w:link w:val="852"/>
     <w:uiPriority w:val="9"/>
     <w:pPr>
       <w:pBdr/>
@@ -40975,10 +41313,10 @@
       <w:color w:val="595959" w:themeColor="text1" w:themeTint="A6"/>
     </w:rPr>
   </w:style>
-  <w:style w:type="character" w:styleId="861">
+  <w:style w:type="character" w:styleId="863">
     <w:name w:val="Heading 7 Char"/>
-    <w:basedOn w:val="854"/>
-    <w:link w:val="851"/>
+    <w:basedOn w:val="856"/>
+    <w:link w:val="853"/>
     <w:uiPriority w:val="9"/>
     <w:pPr>
       <w:pBdr/>
@@ -40990,10 +41328,10 @@
       <w:color w:val="595959" w:themeColor="text1" w:themeTint="A6"/>
     </w:rPr>
   </w:style>
-  <w:style w:type="character" w:styleId="862">
+  <w:style w:type="character" w:styleId="864">
     <w:name w:val="Heading 8 Char"/>
-    <w:basedOn w:val="854"/>
-    <w:link w:val="852"/>
+    <w:basedOn w:val="856"/>
+    <w:link w:val="854"/>
     <w:uiPriority w:val="9"/>
     <w:pPr>
       <w:pBdr/>
@@ -41007,10 +41345,10 @@
       <w:color w:val="272727" w:themeColor="text1" w:themeTint="D8"/>
     </w:rPr>
   </w:style>
-  <w:style w:type="character" w:styleId="863">
+  <w:style w:type="character" w:styleId="865">
     <w:name w:val="Heading 9 Char"/>
-    <w:basedOn w:val="854"/>
-    <w:link w:val="853"/>
+    <w:basedOn w:val="856"/>
+    <w:link w:val="855"/>
     <w:uiPriority w:val="9"/>
     <w:pPr>
       <w:pBdr/>
@@ -41024,11 +41362,11 @@
       <w:color w:val="272727" w:themeColor="text1" w:themeTint="D8"/>
     </w:rPr>
   </w:style>
-  <w:style w:type="paragraph" w:styleId="864">
+  <w:style w:type="paragraph" w:styleId="866">
     <w:name w:val="Title"/>
-    <w:basedOn w:val="904"/>
-    <w:next w:val="904"/>
-    <w:link w:val="865"/>
+    <w:basedOn w:val="906"/>
+    <w:next w:val="906"/>
+    <w:link w:val="867"/>
     <w:uiPriority w:val="10"/>
     <w:qFormat/>
     <w:pPr>
@@ -41044,10 +41382,10 @@
       <w:szCs w:val="56"/>
     </w:rPr>
   </w:style>
-  <w:style w:type="character" w:styleId="865">
+  <w:style w:type="character" w:styleId="867">
     <w:name w:val="Title Char"/>
-    <w:basedOn w:val="854"/>
-    <w:link w:val="864"/>
+    <w:basedOn w:val="856"/>
+    <w:link w:val="866"/>
     <w:uiPriority w:val="10"/>
     <w:pPr>
       <w:pBdr/>
@@ -41061,11 +41399,11 @@
       <w:szCs w:val="56"/>
     </w:rPr>
   </w:style>
-  <w:style w:type="paragraph" w:styleId="866">
+  <w:style w:type="paragraph" w:styleId="868">
     <w:name w:val="Subtitle"/>
-    <w:basedOn w:val="904"/>
-    <w:next w:val="904"/>
-    <w:link w:val="867"/>
+    <w:basedOn w:val="906"/>
+    <w:next w:val="906"/>
+    <w:link w:val="869"/>
     <w:uiPriority w:val="11"/>
     <w:qFormat/>
     <w:pPr>
@@ -41083,10 +41421,10 @@
       <w:szCs w:val="28"/>
     </w:rPr>
   </w:style>
-  <w:style w:type="character" w:styleId="867">
+  <w:style w:type="character" w:styleId="869">
     <w:name w:val="Subtitle Char"/>
-    <w:basedOn w:val="854"/>
-    <w:link w:val="866"/>
+    <w:basedOn w:val="856"/>
+    <w:link w:val="868"/>
     <w:uiPriority w:val="11"/>
     <w:pPr>
       <w:pBdr/>
@@ -41100,11 +41438,11 @@
       <w:szCs w:val="28"/>
     </w:rPr>
   </w:style>
-  <w:style w:type="paragraph" w:styleId="868">
+  <w:style w:type="paragraph" w:styleId="870">
     <w:name w:val="Quote"/>
-    <w:basedOn w:val="904"/>
-    <w:next w:val="904"/>
-    <w:link w:val="869"/>
+    <w:basedOn w:val="906"/>
+    <w:next w:val="906"/>
+    <w:link w:val="871"/>
     <w:uiPriority w:val="29"/>
     <w:qFormat/>
     <w:pPr>
@@ -41119,10 +41457,10 @@
       <w:color w:val="404040" w:themeColor="text1" w:themeTint="BF"/>
     </w:rPr>
   </w:style>
-  <w:style w:type="character" w:styleId="869">
+  <w:style w:type="character" w:styleId="871">
     <w:name w:val="Quote Char"/>
-    <w:basedOn w:val="854"/>
-    <w:link w:val="868"/>
+    <w:basedOn w:val="856"/>
+    <w:link w:val="870"/>
     <w:uiPriority w:val="29"/>
     <w:pPr>
       <w:pBdr/>
@@ -41135,9 +41473,9 @@
       <w:color w:val="404040" w:themeColor="text1" w:themeTint="BF"/>
     </w:rPr>
   </w:style>
-  <w:style w:type="character" w:styleId="870">
+  <w:style w:type="character" w:styleId="872">
     <w:name w:val="Intense Emphasis"/>
-    <w:basedOn w:val="854"/>
+    <w:basedOn w:val="856"/>
     <w:uiPriority w:val="21"/>
     <w:qFormat/>
     <w:pPr>
@@ -41151,11 +41489,11 @@
       <w:color w:val="0f4761" w:themeColor="accent1" w:themeShade="BF"/>
     </w:rPr>
   </w:style>
-  <w:style w:type="paragraph" w:styleId="871">
+  <w:style w:type="paragraph" w:styleId="873">
     <w:name w:val="Intense Quote"/>
-    <w:basedOn w:val="904"/>
-    <w:next w:val="904"/>
-    <w:link w:val="872"/>
+    <w:basedOn w:val="906"/>
+    <w:next w:val="906"/>
+    <w:link w:val="874"/>
     <w:uiPriority w:val="30"/>
     <w:qFormat/>
     <w:pPr>
@@ -41173,10 +41511,10 @@
       <w:color w:val="0f4761" w:themeColor="accent1" w:themeShade="BF"/>
     </w:rPr>
   </w:style>
-  <w:style w:type="character" w:styleId="872">
+  <w:style w:type="character" w:styleId="874">
     <w:name w:val="Intense Quote Char"/>
-    <w:basedOn w:val="854"/>
-    <w:link w:val="871"/>
+    <w:basedOn w:val="856"/>
+    <w:link w:val="873"/>
     <w:uiPriority w:val="30"/>
     <w:pPr>
       <w:pBdr/>
@@ -41189,9 +41527,9 @@
       <w:color w:val="0f4761" w:themeColor="accent1" w:themeShade="BF"/>
     </w:rPr>
   </w:style>
-  <w:style w:type="character" w:styleId="873">
+  <w:style w:type="character" w:styleId="875">
     <w:name w:val="Intense Reference"/>
-    <w:basedOn w:val="854"/>
+    <w:basedOn w:val="856"/>
     <w:uiPriority w:val="32"/>
     <w:qFormat/>
     <w:pPr>
@@ -41207,9 +41545,9 @@
       <w:spacing w:val="5"/>
     </w:rPr>
   </w:style>
-  <w:style w:type="character" w:styleId="874">
+  <w:style w:type="character" w:styleId="876">
     <w:name w:val="Subtle Emphasis"/>
-    <w:basedOn w:val="854"/>
+    <w:basedOn w:val="856"/>
     <w:uiPriority w:val="19"/>
     <w:qFormat/>
     <w:pPr>
@@ -41223,9 +41561,9 @@
       <w:color w:val="404040" w:themeColor="text1" w:themeTint="BF"/>
     </w:rPr>
   </w:style>
-  <w:style w:type="character" w:styleId="875">
+  <w:style w:type="character" w:styleId="877">
     <w:name w:val="Emphasis"/>
-    <w:basedOn w:val="854"/>
+    <w:basedOn w:val="856"/>
     <w:uiPriority w:val="20"/>
     <w:qFormat/>
     <w:pPr>
@@ -41238,9 +41576,9 @@
       <w:iCs/>
     </w:rPr>
   </w:style>
-  <w:style w:type="character" w:styleId="876">
+  <w:style w:type="character" w:styleId="878">
     <w:name w:val="Strong"/>
-    <w:basedOn w:val="854"/>
+    <w:basedOn w:val="856"/>
     <w:uiPriority w:val="22"/>
     <w:qFormat/>
     <w:pPr>
@@ -41253,9 +41591,9 @@
       <w:bCs/>
     </w:rPr>
   </w:style>
-  <w:style w:type="character" w:styleId="877">
+  <w:style w:type="character" w:styleId="879">
     <w:name w:val="Subtle Reference"/>
-    <w:basedOn w:val="854"/>
+    <w:basedOn w:val="856"/>
     <w:uiPriority w:val="31"/>
     <w:qFormat/>
     <w:pPr>
@@ -41268,9 +41606,9 @@
       <w:color w:val="5a5a5a" w:themeColor="text1" w:themeTint="A5"/>
     </w:rPr>
   </w:style>
-  <w:style w:type="character" w:styleId="878">
+  <w:style w:type="character" w:styleId="880">
     <w:name w:val="Book Title"/>
-    <w:basedOn w:val="854"/>
+    <w:basedOn w:val="856"/>
     <w:uiPriority w:val="33"/>
     <w:qFormat/>
     <w:pPr>
@@ -41286,36 +41624,9 @@
       <w:spacing w:val="5"/>
     </w:rPr>
   </w:style>
-  <w:style w:type="paragraph" w:styleId="879">
+  <w:style w:type="paragraph" w:styleId="881">
     <w:name w:val="Header"/>
-    <w:basedOn w:val="904"/>
-    <w:link w:val="880"/>
-    <w:uiPriority w:val="99"/>
-    <w:unhideWhenUsed/>
-    <w:pPr>
-      <w:pBdr/>
-      <w:tabs>
-        <w:tab w:val="center" w:leader="none" w:pos="4844"/>
-        <w:tab w:val="right" w:leader="none" w:pos="9689"/>
-      </w:tabs>
-      <w:spacing w:after="0" w:line="240" w:lineRule="auto"/>
-      <w:ind/>
-    </w:pPr>
-  </w:style>
-  <w:style w:type="character" w:styleId="880">
-    <w:name w:val="Header Char"/>
-    <w:basedOn w:val="854"/>
-    <w:link w:val="879"/>
-    <w:uiPriority w:val="99"/>
-    <w:pPr>
-      <w:pBdr/>
-      <w:spacing/>
-      <w:ind/>
-    </w:pPr>
-  </w:style>
-  <w:style w:type="paragraph" w:styleId="881">
-    <w:name w:val="Footer"/>
-    <w:basedOn w:val="904"/>
+    <w:basedOn w:val="906"/>
     <w:link w:val="882"/>
     <w:uiPriority w:val="99"/>
     <w:unhideWhenUsed/>
@@ -41330,8 +41641,8 @@
     </w:pPr>
   </w:style>
   <w:style w:type="character" w:styleId="882">
-    <w:name w:val="Footer Char"/>
-    <w:basedOn w:val="854"/>
+    <w:name w:val="Header Char"/>
+    <w:basedOn w:val="856"/>
     <w:link w:val="881"/>
     <w:uiPriority w:val="99"/>
     <w:pPr>
@@ -41341,9 +41652,36 @@
     </w:pPr>
   </w:style>
   <w:style w:type="paragraph" w:styleId="883">
+    <w:name w:val="Footer"/>
+    <w:basedOn w:val="906"/>
+    <w:link w:val="884"/>
+    <w:uiPriority w:val="99"/>
+    <w:unhideWhenUsed/>
+    <w:pPr>
+      <w:pBdr/>
+      <w:tabs>
+        <w:tab w:val="center" w:leader="none" w:pos="4844"/>
+        <w:tab w:val="right" w:leader="none" w:pos="9689"/>
+      </w:tabs>
+      <w:spacing w:after="0" w:line="240" w:lineRule="auto"/>
+      <w:ind/>
+    </w:pPr>
+  </w:style>
+  <w:style w:type="character" w:styleId="884">
+    <w:name w:val="Footer Char"/>
+    <w:basedOn w:val="856"/>
+    <w:link w:val="883"/>
+    <w:uiPriority w:val="99"/>
+    <w:pPr>
+      <w:pBdr/>
+      <w:spacing/>
+      <w:ind/>
+    </w:pPr>
+  </w:style>
+  <w:style w:type="paragraph" w:styleId="885">
     <w:name w:val="Caption"/>
-    <w:basedOn w:val="904"/>
-    <w:next w:val="904"/>
+    <w:basedOn w:val="906"/>
+    <w:next w:val="906"/>
     <w:uiPriority w:val="35"/>
     <w:unhideWhenUsed/>
     <w:qFormat/>
@@ -41360,10 +41698,10 @@
       <w:szCs w:val="18"/>
     </w:rPr>
   </w:style>
-  <w:style w:type="paragraph" w:styleId="884">
+  <w:style w:type="paragraph" w:styleId="886">
     <w:name w:val="footnote text"/>
-    <w:basedOn w:val="904"/>
-    <w:link w:val="885"/>
+    <w:basedOn w:val="906"/>
+    <w:link w:val="887"/>
     <w:uiPriority w:val="99"/>
     <w:semiHidden/>
     <w:unhideWhenUsed/>
@@ -41377,10 +41715,10 @@
       <w:szCs w:val="20"/>
     </w:rPr>
   </w:style>
-  <w:style w:type="character" w:styleId="885">
+  <w:style w:type="character" w:styleId="887">
     <w:name w:val="Footnote Text Char"/>
-    <w:basedOn w:val="854"/>
-    <w:link w:val="884"/>
+    <w:basedOn w:val="856"/>
+    <w:link w:val="886"/>
     <w:uiPriority w:val="99"/>
     <w:semiHidden/>
     <w:pPr>
@@ -41393,9 +41731,9 @@
       <w:szCs w:val="20"/>
     </w:rPr>
   </w:style>
-  <w:style w:type="character" w:styleId="886">
+  <w:style w:type="character" w:styleId="888">
     <w:name w:val="footnote reference"/>
-    <w:basedOn w:val="854"/>
+    <w:basedOn w:val="856"/>
     <w:uiPriority w:val="99"/>
     <w:semiHidden/>
     <w:unhideWhenUsed/>
@@ -41408,10 +41746,10 @@
       <w:vertAlign w:val="superscript"/>
     </w:rPr>
   </w:style>
-  <w:style w:type="paragraph" w:styleId="887">
+  <w:style w:type="paragraph" w:styleId="889">
     <w:name w:val="endnote text"/>
-    <w:basedOn w:val="904"/>
-    <w:link w:val="888"/>
+    <w:basedOn w:val="906"/>
+    <w:link w:val="890"/>
     <w:uiPriority w:val="99"/>
     <w:semiHidden/>
     <w:unhideWhenUsed/>
@@ -41425,10 +41763,10 @@
       <w:szCs w:val="20"/>
     </w:rPr>
   </w:style>
-  <w:style w:type="character" w:styleId="888">
+  <w:style w:type="character" w:styleId="890">
     <w:name w:val="Endnote Text Char"/>
-    <w:basedOn w:val="854"/>
-    <w:link w:val="887"/>
+    <w:basedOn w:val="856"/>
+    <w:link w:val="889"/>
     <w:uiPriority w:val="99"/>
     <w:semiHidden/>
     <w:pPr>
@@ -41441,9 +41779,9 @@
       <w:szCs w:val="20"/>
     </w:rPr>
   </w:style>
-  <w:style w:type="character" w:styleId="889">
+  <w:style w:type="character" w:styleId="891">
     <w:name w:val="endnote reference"/>
-    <w:basedOn w:val="854"/>
+    <w:basedOn w:val="856"/>
     <w:uiPriority w:val="99"/>
     <w:semiHidden/>
     <w:unhideWhenUsed/>
@@ -41456,9 +41794,9 @@
       <w:vertAlign w:val="superscript"/>
     </w:rPr>
   </w:style>
-  <w:style w:type="character" w:styleId="890">
+  <w:style w:type="character" w:styleId="892">
     <w:name w:val="Hyperlink"/>
-    <w:basedOn w:val="854"/>
+    <w:basedOn w:val="856"/>
     <w:uiPriority w:val="99"/>
     <w:unhideWhenUsed/>
     <w:pPr>
@@ -41471,9 +41809,9 @@
       <w:u w:val="single"/>
     </w:rPr>
   </w:style>
-  <w:style w:type="character" w:styleId="891">
+  <w:style w:type="character" w:styleId="893">
     <w:name w:val="FollowedHyperlink"/>
-    <w:basedOn w:val="854"/>
+    <w:basedOn w:val="856"/>
     <w:uiPriority w:val="99"/>
     <w:semiHidden/>
     <w:unhideWhenUsed/>
@@ -41487,10 +41825,10 @@
       <w:u w:val="single"/>
     </w:rPr>
   </w:style>
-  <w:style w:type="paragraph" w:styleId="892">
+  <w:style w:type="paragraph" w:styleId="894">
     <w:name w:val="toc 1"/>
-    <w:basedOn w:val="904"/>
-    <w:next w:val="904"/>
+    <w:basedOn w:val="906"/>
+    <w:next w:val="906"/>
     <w:uiPriority w:val="39"/>
     <w:unhideWhenUsed/>
     <w:pPr>
@@ -41503,10 +41841,10 @@
       <w:u w:val="single"/>
     </w:rPr>
   </w:style>
-  <w:style w:type="paragraph" w:styleId="893">
+  <w:style w:type="paragraph" w:styleId="895">
     <w:name w:val="toc 2"/>
-    <w:basedOn w:val="904"/>
-    <w:next w:val="904"/>
+    <w:basedOn w:val="906"/>
+    <w:next w:val="906"/>
     <w:uiPriority w:val="39"/>
     <w:unhideWhenUsed/>
     <w:pPr>
@@ -41519,10 +41857,10 @@
       <w:u w:val="single"/>
     </w:rPr>
   </w:style>
-  <w:style w:type="paragraph" w:styleId="894">
+  <w:style w:type="paragraph" w:styleId="896">
     <w:name w:val="toc 3"/>
-    <w:basedOn w:val="904"/>
-    <w:next w:val="904"/>
+    <w:basedOn w:val="906"/>
+    <w:next w:val="906"/>
     <w:uiPriority w:val="39"/>
     <w:unhideWhenUsed/>
     <w:pPr>
@@ -41535,10 +41873,10 @@
       <w:u w:val="single"/>
     </w:rPr>
   </w:style>
-  <w:style w:type="paragraph" w:styleId="895">
+  <w:style w:type="paragraph" w:styleId="897">
     <w:name w:val="toc 4"/>
-    <w:basedOn w:val="904"/>
-    <w:next w:val="904"/>
+    <w:basedOn w:val="906"/>
+    <w:next w:val="906"/>
     <w:uiPriority w:val="39"/>
     <w:unhideWhenUsed/>
     <w:pPr>
@@ -41551,10 +41889,10 @@
       <w:u w:val="single"/>
     </w:rPr>
   </w:style>
-  <w:style w:type="paragraph" w:styleId="896">
+  <w:style w:type="paragraph" w:styleId="898">
     <w:name w:val="toc 5"/>
-    <w:basedOn w:val="904"/>
-    <w:next w:val="904"/>
+    <w:basedOn w:val="906"/>
+    <w:next w:val="906"/>
     <w:uiPriority w:val="39"/>
     <w:unhideWhenUsed/>
     <w:pPr>
@@ -41567,10 +41905,10 @@
       <w:u w:val="single"/>
     </w:rPr>
   </w:style>
-  <w:style w:type="paragraph" w:styleId="897">
+  <w:style w:type="paragraph" w:styleId="899">
     <w:name w:val="toc 6"/>
-    <w:basedOn w:val="904"/>
-    <w:next w:val="904"/>
+    <w:basedOn w:val="906"/>
+    <w:next w:val="906"/>
     <w:uiPriority w:val="39"/>
     <w:unhideWhenUsed/>
     <w:pPr>
@@ -41583,10 +41921,10 @@
       <w:u w:val="single"/>
     </w:rPr>
   </w:style>
-  <w:style w:type="paragraph" w:styleId="898">
+  <w:style w:type="paragraph" w:styleId="900">
     <w:name w:val="toc 7"/>
-    <w:basedOn w:val="904"/>
-    <w:next w:val="904"/>
+    <w:basedOn w:val="906"/>
+    <w:next w:val="906"/>
     <w:uiPriority w:val="39"/>
     <w:unhideWhenUsed/>
     <w:pPr>
@@ -41599,10 +41937,10 @@
       <w:u w:val="single"/>
     </w:rPr>
   </w:style>
-  <w:style w:type="paragraph" w:styleId="899">
+  <w:style w:type="paragraph" w:styleId="901">
     <w:name w:val="toc 8"/>
-    <w:basedOn w:val="904"/>
-    <w:next w:val="904"/>
+    <w:basedOn w:val="906"/>
+    <w:next w:val="906"/>
     <w:uiPriority w:val="39"/>
     <w:unhideWhenUsed/>
     <w:pPr>
@@ -41615,10 +41953,10 @@
       <w:u w:val="single"/>
     </w:rPr>
   </w:style>
-  <w:style w:type="paragraph" w:styleId="900">
+  <w:style w:type="paragraph" w:styleId="902">
     <w:name w:val="toc 9"/>
-    <w:basedOn w:val="904"/>
-    <w:next w:val="904"/>
+    <w:basedOn w:val="906"/>
+    <w:next w:val="906"/>
     <w:uiPriority w:val="39"/>
     <w:unhideWhenUsed/>
     <w:pPr>
@@ -41631,9 +41969,9 @@
       <w:u w:val="single"/>
     </w:rPr>
   </w:style>
-  <w:style w:type="character" w:styleId="901">
+  <w:style w:type="character" w:styleId="903">
     <w:name w:val="Placeholder Text"/>
-    <w:basedOn w:val="854"/>
+    <w:basedOn w:val="856"/>
     <w:uiPriority w:val="99"/>
     <w:semiHidden/>
     <w:pPr>
@@ -41645,7 +41983,7 @@
       <w:color w:val="666666"/>
     </w:rPr>
   </w:style>
-  <w:style w:type="paragraph" w:styleId="902">
+  <w:style w:type="paragraph" w:styleId="904">
     <w:name w:val="TOC Heading"/>
     <w:uiPriority w:val="39"/>
     <w:unhideWhenUsed/>
@@ -41655,10 +41993,10 @@
       <w:ind/>
     </w:pPr>
   </w:style>
-  <w:style w:type="paragraph" w:styleId="903">
+  <w:style w:type="paragraph" w:styleId="905">
     <w:name w:val="table of figures"/>
-    <w:basedOn w:val="904"/>
-    <w:next w:val="904"/>
+    <w:basedOn w:val="906"/>
+    <w:next w:val="906"/>
     <w:uiPriority w:val="99"/>
     <w:unhideWhenUsed/>
     <w:pPr>
@@ -41667,7 +42005,7 @@
       <w:ind/>
     </w:pPr>
   </w:style>
-  <w:style w:type="paragraph" w:styleId="904" w:default="1">
+  <w:style w:type="paragraph" w:styleId="906" w:default="1">
     <w:name w:val="Normal"/>
     <w:qFormat/>
     <w:pPr>
@@ -41676,7 +42014,7 @@
       <w:ind/>
     </w:pPr>
   </w:style>
-  <w:style w:type="table" w:styleId="905" w:default="1">
+  <w:style w:type="table" w:styleId="907" w:default="1">
     <w:name w:val="Normal Table"/>
     <w:uiPriority w:val="99"/>
     <w:semiHidden/>
@@ -41869,7 +42207,7 @@
       </w:tcPr>
     </w:tblStylePr>
   </w:style>
-  <w:style w:type="numbering" w:styleId="906" w:default="1">
+  <w:style w:type="numbering" w:styleId="908" w:default="1">
     <w:name w:val="No List"/>
     <w:uiPriority w:val="99"/>
     <w:semiHidden/>
@@ -41880,9 +42218,9 @@
       <w:ind/>
     </w:pPr>
   </w:style>
-  <w:style w:type="paragraph" w:styleId="907">
+  <w:style w:type="paragraph" w:styleId="909">
     <w:name w:val="No Spacing"/>
-    <w:basedOn w:val="904"/>
+    <w:basedOn w:val="906"/>
     <w:uiPriority w:val="1"/>
     <w:qFormat/>
     <w:pPr>
@@ -41891,9 +42229,9 @@
       <w:ind/>
     </w:pPr>
   </w:style>
-  <w:style w:type="paragraph" w:styleId="908">
+  <w:style w:type="paragraph" w:styleId="910">
     <w:name w:val="List Paragraph"/>
-    <w:basedOn w:val="904"/>
+    <w:basedOn w:val="906"/>
     <w:uiPriority w:val="34"/>
     <w:qFormat/>
     <w:pPr>

</xml_diff>

<commit_message>
Arreglo en las fichas de mi tetris a la hora de escoger una varible random, asi como tambien arreglo en la documentacion
</commit_message>
<xml_diff>
--- a/Documentacion_Desafio1.docx
+++ b/Documentacion_Desafio1.docx
@@ -8867,7 +8867,7 @@
             <m:rPr>
               <m:sty m:val="i"/>
             </m:rPr>
-            <m:t>tablero[alto][byte por fila]</m:t>
+            <m:t>tablero[alto][ancho_bits]</m:t>
           </m:r>
         </m:oMath>
       </m:oMathPara>
@@ -9127,6 +9127,7 @@
         <w:jc w:val="center"/>
         <w:rPr>
           <w:rFonts w:ascii="Asana Math" w:hAnsi="Asana Math" w:eastAsia="Asana Math" w:cs="Asana Math"/>
+          <w:highlight w:val="none"/>
           <w:lang w:val="es-ES"/>
         </w:rPr>
       </w:pPr>
@@ -9142,34 +9143,99 @@
           <w:rFonts w:ascii="Asana Math" w:hAnsi="Asana Math" w:eastAsia="Asana Math" w:cs="Asana Math"/>
           <w:lang w:val="es-ES"/>
         </w:rPr>
-        <w:t xml:space="preserve">el bit masking por ejemplo 2x2, 3x3 , 4x4, y ya  con esto estoy indexado</w:t>
-      </w:r>
-      <w:r>
-        <w:rPr>
-          <w:rFonts w:ascii="Asana Math" w:hAnsi="Asana Math" w:eastAsia="Asana Math" w:cs="Asana Math"/>
-          <w:highlight w:val="none"/>
+        <w:t xml:space="preserve">el bit masking por ejemplo 2x2, 3x3 , 4x4, y ya  con esto estoy indexado.</w:t>
+      </w:r>
+      <w:r>
+        <w:rPr>
+          <w:rFonts w:ascii="Asana Math" w:hAnsi="Asana Math" w:eastAsia="Asana Math" w:cs="Asana Math"/>
           <w:lang w:val="es-ES"/>
         </w:rPr>
       </w:r>
     </w:p>
     <w:p>
       <w:pPr>
-        <w:pBdr/>
+        <w:suppressLineNumbers w:val="false"/>
+        <w:pBdr>
+          <w:top w:val="single" w:color="000000" w:sz="4" w:space="0"/>
+          <w:left w:val="single" w:color="000000" w:sz="4" w:space="0"/>
+          <w:bottom w:val="single" w:color="000000" w:sz="4" w:space="0"/>
+          <w:right w:val="single" w:color="000000" w:sz="4" w:space="0"/>
+          <w:between w:val="none" w:color="000000" w:sz="4" w:space="0"/>
+        </w:pBdr>
         <w:spacing/>
         <w:ind/>
         <w:jc w:val="center"/>
         <w:rPr>
           <w:rFonts w:ascii="Asana Math" w:hAnsi="Asana Math" w:eastAsia="Asana Math" w:cs="Asana Math"/>
-          <w:highlight w:val="none"/>
+          <w:color w:val="ff0000"/>
+        </w:rPr>
+      </w:pPr>
+      <w:r>
+        <w:rPr>
+          <w:rFonts w:ascii="Asana Math" w:hAnsi="Asana Math" w:eastAsia="Asana Math" w:cs="Asana Math"/>
+          <w:color w:val="ff0000"/>
           <w:lang w:val="es-ES"/>
         </w:rPr>
-      </w:pPr>
-      <w:r>
-        <w:rPr>
-          <w:rFonts w:ascii="Asana Math" w:hAnsi="Asana Math" w:eastAsia="Asana Math" w:cs="Asana Math"/>
-          <w:highlight w:val="none"/>
+        <w:t xml:space="preserve">Debido a problemas en el codigo, todas las fichas deben de ocupar un espacio de matriz de 4x4 aunque algunas unicamente ocupen un espacio de 2x2.</w:t>
+      </w:r>
+      <w:r>
+        <w:rPr>
+          <w:rFonts w:ascii="Asana Math" w:hAnsi="Asana Math" w:eastAsia="Asana Math" w:cs="Asana Math"/>
+          <w:color w:val="ff0000"/>
+        </w:rPr>
+      </w:r>
+    </w:p>
+    <w:p>
+      <w:pPr>
+        <w:pBdr/>
+        <w:spacing/>
+        <w:ind/>
+        <w:jc w:val="center"/>
+        <w:rPr>
+          <w:rFonts w:ascii="Asana Math" w:hAnsi="Asana Math" w:eastAsia="Asana Math" w:cs="Asana Math"/>
           <w:lang w:val="es-ES"/>
         </w:rPr>
+      </w:pPr>
+      <w:r>
+        <w:rPr>
+          <w:rFonts w:ascii="Asana Math" w:hAnsi="Asana Math" w:eastAsia="Asana Math" w:cs="Asana Math"/>
+          <w:highlight w:val="none"/>
+          <w:lang w:val="es-ES" w:bidi="es-ES"/>
+        </w:rPr>
+      </w:r>
+      <w:r>
+        <w:rPr>
+          <w:rFonts w:ascii="Asana Math" w:hAnsi="Asana Math" w:eastAsia="Asana Math" w:cs="Asana Math"/>
+          <w:highlight w:val="none"/>
+          <w:lang w:val="es-ES" w:bidi="es-ES"/>
+        </w:rPr>
+      </w:r>
+      <w:r>
+        <w:rPr>
+          <w:rFonts w:ascii="Asana Math" w:hAnsi="Asana Math" w:eastAsia="Asana Math" w:cs="Asana Math"/>
+          <w:highlight w:val="none"/>
+          <w:lang w:val="es-ES"/>
+        </w:rPr>
+      </w:r>
+    </w:p>
+    <w:p>
+      <w:pPr>
+        <w:pBdr/>
+        <w:spacing/>
+        <w:ind/>
+        <w:jc w:val="center"/>
+        <w:rPr>
+          <w:rFonts w:ascii="Asana Math" w:hAnsi="Asana Math" w:eastAsia="Asana Math" w:cs="Asana Math"/>
+          <w:highlight w:val="none"/>
+          <w:lang w:val="es-ES"/>
+        </w:rPr>
+      </w:pPr>
+      <w:r>
+        <w:rPr>
+          <w:rFonts w:ascii="Asana Math" w:hAnsi="Asana Math" w:eastAsia="Asana Math" w:cs="Asana Math"/>
+          <w:highlight w:val="none"/>
+          <w:lang w:val="es-ES"/>
+        </w:rPr>
         <w:t xml:space="preserve">Pero para mejorar considerablemente mi indexaci</w:t>
       </w:r>
       <w:r>
@@ -9179,6 +9245,13 @@
           <w:lang w:val="es-ES"/>
         </w:rPr>
         <w:t xml:space="preserve">ón puedo utilizar variables de posicion como por ejemplo:</w:t>
+      </w:r>
+      <w:r>
+        <w:rPr>
+          <w:rFonts w:ascii="Asana Math" w:hAnsi="Asana Math" w:eastAsia="Asana Math" w:cs="Asana Math"/>
+          <w:highlight w:val="none"/>
+          <w:lang w:val="es-ES"/>
+        </w:rPr>
       </w:r>
       <w:r>
         <w:rPr>
@@ -9233,7 +9306,7 @@
               <m:endChr m:val=")"/>
               <m:ctrlPr>
                 <w:rPr>
-                  <w:rFonts w:hint="default" w:ascii="Cambria Math" w:hAnsi="Cambria Math" w:eastAsia="Cambria Math" w:cs="Cambria Math"/>
+                  <w:rFonts w:ascii="Cambria Math" w:hAnsi="Cambria Math" w:eastAsia="Cambria Math" w:cs="Cambria Math"/>
                   <w:highlight w:val="none"/>
                   <w:lang w:val="es-ES" w:bidi="es-ES"/>
                 </w:rPr>
@@ -9244,7 +9317,7 @@
                 <m:fPr>
                   <m:ctrlPr>
                     <w:rPr>
-                      <w:rFonts w:hint="default" w:ascii="Cambria Math" w:hAnsi="Cambria Math" w:eastAsia="Cambria Math" w:cs="Cambria Math"/>
+                      <w:rFonts w:ascii="Cambria Math" w:hAnsi="Cambria Math" w:eastAsia="Cambria Math" w:cs="Cambria Math"/>
                       <w:highlight w:val="none"/>
                       <w:lang w:val="es-ES" w:bidi="es-ES"/>
                     </w:rPr>
@@ -9296,14 +9369,13 @@
         <w:rPr>
           <w:rFonts w:ascii="Asana Math" w:hAnsi="Asana Math" w:eastAsia="Asana Math" w:cs="Asana Math"/>
           <w:highlight w:val="none"/>
-          <w:lang w:val="es-ES" w:bidi="es-ES"/>
-        </w:rPr>
-      </w:r>
-      <w:r>
-        <w:rPr>
-          <w:rFonts w:ascii="Asana Math" w:hAnsi="Asana Math" w:eastAsia="Asana Math" w:cs="Asana Math"/>
-          <w:highlight w:val="none"/>
           <w:lang w:val="es-ES"/>
+        </w:rPr>
+      </w:r>
+      <w:r>
+        <w:rPr>
+          <w:rFonts w:ascii="Asana Math" w:hAnsi="Asana Math" w:eastAsia="Asana Math" w:cs="Asana Math"/>
+          <w:highlight w:val="none"/>
         </w:rPr>
       </w:r>
     </w:p>
@@ -9333,7 +9405,13 @@
           <w:lang w:val="es-ES"/>
         </w:rPr>
       </w:r>
-      <w:r/>
+      <w:r>
+        <w:rPr>
+          <w:rFonts w:ascii="Asana Math" w:hAnsi="Asana Math" w:eastAsia="Asana Math" w:cs="Asana Math"/>
+          <w:highlight w:val="none"/>
+          <w:lang w:val="es-ES"/>
+        </w:rPr>
+      </w:r>
     </w:p>
     <w:p>
       <w:pPr>
@@ -9611,6 +9689,13 @@
           <w:lang w:val="es-ES" w:bidi="es-ES"/>
         </w:rPr>
         <w:t xml:space="preserve">cuando nos movemos y comparamos estamos indexando nuestra ficha completa.</w:t>
+      </w:r>
+      <w:r>
+        <w:rPr>
+          <w:rFonts w:ascii="Asana Math" w:hAnsi="Asana Math" w:eastAsia="Asana Math" w:cs="Asana Math"/>
+          <w:highlight w:val="none"/>
+          <w:lang w:val="es-ES" w:bidi="es-ES"/>
+        </w:rPr>
       </w:r>
       <w:r>
         <w:rPr>
@@ -10300,7 +10385,9 @@
       </w:r>
       <w:r>
         <w:rPr>
-          <w:rFonts w:ascii="Asana Math" w:hAnsi="Asana Math" w:cs="Asana Math"/>
+          <w:rFonts w:ascii="Asana Math" w:hAnsi="Asana Math" w:eastAsia="Asana Math" w:cs="Asana Math"/>
+          <w:highlight w:val="none"/>
+          <w:lang w:val="es-ES"/>
         </w:rPr>
       </w:r>
       <w:r>
@@ -10367,7 +10454,7 @@
           <mc:Choice Requires="wpg">
             <w:drawing>
               <wp:inline xmlns:wp="http://schemas.openxmlformats.org/drawingml/2006/wordprocessingDrawing" distT="0" distB="0" distL="0" distR="0">
-                <wp:extent cx="3573518" cy="1962102"/>
+                <wp:extent cx="3573518" cy="1962101"/>
                 <wp:effectExtent l="0" t="0" r="0" b="0"/>
                 <wp:docPr id="18" name=""/>
                 <wp:cNvGraphicFramePr>
@@ -10377,7 +10464,7 @@
                   <a:graphicData uri="http://schemas.openxmlformats.org/drawingml/2006/picture">
                     <pic:pic xmlns:pic="http://schemas.openxmlformats.org/drawingml/2006/picture">
                       <pic:nvPicPr>
-                        <pic:cNvPr id="215351432" name=""/>
+                        <pic:cNvPr id="1966354941" name=""/>
                         <pic:cNvPicPr>
                           <a:picLocks noChangeAspect="1"/>
                         </pic:cNvPicPr>
@@ -10390,7 +10477,7 @@
                       <pic:spPr bwMode="auto">
                         <a:xfrm flipH="0" flipV="0">
                           <a:off x="0" y="0"/>
-                          <a:ext cx="3573518" cy="1962101"/>
+                          <a:ext cx="3573517" cy="1962100"/>
                         </a:xfrm>
                         <a:prstGeom prst="rect">
                           <a:avLst/>
@@ -10438,6 +10525,12 @@
           <w:lang w:val="es-ES"/>
         </w:rPr>
       </w:r>
+      <w:r/>
+      <w:r>
+        <w:rPr>
+          <w:rFonts w:ascii="Asana Math" w:hAnsi="Asana Math" w:cs="Asana Math"/>
+        </w:rPr>
+      </w:r>
       <w:r>
         <w:rPr>
           <w:rFonts w:ascii="Asana Math" w:hAnsi="Asana Math" w:cs="Asana Math"/>
@@ -10517,7 +10610,9 @@
       </w:r>
       <w:r>
         <w:rPr>
-          <w:rFonts w:ascii="Asana Math" w:hAnsi="Asana Math" w:cs="Asana Math"/>
+          <w:rFonts w:ascii="Asana Math" w:hAnsi="Asana Math" w:eastAsia="Asana Math" w:cs="Asana Math"/>
+          <w:highlight w:val="none"/>
+          <w:lang w:val="es-ES"/>
         </w:rPr>
       </w:r>
       <w:r>
@@ -10608,7 +10703,8 @@
       </m:oMathPara>
       <w:r>
         <w:rPr>
-          <w:rFonts w:ascii="Asana Math" w:hAnsi="Asana Math" w:cs="Asana Math"/>
+          <w:rFonts w:ascii="Asana Math" w:hAnsi="Asana Math" w:eastAsia="Asana Math" w:cs="Asana Math"/>
+          <w:highlight w:val="none"/>
         </w:rPr>
       </w:r>
       <w:r>
@@ -10655,7 +10751,9 @@
       </w:r>
       <w:r>
         <w:rPr>
-          <w:rFonts w:ascii="Asana Math" w:hAnsi="Asana Math" w:cs="Asana Math"/>
+          <w:rFonts w:ascii="Asana Math" w:hAnsi="Asana Math" w:eastAsia="Asana Math" w:cs="Asana Math"/>
+          <w:highlight w:val="none"/>
+          <w:lang w:val="es-ES"/>
         </w:rPr>
       </w:r>
       <w:r>
@@ -10688,7 +10786,9 @@
       </w:r>
       <w:r>
         <w:rPr>
-          <w:rFonts w:ascii="Asana Math" w:hAnsi="Asana Math" w:cs="Asana Math"/>
+          <w:rFonts w:ascii="Asana Math" w:hAnsi="Asana Math" w:eastAsia="Asana Math" w:cs="Asana Math"/>
+          <w:highlight w:val="none"/>
+          <w:lang w:val="es-ES"/>
         </w:rPr>
       </w:r>
       <w:r>
@@ -10725,13 +10825,6 @@
       </w:r>
       <w:r>
         <w:rPr>
-          <w:rFonts w:ascii="Asana Math" w:hAnsi="Asana Math" w:cs="Asana Math"/>
-          <w:sz w:val="20"/>
-          <w:szCs w:val="20"/>
-        </w:rPr>
-      </w:r>
-      <w:r>
-        <w:rPr>
           <w:rFonts w:ascii="Asana Math" w:hAnsi="Asana Math" w:eastAsia="Asana Math" w:cs="Asana Math"/>
           <w:sz w:val="24"/>
           <w:szCs w:val="24"/>
@@ -10739,6 +10832,15 @@
           <w:lang w:val="es-ES"/>
         </w:rPr>
       </w:r>
+      <w:r>
+        <w:rPr>
+          <w:rFonts w:ascii="Asana Math" w:hAnsi="Asana Math" w:eastAsia="Asana Math" w:cs="Asana Math"/>
+          <w:sz w:val="24"/>
+          <w:szCs w:val="24"/>
+          <w:highlight w:val="none"/>
+          <w:lang w:val="es-ES"/>
+        </w:rPr>
+      </w:r>
     </w:p>
     <w:p>
       <w:pPr>
@@ -10806,7 +10908,9 @@
       </w:r>
       <w:r>
         <w:rPr>
-          <w:rFonts w:ascii="Asana Math" w:hAnsi="Asana Math" w:cs="Asana Math"/>
+          <w:b/>
+          <w:bCs/>
+          <w:highlight w:val="none"/>
         </w:rPr>
       </w:r>
       <w:r>
@@ -11024,6 +11128,11 @@
           <w:lang w:val="es-ES"/>
         </w:rPr>
         <w:t xml:space="preserve"> esto inmediatamente me movera las fichas.</w:t>
+      </w:r>
+      <w:r>
+        <w:rPr>
+          <w:rFonts w:ascii="Asana Math" w:hAnsi="Asana Math" w:cs="Asana Math"/>
+        </w:rPr>
       </w:r>
       <w:r>
         <w:rPr>

</xml_diff>

<commit_message>
Edicion Documento parte de la creación del tablero
</commit_message>
<xml_diff>
--- a/Documentacion_Desafio1.docx
+++ b/Documentacion_Desafio1.docx
@@ -2039,49 +2039,40 @@
         <w:ind/>
         <w:jc w:val="center"/>
         <w:rPr>
-          <w:rFonts w:ascii="Asana Math" w:hAnsi="Asana Math" w:eastAsia="Asana Math" w:cs="Asana Math"/>
-          <w:sz w:val="28"/>
-          <w:szCs w:val="28"/>
-          <w:highlight w:val="none"/>
-          <w:lang w:val="es-ES"/>
-        </w:rPr>
-      </w:pPr>
-      <w:r>
-        <w:rPr>
-          <w:rFonts w:ascii="Asana Math" w:hAnsi="Asana Math" w:eastAsia="Asana Math" w:cs="Asana Math"/>
-          <w:sz w:val="28"/>
-          <w:szCs w:val="28"/>
-          <w:highlight w:val="none"/>
-          <w:lang w:val="es-ES"/>
+          <w:rFonts w:ascii="Times New Roman" w:hAnsi="Times New Roman" w:cs="Times New Roman"/>
+          <w:b/>
+          <w:bCs/>
+          <w:i/>
+          <w:sz w:val="24"/>
+          <w:szCs w:val="24"/>
+          <w:u w:val="single"/>
+        </w:rPr>
+      </w:pPr>
+      <w:r>
+        <w:rPr>
+          <w:rFonts w:ascii="Times New Roman" w:hAnsi="Times New Roman" w:eastAsia="Times New Roman" w:cs="Times New Roman"/>
+          <w:b/>
+          <w:bCs/>
+          <w:i/>
+          <w:iCs/>
+          <w:sz w:val="24"/>
+          <w:szCs w:val="24"/>
+          <w:highlight w:val="none"/>
+          <w:u w:val="single"/>
+          <w:lang w:val="es-ES" w:bidi="es-ES"/>
         </w:rPr>
         <w:t xml:space="preserve">EL TABLERO</w:t>
       </w:r>
       <w:r>
         <w:rPr>
-          <w:rFonts w:ascii="Asana Math" w:hAnsi="Asana Math" w:eastAsia="Asana Math" w:cs="Asana Math"/>
-          <w:sz w:val="28"/>
-          <w:szCs w:val="28"/>
-          <w:highlight w:val="none"/>
-          <w:lang w:val="es-ES"/>
-        </w:rPr>
-        <w:t xml:space="preserve">.</w:t>
-      </w:r>
-      <w:r>
-        <w:rPr>
-          <w:rFonts w:ascii="Asana Math" w:hAnsi="Asana Math" w:eastAsia="Asana Math" w:cs="Asana Math"/>
-          <w:sz w:val="28"/>
-          <w:szCs w:val="28"/>
-          <w:highlight w:val="none"/>
-          <w:lang w:val="es-ES"/>
-        </w:rPr>
-      </w:r>
-      <w:r>
-        <w:rPr>
-          <w:rFonts w:ascii="Asana Math" w:hAnsi="Asana Math" w:eastAsia="Asana Math" w:cs="Asana Math"/>
-          <w:sz w:val="28"/>
-          <w:szCs w:val="28"/>
-          <w:highlight w:val="none"/>
-          <w:lang w:val="es-ES"/>
+          <w:rFonts w:ascii="Times New Roman" w:hAnsi="Times New Roman" w:eastAsia="Times New Roman" w:cs="Times New Roman"/>
+          <w:b/>
+          <w:bCs/>
+          <w:i/>
+          <w:iCs/>
+          <w:sz w:val="24"/>
+          <w:szCs w:val="24"/>
+          <w:u w:val="single"/>
         </w:rPr>
       </w:r>
     </w:p>
@@ -2092,38 +2083,22 @@
         <w:ind/>
         <w:jc w:val="center"/>
         <w:rPr>
-          <w:rFonts w:ascii="Asana Math" w:hAnsi="Asana Math" w:eastAsia="Asana Math" w:cs="Asana Math"/>
-          <w:sz w:val="28"/>
-          <w:szCs w:val="28"/>
-          <w:highlight w:val="none"/>
-          <w:lang w:val="es-ES"/>
-        </w:rPr>
-      </w:pPr>
-      <w:r>
-        <w:rPr>
-          <w:rFonts w:ascii="Asana Math" w:hAnsi="Asana Math" w:eastAsia="Asana Math" w:cs="Asana Math"/>
-          <w:sz w:val="28"/>
-          <w:szCs w:val="28"/>
+          <w:rFonts w:ascii="Times New Roman" w:hAnsi="Times New Roman" w:cs="Times New Roman"/>
+        </w:rPr>
+      </w:pPr>
+      <w:r>
+        <w:rPr>
+          <w:rFonts w:ascii="Times New Roman" w:hAnsi="Times New Roman" w:eastAsia="Times New Roman" w:cs="Times New Roman"/>
+          <w:sz w:val="22"/>
+          <w:szCs w:val="22"/>
           <w:highlight w:val="none"/>
           <w:lang w:val="es-ES" w:bidi="es-ES"/>
         </w:rPr>
-      </w:r>
-      <w:r>
-        <w:rPr>
-          <w:rFonts w:ascii="Asana Math" w:hAnsi="Asana Math" w:eastAsia="Asana Math" w:cs="Asana Math"/>
-          <w:sz w:val="28"/>
-          <w:szCs w:val="28"/>
-          <w:highlight w:val="none"/>
-          <w:lang w:val="es-ES"/>
-        </w:rPr>
-      </w:r>
-      <w:r>
-        <w:rPr>
-          <w:rFonts w:ascii="Asana Math" w:hAnsi="Asana Math" w:eastAsia="Asana Math" w:cs="Asana Math"/>
-          <w:sz w:val="28"/>
-          <w:szCs w:val="28"/>
-          <w:highlight w:val="none"/>
-          <w:lang w:val="es-ES"/>
+        <w:t xml:space="preserve">¿Cómo puedo hacer y representar el tablero mediante caracteres "." y "#" cumpliendo las condiciones dadas?</w:t>
+      </w:r>
+      <w:r>
+        <w:rPr>
+          <w:rFonts w:ascii="Times New Roman" w:hAnsi="Times New Roman" w:eastAsia="Times New Roman" w:cs="Times New Roman"/>
         </w:rPr>
       </w:r>
     </w:p>
@@ -2134,59 +2109,22 @@
         <w:ind/>
         <w:jc w:val="center"/>
         <w:rPr>
-          <w:rFonts w:ascii="Asana Math" w:hAnsi="Asana Math" w:eastAsia="Asana Math" w:cs="Asana Math"/>
-          <w:sz w:val="28"/>
-          <w:szCs w:val="28"/>
-          <w:highlight w:val="none"/>
-          <w:lang w:val="es-ES"/>
-        </w:rPr>
-      </w:pPr>
-      <w:r>
-        <w:rPr>
-          <w:rFonts w:ascii="Asana Math" w:hAnsi="Asana Math" w:eastAsia="Asana Math" w:cs="Asana Math"/>
-          <w:sz w:val="28"/>
-          <w:szCs w:val="28"/>
+          <w:rFonts w:ascii="Times New Roman" w:hAnsi="Times New Roman" w:cs="Times New Roman"/>
+        </w:rPr>
+      </w:pPr>
+      <w:r>
+        <w:rPr>
+          <w:rFonts w:ascii="Times New Roman" w:hAnsi="Times New Roman" w:eastAsia="Times New Roman" w:cs="Times New Roman"/>
+          <w:sz w:val="22"/>
+          <w:szCs w:val="22"/>
           <w:highlight w:val="none"/>
           <w:lang w:val="es-ES" w:bidi="es-ES"/>
         </w:rPr>
-        <w:t xml:space="preserve">¿C</w:t>
-      </w:r>
-      <w:r>
-        <w:rPr>
-          <w:rFonts w:ascii="Asana Math" w:hAnsi="Asana Math" w:eastAsia="Asana Math" w:cs="Asana Math"/>
-          <w:sz w:val="28"/>
-          <w:szCs w:val="28"/>
-          <w:highlight w:val="none"/>
-          <w:lang w:val="es-ES" w:bidi="es-ES"/>
-        </w:rPr>
-        <w:t xml:space="preserve">ómo puedo hacer y representar al trablero mediante caracteres “.” y “#” cumpliendo las condiciones dadas?</w:t>
-      </w:r>
-      <w:r>
-        <w:rPr>
-          <w:rFonts w:ascii="Asana Math" w:hAnsi="Asana Math" w:eastAsia="Asana Math" w:cs="Asana Math"/>
-          <w:sz w:val="28"/>
-          <w:szCs w:val="28"/>
-          <w:highlight w:val="none"/>
-          <w:lang w:val="es-ES" w:bidi="es-ES"/>
-        </w:rPr>
-        <w:t xml:space="preserve">   </w:t>
-      </w:r>
-      <w:r>
-        <w:rPr>
-          <w:rFonts w:ascii="Asana Math" w:hAnsi="Asana Math" w:eastAsia="Asana Math" w:cs="Asana Math"/>
-          <w:sz w:val="28"/>
-          <w:szCs w:val="28"/>
-          <w:highlight w:val="none"/>
-          <w:lang w:val="es-ES"/>
-        </w:rPr>
-      </w:r>
-      <w:r>
-        <w:rPr>
-          <w:rFonts w:ascii="Asana Math" w:hAnsi="Asana Math" w:eastAsia="Asana Math" w:cs="Asana Math"/>
-          <w:sz w:val="28"/>
-          <w:szCs w:val="28"/>
-          <w:highlight w:val="none"/>
-          <w:lang w:val="es-ES"/>
+        <w:t xml:space="preserve">Realmente no trabajaremos con ese tipo de archivos; esos símbolos char únicamente serán la representación por consola del programa a desarrollar.</w:t>
+      </w:r>
+      <w:r>
+        <w:rPr>
+          <w:rFonts w:ascii="Times New Roman" w:hAnsi="Times New Roman" w:eastAsia="Times New Roman" w:cs="Times New Roman"/>
         </w:rPr>
       </w:r>
     </w:p>
@@ -2197,224 +2135,96 @@
         <w:ind/>
         <w:jc w:val="center"/>
         <w:rPr>
-          <w:rFonts w:ascii="Asana Math" w:hAnsi="Asana Math" w:eastAsia="Asana Math" w:cs="Asana Math"/>
+          <w:rFonts w:ascii="Times New Roman" w:hAnsi="Times New Roman" w:cs="Times New Roman"/>
+        </w:rPr>
+      </w:pPr>
+      <w:r>
+        <w:rPr>
+          <w:rFonts w:ascii="Times New Roman" w:hAnsi="Times New Roman" w:eastAsia="Times New Roman" w:cs="Times New Roman"/>
           <w:sz w:val="22"/>
           <w:szCs w:val="22"/>
           <w:highlight w:val="none"/>
-          <w:lang w:val="es-ES"/>
-        </w:rPr>
-      </w:pPr>
-      <w:r>
-        <w:rPr>
-          <w:rFonts w:ascii="Asana Math" w:hAnsi="Asana Math" w:eastAsia="Asana Math" w:cs="Asana Math"/>
+          <w:lang w:val="es-ES" w:bidi="es-ES"/>
+        </w:rPr>
+        <w:t xml:space="preserve">La verdadera esencia y lo fundamental del tablero es la representación que tendremos y el tipo de variables que utilizaremos para ello. Pero debido a una obligación de entrega, tendremos que trabajar a nivel de bits con operadores bitwise (bit a bit), así q</w:t>
+      </w:r>
+      <w:r>
+        <w:rPr>
+          <w:rFonts w:ascii="Times New Roman" w:hAnsi="Times New Roman" w:eastAsia="Times New Roman" w:cs="Times New Roman"/>
           <w:sz w:val="22"/>
           <w:szCs w:val="22"/>
           <w:highlight w:val="none"/>
           <w:lang w:val="es-ES" w:bidi="es-ES"/>
         </w:rPr>
-        <w:t xml:space="preserve">Realmente no trabajaremos con ese tipo de archivos , esos simbolos char unicamente seran la representacion por consola del programa a desarrollar</w:t>
-      </w:r>
-      <w:r>
-        <w:rPr>
-          <w:rFonts w:ascii="Asana Math" w:hAnsi="Asana Math" w:eastAsia="Asana Math" w:cs="Asana Math"/>
+        <w:t xml:space="preserve">ue la mejor manera de manejarlo es trabajar con enteros, más directamente con su valor binario; es decir, que lo que nos interesa es el manejo de los bits.</w:t>
+      </w:r>
+      <w:r>
+        <w:rPr>
+          <w:rFonts w:ascii="Times New Roman" w:hAnsi="Times New Roman" w:eastAsia="Times New Roman" w:cs="Times New Roman"/>
+        </w:rPr>
+      </w:r>
+    </w:p>
+    <w:p>
+      <w:pPr>
+        <w:pBdr/>
+        <w:spacing/>
+        <w:ind/>
+        <w:jc w:val="center"/>
+        <w:rPr>
+          <w:rFonts w:ascii="Times New Roman" w:hAnsi="Times New Roman" w:cs="Times New Roman"/>
+        </w:rPr>
+      </w:pPr>
+      <w:r>
+        <w:rPr>
+          <w:rFonts w:ascii="Times New Roman" w:hAnsi="Times New Roman" w:eastAsia="Times New Roman" w:cs="Times New Roman"/>
           <w:sz w:val="22"/>
           <w:szCs w:val="22"/>
           <w:highlight w:val="none"/>
-          <w:lang w:val="es-ES"/>
-        </w:rPr>
-        <w:t xml:space="preserve">.</w:t>
-      </w:r>
-      <w:r>
-        <w:rPr>
-          <w:rFonts w:ascii="Asana Math" w:hAnsi="Asana Math" w:eastAsia="Asana Math" w:cs="Asana Math"/>
+          <w:lang w:val="es-ES" w:bidi="es-ES"/>
+        </w:rPr>
+        <w:t xml:space="preserve">Nosotros, por básica informática, sabemos que un entero tiene un valor en bytes que lo define la arquitectura en la que se emplea dicho valor informático, teniendo así que el valor básico informático de un entero es 4 bytes.</w:t>
+      </w:r>
+      <w:r>
+        <w:rPr>
+          <w:rFonts w:ascii="Times New Roman" w:hAnsi="Times New Roman" w:eastAsia="Times New Roman" w:cs="Times New Roman"/>
+        </w:rPr>
+      </w:r>
+    </w:p>
+    <w:p>
+      <w:pPr>
+        <w:pBdr/>
+        <w:spacing/>
+        <w:ind/>
+        <w:jc w:val="center"/>
+        <w:rPr>
+          <w:rFonts w:ascii="Times New Roman" w:hAnsi="Times New Roman" w:cs="Times New Roman"/>
           <w:sz w:val="22"/>
           <w:szCs w:val="22"/>
           <w:highlight w:val="none"/>
-          <w:lang w:val="es-ES"/>
-        </w:rPr>
-      </w:r>
-      <w:r>
-        <w:rPr>
-          <w:rFonts w:ascii="Asana Math" w:hAnsi="Asana Math" w:eastAsia="Asana Math" w:cs="Asana Math"/>
+        </w:rPr>
+      </w:pPr>
+      <w:r>
+        <w:rPr>
+          <w:rFonts w:ascii="Times New Roman" w:hAnsi="Times New Roman" w:eastAsia="Times New Roman" w:cs="Times New Roman"/>
           <w:sz w:val="22"/>
           <w:szCs w:val="22"/>
           <w:highlight w:val="none"/>
-          <w:lang w:val="es-ES"/>
-        </w:rPr>
-      </w:r>
-    </w:p>
-    <w:p>
-      <w:pPr>
-        <w:pBdr/>
-        <w:spacing/>
-        <w:ind/>
-        <w:jc w:val="center"/>
-        <w:rPr>
-          <w:rFonts w:ascii="Asana Math" w:hAnsi="Asana Math" w:eastAsia="Asana Math" w:cs="Asana Math"/>
+          <w:lang w:val="es-ES" w:bidi="es-ES"/>
+        </w:rPr>
+        <w:t xml:space="preserve">4 bytes en binario serían 32 bits disponibles, viéndolo de una forma gráfica.</w:t>
+      </w:r>
+      <w:r>
+        <w:rPr>
+          <w:rFonts w:ascii="Times New Roman" w:hAnsi="Times New Roman" w:eastAsia="Times New Roman" w:cs="Times New Roman"/>
           <w:sz w:val="22"/>
           <w:szCs w:val="22"/>
           <w:highlight w:val="none"/>
-          <w:lang w:val="es-ES"/>
-        </w:rPr>
-      </w:pPr>
-      <w:r>
-        <w:rPr>
-          <w:rFonts w:ascii="Asana Math" w:hAnsi="Asana Math" w:eastAsia="Asana Math" w:cs="Asana Math"/>
-          <w:sz w:val="22"/>
-          <w:szCs w:val="22"/>
-          <w:highlight w:val="none"/>
           <w:lang w:val="es-ES" w:bidi="es-ES"/>
         </w:rPr>
-        <w:t xml:space="preserve">La verdadera escencia y lo fundamental del tablero es la representacion que tendremos </w:t>
-      </w:r>
-      <w:r>
-        <w:rPr>
-          <w:rFonts w:ascii="Asana Math" w:hAnsi="Asana Math" w:eastAsia="Asana Math" w:cs="Asana Math"/>
-          <w:sz w:val="22"/>
-          <w:szCs w:val="22"/>
-          <w:highlight w:val="none"/>
-          <w:lang w:val="es-ES"/>
-        </w:rPr>
-        <w:t xml:space="preserve">y el tipo de variables que utilizaremos para ello; Pero debido a una </w:t>
-      </w:r>
-      <w:r>
-        <w:rPr>
-          <w:rFonts w:ascii="Asana Math" w:hAnsi="Asana Math" w:eastAsia="Asana Math" w:cs="Asana Math"/>
-          <w:sz w:val="22"/>
-          <w:szCs w:val="22"/>
-          <w:highlight w:val="none"/>
-          <w:lang w:val="es-ES"/>
-        </w:rPr>
-        <w:t xml:space="preserve">obligacion de entrega tendremos que  trabajar a nivel de bits con operadores bitwise(Bit a bit) asi que la mejor manera de manejarlo es trabajar con enteros , mas directamente con su valor binario; es decir que lo que nos interesa es el manejo de los bits.</w:t>
-      </w:r>
-      <w:r>
-        <w:rPr>
-          <w:rFonts w:ascii="Asana Math" w:hAnsi="Asana Math" w:eastAsia="Asana Math" w:cs="Asana Math"/>
-          <w:sz w:val="22"/>
-          <w:szCs w:val="22"/>
-          <w:highlight w:val="none"/>
-          <w:lang w:val="es-ES"/>
-        </w:rPr>
-      </w:r>
-      <w:r>
-        <w:rPr>
-          <w:rFonts w:ascii="Asana Math" w:hAnsi="Asana Math" w:eastAsia="Asana Math" w:cs="Asana Math"/>
-          <w:sz w:val="22"/>
-          <w:szCs w:val="22"/>
-          <w:highlight w:val="none"/>
-          <w:lang w:val="es-ES"/>
-        </w:rPr>
-      </w:r>
-    </w:p>
-    <w:p>
-      <w:pPr>
-        <w:pBdr/>
-        <w:spacing/>
-        <w:ind/>
-        <w:jc w:val="center"/>
-        <w:rPr>
-          <w:rFonts w:ascii="Asana Math" w:hAnsi="Asana Math" w:eastAsia="Asana Math" w:cs="Asana Math"/>
-          <w:sz w:val="22"/>
-          <w:szCs w:val="22"/>
-          <w:highlight w:val="none"/>
-          <w:lang w:val="es-ES" w:bidi="es-ES"/>
-        </w:rPr>
-      </w:pPr>
-      <w:r>
-        <w:rPr>
-          <w:rFonts w:ascii="Asana Math" w:hAnsi="Asana Math" w:eastAsia="Asana Math" w:cs="Asana Math"/>
-          <w:sz w:val="22"/>
-          <w:szCs w:val="22"/>
-          <w:highlight w:val="none"/>
-          <w:lang w:val="es-ES" w:bidi="es-ES"/>
-        </w:rPr>
-        <w:t xml:space="preserve">Nosotros por b</w:t>
-      </w:r>
-      <w:r>
-        <w:rPr>
-          <w:rFonts w:ascii="Asana Math" w:hAnsi="Asana Math" w:eastAsia="Asana Math" w:cs="Asana Math"/>
-          <w:sz w:val="22"/>
-          <w:szCs w:val="22"/>
-          <w:highlight w:val="none"/>
-          <w:lang w:val="es-ES" w:bidi="es-ES"/>
-        </w:rPr>
-        <w:t xml:space="preserve">ásica informatica sabemos que un entero tiene un valor en bytes que lo define la arquitectura en la que se emplea dicho valor informatico teniendo asi, que el valor b</w:t>
-      </w:r>
-      <w:r>
-        <w:rPr>
-          <w:rFonts w:ascii="Asana Math" w:hAnsi="Asana Math" w:eastAsia="Asana Math" w:cs="Asana Math"/>
-          <w:sz w:val="22"/>
-          <w:szCs w:val="22"/>
-          <w:highlight w:val="none"/>
-          <w:lang w:val="es-ES" w:bidi="es-ES"/>
-        </w:rPr>
-        <w:t xml:space="preserve">ásico informatico de un entero es 4 byte.</w:t>
-      </w:r>
-      <w:r>
-        <w:rPr>
-          <w:rFonts w:ascii="Asana Math" w:hAnsi="Asana Math" w:eastAsia="Asana Math" w:cs="Asana Math"/>
-          <w:sz w:val="22"/>
-          <w:szCs w:val="22"/>
-          <w:highlight w:val="none"/>
-          <w:lang w:val="es-ES" w:bidi="es-ES"/>
-        </w:rPr>
-      </w:r>
-      <w:r>
-        <w:rPr>
-          <w:rFonts w:ascii="Asana Math" w:hAnsi="Asana Math" w:eastAsia="Asana Math" w:cs="Asana Math"/>
-          <w:sz w:val="22"/>
-          <w:szCs w:val="22"/>
-          <w:highlight w:val="none"/>
-          <w:lang w:val="es-ES" w:bidi="es-ES"/>
-        </w:rPr>
-      </w:r>
-    </w:p>
-    <w:p>
-      <w:pPr>
-        <w:pBdr/>
-        <w:spacing/>
-        <w:ind/>
-        <w:jc w:val="center"/>
-        <w:rPr>
-          <w:rFonts w:ascii="Asana Math" w:hAnsi="Asana Math" w:eastAsia="Asana Math" w:cs="Asana Math"/>
-          <w:sz w:val="22"/>
-          <w:szCs w:val="22"/>
-          <w:highlight w:val="none"/>
-          <w:lang w:val="es-ES" w:bidi="es-ES"/>
-        </w:rPr>
-      </w:pPr>
-      <w:r>
-        <w:rPr>
-          <w:rFonts w:ascii="Asana Math" w:hAnsi="Asana Math" w:eastAsia="Asana Math" w:cs="Asana Math"/>
-          <w:sz w:val="22"/>
-          <w:szCs w:val="22"/>
-          <w:highlight w:val="none"/>
-          <w:lang w:val="es-ES" w:bidi="es-ES"/>
-        </w:rPr>
-        <w:t xml:space="preserve">4 byte en binario serian 32 bits disponibles viendolo de una forma gr</w:t>
-      </w:r>
-      <w:r>
-        <w:rPr>
-          <w:rFonts w:ascii="Asana Math" w:hAnsi="Asana Math" w:eastAsia="Asana Math" w:cs="Asana Math"/>
-          <w:sz w:val="22"/>
-          <w:szCs w:val="22"/>
-          <w:highlight w:val="none"/>
-          <w:lang w:val="es-ES" w:bidi="es-ES"/>
-        </w:rPr>
-        <w:t xml:space="preserve">áfica.</w:t>
-      </w:r>
-      <w:r>
-        <w:rPr>
-          <w:rFonts w:ascii="Asana Math" w:hAnsi="Asana Math" w:eastAsia="Asana Math" w:cs="Asana Math"/>
-          <w:sz w:val="22"/>
-          <w:szCs w:val="22"/>
-          <w:highlight w:val="none"/>
-          <w:lang w:val="es-ES" w:bidi="es-ES"/>
-        </w:rPr>
-      </w:r>
-      <w:r>
-        <w:rPr>
-          <w:rFonts w:ascii="Asana Math" w:hAnsi="Asana Math" w:eastAsia="Asana Math" w:cs="Asana Math"/>
+      </w:r>
+      <w:r>
+        <w:rPr>
+          <w:rFonts w:ascii="Times New Roman" w:hAnsi="Times New Roman" w:eastAsia="Times New Roman" w:cs="Times New Roman"/>
           <w:sz w:val="22"/>
           <w:szCs w:val="22"/>
           <w:highlight w:val="none"/>
@@ -2595,35 +2405,32 @@
         <w:ind/>
         <w:jc w:val="center"/>
         <w:rPr>
-          <w:rFonts w:ascii="Asana Math" w:hAnsi="Asana Math" w:eastAsia="Asana Math" w:cs="Asana Math"/>
-          <w:highlight w:val="none"/>
+          <w:rFonts w:ascii="Times New Roman" w:hAnsi="Times New Roman" w:cs="Times New Roman"/>
+          <w:highlight w:val="none"/>
+        </w:rPr>
+      </w:pPr>
+      <w:r>
+        <w:rPr>
+          <w:rFonts w:ascii="Times New Roman" w:hAnsi="Times New Roman" w:eastAsia="Times New Roman" w:cs="Times New Roman"/>
           <w:lang w:val="es-ES"/>
         </w:rPr>
-      </w:pPr>
-      <w:r>
-        <w:rPr>
-          <w:rFonts w:ascii="Asana Math" w:hAnsi="Asana Math" w:eastAsia="Asana Math" w:cs="Asana Math"/>
+      </w:r>
+      <w:r>
+        <w:rPr>
+          <w:rFonts w:ascii="Times New Roman" w:hAnsi="Times New Roman" w:eastAsia="Times New Roman" w:cs="Times New Roman"/>
           <w:lang w:val="es-ES"/>
         </w:rPr>
-        <w:t xml:space="preserve">Si somos los suficientes atentos podemos notar que un entero a nivel de bits se parece a una fila con 32 columnas; Y si nos llevamos esa l</w:t>
-      </w:r>
-      <w:r>
-        <w:rPr>
-          <w:rFonts w:ascii="Asana Math" w:hAnsi="Asana Math" w:eastAsia="Asana Math" w:cs="Asana Math"/>
+        <w:t xml:space="preserve">Si somos los suficientemente atentos, podemos notar que un entero a nivel de bits se parece a una fila con 32 columnas. Y si nos llevamos esa lógica, podemos decir que si tuviéramos 1 byte, tendríamos una fila con 8 columnas.</w:t>
+      </w:r>
+      <w:r>
+        <w:rPr>
+          <w:rFonts w:ascii="Times New Roman" w:hAnsi="Times New Roman" w:eastAsia="Times New Roman" w:cs="Times New Roman"/>
           <w:lang w:val="es-ES"/>
         </w:rPr>
-        <w:t xml:space="preserve">ógica podemos decir que si tuvieras 1 byte tendriamos un fila con 8 columnas </w:t>
-      </w:r>
-      <w:r>
-        <w:rPr>
-          <w:rFonts w:ascii="Asana Math" w:hAnsi="Asana Math" w:eastAsia="Asana Math" w:cs="Asana Math"/>
-          <w:highlight w:val="none"/>
-          <w:lang w:val="es-ES"/>
-        </w:rPr>
-      </w:r>
-      <w:r>
-        <w:rPr>
-          <w:rFonts w:ascii="Asana Math" w:hAnsi="Asana Math" w:eastAsia="Asana Math" w:cs="Asana Math"/>
+      </w:r>
+      <w:r>
+        <w:rPr>
+          <w:rFonts w:ascii="Times New Roman" w:hAnsi="Times New Roman" w:eastAsia="Times New Roman" w:cs="Times New Roman"/>
           <w:highlight w:val="none"/>
           <w:lang w:val="es-ES"/>
         </w:rPr>
@@ -2779,39 +2586,20 @@
         <w:ind/>
         <w:jc w:val="center"/>
         <w:rPr>
-          <w:rFonts w:ascii="Asana Math" w:hAnsi="Asana Math" w:eastAsia="Asana Math" w:cs="Asana Math"/>
+          <w:rFonts w:ascii="Times New Roman" w:hAnsi="Times New Roman" w:cs="Times New Roman"/>
+        </w:rPr>
+      </w:pPr>
+      <w:r>
+        <w:rPr>
+          <w:rFonts w:ascii="Times New Roman" w:hAnsi="Times New Roman" w:eastAsia="Times New Roman" w:cs="Times New Roman"/>
           <w:highlight w:val="none"/>
           <w:lang w:val="es-ES"/>
         </w:rPr>
-      </w:pPr>
-      <w:r>
-        <w:rPr>
-          <w:rFonts w:ascii="Asana Math" w:hAnsi="Asana Math" w:eastAsia="Asana Math" w:cs="Asana Math"/>
-          <w:highlight w:val="none"/>
-          <w:lang w:val="es-ES"/>
-        </w:rPr>
-        <w:t xml:space="preserve">Entonces nuestra l</w:t>
-      </w:r>
-      <w:r>
-        <w:rPr>
-          <w:rFonts w:ascii="Asana Math" w:hAnsi="Asana Math" w:eastAsia="Asana Math" w:cs="Asana Math"/>
-          <w:highlight w:val="none"/>
-          <w:lang w:val="es-ES"/>
-        </w:rPr>
-        <w:t xml:space="preserve">ógica nos dice que el tipo de variable debe de ser de un 1 byte.</w:t>
-      </w:r>
-      <w:r>
-        <w:rPr>
-          <w:rFonts w:ascii="Asana Math" w:hAnsi="Asana Math" w:eastAsia="Asana Math" w:cs="Asana Math"/>
-          <w:highlight w:val="none"/>
-          <w:lang w:val="es-ES"/>
-        </w:rPr>
-      </w:r>
-      <w:r>
-        <w:rPr>
-          <w:rFonts w:ascii="Asana Math" w:hAnsi="Asana Math" w:eastAsia="Asana Math" w:cs="Asana Math"/>
-          <w:highlight w:val="none"/>
-          <w:lang w:val="es-ES"/>
+        <w:t xml:space="preserve">Entonces, nuestra lógica nos dice que el tipo de variable debe ser de 1 byte. Y esa variable es la variable char → 1 byte.</w:t>
+      </w:r>
+      <w:r>
+        <w:rPr>
+          <w:rFonts w:ascii="Times New Roman" w:hAnsi="Times New Roman" w:eastAsia="Times New Roman" w:cs="Times New Roman"/>
         </w:rPr>
       </w:r>
     </w:p>
@@ -2822,47 +2610,19 @@
         <w:ind/>
         <w:jc w:val="center"/>
         <w:rPr>
-          <w:rFonts w:ascii="Asana Math" w:hAnsi="Asana Math" w:cs="Asana Math"/>
-          <w:highlight w:val="none"/>
-        </w:rPr>
-      </w:pPr>
-      <w:r>
-        <w:rPr>
-          <w:rFonts w:ascii="Asana Math" w:hAnsi="Asana Math" w:eastAsia="Asana Math" w:cs="Asana Math"/>
+          <w:rFonts w:ascii="Times New Roman" w:hAnsi="Times New Roman" w:cs="Times New Roman"/>
+        </w:rPr>
+      </w:pPr>
+      <w:r>
+        <w:rPr>
+          <w:rFonts w:ascii="Times New Roman" w:hAnsi="Times New Roman" w:eastAsia="Times New Roman" w:cs="Times New Roman"/>
           <w:highlight w:val="none"/>
           <w:lang w:val="es-ES"/>
         </w:rPr>
-        <w:t xml:space="preserve">Y esa variables es la variable </w:t>
-      </w:r>
-      <w:r>
-        <w:rPr>
-          <w:rFonts w:ascii="Asana Math" w:hAnsi="Asana Math" w:eastAsia="Asana Math" w:cs="Asana Math"/>
-          <w:b/>
-          <w:bCs/>
-          <w:color w:val="000000" w:themeColor="text1"/>
-          <w:highlight w:val="none"/>
-          <w:lang w:val="es-ES"/>
-        </w:rPr>
-        <w:t xml:space="preserve">char → 1 byte</w:t>
-      </w:r>
-      <w:r>
-        <w:rPr>
-          <w:rFonts w:ascii="Asana Math" w:hAnsi="Asana Math" w:eastAsia="Asana Math" w:cs="Asana Math"/>
-          <w:highlight w:val="none"/>
-          <w:lang w:val="es-ES"/>
-        </w:rPr>
-        <w:t xml:space="preserve">.</w:t>
-      </w:r>
-      <w:r>
-        <w:rPr>
-          <w:rFonts w:ascii="Asana Math" w:hAnsi="Asana Math" w:cs="Asana Math"/>
-          <w:highlight w:val="none"/>
-        </w:rPr>
-      </w:r>
-      <w:r>
-        <w:rPr>
-          <w:rFonts w:ascii="Asana Math" w:hAnsi="Asana Math" w:cs="Asana Math"/>
-          <w:highlight w:val="none"/>
+      </w:r>
+      <w:r>
+        <w:rPr>
+          <w:rFonts w:ascii="Times New Roman" w:hAnsi="Times New Roman" w:eastAsia="Times New Roman" w:cs="Times New Roman"/>
         </w:rPr>
       </w:r>
     </w:p>
@@ -2873,30 +2633,20 @@
         <w:ind/>
         <w:jc w:val="center"/>
         <w:rPr>
-          <w:rFonts w:ascii="Asana Math" w:hAnsi="Asana Math" w:eastAsia="Asana Math" w:cs="Asana Math"/>
+          <w:rFonts w:ascii="Times New Roman" w:hAnsi="Times New Roman" w:cs="Times New Roman"/>
+        </w:rPr>
+      </w:pPr>
+      <w:r>
+        <w:rPr>
+          <w:rFonts w:ascii="Times New Roman" w:hAnsi="Times New Roman" w:eastAsia="Times New Roman" w:cs="Times New Roman"/>
           <w:highlight w:val="none"/>
           <w:lang w:val="es-ES"/>
         </w:rPr>
-      </w:pPr>
-      <w:r>
-        <w:rPr>
-          <w:rFonts w:ascii="Asana Math" w:hAnsi="Asana Math" w:eastAsia="Asana Math" w:cs="Asana Math"/>
-          <w:lang w:val="es-ES"/>
-        </w:rPr>
-        <w:t xml:space="preserve">Ya tengo las columnas minimas(ancho) de nuestro tablero de tetris, pero y las otra filas como ¿podriamos nosotros representarlas a nivel de bits?</w:t>
-      </w:r>
-      <w:r>
-        <w:rPr>
-          <w:rFonts w:ascii="Asana Math" w:hAnsi="Asana Math" w:eastAsia="Asana Math" w:cs="Asana Math"/>
-          <w:highlight w:val="none"/>
-          <w:lang w:val="es-ES"/>
-        </w:rPr>
-      </w:r>
-      <w:r>
-        <w:rPr>
-          <w:rFonts w:ascii="Asana Math" w:hAnsi="Asana Math" w:eastAsia="Asana Math" w:cs="Asana Math"/>
-          <w:highlight w:val="none"/>
-          <w:lang w:val="es-ES"/>
+        <w:t xml:space="preserve">Ya tengo las columnas mínimas (ancho) de nuestro tablero de Tetris, pero las otras filas, ¿cómo podríamos nosotros representarlas a nivel de bits?</w:t>
+      </w:r>
+      <w:r>
+        <w:rPr>
+          <w:rFonts w:ascii="Times New Roman" w:hAnsi="Times New Roman" w:eastAsia="Times New Roman" w:cs="Times New Roman"/>
         </w:rPr>
       </w:r>
     </w:p>
@@ -2907,37 +2657,59 @@
         <w:ind/>
         <w:jc w:val="center"/>
         <w:rPr>
-          <w:rFonts w:ascii="Asana Math" w:hAnsi="Asana Math" w:cs="Asana Math"/>
+          <w:rFonts w:ascii="Times New Roman" w:hAnsi="Times New Roman" w:cs="Times New Roman"/>
+        </w:rPr>
+      </w:pPr>
+      <w:r>
+        <w:rPr>
+          <w:rFonts w:ascii="Times New Roman" w:hAnsi="Times New Roman" w:eastAsia="Times New Roman" w:cs="Times New Roman"/>
           <w:highlight w:val="none"/>
           <w:lang w:val="es-ES"/>
         </w:rPr>
-      </w:pPr>
-      <w:r>
-        <w:rPr>
-          <w:rFonts w:ascii="Asana Math" w:hAnsi="Asana Math" w:cs="Asana Math"/>
+      </w:r>
+      <w:r>
+        <w:rPr>
+          <w:rFonts w:ascii="Times New Roman" w:hAnsi="Times New Roman" w:eastAsia="Times New Roman" w:cs="Times New Roman"/>
+        </w:rPr>
+      </w:r>
+    </w:p>
+    <w:p>
+      <w:pPr>
+        <w:pBdr/>
+        <w:spacing/>
+        <w:ind/>
+        <w:jc w:val="center"/>
+        <w:rPr>
+          <w:rFonts w:ascii="Times New Roman" w:hAnsi="Times New Roman" w:cs="Times New Roman"/>
+          <w:highlight w:val="none"/>
+        </w:rPr>
+      </w:pPr>
+      <w:r>
+        <w:rPr>
+          <w:rFonts w:ascii="Times New Roman" w:hAnsi="Times New Roman" w:eastAsia="Times New Roman" w:cs="Times New Roman"/>
           <w:highlight w:val="none"/>
           <w:lang w:val="es-ES"/>
         </w:rPr>
-        <w:t xml:space="preserve">Normalmente  tenemos la costumbre de malinterpretar lo que significa </w:t>
-      </w:r>
-      <w:r>
-        <w:rPr>
-          <w:rFonts w:ascii="Asana Math" w:hAnsi="Asana Math" w:cs="Asana Math"/>
+        <w:t xml:space="preserve">Normalmente tenemos la costumbre de malinterpretar lo que significa una matriz a nivel de memoria y pensamos que se basa en filas y columnas, pero en realidad son posiciones de memoria que están contiguas, unas pegadas a las otras, y mediante esa contiguida</w:t>
+      </w:r>
+      <w:r>
+        <w:rPr>
+          <w:rFonts w:ascii="Times New Roman" w:hAnsi="Times New Roman" w:eastAsia="Times New Roman" w:cs="Times New Roman"/>
           <w:highlight w:val="none"/>
           <w:lang w:val="es-ES"/>
         </w:rPr>
-        <w:t xml:space="preserve">una matriz a nivel de memoria y pensamos que se basa en filas y columnas, pero en realidad son posiciones de memoria que estan contiguas, unas pegadas a las otras , y mediante esa contiguidad podemos crear matrices graficamente.</w:t>
-      </w:r>
-      <w:r>
-        <w:rPr>
-          <w:rFonts w:ascii="Asana Math" w:hAnsi="Asana Math" w:cs="Asana Math"/>
+        <w:t xml:space="preserve">d podemos crear matrices gráficamente.</w:t>
+      </w:r>
+      <w:r>
+        <w:rPr>
+          <w:rFonts w:ascii="Times New Roman" w:hAnsi="Times New Roman" w:eastAsia="Times New Roman" w:cs="Times New Roman"/>
           <w:highlight w:val="none"/>
           <w:lang w:val="es-ES"/>
         </w:rPr>
       </w:r>
       <w:r>
         <w:rPr>
-          <w:rFonts w:ascii="Asana Math" w:hAnsi="Asana Math" w:cs="Asana Math"/>
+          <w:rFonts w:ascii="Times New Roman" w:hAnsi="Times New Roman" w:eastAsia="Times New Roman" w:cs="Times New Roman"/>
           <w:highlight w:val="none"/>
           <w:lang w:val="es-ES"/>
         </w:rPr>
@@ -3093,35 +2865,25 @@
         <w:ind/>
         <w:jc w:val="center"/>
         <w:rPr>
-          <w:rFonts w:ascii="Asana Math" w:hAnsi="Asana Math" w:eastAsia="Asana Math" w:cs="Asana Math"/>
+          <w:rFonts w:ascii="Times New Roman" w:hAnsi="Times New Roman" w:cs="Times New Roman"/>
+        </w:rPr>
+      </w:pPr>
+      <w:r>
+        <w:rPr>
+          <w:rFonts w:ascii="Times New Roman" w:hAnsi="Times New Roman" w:eastAsia="Times New Roman" w:cs="Times New Roman"/>
           <w:highlight w:val="none"/>
           <w:lang w:val="es-ES"/>
         </w:rPr>
-      </w:pPr>
-      <w:r>
-        <w:rPr>
-          <w:rFonts w:ascii="Asana Math" w:hAnsi="Asana Math" w:eastAsia="Asana Math" w:cs="Asana Math"/>
-          <w:lang w:val="es-ES"/>
-        </w:rPr>
-        <w:t xml:space="preserve">Siguiendo esa l</w:t>
-      </w:r>
-      <w:r>
-        <w:rPr>
-          <w:rFonts w:ascii="Asana Math" w:hAnsi="Asana Math" w:eastAsia="Asana Math" w:cs="Asana Math"/>
-          <w:lang w:val="es-ES"/>
-        </w:rPr>
-        <w:t xml:space="preserve">ógica podemos decir que podemos crear un tablero con un arreglo dinamico de chars , que primordialmente los trabajaremos a nivel de bits y luego los convertiremos a Caracteres en consola.</w:t>
-      </w:r>
-      <w:r>
-        <w:rPr>
-          <w:rFonts w:ascii="Asana Math" w:hAnsi="Asana Math" w:eastAsia="Asana Math" w:cs="Asana Math"/>
-          <w:highlight w:val="none"/>
-          <w:lang w:val="es-ES"/>
-        </w:rPr>
-      </w:r>
-      <w:r>
-        <w:rPr>
-          <w:rFonts w:ascii="Asana Math" w:hAnsi="Asana Math" w:eastAsia="Asana Math" w:cs="Asana Math"/>
+        <w:t xml:space="preserve">Siguiendo esa lógica, podemos decir que podemos crear un tablero con un arreglo dinámico de chars, que primordialmente los trabajaremos a nivel de bits y luego los convertiremos a caracteres en consola.</w:t>
+      </w:r>
+      <w:r>
+        <w:rPr>
+          <w:rFonts w:ascii="Times New Roman" w:hAnsi="Times New Roman" w:eastAsia="Times New Roman" w:cs="Times New Roman"/>
+        </w:rPr>
+      </w:r>
+      <w:r>
+        <w:rPr>
+          <w:rFonts w:ascii="Times New Roman" w:hAnsi="Times New Roman" w:eastAsia="Times New Roman" w:cs="Times New Roman"/>
           <w:highlight w:val="none"/>
           <w:lang w:val="es-ES"/>
         </w:rPr>
@@ -3134,37 +2896,28 @@
         <w:ind/>
         <w:jc w:val="center"/>
         <w:rPr>
-          <w:rFonts w:ascii="Asana Math" w:hAnsi="Asana Math" w:eastAsia="Asana Math" w:cs="Asana Math"/>
+          <w:rFonts w:ascii="Times New Roman" w:hAnsi="Times New Roman" w:cs="Times New Roman"/>
+          <w:highlight w:val="none"/>
+        </w:rPr>
+      </w:pPr>
+      <w:r>
+        <w:rPr>
+          <w:rFonts w:ascii="Times New Roman" w:hAnsi="Times New Roman" w:eastAsia="Times New Roman" w:cs="Times New Roman"/>
           <w:highlight w:val="none"/>
           <w:lang w:val="es-ES"/>
         </w:rPr>
-      </w:pPr>
-      <w:r>
-        <w:rPr>
-          <w:rFonts w:ascii="Asana Math" w:hAnsi="Asana Math" w:eastAsia="Asana Math" w:cs="Asana Math"/>
+        <w:t xml:space="preserve">Un punto importante a tener en cuenta es que el ancho de nuestro tablero será múltiplo de byte (8 bits). De una forma matemática, nuestro ancho estará dado por:</w:t>
+      </w:r>
+      <w:r>
+        <w:rPr>
+          <w:rFonts w:ascii="Times New Roman" w:hAnsi="Times New Roman" w:eastAsia="Times New Roman" w:cs="Times New Roman"/>
           <w:highlight w:val="none"/>
           <w:lang w:val="es-ES"/>
         </w:rPr>
-        <w:t xml:space="preserve">Un punto importante a tener en cuenta es que el ancho de nuestro tablero seran multiplos de byte(8 bits), de una forma matematica nuestro ancho estar</w:t>
-      </w:r>
-      <w:r>
-        <w:rPr>
-          <w:rFonts w:ascii="Asana Math" w:hAnsi="Asana Math" w:eastAsia="Asana Math" w:cs="Asana Math"/>
-          <w:highlight w:val="none"/>
-          <w:lang w:val="es-ES"/>
-        </w:rPr>
-        <w:t xml:space="preserve">á dado por</w:t>
-      </w:r>
-      <w:r>
-        <w:rPr>
-          <w:rFonts w:ascii="Asana Math" w:hAnsi="Asana Math" w:eastAsia="Asana Math" w:cs="Asana Math"/>
-          <w:highlight w:val="none"/>
-          <w:lang w:val="es-ES"/>
-        </w:rPr>
-      </w:r>
-      <w:r>
-        <w:rPr>
-          <w:rFonts w:ascii="Asana Math" w:hAnsi="Asana Math" w:eastAsia="Asana Math" w:cs="Asana Math"/>
+      </w:r>
+      <w:r>
+        <w:rPr>
+          <w:rFonts w:ascii="Times New Roman" w:hAnsi="Times New Roman" w:eastAsia="Times New Roman" w:cs="Times New Roman"/>
           <w:highlight w:val="none"/>
           <w:lang w:val="es-ES"/>
         </w:rPr>
@@ -3184,38 +2937,28 @@
         <w:ind/>
         <w:jc w:val="center"/>
         <w:rPr>
-          <w:rFonts w:ascii="Asana Math" w:hAnsi="Asana Math" w:cs="Asana Math"/>
-        </w:rPr>
-      </w:pPr>
-      <w:r>
-        <w:rPr>
-          <w:rFonts w:ascii="Asana Math" w:hAnsi="Asana Math" w:eastAsia="Asana Math" w:cs="Asana Math"/>
+          <w:rFonts w:ascii="Classic Console" w:hAnsi="Classic Console" w:cs="Classic Console"/>
+          <w:sz w:val="36"/>
+          <w:szCs w:val="36"/>
+          <w:highlight w:val="none"/>
+        </w:rPr>
+      </w:pPr>
+      <w:r>
+        <w:rPr>
+          <w:rFonts w:ascii="Classic Console" w:hAnsi="Classic Console" w:eastAsia="Classic Console" w:cs="Classic Console"/>
+          <w:sz w:val="32"/>
+          <w:szCs w:val="32"/>
           <w:highlight w:val="none"/>
           <w:lang w:val="es-ES"/>
         </w:rPr>
-        <w:t xml:space="preserve"> </w:t>
-      </w:r>
-      <m:oMath>
-        <m:r>
-          <w:rPr>
-            <w:rFonts w:hint="default" w:ascii="Cambria Math" w:hAnsi="Cambria Math" w:eastAsia="Cambria Math" w:cs="Cambria Math"/>
-            <w:highlight w:val="none"/>
-            <w:lang w:val="es-ES" w:bidi="es-ES"/>
-          </w:rPr>
-          <m:rPr>
-            <m:sty m:val="i"/>
-          </m:rPr>
-          <m:t>N*Byte=N*8bits</m:t>
-        </m:r>
-      </m:oMath>
-      <w:r>
-        <w:rPr>
-          <w:rFonts w:ascii="Asana Math" w:hAnsi="Asana Math" w:cs="Asana Math"/>
-        </w:rPr>
-      </w:r>
-      <w:r>
-        <w:rPr>
-          <w:rFonts w:ascii="Asana Math" w:hAnsi="Asana Math" w:cs="Asana Math"/>
+        <w:t xml:space="preserve">N*Byte = N*(8) bits</w:t>
+      </w:r>
+      <w:r>
+        <w:rPr>
+          <w:rFonts w:ascii="Classic Console" w:hAnsi="Classic Console" w:eastAsia="Classic Console" w:cs="Classic Console"/>
+          <w:sz w:val="32"/>
+          <w:szCs w:val="32"/>
+          <w:highlight w:val="none"/>
         </w:rPr>
       </w:r>
     </w:p>
@@ -3226,49 +2969,172 @@
         <w:ind/>
         <w:jc w:val="center"/>
         <w:rPr>
-          <w:rFonts w:ascii="Asana Math" w:hAnsi="Asana Math" w:eastAsia="Asana Math" w:cs="Asana Math"/>
+          <w:rFonts w:ascii="Times New Roman" w:hAnsi="Times New Roman" w:eastAsia="Times New Roman" w:cs="Times New Roman"/>
+          <w:b/>
+          <w:bCs/>
+          <w:i/>
           <w:sz w:val="24"/>
           <w:szCs w:val="24"/>
           <w:highlight w:val="none"/>
-          <w:lang w:val="es-ES" w:bidi="es-ES"/>
-        </w:rPr>
-      </w:pPr>
-      <w:r>
-        <w:rPr>
-          <w:rFonts w:ascii="Asana Math" w:hAnsi="Asana Math" w:eastAsia="Asana Math" w:cs="Asana Math"/>
+          <w:u w:val="none"/>
+        </w:rPr>
+      </w:pPr>
+      <w:r>
+        <w:rPr>
+          <w:rFonts w:ascii="Times New Roman" w:hAnsi="Times New Roman" w:eastAsia="Times New Roman" w:cs="Times New Roman"/>
+          <w:b/>
+          <w:bCs/>
+          <w:i/>
+          <w:iCs/>
           <w:sz w:val="24"/>
           <w:szCs w:val="24"/>
           <w:highlight w:val="none"/>
+          <w:u w:val="none"/>
           <w:lang w:val="es-ES" w:bidi="es-ES"/>
         </w:rPr>
-        <w:t xml:space="preserve">CREACI</w:t>
-      </w:r>
-      <w:r>
-        <w:rPr>
-          <w:rFonts w:ascii="Asana Math" w:hAnsi="Asana Math" w:eastAsia="Asana Math" w:cs="Asana Math"/>
+      </w:r>
+      <w:r>
+        <w:rPr>
+          <w:rFonts w:ascii="Times New Roman" w:hAnsi="Times New Roman" w:eastAsia="Times New Roman" w:cs="Times New Roman"/>
+          <w:b/>
+          <w:bCs/>
+          <w:i/>
+          <w:iCs/>
           <w:sz w:val="24"/>
           <w:szCs w:val="24"/>
           <w:highlight w:val="none"/>
+          <w:u w:val="none"/>
           <w:lang w:val="es-ES" w:bidi="es-ES"/>
         </w:rPr>
-        <w:t xml:space="preserve">ÓN DEL TABLERO.</w:t>
-      </w:r>
-      <w:r>
-        <w:rPr>
-          <w:rFonts w:ascii="Asana Math" w:hAnsi="Asana Math" w:eastAsia="Asana Math" w:cs="Asana Math"/>
+      </w:r>
+      <w:r>
+        <w:rPr>
+          <w:rFonts w:ascii="Times New Roman" w:hAnsi="Times New Roman" w:eastAsia="Times New Roman" w:cs="Times New Roman"/>
+          <w:b/>
+          <w:bCs/>
+          <w:i/>
+          <w:iCs/>
           <w:sz w:val="24"/>
           <w:szCs w:val="24"/>
           <w:highlight w:val="none"/>
+          <w:u w:val="none"/>
           <w:lang w:val="es-ES" w:bidi="es-ES"/>
         </w:rPr>
       </w:r>
-      <w:r>
-        <w:rPr>
-          <w:rFonts w:ascii="Asana Math" w:hAnsi="Asana Math" w:eastAsia="Asana Math" w:cs="Asana Math"/>
+    </w:p>
+    <w:p>
+      <w:pPr>
+        <w:pBdr/>
+        <w:spacing/>
+        <w:ind/>
+        <w:jc w:val="center"/>
+        <w:rPr>
+          <w:rFonts w:ascii="Times New Roman" w:hAnsi="Times New Roman" w:eastAsia="Times New Roman" w:cs="Times New Roman"/>
+          <w:b/>
+          <w:bCs/>
+          <w:i/>
           <w:sz w:val="24"/>
           <w:szCs w:val="24"/>
           <w:highlight w:val="none"/>
+          <w:u w:val="none"/>
           <w:lang w:val="es-ES" w:bidi="es-ES"/>
+        </w:rPr>
+      </w:pPr>
+      <w:r>
+        <w:rPr>
+          <w:rFonts w:ascii="Times New Roman" w:hAnsi="Times New Roman" w:eastAsia="Times New Roman" w:cs="Times New Roman"/>
+          <w:b/>
+          <w:bCs/>
+          <w:i/>
+          <w:iCs/>
+          <w:sz w:val="24"/>
+          <w:szCs w:val="24"/>
+          <w:highlight w:val="none"/>
+          <w:u w:val="none"/>
+          <w:lang w:val="es-ES" w:bidi="es-ES"/>
+        </w:rPr>
+        <w:t xml:space="preserve">CREACI</w:t>
+      </w:r>
+      <w:r>
+        <w:rPr>
+          <w:rFonts w:ascii="Times New Roman" w:hAnsi="Times New Roman" w:eastAsia="Times New Roman" w:cs="Times New Roman"/>
+          <w:b/>
+          <w:bCs/>
+          <w:i/>
+          <w:iCs/>
+          <w:sz w:val="24"/>
+          <w:szCs w:val="24"/>
+          <w:highlight w:val="none"/>
+          <w:u w:val="none"/>
+          <w:lang w:val="es-ES" w:bidi="es-ES"/>
+        </w:rPr>
+        <w:t xml:space="preserve">ÓN DEL TABLERO.</w:t>
+      </w:r>
+      <w:r>
+        <w:rPr>
+          <w:rFonts w:ascii="Times New Roman" w:hAnsi="Times New Roman" w:eastAsia="Times New Roman" w:cs="Times New Roman"/>
+          <w:b/>
+          <w:bCs/>
+          <w:i/>
+          <w:iCs/>
+          <w:sz w:val="24"/>
+          <w:szCs w:val="24"/>
+          <w:highlight w:val="none"/>
+          <w:u w:val="none"/>
+          <w:lang w:val="es-ES" w:bidi="es-ES"/>
+        </w:rPr>
+      </w:r>
+      <w:r>
+        <w:rPr>
+          <w:rFonts w:ascii="Times New Roman" w:hAnsi="Times New Roman" w:eastAsia="Times New Roman" w:cs="Times New Roman"/>
+          <w:b/>
+          <w:bCs/>
+          <w:i/>
+          <w:iCs/>
+          <w:sz w:val="24"/>
+          <w:szCs w:val="24"/>
+          <w:highlight w:val="none"/>
+          <w:u w:val="none"/>
+          <w:lang w:val="es-ES" w:bidi="es-ES"/>
+        </w:rPr>
+      </w:r>
+      <w:r>
+        <w:rPr>
+          <w:rFonts w:ascii="Times New Roman" w:hAnsi="Times New Roman" w:eastAsia="Times New Roman" w:cs="Times New Roman"/>
+          <w:sz w:val="24"/>
+          <w:szCs w:val="24"/>
+          <w:highlight w:val="none"/>
+          <w:lang w:val="es-ES" w:bidi="es-ES"/>
+        </w:rPr>
+      </w:r>
+      <w:r>
+        <w:rPr>
+          <w:rFonts w:ascii="Times New Roman" w:hAnsi="Times New Roman" w:eastAsia="Times New Roman" w:cs="Times New Roman"/>
+          <w:sz w:val="24"/>
+          <w:szCs w:val="24"/>
+          <w:highlight w:val="none"/>
+          <w:lang w:val="es-ES" w:bidi="es-ES"/>
+        </w:rPr>
+      </w:r>
+      <w:r>
+        <w:rPr>
+          <w:rFonts w:ascii="Times New Roman" w:hAnsi="Times New Roman" w:eastAsia="Times New Roman" w:cs="Times New Roman"/>
+          <w:sz w:val="24"/>
+          <w:szCs w:val="24"/>
+          <w:highlight w:val="none"/>
+          <w:lang w:val="es-ES" w:bidi="es-ES"/>
+        </w:rPr>
+      </w:r>
+      <w:r>
+        <w:rPr>
+          <w:rFonts w:ascii="Times New Roman" w:hAnsi="Times New Roman" w:eastAsia="Times New Roman" w:cs="Times New Roman"/>
+          <w:b/>
+          <w:bCs/>
+          <w:i/>
+          <w:sz w:val="24"/>
+          <w:szCs w:val="24"/>
+          <w:highlight w:val="none"/>
+          <w:u w:val="none"/>
         </w:rPr>
       </w:r>
     </w:p>
@@ -3279,7 +3145,7 @@
         <w:ind/>
         <w:jc w:val="center"/>
         <w:rPr>
-          <w:rFonts w:ascii="Asana Math" w:hAnsi="Asana Math" w:eastAsia="Asana Math" w:cs="Asana Math"/>
+          <w:rFonts w:ascii="Times New Roman" w:hAnsi="Times New Roman" w:eastAsia="Times New Roman" w:cs="Times New Roman"/>
           <w:sz w:val="22"/>
           <w:szCs w:val="22"/>
           <w:highlight w:val="none"/>
@@ -3288,46 +3154,70 @@
       </w:pPr>
       <w:r>
         <w:rPr>
-          <w:rFonts w:ascii="Asana Math" w:hAnsi="Asana Math" w:eastAsia="Asana Math" w:cs="Asana Math"/>
+          <w:rFonts w:ascii="Times New Roman" w:hAnsi="Times New Roman" w:eastAsia="Times New Roman" w:cs="Times New Roman"/>
           <w:sz w:val="22"/>
           <w:szCs w:val="22"/>
           <w:highlight w:val="none"/>
           <w:lang w:val="es-ES" w:bidi="es-ES"/>
         </w:rPr>
-        <w:t xml:space="preserve">En la l</w:t>
-      </w:r>
-      <w:r>
-        <w:rPr>
-          <w:rFonts w:ascii="Asana Math" w:hAnsi="Asana Math" w:eastAsia="Asana Math" w:cs="Asana Math"/>
+      </w:r>
+      <w:r>
+        <w:rPr>
+          <w:rFonts w:ascii="Times New Roman" w:hAnsi="Times New Roman" w:eastAsia="Times New Roman" w:cs="Times New Roman"/>
           <w:sz w:val="22"/>
           <w:szCs w:val="22"/>
           <w:highlight w:val="none"/>
           <w:lang w:val="es-ES" w:bidi="es-ES"/>
         </w:rPr>
-        <w:t xml:space="preserve">ógica primordial que tenemos un usuario ingresar</w:t>
-      </w:r>
-      <w:r>
-        <w:rPr>
-          <w:rFonts w:ascii="Asana Math" w:hAnsi="Asana Math" w:eastAsia="Asana Math" w:cs="Asana Math"/>
+        <w:t xml:space="preserve">En la lógica primordial, tenemos que un usuario ingresará por consola un ancho y alto mínimo, y nuestro programa deberá convertir eso a un tablero de bits, no sin antes pasar por nuestras transformaciones.</w:t>
+      </w:r>
+      <w:r>
+        <w:rPr>
+          <w:rFonts w:ascii="Times New Roman" w:hAnsi="Times New Roman" w:eastAsia="Times New Roman" w:cs="Times New Roman"/>
           <w:sz w:val="22"/>
           <w:szCs w:val="22"/>
           <w:highlight w:val="none"/>
           <w:lang w:val="es-ES" w:bidi="es-ES"/>
         </w:rPr>
-        <w:t xml:space="preserve">á por consola un ancho y alto minimo y nuestro programa debera convertir eso a un tablero de bits , no sin antes pasar por nuestras tranformaciones.</w:t>
-      </w:r>
-      <w:r>
-        <w:rPr>
-          <w:rFonts w:ascii="Asana Math" w:hAnsi="Asana Math" w:eastAsia="Asana Math" w:cs="Asana Math"/>
+      </w:r>
+      <w:r>
+        <w:rPr>
+          <w:rFonts w:ascii="Times New Roman" w:hAnsi="Times New Roman" w:cs="Times New Roman"/>
           <w:sz w:val="22"/>
           <w:szCs w:val="22"/>
           <w:highlight w:val="none"/>
+        </w:rPr>
+      </w:r>
+      <w:r>
+        <w:rPr>
+          <w:rFonts w:ascii="Times New Roman" w:hAnsi="Times New Roman" w:eastAsia="Times New Roman" w:cs="Times New Roman"/>
+          <w:sz w:val="22"/>
+          <w:szCs w:val="22"/>
+          <w:highlight w:val="none"/>
           <w:lang w:val="es-ES" w:bidi="es-ES"/>
         </w:rPr>
       </w:r>
       <w:r>
         <w:rPr>
-          <w:rFonts w:ascii="Asana Math" w:hAnsi="Asana Math" w:eastAsia="Asana Math" w:cs="Asana Math"/>
+          <w:rFonts w:ascii="Times New Roman" w:hAnsi="Times New Roman" w:eastAsia="Times New Roman" w:cs="Times New Roman"/>
+          <w:sz w:val="22"/>
+          <w:szCs w:val="22"/>
+          <w:highlight w:val="none"/>
+          <w:lang w:val="es-ES" w:bidi="es-ES"/>
+        </w:rPr>
+      </w:r>
+      <w:r>
+        <w:rPr>
+          <w:rFonts w:ascii="Times New Roman" w:hAnsi="Times New Roman" w:eastAsia="Times New Roman" w:cs="Times New Roman"/>
+          <w:sz w:val="22"/>
+          <w:szCs w:val="22"/>
+          <w:highlight w:val="none"/>
+          <w:lang w:val="es-ES" w:bidi="es-ES"/>
+        </w:rPr>
+      </w:r>
+      <w:r>
+        <w:rPr>
+          <w:rFonts w:ascii="Times New Roman" w:hAnsi="Times New Roman" w:eastAsia="Times New Roman" w:cs="Times New Roman"/>
           <w:sz w:val="22"/>
           <w:szCs w:val="22"/>
           <w:highlight w:val="none"/>
@@ -3349,182 +3239,108 @@
         <w:ind/>
         <w:jc w:val="center"/>
         <w:rPr>
-          <w:rFonts w:ascii="Asana Math" w:hAnsi="Asana Math" w:eastAsia="Asana Math" w:cs="Asana Math"/>
+          <w:rFonts w:ascii="Classic Console" w:hAnsi="Classic Console" w:cs="Classic Console"/>
+          <w:sz w:val="24"/>
+          <w:szCs w:val="24"/>
+          <w:highlight w:val="none"/>
+        </w:rPr>
+      </w:pPr>
+      <w:r>
+        <w:rPr>
+          <w:rFonts w:ascii="Times New Roman" w:hAnsi="Times New Roman" w:eastAsia="Times New Roman" w:cs="Times New Roman"/>
+          <w:sz w:val="32"/>
+          <w:szCs w:val="32"/>
+          <w:highlight w:val="none"/>
+          <w:lang w:val="es-ES" w:bidi="es-ES"/>
+        </w:rPr>
+      </w:r>
+      <w:r>
+        <w:rPr>
+          <w:rFonts w:ascii="Classic Console" w:hAnsi="Classic Console" w:eastAsia="Classic Console" w:cs="Classic Console"/>
+          <w:sz w:val="32"/>
+          <w:szCs w:val="32"/>
+          <w:highlight w:val="none"/>
+          <w:lang w:val="es-ES" w:bidi="es-ES"/>
+        </w:rPr>
+        <w:t xml:space="preserve">Bytes_por_filas = (ancho)/(8) #Bytes</w:t>
+      </w:r>
+      <w:r>
+        <w:rPr>
+          <w:rFonts w:ascii="Classic Console" w:hAnsi="Classic Console" w:cs="Classic Console"/>
+          <w:sz w:val="24"/>
+          <w:szCs w:val="24"/>
+          <w:highlight w:val="none"/>
+        </w:rPr>
+      </w:r>
+    </w:p>
+    <w:p>
+      <w:pPr>
+        <w:pBdr/>
+        <w:spacing/>
+        <w:ind/>
+        <w:jc w:val="center"/>
+        <w:rPr>
+          <w:rFonts w:ascii="Times New Roman" w:hAnsi="Times New Roman" w:eastAsia="Times New Roman" w:cs="Times New Roman"/>
           <w:sz w:val="22"/>
           <w:szCs w:val="22"/>
           <w:highlight w:val="none"/>
-        </w:rPr>
-      </w:pPr>
-      <w:r>
-        <w:rPr>
-          <w:rFonts w:ascii="Asana Math" w:hAnsi="Asana Math" w:eastAsia="Asana Math" w:cs="Asana Math"/>
+          <w:lang w:val="es-ES" w:bidi="es-ES"/>
+        </w:rPr>
+      </w:pPr>
+      <w:r>
+        <w:rPr>
+          <w:rFonts w:ascii="Times New Roman" w:hAnsi="Times New Roman" w:eastAsia="Times New Roman" w:cs="Times New Roman"/>
           <w:sz w:val="22"/>
           <w:szCs w:val="22"/>
           <w:highlight w:val="none"/>
           <w:lang w:val="es-ES" w:bidi="es-ES"/>
         </w:rPr>
       </w:r>
-      <m:oMathPara>
-        <m:oMathParaPr/>
-        <m:oMath>
-          <m:r>
-            <w:rPr>
-              <w:rFonts w:hint="default" w:ascii="Cambria Math" w:hAnsi="Cambria Math" w:eastAsia="Cambria Math" w:cs="Cambria Math"/>
-              <w:sz w:val="22"/>
-              <w:szCs w:val="22"/>
-              <w:highlight w:val="none"/>
-              <w:lang w:val="es-ES" w:bidi="es-ES"/>
-            </w:rPr>
-            <m:rPr/>
-            <m:t> Bytes por filas=</m:t>
-          </m:r>
-          <m:f>
-            <m:fPr>
-              <m:ctrlPr>
-                <w:rPr>
-                  <w:rFonts w:ascii="Cambria Math" w:hAnsi="Cambria Math" w:eastAsia="Cambria Math" w:cs="Cambria Math"/>
-                  <w:sz w:val="22"/>
-                  <w:szCs w:val="22"/>
-                  <w:highlight w:val="none"/>
-                  <w:lang w:val="es-ES" w:bidi="es-ES"/>
-                </w:rPr>
-              </m:ctrlPr>
-            </m:fPr>
-            <m:num>
-              <m:r>
-                <w:rPr>
-                  <w:rFonts w:hint="default" w:ascii="Cambria Math" w:hAnsi="Cambria Math" w:eastAsia="Cambria Math" w:cs="Cambria Math"/>
-                  <w:sz w:val="22"/>
-                  <w:szCs w:val="22"/>
-                  <w:highlight w:val="none"/>
-                  <w:lang w:val="es-ES" w:bidi="es-ES"/>
-                </w:rPr>
-                <m:rPr>
-                  <m:sty m:val="i"/>
-                </m:rPr>
-                <m:t>Ancho</m:t>
-              </m:r>
-            </m:num>
-            <m:den>
-              <m:r>
-                <w:rPr>
-                  <w:rFonts w:hint="default" w:ascii="Cambria Math" w:hAnsi="Cambria Math" w:eastAsia="Cambria Math" w:cs="Cambria Math"/>
-                  <w:sz w:val="22"/>
-                  <w:szCs w:val="22"/>
-                  <w:highlight w:val="none"/>
-                  <w:lang w:val="es-ES" w:bidi="es-ES"/>
-                </w:rPr>
-                <m:rPr>
-                  <m:sty m:val="i"/>
-                </m:rPr>
-                <m:t>8</m:t>
-              </m:r>
-            </m:den>
-          </m:f>
-          <m:r>
-            <w:rPr>
-              <w:rFonts w:hint="default" w:ascii="Cambria Math" w:hAnsi="Cambria Math" w:eastAsia="Cambria Math" w:cs="Cambria Math"/>
-              <w:sz w:val="22"/>
-              <w:szCs w:val="22"/>
-              <w:highlight w:val="none"/>
-              <w:lang w:val="es-ES" w:bidi="es-ES"/>
-            </w:rPr>
-            <m:rPr>
-              <m:sty m:val="i"/>
-            </m:rPr>
-            <m:t>→ # </m:t>
-          </m:r>
-          <m:r>
-            <w:rPr>
-              <w:rFonts w:hint="default" w:ascii="Cambria Math" w:hAnsi="Cambria Math" w:eastAsia="Cambria Math" w:cs="Cambria Math"/>
-              <w:sz w:val="22"/>
-              <w:szCs w:val="22"/>
-              <w:highlight w:val="none"/>
-              <w:lang w:val="es-ES" w:bidi="es-ES"/>
-            </w:rPr>
-            <m:rPr>
-              <m:sty m:val="i"/>
-            </m:rPr>
-            <m:t>byte</m:t>
-          </m:r>
-        </m:oMath>
-      </m:oMathPara>
-      <w:r>
-        <w:rPr>
-          <w:rFonts w:ascii="Asana Math" w:hAnsi="Asana Math" w:eastAsia="Asana Math" w:cs="Asana Math"/>
+      <w:r>
+        <w:rPr>
+          <w:rFonts w:ascii="Times New Roman" w:hAnsi="Times New Roman" w:eastAsia="Times New Roman" w:cs="Times New Roman"/>
           <w:sz w:val="22"/>
           <w:szCs w:val="22"/>
           <w:highlight w:val="none"/>
-        </w:rPr>
-      </w:r>
-      <w:r>
-        <w:rPr>
-          <w:rFonts w:ascii="Asana Math" w:hAnsi="Asana Math" w:eastAsia="Asana Math" w:cs="Asana Math"/>
+          <w:lang w:val="es-ES" w:bidi="es-ES"/>
+        </w:rPr>
+        <w:t xml:space="preserve">Con el resultado de nuestra primera </w:t>
+      </w:r>
+      <w:r>
+        <w:rPr>
+          <w:rFonts w:ascii="Times New Roman" w:hAnsi="Times New Roman" w:eastAsia="Times New Roman" w:cs="Times New Roman"/>
           <w:sz w:val="22"/>
           <w:szCs w:val="22"/>
           <w:highlight w:val="none"/>
-        </w:rPr>
-      </w:r>
-    </w:p>
-    <w:p>
-      <w:pPr>
-        <w:pBdr/>
-        <w:spacing/>
-        <w:ind/>
-        <w:jc w:val="center"/>
-        <w:rPr>
-          <w:rFonts w:ascii="Asana Math" w:hAnsi="Asana Math" w:eastAsia="Asana Math" w:cs="Asana Math"/>
+          <w:lang w:val="es-ES" w:bidi="es-ES"/>
+        </w:rPr>
+        <w:t xml:space="preserve">transformación</w:t>
+      </w:r>
+      <w:r>
+        <w:rPr>
+          <w:rFonts w:ascii="Times New Roman" w:hAnsi="Times New Roman" w:eastAsia="Times New Roman" w:cs="Times New Roman"/>
           <w:sz w:val="22"/>
           <w:szCs w:val="22"/>
           <w:highlight w:val="none"/>
-          <w:lang w:val="es-ES"/>
-        </w:rPr>
-      </w:pPr>
-      <w:r>
-        <w:rPr>
-          <w:rFonts w:ascii="Asana Math" w:hAnsi="Asana Math" w:eastAsia="Asana Math" w:cs="Asana Math"/>
-          <w:sz w:val="28"/>
-          <w:szCs w:val="28"/>
-          <w:highlight w:val="none"/>
           <w:lang w:val="es-ES" w:bidi="es-ES"/>
         </w:rPr>
-      </w:r>
-      <w:r>
-        <w:rPr>
-          <w:rFonts w:ascii="Asana Math" w:hAnsi="Asana Math" w:eastAsia="Asana Math" w:cs="Asana Math"/>
+        <w:t xml:space="preserve">, podemos asignar de cuántos bytes será nuestro entero.</w:t>
+      </w:r>
+      <w:r>
+        <w:rPr>
+          <w:rFonts w:ascii="Cambria Math" w:hAnsi="Cambria Math" w:eastAsia="Cambria Math" w:cs="Cambria Math"/>
           <w:sz w:val="22"/>
           <w:szCs w:val="22"/>
           <w:highlight w:val="none"/>
-          <w:lang w:val="es-ES"/>
-        </w:rPr>
-        <w:t xml:space="preserve">Con el resultado de nuestra primera tranformaci</w:t>
-      </w:r>
-      <w:r>
-        <w:rPr>
-          <w:rFonts w:ascii="Asana Math" w:hAnsi="Asana Math" w:eastAsia="Asana Math" w:cs="Asana Math"/>
+        </w:rPr>
+      </w:r>
+      <w:r>
+        <w:rPr>
+          <w:rFonts w:ascii="Times New Roman" w:hAnsi="Times New Roman" w:eastAsia="Times New Roman" w:cs="Times New Roman"/>
           <w:sz w:val="22"/>
           <w:szCs w:val="22"/>
           <w:highlight w:val="none"/>
-          <w:lang w:val="es-ES"/>
-        </w:rPr>
-        <w:t xml:space="preserve">ón podemos asignar de cuantos byte a nuestro entero.</w:t>
-      </w:r>
-      <w:r>
-        <w:rPr>
-          <w:rFonts w:ascii="Asana Math" w:hAnsi="Asana Math" w:eastAsia="Asana Math" w:cs="Asana Math"/>
-          <w:sz w:val="22"/>
-          <w:szCs w:val="22"/>
-          <w:highlight w:val="none"/>
-          <w:lang w:val="es-ES"/>
-        </w:rPr>
-      </w:r>
-      <w:r>
-        <w:rPr>
-          <w:rFonts w:ascii="Asana Math" w:hAnsi="Asana Math" w:eastAsia="Asana Math" w:cs="Asana Math"/>
-          <w:sz w:val="22"/>
-          <w:szCs w:val="22"/>
-          <w:highlight w:val="none"/>
-          <w:lang w:val="es-ES"/>
+          <w:lang w:val="es-ES" w:bidi="es-ES"/>
         </w:rPr>
       </w:r>
     </w:p>
@@ -3542,104 +3358,76 @@
         <w:ind/>
         <w:jc w:val="center"/>
         <w:rPr>
-          <w:rFonts w:ascii="Cambria Math" w:hAnsi="Cambria Math" w:eastAsia="Cambria Math" w:cs="Cambria Math"/>
+          <w:rFonts w:ascii="Classic Console" w:hAnsi="Classic Console" w:cs="Classic Console"/>
+          <w:sz w:val="44"/>
+          <w:szCs w:val="44"/>
+          <w:highlight w:val="none"/>
+        </w:rPr>
+      </w:pPr>
+      <w:r>
+        <w:rPr>
+          <w:rFonts w:ascii="Classic Console" w:hAnsi="Classic Console" w:eastAsia="Classic Console" w:cs="Classic Console"/>
+          <w:sz w:val="32"/>
+          <w:szCs w:val="32"/>
+          <w:highlight w:val="none"/>
+          <w:lang w:val="es-ES"/>
+        </w:rPr>
+        <w:t xml:space="preserve">Unsigned char tablero[alto][bytes_por_filas]</w:t>
+      </w:r>
+      <w:r>
+        <w:rPr>
+          <w:rFonts w:ascii="Classic Console" w:hAnsi="Classic Console" w:cs="Classic Console"/>
+          <w:sz w:val="44"/>
+          <w:szCs w:val="44"/>
+          <w:highlight w:val="none"/>
+        </w:rPr>
+      </w:r>
+    </w:p>
+    <w:p>
+      <w:pPr>
+        <w:pBdr/>
+        <w:spacing/>
+        <w:ind/>
+        <w:jc w:val="center"/>
+        <w:rPr>
+          <w:rFonts w:ascii="Times New Roman" w:hAnsi="Times New Roman" w:eastAsia="Times New Roman" w:cs="Times New Roman"/>
           <w:sz w:val="22"/>
           <w:szCs w:val="22"/>
           <w:highlight w:val="none"/>
-        </w:rPr>
-      </w:pPr>
-      <w:r/>
-      <m:oMathPara>
-        <m:oMathParaPr/>
-        <m:oMath>
-          <m:r>
-            <w:rPr>
-              <w:rFonts w:hint="default" w:ascii="Cambria Math" w:hAnsi="Cambria Math" w:eastAsia="Cambria Math" w:cs="Cambria Math"/>
-              <w:sz w:val="22"/>
-              <w:szCs w:val="22"/>
-              <w:highlight w:val="none"/>
-              <w:lang w:val="es-ES" w:bidi="es-ES"/>
-            </w:rPr>
-            <m:rPr>
-              <m:sty m:val="i"/>
-            </m:rPr>
-            <m:t> Unsigned char tablero[alto][Bytes por filas]</m:t>
-          </m:r>
-        </m:oMath>
-      </m:oMathPara>
-      <w:r>
-        <w:rPr>
-          <w:rFonts w:ascii="Cambria Math" w:hAnsi="Cambria Math" w:eastAsia="Cambria Math" w:cs="Cambria Math"/>
+          <w:lang w:val="es-ES"/>
+        </w:rPr>
+      </w:pPr>
+      <w:r>
+        <w:rPr>
+          <w:rFonts w:ascii="Times New Roman" w:hAnsi="Times New Roman" w:eastAsia="Times New Roman" w:cs="Times New Roman"/>
           <w:sz w:val="22"/>
           <w:szCs w:val="22"/>
           <w:highlight w:val="none"/>
-        </w:rPr>
-      </w:r>
-      <w:r>
-        <w:rPr>
-          <w:rFonts w:ascii="Cambria Math" w:hAnsi="Cambria Math" w:eastAsia="Cambria Math" w:cs="Cambria Math"/>
+          <w:lang w:val="es-ES"/>
+        </w:rPr>
+      </w:r>
+      <w:r>
+        <w:rPr>
+          <w:rFonts w:ascii="Times New Roman" w:hAnsi="Times New Roman" w:eastAsia="Times New Roman" w:cs="Times New Roman"/>
           <w:sz w:val="22"/>
           <w:szCs w:val="22"/>
           <w:highlight w:val="none"/>
-        </w:rPr>
-      </w:r>
-    </w:p>
-    <w:p>
-      <w:pPr>
-        <w:pBdr/>
-        <w:spacing/>
-        <w:ind/>
-        <w:jc w:val="center"/>
-        <w:rPr>
-          <w:rFonts w:ascii="Asana Math" w:hAnsi="Asana Math" w:eastAsia="Asana Math" w:cs="Asana Math"/>
+          <w:lang w:val="es-ES"/>
+        </w:rPr>
+        <w:t xml:space="preserve">La transformación del alto me dará la dimensión de nuestro array y, por ende, nuestro tablero de Tetris (convirtiéndolo mentalmente a un tablero).</w:t>
+      </w:r>
+      <w:r>
+        <w:rPr>
+          <w:rFonts w:ascii="Times New Roman" w:hAnsi="Times New Roman" w:eastAsia="Times New Roman" w:cs="Times New Roman"/>
           <w:sz w:val="22"/>
           <w:szCs w:val="22"/>
           <w:highlight w:val="none"/>
           <w:lang w:val="es-ES"/>
         </w:rPr>
-      </w:pPr>
-      <w:r>
-        <w:rPr>
-          <w:rFonts w:ascii="Asana Math" w:hAnsi="Asana Math" w:eastAsia="Asana Math" w:cs="Asana Math"/>
-          <w:sz w:val="22"/>
-          <w:szCs w:val="22"/>
-          <w:highlight w:val="none"/>
-          <w:lang w:val="es-ES"/>
-        </w:rPr>
-        <w:t xml:space="preserve">La tranformaci</w:t>
-      </w:r>
-      <w:r>
-        <w:rPr>
-          <w:rFonts w:ascii="Asana Math" w:hAnsi="Asana Math" w:eastAsia="Asana Math" w:cs="Asana Math"/>
-          <w:sz w:val="22"/>
-          <w:szCs w:val="22"/>
-          <w:highlight w:val="none"/>
-          <w:lang w:val="es-ES"/>
-        </w:rPr>
-        <w:t xml:space="preserve">ón del alto me dara la dimensi</w:t>
-      </w:r>
-      <w:r>
-        <w:rPr>
-          <w:rFonts w:ascii="Asana Math" w:hAnsi="Asana Math" w:eastAsia="Asana Math" w:cs="Asana Math"/>
-          <w:sz w:val="22"/>
-          <w:szCs w:val="22"/>
-          <w:highlight w:val="none"/>
-          <w:lang w:val="es-ES"/>
-        </w:rPr>
-        <w:t xml:space="preserve">ón de nuestro array y por ende nuestro tablero de tetris(Convirtiendolo mentalmente a un tablero)</w:t>
-      </w:r>
-      <w:r>
-        <w:rPr>
-          <w:rFonts w:ascii="Asana Math" w:hAnsi="Asana Math" w:eastAsia="Asana Math" w:cs="Asana Math"/>
-          <w:sz w:val="22"/>
-          <w:szCs w:val="22"/>
-          <w:highlight w:val="none"/>
-          <w:lang w:val="es-ES"/>
-        </w:rPr>
-      </w:r>
-      <w:r>
-        <w:rPr>
-          <w:rFonts w:ascii="Asana Math" w:hAnsi="Asana Math" w:eastAsia="Asana Math" w:cs="Asana Math"/>
+      </w:r>
+      <w:r>
+        <w:rPr>
+          <w:rFonts w:ascii="Times New Roman" w:hAnsi="Times New Roman" w:eastAsia="Times New Roman" w:cs="Times New Roman"/>
           <w:sz w:val="22"/>
           <w:szCs w:val="22"/>
           <w:highlight w:val="none"/>
@@ -3727,7 +3515,7 @@
                   <a:graphicData uri="http://schemas.openxmlformats.org/drawingml/2006/picture">
                     <pic:pic xmlns:pic="http://schemas.openxmlformats.org/drawingml/2006/picture">
                       <pic:nvPicPr>
-                        <pic:cNvPr id="1129519644" name=""/>
+                        <pic:cNvPr id="1934559401" name=""/>
                         <pic:cNvPicPr>
                           <a:picLocks noChangeAspect="1"/>
                         </pic:cNvPicPr>
@@ -3740,7 +3528,7 @@
                       <pic:spPr bwMode="auto">
                         <a:xfrm>
                           <a:off x="0" y="0"/>
-                          <a:ext cx="5943599" cy="2679825"/>
+                          <a:ext cx="5943598" cy="2679824"/>
                         </a:xfrm>
                         <a:prstGeom prst="rect">
                           <a:avLst/>
@@ -3790,6 +3578,7 @@
           <w:lang w:val="es-ES" w:bidi="es-ES"/>
         </w:rPr>
       </w:r>
+      <w:r/>
       <w:r>
         <w:rPr>
           <w:rFonts w:ascii="Asana Math" w:hAnsi="Asana Math" w:eastAsia="Asana Math" w:cs="Asana Math"/>
@@ -3799,6 +3588,15 @@
           <w:lang w:val="es-ES" w:bidi="es-ES"/>
         </w:rPr>
       </w:r>
+      <w:r>
+        <w:rPr>
+          <w:rFonts w:ascii="Asana Math" w:hAnsi="Asana Math" w:eastAsia="Asana Math" w:cs="Asana Math"/>
+          <w:sz w:val="22"/>
+          <w:szCs w:val="22"/>
+          <w:highlight w:val="none"/>
+          <w:lang w:val="es-ES" w:bidi="es-ES"/>
+        </w:rPr>
+      </w:r>
     </w:p>
     <w:p>
       <w:pPr>
@@ -3844,16 +3642,22 @@
         <w:ind/>
         <w:jc w:val="center"/>
         <w:rPr>
-          <w:rFonts w:ascii="Asana Math" w:hAnsi="Asana Math" w:eastAsia="Asana Math" w:cs="Asana Math"/>
+          <w:rFonts w:ascii="Times New Roman" w:hAnsi="Times New Roman" w:cs="Times New Roman"/>
+          <w:b/>
+          <w:bCs/>
+          <w:i/>
           <w:sz w:val="24"/>
           <w:szCs w:val="24"/>
           <w:highlight w:val="none"/>
-          <w:lang w:val="es-ES"/>
-        </w:rPr>
-      </w:pPr>
-      <w:r>
-        <w:rPr>
-          <w:rFonts w:ascii="Asana Math" w:hAnsi="Asana Math" w:eastAsia="Asana Math" w:cs="Asana Math"/>
+        </w:rPr>
+      </w:pPr>
+      <w:r>
+        <w:rPr>
+          <w:rFonts w:ascii="Times New Roman" w:hAnsi="Times New Roman" w:eastAsia="Times New Roman" w:cs="Times New Roman"/>
+          <w:b/>
+          <w:bCs/>
+          <w:i/>
+          <w:iCs/>
           <w:sz w:val="24"/>
           <w:szCs w:val="24"/>
           <w:lang w:val="es-ES"/>
@@ -3862,31 +3666,30 @@
       </w:r>
       <w:r>
         <w:rPr>
-          <w:rFonts w:ascii="Asana Math" w:hAnsi="Asana Math" w:cs="Asana Math"/>
+          <w:rFonts w:ascii="Times New Roman" w:hAnsi="Times New Roman" w:eastAsia="Times New Roman" w:cs="Times New Roman"/>
+          <w:b/>
+          <w:bCs/>
+          <w:i/>
+          <w:iCs/>
           <w:sz w:val="24"/>
           <w:szCs w:val="24"/>
+          <w:highlight w:val="none"/>
           <w:lang w:val="es-ES"/>
         </w:rPr>
-        <w:t xml:space="preserve">.</w:t>
-      </w:r>
-      <w:r>
-        <w:rPr>
-          <w:rFonts w:ascii="Asana Math" w:hAnsi="Asana Math" w:eastAsia="Asana Math" w:cs="Asana Math"/>
+      </w:r>
+      <w:r>
+        <w:rPr>
+          <w:rFonts w:ascii="Times New Roman" w:hAnsi="Times New Roman" w:eastAsia="Times New Roman" w:cs="Times New Roman"/>
+          <w:b/>
+          <w:bCs/>
+          <w:i/>
+          <w:iCs/>
           <w:sz w:val="24"/>
           <w:szCs w:val="24"/>
           <w:highlight w:val="none"/>
           <w:lang w:val="es-ES"/>
         </w:rPr>
       </w:r>
-      <w:r>
-        <w:rPr>
-          <w:rFonts w:ascii="Asana Math" w:hAnsi="Asana Math" w:eastAsia="Asana Math" w:cs="Asana Math"/>
-          <w:sz w:val="24"/>
-          <w:szCs w:val="24"/>
-          <w:highlight w:val="none"/>
-          <w:lang w:val="es-ES"/>
-        </w:rPr>
-      </w:r>
     </w:p>
     <w:p>
       <w:pPr>
@@ -3895,78 +3698,69 @@
         <w:ind/>
         <w:jc w:val="center"/>
         <w:rPr>
-          <w:rFonts w:ascii="Asana Math" w:hAnsi="Asana Math" w:eastAsia="Asana Math" w:cs="Asana Math"/>
+          <w:rFonts w:ascii="Times New Roman" w:hAnsi="Times New Roman" w:cs="Times New Roman"/>
+        </w:rPr>
+      </w:pPr>
+      <w:r>
+        <w:rPr>
+          <w:rFonts w:ascii="Times New Roman" w:hAnsi="Times New Roman" w:eastAsia="Times New Roman" w:cs="Times New Roman"/>
           <w:sz w:val="22"/>
           <w:szCs w:val="22"/>
           <w:highlight w:val="none"/>
-          <w:lang w:val="es-ES"/>
-        </w:rPr>
-      </w:pPr>
-      <w:r>
-        <w:rPr>
-          <w:rFonts w:ascii="Asana Math" w:hAnsi="Asana Math" w:eastAsia="Asana Math" w:cs="Asana Math"/>
+          <w:lang w:val="es-ES" w:bidi="es-ES"/>
+        </w:rPr>
+        <w:t xml:space="preserve">Necesitamos asignar memoria dinámica para crear nuestro tablero. Esto lo hacemos de la siguiente forma:</w:t>
+      </w:r>
+      <w:r>
+        <w:rPr>
+          <w:rFonts w:ascii="Times New Roman" w:hAnsi="Times New Roman" w:eastAsia="Times New Roman" w:cs="Times New Roman"/>
+        </w:rPr>
+      </w:r>
+      <w:r>
+        <w:rPr>
+          <w:rFonts w:ascii="Times New Roman" w:hAnsi="Times New Roman" w:eastAsia="Times New Roman" w:cs="Times New Roman"/>
           <w:sz w:val="22"/>
           <w:szCs w:val="22"/>
           <w:highlight w:val="none"/>
-          <w:lang w:val="es-ES"/>
-        </w:rPr>
-        <w:t xml:space="preserve">Necesitamos asignar Memoria dinamica para crear nuestro tablero, eso lo hacemos de la siguiente forma:</w:t>
-      </w:r>
-      <w:r>
-        <w:rPr>
-          <w:rFonts w:ascii="Asana Math" w:hAnsi="Asana Math" w:eastAsia="Asana Math" w:cs="Asana Math"/>
+          <w:lang w:val="es-ES" w:bidi="es-ES"/>
+        </w:rPr>
+      </w:r>
+    </w:p>
+    <w:p>
+      <w:pPr>
+        <w:pBdr/>
+        <w:spacing/>
+        <w:ind/>
+        <w:jc w:val="center"/>
+        <w:rPr>
+          <w:rFonts w:ascii="Times New Roman" w:hAnsi="Times New Roman" w:cs="Times New Roman"/>
           <w:sz w:val="22"/>
           <w:szCs w:val="22"/>
           <w:highlight w:val="none"/>
-          <w:lang w:val="es-ES"/>
-        </w:rPr>
-      </w:r>
-      <w:r>
-        <w:rPr>
-          <w:rFonts w:ascii="Asana Math" w:hAnsi="Asana Math" w:eastAsia="Asana Math" w:cs="Asana Math"/>
+        </w:rPr>
+      </w:pPr>
+      <w:r>
+        <w:rPr>
+          <w:rFonts w:ascii="Times New Roman" w:hAnsi="Times New Roman" w:eastAsia="Times New Roman" w:cs="Times New Roman"/>
           <w:sz w:val="22"/>
           <w:szCs w:val="22"/>
           <w:highlight w:val="none"/>
-          <w:lang w:val="es-ES"/>
-        </w:rPr>
-      </w:r>
-    </w:p>
-    <w:p>
-      <w:pPr>
-        <w:pBdr/>
-        <w:spacing/>
-        <w:ind/>
-        <w:jc w:val="center"/>
-        <w:rPr>
-          <w:rFonts w:ascii="Asana Math" w:hAnsi="Asana Math" w:eastAsia="Asana Math" w:cs="Asana Math"/>
+          <w:lang w:val="es-ES" w:bidi="es-ES"/>
+        </w:rPr>
+        <w:t xml:space="preserve">Primero, necesito un puntero que me apunte a un puntero, que a su vez apunte a filas, y ese puntero a filas que me apunte a las columnas:</w:t>
+      </w:r>
+      <w:r>
+        <w:rPr>
+          <w:rFonts w:ascii="Times New Roman" w:hAnsi="Times New Roman" w:eastAsia="Times New Roman" w:cs="Times New Roman"/>
           <w:sz w:val="22"/>
           <w:szCs w:val="22"/>
           <w:highlight w:val="none"/>
           <w:lang w:val="es-ES" w:bidi="es-ES"/>
         </w:rPr>
-      </w:pPr>
-      <w:r>
-        <w:rPr>
-          <w:rFonts w:ascii="Asana Math" w:hAnsi="Asana Math" w:eastAsia="Asana Math" w:cs="Asana Math"/>
-          <w:sz w:val="22"/>
-          <w:szCs w:val="22"/>
-          <w:highlight w:val="none"/>
-          <w:lang w:val="es-ES" w:bidi="es-ES"/>
-        </w:rPr>
-        <w:t xml:space="preserve">Primero necesito un puntero que me apunte a un puntero que apunte a filas y ese puntero a filas que me apunte a las columnas</w:t>
-      </w:r>
-      <w:r>
-        <w:rPr>
-          <w:rFonts w:ascii="Asana Math" w:hAnsi="Asana Math" w:eastAsia="Asana Math" w:cs="Asana Math"/>
-          <w:sz w:val="22"/>
-          <w:szCs w:val="22"/>
-          <w:highlight w:val="none"/>
-          <w:lang w:val="es-ES" w:bidi="es-ES"/>
-        </w:rPr>
-      </w:r>
-      <w:r>
-        <w:rPr>
-          <w:rFonts w:ascii="Asana Math" w:hAnsi="Asana Math" w:eastAsia="Asana Math" w:cs="Asana Math"/>
+      </w:r>
+      <w:r>
+        <w:rPr>
+          <w:rFonts w:ascii="Times New Roman" w:hAnsi="Times New Roman" w:eastAsia="Times New Roman" w:cs="Times New Roman"/>
           <w:sz w:val="22"/>
           <w:szCs w:val="22"/>
           <w:highlight w:val="none"/>
@@ -3988,92 +3782,86 @@
         <w:ind/>
         <w:jc w:val="center"/>
         <w:rPr>
-          <w:rFonts w:ascii="Asana Math" w:hAnsi="Asana Math" w:eastAsia="Asana Math" w:cs="Asana Math"/>
+          <w:rFonts w:ascii="Classic Console" w:hAnsi="Classic Console" w:cs="Classic Console"/>
+          <w:sz w:val="32"/>
+          <w:szCs w:val="32"/>
+          <w:highlight w:val="none"/>
+        </w:rPr>
+      </w:pPr>
+      <w:r>
+        <w:rPr>
+          <w:rFonts w:ascii="Classic Console" w:hAnsi="Classic Console" w:eastAsia="Classic Console" w:cs="Classic Console"/>
+          <w:sz w:val="32"/>
+          <w:szCs w:val="32"/>
+          <w:highlight w:val="none"/>
+          <w:lang w:val="es-ES" w:bidi="es-ES"/>
+        </w:rPr>
+        <w:t xml:space="preserve">Unsigned char ** tablero;</w:t>
+      </w:r>
+      <w:r>
+        <w:rPr>
+          <w:rFonts w:ascii="Classic Console" w:hAnsi="Classic Console" w:eastAsia="Classic Console" w:cs="Classic Console"/>
+          <w:sz w:val="32"/>
+          <w:szCs w:val="32"/>
+          <w:highlight w:val="none"/>
+          <w:lang w:val="es-ES" w:bidi="es-ES"/>
+        </w:rPr>
+      </w:r>
+      <w:r>
+        <w:rPr>
+          <w:rFonts w:ascii="Classic Console" w:hAnsi="Classic Console" w:eastAsia="Classic Console" w:cs="Classic Console"/>
+          <w:sz w:val="32"/>
+          <w:szCs w:val="32"/>
+          <w:highlight w:val="none"/>
+          <w:lang w:val="es-ES" w:bidi="es-ES"/>
+        </w:rPr>
+      </w:r>
+    </w:p>
+    <w:p>
+      <w:pPr>
+        <w:pBdr/>
+        <w:spacing/>
+        <w:ind/>
+        <w:jc w:val="center"/>
+        <w:rPr>
+          <w:rFonts w:ascii="Times New Roman" w:hAnsi="Times New Roman" w:eastAsia="Times New Roman" w:cs="Times New Roman"/>
           <w:sz w:val="22"/>
           <w:szCs w:val="22"/>
           <w:highlight w:val="none"/>
-        </w:rPr>
-      </w:pPr>
-      <w:r>
-        <w:rPr>
-          <w:rFonts w:ascii="Asana Math" w:hAnsi="Asana Math" w:eastAsia="Asana Math" w:cs="Asana Math"/>
+          <w:lang w:val="es-ES" w:bidi="es-ES"/>
+        </w:rPr>
+      </w:pPr>
+      <w:r>
+        <w:rPr>
+          <w:rFonts w:ascii="Times New Roman" w:hAnsi="Times New Roman" w:eastAsia="Times New Roman" w:cs="Times New Roman"/>
           <w:sz w:val="22"/>
           <w:szCs w:val="22"/>
           <w:highlight w:val="none"/>
           <w:lang w:val="es-ES" w:bidi="es-ES"/>
         </w:rPr>
       </w:r>
-      <m:oMathPara>
-        <m:oMathParaPr/>
-        <m:oMath>
-          <m:r>
-            <w:rPr>
-              <w:rFonts w:hint="default" w:ascii="Cambria Math" w:hAnsi="Cambria Math" w:eastAsia="Cambria Math" w:cs="Cambria Math"/>
-              <w:sz w:val="22"/>
-              <w:szCs w:val="22"/>
-              <w:highlight w:val="none"/>
-              <w:lang w:val="es-ES" w:bidi="es-ES"/>
-            </w:rPr>
-            <m:rPr>
-              <m:sty m:val="i"/>
-            </m:rPr>
-            <m:t>unsigned char **tablero;</m:t>
-          </m:r>
-        </m:oMath>
-      </m:oMathPara>
-      <w:r>
-        <w:rPr>
-          <w:rFonts w:ascii="Asana Math" w:hAnsi="Asana Math" w:eastAsia="Asana Math" w:cs="Asana Math"/>
+      <w:r>
+        <w:rPr>
+          <w:rFonts w:ascii="Times New Roman" w:hAnsi="Times New Roman" w:eastAsia="Times New Roman" w:cs="Times New Roman"/>
           <w:sz w:val="22"/>
           <w:szCs w:val="22"/>
           <w:highlight w:val="none"/>
-        </w:rPr>
-      </w:r>
-      <w:r>
-        <w:rPr>
-          <w:rFonts w:ascii="Asana Math" w:hAnsi="Asana Math" w:eastAsia="Asana Math" w:cs="Asana Math"/>
+          <w:lang w:val="es-ES" w:bidi="es-ES"/>
+        </w:rPr>
+        <w:t xml:space="preserve">Después, reservo un arreglo de punteros que me apuntarán a cada fila:</w:t>
+      </w:r>
+      <w:r>
+        <w:rPr>
+          <w:rFonts w:ascii="Times New Roman" w:hAnsi="Times New Roman" w:eastAsia="Times New Roman" w:cs="Times New Roman"/>
           <w:sz w:val="22"/>
           <w:szCs w:val="22"/>
           <w:highlight w:val="none"/>
-        </w:rPr>
-      </w:r>
-    </w:p>
-    <w:p>
-      <w:pPr>
-        <w:pBdr/>
-        <w:spacing/>
-        <w:ind/>
-        <w:jc w:val="center"/>
-        <w:rPr>
-          <w:rFonts w:ascii="Asana Math" w:hAnsi="Asana Math" w:eastAsia="Asana Math" w:cs="Asana Math"/>
-          <w:sz w:val="22"/>
-          <w:szCs w:val="22"/>
-          <w:highlight w:val="none"/>
-          <w:lang w:val="es-ES"/>
-        </w:rPr>
-      </w:pPr>
-      <w:r>
-        <w:rPr>
-          <w:rFonts w:ascii="Asana Math" w:hAnsi="Asana Math" w:eastAsia="Asana Math" w:cs="Asana Math"/>
-          <w:sz w:val="22"/>
-          <w:szCs w:val="22"/>
-          <w:highlight w:val="none"/>
           <w:lang w:val="es-ES" w:bidi="es-ES"/>
         </w:rPr>
-        <w:t xml:space="preserve">Despues reservo un arreglo de punteros que me apuntaran a cada fila</w:t>
-      </w:r>
-      <w:r>
-        <w:rPr>
-          <w:rFonts w:ascii="Asana Math" w:hAnsi="Asana Math" w:eastAsia="Asana Math" w:cs="Asana Math"/>
-          <w:sz w:val="22"/>
-          <w:szCs w:val="22"/>
-          <w:highlight w:val="none"/>
-          <w:lang w:val="es-ES"/>
-        </w:rPr>
-      </w:r>
-      <w:r>
-        <w:rPr>
-          <w:rFonts w:ascii="Asana Math" w:hAnsi="Asana Math" w:eastAsia="Asana Math" w:cs="Asana Math"/>
+      </w:r>
+      <w:r>
+        <w:rPr>
+          <w:rFonts w:ascii="Times New Roman" w:hAnsi="Times New Roman" w:eastAsia="Times New Roman" w:cs="Times New Roman"/>
           <w:sz w:val="22"/>
           <w:szCs w:val="22"/>
           <w:highlight w:val="none"/>
@@ -4095,92 +3883,88 @@
         <w:ind/>
         <w:jc w:val="center"/>
         <w:rPr>
-          <w:rFonts w:ascii="Asana Math" w:hAnsi="Asana Math" w:eastAsia="Asana Math" w:cs="Asana Math"/>
+          <w:rFonts w:ascii="Classic Console" w:hAnsi="Classic Console" w:cs="Classic Console"/>
+          <w:sz w:val="32"/>
+          <w:szCs w:val="32"/>
+          <w:highlight w:val="none"/>
+        </w:rPr>
+      </w:pPr>
+      <w:r>
+        <w:rPr>
+          <w:rFonts w:ascii="Classic Console" w:hAnsi="Classic Console" w:eastAsia="Classic Console" w:cs="Classic Console"/>
+          <w:sz w:val="32"/>
+          <w:szCs w:val="32"/>
+          <w:highlight w:val="none"/>
+          <w:lang w:val="es-ES"/>
+        </w:rPr>
+        <w:t xml:space="preserve">tablero = new unsigned char*(alto)</w:t>
+      </w:r>
+      <w:r>
+        <w:rPr>
+          <w:rFonts w:ascii="Classic Console" w:hAnsi="Classic Console" w:eastAsia="Classic Console" w:cs="Classic Console"/>
+          <w:sz w:val="32"/>
+          <w:szCs w:val="32"/>
+          <w:highlight w:val="none"/>
+          <w:lang w:val="es-ES"/>
+        </w:rPr>
+      </w:r>
+      <w:r>
+        <w:rPr>
+          <w:rFonts w:ascii="Classic Console" w:hAnsi="Classic Console" w:eastAsia="Classic Console" w:cs="Classic Console"/>
+          <w:sz w:val="32"/>
+          <w:szCs w:val="32"/>
+          <w:highlight w:val="none"/>
+          <w:lang w:val="es-ES"/>
+        </w:rPr>
+      </w:r>
+    </w:p>
+    <w:p>
+      <w:pPr>
+        <w:pBdr/>
+        <w:spacing/>
+        <w:ind/>
+        <w:jc w:val="center"/>
+        <w:rPr>
+          <w:rFonts w:ascii="Times New Roman" w:hAnsi="Times New Roman" w:eastAsia="Times New Roman" w:cs="Times New Roman"/>
           <w:sz w:val="22"/>
           <w:szCs w:val="22"/>
           <w:highlight w:val="none"/>
-        </w:rPr>
-      </w:pPr>
-      <w:r>
-        <w:rPr>
-          <w:rFonts w:ascii="Asana Math" w:hAnsi="Asana Math" w:eastAsia="Asana Math" w:cs="Asana Math"/>
+          <w:lang w:val="es-ES"/>
+        </w:rPr>
+      </w:pPr>
+      <w:r>
+        <w:rPr>
+          <w:rFonts w:ascii="Times New Roman" w:hAnsi="Times New Roman" w:eastAsia="Times New Roman" w:cs="Times New Roman"/>
           <w:sz w:val="22"/>
           <w:szCs w:val="22"/>
           <w:highlight w:val="none"/>
           <w:lang w:val="es-ES"/>
         </w:rPr>
-      </w:r>
-      <m:oMathPara>
-        <m:oMathParaPr/>
-        <m:oMath>
-          <m:r>
-            <w:rPr>
-              <w:rFonts w:hint="default" w:ascii="Cambria Math" w:hAnsi="Cambria Math" w:eastAsia="Cambria Math" w:cs="Cambria Math"/>
-              <w:sz w:val="22"/>
-              <w:szCs w:val="22"/>
-              <w:highlight w:val="none"/>
-              <w:lang w:val="es-ES" w:bidi="es-ES"/>
-            </w:rPr>
-            <m:rPr>
-              <m:sty m:val="i"/>
-            </m:rPr>
-            <m:t>tablero = new unsigned char*(alto)</m:t>
-          </m:r>
-        </m:oMath>
-      </m:oMathPara>
-      <w:r>
-        <w:rPr>
-          <w:rFonts w:ascii="Asana Math" w:hAnsi="Asana Math" w:eastAsia="Asana Math" w:cs="Asana Math"/>
+        <w:t xml:space="preserve">Luego,reservo los bis que utilizar</w:t>
+      </w:r>
+      <w:r>
+        <w:rPr>
+          <w:rFonts w:ascii="Times New Roman" w:hAnsi="Times New Roman" w:eastAsia="Times New Roman" w:cs="Times New Roman"/>
           <w:sz w:val="22"/>
           <w:szCs w:val="22"/>
           <w:highlight w:val="none"/>
-        </w:rPr>
-      </w:r>
-      <w:r>
-        <w:rPr>
-          <w:rFonts w:ascii="Asana Math" w:hAnsi="Asana Math" w:eastAsia="Asana Math" w:cs="Asana Math"/>
+          <w:lang w:val="es-ES"/>
+        </w:rPr>
+        <w:t xml:space="preserve">é </w:t>
+      </w:r>
+      <w:r>
+        <w:rPr>
+          <w:rFonts w:ascii="Times New Roman" w:hAnsi="Times New Roman" w:eastAsia="Times New Roman" w:cs="Times New Roman"/>
           <w:sz w:val="22"/>
           <w:szCs w:val="22"/>
           <w:highlight w:val="none"/>
-        </w:rPr>
-      </w:r>
-    </w:p>
-    <w:p>
-      <w:pPr>
-        <w:pBdr/>
-        <w:spacing/>
-        <w:ind/>
-        <w:jc w:val="center"/>
-        <w:rPr>
-          <w:rFonts w:ascii="Asana Math" w:hAnsi="Asana Math" w:eastAsia="Asana Math" w:cs="Asana Math"/>
-          <w:sz w:val="22"/>
-          <w:szCs w:val="22"/>
-          <w:highlight w:val="none"/>
           <w:lang w:val="es-ES"/>
         </w:rPr>
-      </w:pPr>
-      <w:r>
-        <w:rPr>
-          <w:rFonts w:ascii="Asana Math" w:hAnsi="Asana Math" w:eastAsia="Asana Math" w:cs="Asana Math"/>
-          <w:sz w:val="22"/>
-          <w:szCs w:val="22"/>
-          <w:highlight w:val="none"/>
-          <w:lang w:val="es-ES"/>
-        </w:rPr>
-        <w:t xml:space="preserve">Luego reservo los bis que utilizare para cada fila </w:t>
-      </w:r>
-      <w:r>
-        <w:rPr>
-          <w:rFonts w:ascii="Asana Math" w:hAnsi="Asana Math" w:eastAsia="Asana Math" w:cs="Asana Math"/>
-          <w:sz w:val="22"/>
-          <w:szCs w:val="22"/>
-          <w:highlight w:val="none"/>
-          <w:lang w:val="es-ES"/>
-        </w:rPr>
-      </w:r>
-      <w:r>
-        <w:rPr>
-          <w:rFonts w:ascii="Asana Math" w:hAnsi="Asana Math" w:eastAsia="Asana Math" w:cs="Asana Math"/>
+        <w:t xml:space="preserve">para cada fila</w:t>
+      </w:r>
+      <w:r>
+        <w:rPr>
+          <w:rFonts w:ascii="Times New Roman" w:hAnsi="Times New Roman" w:eastAsia="Times New Roman" w:cs="Times New Roman"/>
           <w:sz w:val="22"/>
           <w:szCs w:val="22"/>
           <w:highlight w:val="none"/>
@@ -4202,96 +3986,36 @@
         <w:ind/>
         <w:jc w:val="center"/>
         <w:rPr>
-          <w:rFonts w:ascii="Asana Math" w:hAnsi="Asana Math" w:eastAsia="Asana Math" w:cs="Asana Math"/>
-          <w:sz w:val="22"/>
-          <w:szCs w:val="22"/>
-          <w:highlight w:val="none"/>
-        </w:rPr>
-      </w:pPr>
-      <w:r>
-        <w:rPr>
-          <w:rFonts w:ascii="Asana Math" w:hAnsi="Asana Math" w:eastAsia="Asana Math" w:cs="Asana Math"/>
-          <w:sz w:val="22"/>
-          <w:szCs w:val="22"/>
+          <w:rFonts w:ascii="Classic Console" w:hAnsi="Classic Console" w:cs="Classic Console"/>
+          <w:sz w:val="32"/>
+          <w:szCs w:val="32"/>
+          <w:highlight w:val="none"/>
+        </w:rPr>
+      </w:pPr>
+      <w:r>
+        <w:rPr>
+          <w:rFonts w:ascii="Classic Console" w:hAnsi="Classic Console" w:eastAsia="Classic Console" w:cs="Classic Console"/>
+          <w:sz w:val="32"/>
+          <w:szCs w:val="32"/>
           <w:highlight w:val="none"/>
           <w:lang w:val="es-ES"/>
         </w:rPr>
-      </w:r>
-      <m:oMathPara>
-        <m:oMathParaPr/>
-        <m:oMath>
-          <m:r>
-            <w:rPr>
-              <w:rFonts w:hint="default" w:ascii="Cambria Math" w:hAnsi="Cambria Math" w:eastAsia="Cambria Math" w:cs="Cambria Math"/>
-              <w:sz w:val="22"/>
-              <w:szCs w:val="22"/>
-              <w:highlight w:val="none"/>
-              <w:lang w:val="es-ES" w:bidi="es-ES"/>
-            </w:rPr>
-            <m:rPr>
-              <m:sty m:val="i"/>
-            </m:rPr>
-            <m:t>tablero</m:t>
-          </m:r>
-          <m:d>
-            <m:dPr>
-              <m:begChr m:val="["/>
-              <m:endChr m:val="]"/>
-              <m:ctrlPr>
-                <w:rPr>
-                  <w:rFonts w:ascii="Cambria Math" w:hAnsi="Cambria Math" w:eastAsia="Cambria Math" w:cs="Cambria Math"/>
-                  <w:sz w:val="22"/>
-                  <w:szCs w:val="22"/>
-                  <w:highlight w:val="none"/>
-                  <w:lang w:val="es-ES" w:bidi="es-ES"/>
-                </w:rPr>
-              </m:ctrlPr>
-            </m:dPr>
-            <m:e>
-              <m:r>
-                <w:rPr>
-                  <w:rFonts w:hint="default" w:ascii="Cambria Math" w:hAnsi="Cambria Math" w:eastAsia="Cambria Math" w:cs="Cambria Math"/>
-                  <w:sz w:val="22"/>
-                  <w:szCs w:val="22"/>
-                  <w:highlight w:val="none"/>
-                  <w:lang w:val="es-ES" w:bidi="es-ES"/>
-                </w:rPr>
-                <m:rPr>
-                  <m:sty m:val="i"/>
-                </m:rPr>
-                <m:t>i</m:t>
-              </m:r>
-            </m:e>
-          </m:d>
-          <m:r>
-            <w:rPr>
-              <w:rFonts w:hint="default" w:ascii="Cambria Math" w:hAnsi="Cambria Math" w:eastAsia="Cambria Math" w:cs="Cambria Math"/>
-              <w:sz w:val="22"/>
-              <w:szCs w:val="22"/>
-              <w:highlight w:val="none"/>
-              <w:lang w:val="es-ES" w:bidi="es-ES"/>
-            </w:rPr>
-            <m:rPr>
-              <m:sty m:val="i"/>
-            </m:rPr>
-            <m:t>=new unsigned char[bytes por fila]</m:t>
-          </m:r>
-        </m:oMath>
-      </m:oMathPara>
-      <w:r>
-        <w:rPr>
-          <w:rFonts w:ascii="Asana Math" w:hAnsi="Asana Math" w:eastAsia="Asana Math" w:cs="Asana Math"/>
-          <w:sz w:val="22"/>
-          <w:szCs w:val="22"/>
-          <w:highlight w:val="none"/>
-        </w:rPr>
-      </w:r>
-      <w:r>
-        <w:rPr>
-          <w:rFonts w:ascii="Asana Math" w:hAnsi="Asana Math" w:eastAsia="Asana Math" w:cs="Asana Math"/>
-          <w:sz w:val="22"/>
-          <w:szCs w:val="22"/>
-          <w:highlight w:val="none"/>
+        <w:t xml:space="preserve">tablero[i] = new unsigned char[bytes_por_filas] </w:t>
+      </w:r>
+      <w:r>
+        <w:rPr>
+          <w:rFonts w:ascii="Classic Console" w:hAnsi="Classic Console" w:eastAsia="Classic Console" w:cs="Classic Console"/>
+          <w:sz w:val="32"/>
+          <w:szCs w:val="32"/>
+          <w:highlight w:val="none"/>
+          <w:lang w:val="es-ES"/>
+        </w:rPr>
+      </w:r>
+      <w:r>
+        <w:rPr>
+          <w:rFonts w:ascii="Classic Console" w:hAnsi="Classic Console" w:eastAsia="Classic Console" w:cs="Classic Console"/>
+          <w:sz w:val="32"/>
+          <w:szCs w:val="32"/>
         </w:rPr>
       </w:r>
     </w:p>
@@ -4309,16 +4033,15 @@
         <w:ind/>
         <w:jc w:val="center"/>
         <w:rPr>
-          <w:rFonts w:ascii="Asana Math" w:hAnsi="Asana Math" w:eastAsia="Asana Math" w:cs="Asana Math"/>
+          <w:rFonts w:ascii="Times New Roman" w:hAnsi="Times New Roman" w:cs="Times New Roman"/>
           <w:sz w:val="22"/>
           <w:szCs w:val="22"/>
           <w:highlight w:val="none"/>
-          <w:lang w:val="es-ES"/>
-        </w:rPr>
-      </w:pPr>
-      <w:r>
-        <w:rPr>
-          <w:rFonts w:ascii="Asana Math" w:hAnsi="Asana Math" w:eastAsia="Asana Math" w:cs="Asana Math"/>
+        </w:rPr>
+      </w:pPr>
+      <w:r>
+        <w:rPr>
+          <w:rFonts w:ascii="Times New Roman" w:hAnsi="Times New Roman" w:eastAsia="Times New Roman" w:cs="Times New Roman"/>
           <w:sz w:val="22"/>
           <w:szCs w:val="22"/>
           <w:highlight w:val="none"/>
@@ -4328,7 +4051,7 @@
       </w:r>
       <w:r>
         <w:rPr>
-          <w:rFonts w:ascii="Asana Math" w:hAnsi="Asana Math" w:eastAsia="Asana Math" w:cs="Asana Math"/>
+          <w:rFonts w:ascii="Times New Roman" w:hAnsi="Times New Roman" w:eastAsia="Times New Roman" w:cs="Times New Roman"/>
           <w:sz w:val="22"/>
           <w:szCs w:val="22"/>
           <w:highlight w:val="none"/>
@@ -4338,7 +4061,7 @@
       </w:r>
       <w:r>
         <w:rPr>
-          <w:rFonts w:ascii="Asana Math" w:hAnsi="Asana Math" w:eastAsia="Asana Math" w:cs="Asana Math"/>
+          <w:rFonts w:ascii="Times New Roman" w:hAnsi="Times New Roman" w:eastAsia="Times New Roman" w:cs="Times New Roman"/>
           <w:sz w:val="22"/>
           <w:szCs w:val="22"/>
           <w:highlight w:val="none"/>
@@ -4347,7 +4070,7 @@
       </w:r>
       <w:r>
         <w:rPr>
-          <w:rFonts w:ascii="Asana Math" w:hAnsi="Asana Math" w:eastAsia="Asana Math" w:cs="Asana Math"/>
+          <w:rFonts w:ascii="Times New Roman" w:hAnsi="Times New Roman" w:eastAsia="Times New Roman" w:cs="Times New Roman"/>
           <w:sz w:val="22"/>
           <w:szCs w:val="22"/>
           <w:highlight w:val="none"/>
@@ -4505,28 +4228,27 @@
         <w:ind/>
         <w:jc w:val="center"/>
         <w:rPr>
-          <w:rFonts w:ascii="Asana Math" w:hAnsi="Asana Math" w:eastAsia="Asana Math" w:cs="Asana Math"/>
-          <w:highlight w:val="none"/>
+          <w:rFonts w:ascii="Times New Roman" w:hAnsi="Times New Roman" w:cs="Times New Roman"/>
+          <w:highlight w:val="none"/>
+        </w:rPr>
+      </w:pPr>
+      <w:r>
+        <w:rPr>
+          <w:rFonts w:ascii="Times New Roman" w:hAnsi="Times New Roman" w:eastAsia="Times New Roman" w:cs="Times New Roman"/>
           <w:lang w:val="es-ES"/>
         </w:rPr>
-      </w:pPr>
-      <w:r>
-        <w:rPr>
-          <w:rFonts w:ascii="Asana Math" w:hAnsi="Asana Math" w:eastAsia="Asana Math" w:cs="Asana Math"/>
+        <w:t xml:space="preserve">Al final unicamente rellenamos los valores con 0 para que nos quede algo tipo:</w:t>
+      </w:r>
+      <w:r>
+        <w:rPr>
+          <w:rFonts w:ascii="Times New Roman" w:hAnsi="Times New Roman" w:eastAsia="Times New Roman" w:cs="Times New Roman"/>
+          <w:highlight w:val="none"/>
           <w:lang w:val="es-ES"/>
         </w:rPr>
-        <w:t xml:space="preserve">Al final unicamente rellenamos los valores con 0 para que nos quede algo tipo:</w:t>
-      </w:r>
-      <w:r>
-        <w:rPr>
-          <w:rFonts w:ascii="Asana Math" w:hAnsi="Asana Math" w:eastAsia="Asana Math" w:cs="Asana Math"/>
-          <w:highlight w:val="none"/>
-          <w:lang w:val="es-ES"/>
-        </w:rPr>
-      </w:r>
-      <w:r>
-        <w:rPr>
-          <w:rFonts w:ascii="Asana Math" w:hAnsi="Asana Math" w:eastAsia="Asana Math" w:cs="Asana Math"/>
+      </w:r>
+      <w:r>
+        <w:rPr>
+          <w:rFonts w:ascii="Times New Roman" w:hAnsi="Times New Roman" w:eastAsia="Times New Roman" w:cs="Times New Roman"/>
           <w:highlight w:val="none"/>
           <w:lang w:val="es-ES"/>
         </w:rPr>
@@ -9151,6 +8873,13 @@
           <w:lang w:val="es-ES"/>
         </w:rPr>
       </w:r>
+      <w:r>
+        <w:rPr>
+          <w:rFonts w:ascii="Asana Math" w:hAnsi="Asana Math" w:eastAsia="Asana Math" w:cs="Asana Math"/>
+          <w:highlight w:val="none"/>
+          <w:lang w:val="es-ES"/>
+        </w:rPr>
+      </w:r>
     </w:p>
     <w:p>
       <w:pPr>
@@ -9184,6 +8913,12 @@
           <w:color w:val="ff0000"/>
         </w:rPr>
       </w:r>
+      <w:r>
+        <w:rPr>
+          <w:rFonts w:ascii="Asana Math" w:hAnsi="Asana Math" w:eastAsia="Asana Math" w:cs="Asana Math"/>
+          <w:color w:val="ff0000"/>
+        </w:rPr>
+      </w:r>
     </w:p>
     <w:p>
       <w:pPr>
@@ -9207,13 +8942,12 @@
         <w:rPr>
           <w:rFonts w:ascii="Asana Math" w:hAnsi="Asana Math" w:eastAsia="Asana Math" w:cs="Asana Math"/>
           <w:highlight w:val="none"/>
-          <w:lang w:val="es-ES" w:bidi="es-ES"/>
+          <w:lang w:val="es-ES"/>
         </w:rPr>
       </w:r>
       <w:r>
         <w:rPr>
           <w:rFonts w:ascii="Asana Math" w:hAnsi="Asana Math" w:eastAsia="Asana Math" w:cs="Asana Math"/>
-          <w:highlight w:val="none"/>
           <w:lang w:val="es-ES"/>
         </w:rPr>
       </w:r>
@@ -9369,7 +9103,6 @@
         <w:rPr>
           <w:rFonts w:ascii="Asana Math" w:hAnsi="Asana Math" w:eastAsia="Asana Math" w:cs="Asana Math"/>
           <w:highlight w:val="none"/>
-          <w:lang w:val="es-ES"/>
         </w:rPr>
       </w:r>
       <w:r>
@@ -10518,14 +10251,6 @@
           </mc:Fallback>
         </mc:AlternateContent>
       </w:r>
-      <w:r>
-        <w:rPr>
-          <w:rFonts w:ascii="Asana Math" w:hAnsi="Asana Math" w:eastAsia="Asana Math" w:cs="Asana Math"/>
-          <w:highlight w:val="none"/>
-          <w:lang w:val="es-ES"/>
-        </w:rPr>
-      </w:r>
-      <w:r/>
       <w:r>
         <w:rPr>
           <w:rFonts w:ascii="Asana Math" w:hAnsi="Asana Math" w:cs="Asana Math"/>

</xml_diff>

<commit_message>
Seguimiento y edicion de documentacion, depuracion y diapositivas
</commit_message>
<xml_diff>
--- a/Documentacion_Desafio1.docx
+++ b/Documentacion_Desafio1.docx
@@ -9820,33 +9820,36 @@
     </w:p>
     <w:p>
       <w:pPr>
-        <w:pBdr/>
+        <w:suppressLineNumbers w:val="false"/>
+        <w:pBdr>
+          <w:top w:val="single" w:color="000000" w:sz="4" w:space="0"/>
+          <w:left w:val="single" w:color="000000" w:sz="4" w:space="0"/>
+          <w:bottom w:val="single" w:color="000000" w:sz="4" w:space="0"/>
+          <w:right w:val="single" w:color="000000" w:sz="4" w:space="0"/>
+          <w:between w:val="none" w:color="000000" w:sz="4" w:space="0"/>
+        </w:pBdr>
         <w:spacing/>
         <w:ind/>
         <w:jc w:val="center"/>
         <w:rPr>
-          <w:rFonts w:ascii="Asana Math" w:hAnsi="Asana Math" w:eastAsia="Asana Math" w:cs="Asana Math"/>
+          <w:rFonts w:ascii="Times New Roman" w:hAnsi="Times New Roman" w:cs="Times New Roman"/>
+          <w:color w:val="ff0000"/>
+          <w:highlight w:val="none"/>
+        </w:rPr>
+      </w:pPr>
+      <w:r>
+        <w:rPr>
+          <w:rFonts w:ascii="Times New Roman" w:hAnsi="Times New Roman" w:eastAsia="Times New Roman" w:cs="Times New Roman"/>
+          <w:color w:val="ff0000"/>
           <w:highlight w:val="none"/>
           <w:lang w:val="es-ES"/>
         </w:rPr>
-      </w:pPr>
-      <w:r>
-        <w:rPr>
-          <w:rFonts w:ascii="Asana Math" w:hAnsi="Asana Math" w:eastAsia="Asana Math" w:cs="Asana Math"/>
-          <w:highlight w:val="none"/>
-          <w:lang w:val="es-ES" w:bidi="es-ES"/>
-        </w:rPr>
-      </w:r>
-      <w:r>
-        <w:rPr>
-          <w:rFonts w:ascii="Asana Math" w:hAnsi="Asana Math" w:eastAsia="Asana Math" w:cs="Asana Math"/>
-          <w:highlight w:val="none"/>
-          <w:lang w:val="es-ES"/>
-        </w:rPr>
-      </w:r>
-      <w:r>
-        <w:rPr>
-          <w:rFonts w:ascii="Asana Math" w:hAnsi="Asana Math" w:eastAsia="Asana Math" w:cs="Asana Math"/>
+        <w:t xml:space="preserve">LA FUNCION Y EL BRANCH INDEXATION QUEDAN INUTILIZADOS DEBIDO A PROBLEMAS QUE TENIA CON ESA INDEXACION, PORQUE LITERALMENTE ESTABA HACIENDO UN TRABAJO INNECESARIO.</w:t>
+      </w:r>
+      <w:r>
+        <w:rPr>
+          <w:rFonts w:ascii="Times New Roman" w:hAnsi="Times New Roman" w:eastAsia="Times New Roman" w:cs="Times New Roman"/>
+          <w:color w:val="ff0000"/>
           <w:highlight w:val="none"/>
           <w:lang w:val="es-ES"/>
         </w:rPr>
@@ -9885,22 +9888,63 @@
         <w:ind/>
         <w:jc w:val="center"/>
         <w:rPr>
+          <w:rFonts w:ascii="Times New Roman" w:hAnsi="Times New Roman" w:cs="Times New Roman"/>
+          <w:b/>
+          <w:bCs/>
+          <w:i/>
+          <w:sz w:val="24"/>
+          <w:szCs w:val="24"/>
+          <w:highlight w:val="none"/>
+          <w:u w:val="single"/>
+        </w:rPr>
+      </w:pPr>
+      <w:r>
+        <w:rPr>
+          <w:rFonts w:ascii="Times New Roman" w:hAnsi="Times New Roman" w:eastAsia="Times New Roman" w:cs="Times New Roman"/>
+          <w:b/>
+          <w:bCs/>
+          <w:i/>
+          <w:iCs/>
+          <w:sz w:val="24"/>
+          <w:szCs w:val="24"/>
+          <w:u w:val="single"/>
+          <w:lang w:val="es-ES"/>
+        </w:rPr>
+        <w:t xml:space="preserve">MOVIMIENTOS</w:t>
+      </w:r>
+      <w:r>
+        <w:rPr>
           <w:rFonts w:ascii="Asana Math" w:hAnsi="Asana Math" w:cs="Asana Math"/>
-        </w:rPr>
-      </w:pPr>
-      <w:r>
-        <w:rPr>
-          <w:rFonts w:ascii="Asana Math" w:hAnsi="Asana Math" w:cs="Asana Math"/>
-        </w:rPr>
-      </w:r>
-      <w:r>
-        <w:rPr>
-          <w:rFonts w:ascii="Asana Math" w:hAnsi="Asana Math" w:cs="Asana Math"/>
-        </w:rPr>
-      </w:r>
-      <w:r>
-        <w:rPr>
-          <w:rFonts w:ascii="Asana Math" w:hAnsi="Asana Math" w:cs="Asana Math"/>
+          <w:b/>
+          <w:bCs/>
+          <w:i/>
+          <w:iCs/>
+          <w:sz w:val="24"/>
+          <w:szCs w:val="24"/>
+          <w:u w:val="single"/>
+        </w:rPr>
+      </w:r>
+      <w:r>
+        <w:rPr>
+          <w:rFonts w:ascii="Times New Roman" w:hAnsi="Times New Roman" w:cs="Times New Roman"/>
+          <w:b/>
+          <w:bCs/>
+          <w:i/>
+          <w:iCs/>
+          <w:sz w:val="24"/>
+          <w:szCs w:val="24"/>
+          <w:u w:val="single"/>
+        </w:rPr>
+      </w:r>
+      <w:r>
+        <w:rPr>
+          <w:rFonts w:ascii="Times New Roman" w:hAnsi="Times New Roman" w:cs="Times New Roman"/>
+          <w:b/>
+          <w:bCs/>
+          <w:i/>
+          <w:sz w:val="24"/>
+          <w:szCs w:val="24"/>
+          <w:u w:val="single"/>
         </w:rPr>
       </w:r>
     </w:p>
@@ -9910,23 +9954,51 @@
         <w:spacing/>
         <w:ind/>
         <w:jc w:val="center"/>
-        <w:rPr>
-          <w:rFonts w:ascii="Asana Math" w:hAnsi="Asana Math" w:cs="Asana Math"/>
-        </w:rPr>
-      </w:pPr>
-      <w:r>
-        <w:rPr>
-          <w:rFonts w:ascii="Asana Math" w:hAnsi="Asana Math" w:cs="Asana Math"/>
-        </w:rPr>
-      </w:r>
-      <w:r>
-        <w:rPr>
-          <w:rFonts w:ascii="Asana Math" w:hAnsi="Asana Math" w:cs="Asana Math"/>
-        </w:rPr>
-      </w:r>
-      <w:r>
-        <w:rPr>
-          <w:rFonts w:ascii="Asana Math" w:hAnsi="Asana Math" w:cs="Asana Math"/>
+        <w:rPr/>
+      </w:pPr>
+      <w:r>
+        <w:rPr>
+          <w:rFonts w:ascii="Times New Roman" w:hAnsi="Times New Roman" w:cs="Times New Roman"/>
+          <w:b w:val="0"/>
+          <w:bCs w:val="0"/>
+          <w:i w:val="0"/>
+          <w:iCs w:val="0"/>
+          <w:sz w:val="24"/>
+          <w:szCs w:val="24"/>
+          <w:highlight w:val="none"/>
+          <w:u w:val="none"/>
+          <w:lang w:val="es-ES"/>
+        </w:rPr>
+        <w:t xml:space="preserve">Teniendo mi tablero y mi pieza listos, lo siguiente que puedo hacer es empezar a buscar una solución para mover mis fichas. Primordialmente, puedo pensar en la indexación: si me indexo con coordenadas variables, se puede tener mayor control y facilidad.</w:t>
+      </w:r>
+      <w:r/>
+      <w:r>
+        <w:rPr>
+          <w:rFonts w:ascii="Times New Roman" w:hAnsi="Times New Roman" w:cs="Times New Roman"/>
+          <w:b w:val="0"/>
+          <w:bCs w:val="0"/>
+          <w:i w:val="0"/>
+          <w:iCs w:val="0"/>
+          <w:sz w:val="24"/>
+          <w:szCs w:val="24"/>
+          <w:highlight w:val="none"/>
+          <w:u w:val="none"/>
+          <w:lang w:val="es-ES"/>
+        </w:rPr>
+      </w:r>
+      <w:r/>
+      <w:r>
+        <w:rPr>
+          <w:rFonts w:ascii="Times New Roman" w:hAnsi="Times New Roman" w:cs="Times New Roman"/>
+          <w:b w:val="0"/>
+          <w:bCs w:val="0"/>
+          <w:i w:val="0"/>
+          <w:iCs w:val="0"/>
+          <w:sz w:val="24"/>
+          <w:szCs w:val="24"/>
+          <w:highlight w:val="none"/>
+          <w:u w:val="none"/>
+          <w:lang w:val="es-ES"/>
         </w:rPr>
       </w:r>
     </w:p>
@@ -9936,23 +10008,66 @@
         <w:spacing/>
         <w:ind/>
         <w:jc w:val="center"/>
-        <w:rPr>
-          <w:rFonts w:ascii="Asana Math" w:hAnsi="Asana Math" w:cs="Asana Math"/>
-        </w:rPr>
-      </w:pPr>
-      <w:r>
-        <w:rPr>
-          <w:rFonts w:ascii="Asana Math" w:hAnsi="Asana Math" w:cs="Asana Math"/>
-        </w:rPr>
-      </w:r>
-      <w:r>
-        <w:rPr>
-          <w:rFonts w:ascii="Asana Math" w:hAnsi="Asana Math" w:cs="Asana Math"/>
-        </w:rPr>
-      </w:r>
-      <w:r>
-        <w:rPr>
-          <w:rFonts w:ascii="Asana Math" w:hAnsi="Asana Math" w:cs="Asana Math"/>
+        <w:rPr/>
+      </w:pPr>
+      <w:r>
+        <w:rPr>
+          <w:rFonts w:ascii="Times New Roman" w:hAnsi="Times New Roman" w:cs="Times New Roman"/>
+          <w:b w:val="0"/>
+          <w:bCs w:val="0"/>
+          <w:i w:val="0"/>
+          <w:iCs w:val="0"/>
+          <w:sz w:val="24"/>
+          <w:szCs w:val="24"/>
+          <w:highlight w:val="none"/>
+          <w:u w:val="none"/>
+          <w:lang w:val="es-ES"/>
+        </w:rPr>
+        <w:t xml:space="preserve">Antes de mover, claramente debo primero dibujar mi matriz y también eliminar mi matriz dibujada. Así que, optimizando un poco mi código, no utilizo mi header de indexación debido a que necesito que mis coordenadas sean variables, porque después de cada movi</w:t>
+      </w:r>
+      <w:r>
+        <w:rPr>
+          <w:rFonts w:ascii="Times New Roman" w:hAnsi="Times New Roman" w:cs="Times New Roman"/>
+          <w:b w:val="0"/>
+          <w:bCs w:val="0"/>
+          <w:i w:val="0"/>
+          <w:iCs w:val="0"/>
+          <w:sz w:val="24"/>
+          <w:szCs w:val="24"/>
+          <w:highlight w:val="none"/>
+          <w:u w:val="none"/>
+          <w:lang w:val="es-ES"/>
+        </w:rPr>
+        <w:t xml:space="preserve">miento las coordenadas cambian y no se pueden resetear siempre a un mismo punto.</w:t>
+      </w:r>
+      <w:r/>
+      <w:r>
+        <w:rPr>
+          <w:rFonts w:ascii="Times New Roman" w:hAnsi="Times New Roman" w:cs="Times New Roman"/>
+          <w:b w:val="0"/>
+          <w:bCs w:val="0"/>
+          <w:i w:val="0"/>
+          <w:iCs w:val="0"/>
+          <w:sz w:val="24"/>
+          <w:szCs w:val="24"/>
+          <w:highlight w:val="none"/>
+          <w:u w:val="none"/>
+          <w:lang w:val="es-ES"/>
+        </w:rPr>
+      </w:r>
+      <w:r/>
+      <w:r>
+        <w:rPr>
+          <w:rFonts w:ascii="Times New Roman" w:hAnsi="Times New Roman" w:cs="Times New Roman"/>
+          <w:b w:val="0"/>
+          <w:bCs w:val="0"/>
+          <w:i w:val="0"/>
+          <w:iCs w:val="0"/>
+          <w:sz w:val="24"/>
+          <w:szCs w:val="24"/>
+          <w:highlight w:val="none"/>
+          <w:u w:val="none"/>
+          <w:lang w:val="es-ES"/>
         </w:rPr>
       </w:r>
     </w:p>
@@ -9963,22 +10078,58 @@
         <w:ind/>
         <w:jc w:val="center"/>
         <w:rPr>
-          <w:rFonts w:ascii="Asana Math" w:hAnsi="Asana Math" w:cs="Asana Math"/>
-        </w:rPr>
-      </w:pPr>
-      <w:r>
-        <w:rPr>
-          <w:rFonts w:ascii="Asana Math" w:hAnsi="Asana Math" w:cs="Asana Math"/>
-        </w:rPr>
-      </w:r>
-      <w:r>
-        <w:rPr>
-          <w:rFonts w:ascii="Asana Math" w:hAnsi="Asana Math" w:cs="Asana Math"/>
-        </w:rPr>
-      </w:r>
-      <w:r>
-        <w:rPr>
-          <w:rFonts w:ascii="Asana Math" w:hAnsi="Asana Math" w:cs="Asana Math"/>
+          <w:rFonts w:ascii="Times New Roman" w:hAnsi="Times New Roman" w:cs="Times New Roman"/>
+          <w:b w:val="0"/>
+          <w:bCs w:val="0"/>
+          <w:i w:val="0"/>
+          <w:sz w:val="24"/>
+          <w:szCs w:val="24"/>
+          <w:highlight w:val="none"/>
+          <w:u w:val="none"/>
+          <w:lang w:val="es-ES"/>
+        </w:rPr>
+      </w:pPr>
+      <w:r>
+        <w:rPr>
+          <w:rFonts w:ascii="Times New Roman" w:hAnsi="Times New Roman" w:cs="Times New Roman"/>
+          <w:b w:val="0"/>
+          <w:bCs w:val="0"/>
+          <w:i w:val="0"/>
+          <w:iCs w:val="0"/>
+          <w:sz w:val="24"/>
+          <w:szCs w:val="24"/>
+          <w:highlight w:val="none"/>
+          <w:u w:val="none"/>
+          <w:lang w:val="es-ES"/>
+        </w:rPr>
+        <w:t xml:space="preserve">Llevando esta idea en mano, puedo decir que tengo estos flujos de trabajo:</w:t>
+      </w:r>
+      <w:r/>
+      <w:r>
+        <w:rPr>
+          <w:rFonts w:ascii="Times New Roman" w:hAnsi="Times New Roman" w:cs="Times New Roman"/>
+          <w:b w:val="0"/>
+          <w:bCs w:val="0"/>
+          <w:i w:val="0"/>
+          <w:iCs w:val="0"/>
+          <w:sz w:val="24"/>
+          <w:szCs w:val="24"/>
+          <w:highlight w:val="none"/>
+          <w:u w:val="none"/>
+          <w:lang w:val="es-ES"/>
+        </w:rPr>
+      </w:r>
+      <w:r>
+        <w:rPr>
+          <w:rFonts w:ascii="Times New Roman" w:hAnsi="Times New Roman" w:cs="Times New Roman"/>
+          <w:b w:val="0"/>
+          <w:bCs w:val="0"/>
+          <w:i w:val="0"/>
+          <w:sz w:val="24"/>
+          <w:szCs w:val="24"/>
+          <w:highlight w:val="none"/>
+          <w:u w:val="none"/>
+          <w:lang w:val="es-ES"/>
         </w:rPr>
       </w:r>
     </w:p>
@@ -9989,22 +10140,41 @@
         <w:ind/>
         <w:jc w:val="center"/>
         <w:rPr>
-          <w:rFonts w:ascii="Asana Math" w:hAnsi="Asana Math" w:cs="Asana Math"/>
-        </w:rPr>
-      </w:pPr>
-      <w:r>
-        <w:rPr>
-          <w:rFonts w:ascii="Asana Math" w:hAnsi="Asana Math" w:cs="Asana Math"/>
-        </w:rPr>
-      </w:r>
-      <w:r>
-        <w:rPr>
-          <w:rFonts w:ascii="Asana Math" w:hAnsi="Asana Math" w:cs="Asana Math"/>
-        </w:rPr>
-      </w:r>
-      <w:r>
-        <w:rPr>
-          <w:rFonts w:ascii="Asana Math" w:hAnsi="Asana Math" w:cs="Asana Math"/>
+          <w:rFonts w:ascii="Times New Roman" w:hAnsi="Times New Roman" w:cs="Times New Roman"/>
+          <w:b w:val="0"/>
+          <w:bCs w:val="0"/>
+          <w:i w:val="0"/>
+          <w:sz w:val="24"/>
+          <w:szCs w:val="24"/>
+          <w:highlight w:val="none"/>
+          <w:u w:val="none"/>
+          <w:lang w:val="es-ES"/>
+        </w:rPr>
+      </w:pPr>
+      <w:r>
+        <w:rPr>
+          <w:rFonts w:ascii="Times New Roman" w:hAnsi="Times New Roman" w:cs="Times New Roman"/>
+          <w:b w:val="0"/>
+          <w:bCs w:val="0"/>
+          <w:i w:val="0"/>
+          <w:iCs w:val="0"/>
+          <w:sz w:val="24"/>
+          <w:szCs w:val="24"/>
+          <w:highlight w:val="none"/>
+          <w:u w:val="none"/>
+          <w:lang w:val="es-ES"/>
+        </w:rPr>
+        <w:t xml:space="preserve">elimino tetrimino anterior</w:t>
+      </w:r>
+      <w:r>
+        <w:rPr>
+          <w:rFonts w:ascii="Times New Roman" w:hAnsi="Times New Roman" w:cs="Times New Roman"/>
+          <w:b w:val="0"/>
+          <w:bCs w:val="0"/>
+          <w:i w:val="0"/>
+          <w:sz w:val="24"/>
+          <w:szCs w:val="24"/>
+          <w:u w:val="none"/>
         </w:rPr>
       </w:r>
     </w:p>
@@ -10015,6 +10185,1012 @@
         <w:ind/>
         <w:jc w:val="center"/>
         <w:rPr>
+          <w:rFonts w:ascii="Times New Roman" w:hAnsi="Times New Roman" w:cs="Times New Roman"/>
+          <w:b w:val="0"/>
+          <w:bCs w:val="0"/>
+          <w:i w:val="0"/>
+          <w:sz w:val="24"/>
+          <w:szCs w:val="24"/>
+          <w:highlight w:val="none"/>
+          <w:u w:val="none"/>
+          <w:lang w:val="es-ES"/>
+        </w:rPr>
+      </w:pPr>
+      <w:r>
+        <w:rPr>
+          <w:rFonts w:ascii="Times New Roman" w:hAnsi="Times New Roman" w:cs="Times New Roman"/>
+          <w:b w:val="0"/>
+          <w:bCs w:val="0"/>
+          <w:i w:val="0"/>
+          <w:iCs w:val="0"/>
+          <w:sz w:val="24"/>
+          <w:szCs w:val="24"/>
+          <w:highlight w:val="none"/>
+          <w:u w:val="none"/>
+          <w:lang w:val="es-ES"/>
+        </w:rPr>
+        <w:t xml:space="preserve">Movimiento de tetrimino</w:t>
+      </w:r>
+      <w:r>
+        <w:rPr>
+          <w:rFonts w:ascii="Times New Roman" w:hAnsi="Times New Roman" w:cs="Times New Roman"/>
+          <w:b w:val="0"/>
+          <w:bCs w:val="0"/>
+          <w:i w:val="0"/>
+          <w:sz w:val="24"/>
+          <w:szCs w:val="24"/>
+          <w:u w:val="none"/>
+        </w:rPr>
+      </w:r>
+    </w:p>
+    <w:p>
+      <w:pPr>
+        <w:pBdr/>
+        <w:spacing/>
+        <w:ind/>
+        <w:jc w:val="center"/>
+        <w:rPr>
+          <w:rFonts w:ascii="Times New Roman" w:hAnsi="Times New Roman" w:cs="Times New Roman"/>
+          <w:b w:val="0"/>
+          <w:bCs w:val="0"/>
+          <w:i w:val="0"/>
+          <w:sz w:val="24"/>
+          <w:szCs w:val="24"/>
+          <w:highlight w:val="none"/>
+          <w:u w:val="none"/>
+          <w:lang w:val="es-ES"/>
+        </w:rPr>
+      </w:pPr>
+      <w:r>
+        <w:rPr>
+          <w:rFonts w:ascii="Times New Roman" w:hAnsi="Times New Roman" w:cs="Times New Roman"/>
+          <w:b w:val="0"/>
+          <w:bCs w:val="0"/>
+          <w:i w:val="0"/>
+          <w:iCs w:val="0"/>
+          <w:sz w:val="24"/>
+          <w:szCs w:val="24"/>
+          <w:highlight w:val="none"/>
+          <w:u w:val="none"/>
+          <w:lang w:val="es-ES"/>
+        </w:rPr>
+        <w:t xml:space="preserve">dibujo tetrimino actual</w:t>
+      </w:r>
+      <w:r>
+        <w:rPr>
+          <w:rFonts w:ascii="Times New Roman" w:hAnsi="Times New Roman" w:cs="Times New Roman"/>
+          <w:b w:val="0"/>
+          <w:bCs w:val="0"/>
+          <w:i w:val="0"/>
+          <w:sz w:val="24"/>
+          <w:szCs w:val="24"/>
+          <w:u w:val="none"/>
+        </w:rPr>
+      </w:r>
+      <w:r>
+        <w:rPr>
+          <w:rFonts w:ascii="Times New Roman" w:hAnsi="Times New Roman" w:cs="Times New Roman"/>
+          <w:b w:val="0"/>
+          <w:bCs w:val="0"/>
+          <w:i w:val="0"/>
+          <w:sz w:val="24"/>
+          <w:szCs w:val="24"/>
+          <w:highlight w:val="none"/>
+          <w:u w:val="none"/>
+          <w:lang w:val="es-ES"/>
+        </w:rPr>
+      </w:r>
+    </w:p>
+    <w:p>
+      <w:pPr>
+        <w:pBdr/>
+        <w:spacing/>
+        <w:ind/>
+        <w:jc w:val="center"/>
+        <w:rPr/>
+      </w:pPr>
+      <w:r>
+        <w:rPr>
+          <w:rFonts w:ascii="Times New Roman" w:hAnsi="Times New Roman" w:cs="Times New Roman"/>
+          <w:b w:val="0"/>
+          <w:bCs w:val="0"/>
+          <w:i w:val="0"/>
+          <w:sz w:val="24"/>
+          <w:szCs w:val="24"/>
+          <w:highlight w:val="none"/>
+          <w:u w:val="none"/>
+          <w:lang w:val="es-ES" w:bidi="es-ES"/>
+        </w:rPr>
+        <w:t xml:space="preserve">Lo primero que tengo que hacer a la hora de eliminar o dibujar un tetrimino es indexarme, y eso lo puedo hacer recorriendo el índice de mi tetrimino [i][j]. En este caso, ambos son de 4x4.</w:t>
+      </w:r>
+      <w:r/>
+      <w:r>
+        <w:rPr>
+          <w:rFonts w:ascii="Times New Roman" w:hAnsi="Times New Roman" w:cs="Times New Roman"/>
+          <w:b w:val="0"/>
+          <w:bCs w:val="0"/>
+          <w:i w:val="0"/>
+          <w:sz w:val="24"/>
+          <w:szCs w:val="24"/>
+          <w:highlight w:val="none"/>
+          <w:u w:val="none"/>
+          <w:lang w:val="es-ES" w:bidi="es-ES"/>
+        </w:rPr>
+      </w:r>
+    </w:p>
+    <w:p>
+      <w:pPr>
+        <w:pBdr/>
+        <w:spacing/>
+        <w:ind/>
+        <w:jc w:val="center"/>
+        <w:rPr/>
+      </w:pPr>
+      <w:r>
+        <w:rPr>
+          <w:rFonts w:ascii="Times New Roman" w:hAnsi="Times New Roman" w:cs="Times New Roman"/>
+          <w:b w:val="0"/>
+          <w:bCs w:val="0"/>
+          <w:i w:val="0"/>
+          <w:sz w:val="24"/>
+          <w:szCs w:val="24"/>
+          <w:highlight w:val="none"/>
+          <w:u w:val="none"/>
+          <w:lang w:val="es-ES" w:bidi="es-ES"/>
+        </w:rPr>
+        <w:t xml:space="preserve">Lo siguiente es verificar qué fichas están activas o inactivas.</w:t>
+      </w:r>
+      <w:r/>
+      <w:r>
+        <w:rPr>
+          <w:rFonts w:ascii="Times New Roman" w:hAnsi="Times New Roman" w:cs="Times New Roman"/>
+          <w:b w:val="0"/>
+          <w:bCs w:val="0"/>
+          <w:i w:val="0"/>
+          <w:sz w:val="24"/>
+          <w:szCs w:val="24"/>
+          <w:highlight w:val="none"/>
+          <w:u w:val="none"/>
+          <w:lang w:val="es-ES" w:bidi="es-ES"/>
+        </w:rPr>
+      </w:r>
+      <w:r/>
+      <w:r>
+        <w:rPr>
+          <w:rFonts w:ascii="Times New Roman" w:hAnsi="Times New Roman" w:cs="Times New Roman"/>
+          <w:b w:val="0"/>
+          <w:bCs w:val="0"/>
+          <w:i w:val="0"/>
+          <w:sz w:val="24"/>
+          <w:szCs w:val="24"/>
+          <w:highlight w:val="none"/>
+          <w:u w:val="none"/>
+          <w:lang w:val="es-ES" w:bidi="es-ES"/>
+        </w:rPr>
+      </w:r>
+    </w:p>
+    <w:p>
+      <w:pPr>
+        <w:pBdr/>
+        <w:spacing/>
+        <w:ind/>
+        <w:jc w:val="center"/>
+        <w:rPr/>
+      </w:pPr>
+      <w:r>
+        <w:rPr>
+          <w:rFonts w:ascii="Times New Roman" w:hAnsi="Times New Roman" w:cs="Times New Roman"/>
+          <w:b w:val="0"/>
+          <w:bCs w:val="0"/>
+          <w:i w:val="0"/>
+          <w:sz w:val="24"/>
+          <w:szCs w:val="24"/>
+          <w:highlight w:val="none"/>
+          <w:u w:val="none"/>
+          <w:lang w:val="es-ES" w:bidi="es-ES"/>
+        </w:rPr>
+        <w:t xml:space="preserve">Si la ficha está activa, entonces inicio mis coordenadas variables y empiezo a moverme entre filas y columnas con ayudas auxiliares de las variables i, j.</w:t>
+      </w:r>
+      <w:r/>
+      <w:r>
+        <w:rPr>
+          <w:rFonts w:ascii="Times New Roman" w:hAnsi="Times New Roman" w:cs="Times New Roman"/>
+          <w:b w:val="0"/>
+          <w:bCs w:val="0"/>
+          <w:i w:val="0"/>
+          <w:sz w:val="24"/>
+          <w:szCs w:val="24"/>
+          <w:highlight w:val="none"/>
+          <w:u w:val="none"/>
+          <w:lang w:val="es-ES" w:bidi="es-ES"/>
+        </w:rPr>
+      </w:r>
+      <w:r/>
+      <w:r>
+        <w:rPr>
+          <w:rFonts w:ascii="Times New Roman" w:hAnsi="Times New Roman" w:cs="Times New Roman"/>
+          <w:b w:val="0"/>
+          <w:bCs w:val="0"/>
+          <w:i w:val="0"/>
+          <w:sz w:val="24"/>
+          <w:szCs w:val="24"/>
+          <w:highlight w:val="none"/>
+          <w:u w:val="none"/>
+          <w:lang w:val="es-ES" w:bidi="es-ES"/>
+        </w:rPr>
+      </w:r>
+    </w:p>
+    <w:p>
+      <w:pPr>
+        <w:pBdr/>
+        <w:spacing/>
+        <w:ind/>
+        <w:jc w:val="center"/>
+        <w:rPr/>
+      </w:pPr>
+      <w:r>
+        <w:rPr>
+          <w:rFonts w:ascii="Times New Roman" w:hAnsi="Times New Roman" w:cs="Times New Roman"/>
+          <w:b w:val="0"/>
+          <w:bCs w:val="0"/>
+          <w:i w:val="0"/>
+          <w:sz w:val="24"/>
+          <w:szCs w:val="24"/>
+          <w:highlight w:val="none"/>
+          <w:u w:val="none"/>
+          <w:lang w:val="es-ES" w:bidi="es-ES"/>
+        </w:rPr>
+        <w:t xml:space="preserve">Después de indexarme de esa manera, empiezo a buscar cuántos bytes y bits tienen las columnas con operaciones sencillas, para poder hacer los bitwise después.</w:t>
+      </w:r>
+      <w:r/>
+      <w:r>
+        <w:rPr>
+          <w:rFonts w:ascii="Times New Roman" w:hAnsi="Times New Roman" w:cs="Times New Roman"/>
+          <w:b w:val="0"/>
+          <w:bCs w:val="0"/>
+          <w:i w:val="0"/>
+          <w:sz w:val="24"/>
+          <w:szCs w:val="24"/>
+          <w:highlight w:val="none"/>
+          <w:u w:val="none"/>
+          <w:lang w:val="es-ES" w:bidi="es-ES"/>
+        </w:rPr>
+      </w:r>
+      <w:r/>
+      <w:r>
+        <w:rPr>
+          <w:rFonts w:ascii="Times New Roman" w:hAnsi="Times New Roman" w:cs="Times New Roman"/>
+          <w:b w:val="0"/>
+          <w:bCs w:val="0"/>
+          <w:i w:val="0"/>
+          <w:sz w:val="24"/>
+          <w:szCs w:val="24"/>
+          <w:highlight w:val="none"/>
+          <w:u w:val="none"/>
+          <w:lang w:val="es-ES" w:bidi="es-ES"/>
+        </w:rPr>
+      </w:r>
+    </w:p>
+    <w:p>
+      <w:pPr>
+        <w:pBdr/>
+        <w:spacing/>
+        <w:ind/>
+        <w:jc w:val="center"/>
+        <w:rPr/>
+      </w:pPr>
+      <w:r>
+        <w:rPr>
+          <w:rFonts w:ascii="Times New Roman" w:hAnsi="Times New Roman" w:cs="Times New Roman"/>
+          <w:b w:val="0"/>
+          <w:bCs w:val="0"/>
+          <w:i w:val="0"/>
+          <w:sz w:val="24"/>
+          <w:szCs w:val="24"/>
+          <w:highlight w:val="none"/>
+          <w:u w:val="none"/>
+          <w:lang w:val="es-ES" w:bidi="es-ES"/>
+        </w:rPr>
+        <w:t xml:space="preserve">Cuando empiezo a recorrer los bits, hago un bitwise que utiliza la siguiente lógica:</w:t>
+      </w:r>
+      <w:r/>
+      <w:r>
+        <w:rPr>
+          <w:rFonts w:ascii="Times New Roman" w:hAnsi="Times New Roman" w:cs="Times New Roman"/>
+          <w:b w:val="0"/>
+          <w:bCs w:val="0"/>
+          <w:i w:val="0"/>
+          <w:sz w:val="24"/>
+          <w:szCs w:val="24"/>
+          <w:highlight w:val="none"/>
+          <w:u w:val="none"/>
+          <w:lang w:val="es-ES" w:bidi="es-ES"/>
+        </w:rPr>
+      </w:r>
+      <w:r/>
+      <w:r>
+        <w:rPr>
+          <w:rFonts w:ascii="Times New Roman" w:hAnsi="Times New Roman" w:cs="Times New Roman"/>
+          <w:b w:val="0"/>
+          <w:bCs w:val="0"/>
+          <w:i w:val="0"/>
+          <w:sz w:val="24"/>
+          <w:szCs w:val="24"/>
+          <w:highlight w:val="none"/>
+          <w:u w:val="none"/>
+          <w:lang w:val="es-ES" w:bidi="es-ES"/>
+        </w:rPr>
+      </w:r>
+    </w:p>
+    <w:p>
+      <w:pPr>
+        <w:pBdr/>
+        <w:spacing/>
+        <w:ind/>
+        <w:jc w:val="center"/>
+        <w:rPr>
+          <w:rFonts w:ascii="Times New Roman" w:hAnsi="Times New Roman" w:cs="Times New Roman"/>
+          <w:b w:val="0"/>
+          <w:bCs w:val="0"/>
+          <w:i w:val="0"/>
+          <w:sz w:val="24"/>
+          <w:szCs w:val="24"/>
+          <w:highlight w:val="none"/>
+          <w:u w:val="none"/>
+          <w:lang w:val="es-ES" w:bidi="es-ES"/>
+        </w:rPr>
+      </w:pPr>
+      <w:r>
+        <w:rPr>
+          <w:rFonts w:ascii="Times New Roman" w:hAnsi="Times New Roman" w:cs="Times New Roman"/>
+          <w:b w:val="0"/>
+          <w:bCs w:val="0"/>
+          <w:i w:val="0"/>
+          <w:sz w:val="24"/>
+          <w:szCs w:val="24"/>
+          <w:highlight w:val="none"/>
+          <w:u w:val="none"/>
+          <w:lang w:val="es-ES" w:bidi="es-ES"/>
+        </w:rPr>
+        <w:t xml:space="preserve">A | B nos dice que si un bit está activo, entonces todos estarán activos.</w:t>
+      </w:r>
+      <w:r/>
+      <w:r>
+        <w:rPr>
+          <w:rFonts w:ascii="Times New Roman" w:hAnsi="Times New Roman" w:cs="Times New Roman"/>
+          <w:b w:val="0"/>
+          <w:bCs w:val="0"/>
+          <w:i w:val="0"/>
+          <w:sz w:val="24"/>
+          <w:szCs w:val="24"/>
+          <w:highlight w:val="none"/>
+          <w:u w:val="none"/>
+          <w:lang w:val="es-ES" w:bidi="es-ES"/>
+        </w:rPr>
+      </w:r>
+      <w:r>
+        <w:rPr>
+          <w:rFonts w:ascii="Times New Roman" w:hAnsi="Times New Roman" w:cs="Times New Roman"/>
+          <w:b w:val="0"/>
+          <w:bCs w:val="0"/>
+          <w:i w:val="0"/>
+          <w:sz w:val="24"/>
+          <w:szCs w:val="24"/>
+          <w:highlight w:val="none"/>
+          <w:u w:val="none"/>
+          <w:lang w:val="es-ES" w:bidi="es-ES"/>
+        </w:rPr>
+      </w:r>
+    </w:p>
+    <w:p>
+      <w:pPr>
+        <w:pBdr/>
+        <w:spacing/>
+        <w:ind/>
+        <w:jc w:val="center"/>
+        <w:rPr>
+          <w:rFonts w:ascii="Times New Roman" w:hAnsi="Times New Roman" w:cs="Times New Roman"/>
+          <w:b w:val="0"/>
+          <w:bCs w:val="0"/>
+          <w:i w:val="0"/>
+          <w:sz w:val="24"/>
+          <w:szCs w:val="24"/>
+          <w:highlight w:val="none"/>
+          <w:u w:val="none"/>
+          <w:lang w:val="es-ES" w:bidi="es-ES"/>
+        </w:rPr>
+      </w:pPr>
+      <w:r>
+        <w:rPr>
+          <w:rFonts w:ascii="Times New Roman" w:hAnsi="Times New Roman" w:cs="Times New Roman"/>
+          <w:b w:val="0"/>
+          <w:bCs w:val="0"/>
+          <w:i w:val="0"/>
+          <w:sz w:val="24"/>
+          <w:szCs w:val="24"/>
+          <w:highlight w:val="none"/>
+          <w:u w:val="none"/>
+          <w:lang w:val="es-ES" w:bidi="es-ES"/>
+        </w:rPr>
+      </w:r>
+      <w:r>
+        <mc:AlternateContent>
+          <mc:Choice Requires="wpg">
+            <w:drawing>
+              <wp:anchor xmlns:wp="http://schemas.openxmlformats.org/drawingml/2006/wordprocessingDrawing" xmlns:wp14="http://schemas.microsoft.com/office/word/2010/wordprocessingDrawing" distT="0" distB="0" distL="115200" distR="115200" simplePos="0" relativeHeight="26624" behindDoc="0" locked="0" layoutInCell="1" allowOverlap="1">
+                <wp:simplePos x="0" y="0"/>
+                <wp:positionH relativeFrom="column">
+                  <wp:posOffset>614362</wp:posOffset>
+                </wp:positionH>
+                <wp:positionV relativeFrom="paragraph">
+                  <wp:posOffset>38788</wp:posOffset>
+                </wp:positionV>
+                <wp:extent cx="4714875" cy="1485900"/>
+                <wp:effectExtent l="3175" t="3175" r="3175" b="3175"/>
+                <wp:wrapNone/>
+                <wp:docPr id="18" name=""/>
+                <wp:cNvGraphicFramePr/>
+                <a:graphic xmlns:a="http://schemas.openxmlformats.org/drawingml/2006/main">
+                  <a:graphicData uri="http://schemas.microsoft.com/office/word/2010/wordprocessingShape">
+                    <wps:wsp>
+                      <wps:cNvPr id="0" name=""/>
+                      <wps:cNvSpPr txBox="1"/>
+                      <wps:spPr bwMode="auto">
+                        <a:xfrm rot="0" flipH="0" flipV="0">
+                          <a:off x="0" y="0"/>
+                          <a:ext cx="4714875" cy="1485900"/>
+                        </a:xfrm>
+                        <a:prstGeom prst="rect">
+                          <a:avLst/>
+                        </a:prstGeom>
+                        <a:solidFill>
+                          <a:schemeClr val="lt1"/>
+                        </a:solidFill>
+                        <a:ln w="6350">
+                          <a:solidFill>
+                            <a:prstClr val="black"/>
+                          </a:solidFill>
+                        </a:ln>
+                      </wps:spPr>
+                      <wps:txbx>
+                        <w:txbxContent>
+                          <w:p>
+                            <w:pPr>
+                              <w:pBdr/>
+                              <w:spacing/>
+                              <w:ind/>
+                              <w:rPr>
+                                <w:rFonts w:ascii="Classic Console" w:hAnsi="Classic Console" w:cs="Classic Console"/>
+                                <w:sz w:val="32"/>
+                                <w:szCs w:val="32"/>
+                              </w:rPr>
+                            </w:pPr>
+                            <w:r>
+                              <w:rPr>
+                                <w:rFonts w:ascii="Classic Console" w:hAnsi="Classic Console" w:eastAsia="Classic Console" w:cs="Classic Console"/>
+                                <w:sz w:val="32"/>
+                                <w:szCs w:val="32"/>
+                                <w:lang w:val="es-ES"/>
+                              </w:rPr>
+                              <w:t xml:space="preserve">                </w:t>
+                            </w:r>
+                            <w:r>
+                              <w:rPr>
+                                <w:rFonts w:ascii="Classic Console" w:hAnsi="Classic Console" w:eastAsia="Classic Console" w:cs="Classic Console"/>
+                                <w:sz w:val="32"/>
+                                <w:szCs w:val="32"/>
+                              </w:rPr>
+                              <w:t xml:space="preserve">int fila = y + i;</w:t>
+                            </w:r>
+                            <w:r>
+                              <w:rPr>
+                                <w:rFonts w:ascii="Classic Console" w:hAnsi="Classic Console" w:eastAsia="Classic Console" w:cs="Classic Console"/>
+                                <w:sz w:val="32"/>
+                                <w:szCs w:val="32"/>
+                              </w:rPr>
+                            </w:r>
+                          </w:p>
+                          <w:p>
+                            <w:pPr>
+                              <w:pBdr/>
+                              <w:spacing/>
+                              <w:ind/>
+                              <w:rPr>
+                                <w:rFonts w:ascii="Classic Console" w:hAnsi="Classic Console" w:cs="Classic Console"/>
+                                <w:sz w:val="32"/>
+                                <w:szCs w:val="32"/>
+                              </w:rPr>
+                            </w:pPr>
+                            <w:r>
+                              <w:rPr>
+                                <w:rFonts w:ascii="Classic Console" w:hAnsi="Classic Console" w:eastAsia="Classic Console" w:cs="Classic Console"/>
+                                <w:sz w:val="32"/>
+                                <w:szCs w:val="32"/>
+                              </w:rPr>
+                              <w:t xml:space="preserve">                int columna = x + j;</w:t>
+                            </w:r>
+                            <w:r>
+                              <w:rPr>
+                                <w:rFonts w:ascii="Classic Console" w:hAnsi="Classic Console" w:eastAsia="Classic Console" w:cs="Classic Console"/>
+                                <w:sz w:val="32"/>
+                                <w:szCs w:val="32"/>
+                              </w:rPr>
+                            </w:r>
+                          </w:p>
+                          <w:p>
+                            <w:pPr>
+                              <w:pBdr/>
+                              <w:spacing/>
+                              <w:ind/>
+                              <w:rPr>
+                                <w:rFonts w:ascii="Classic Console" w:hAnsi="Classic Console" w:cs="Classic Console"/>
+                                <w:sz w:val="32"/>
+                                <w:szCs w:val="32"/>
+                              </w:rPr>
+                            </w:pPr>
+                            <w:r>
+                              <w:rPr>
+                                <w:rFonts w:ascii="Classic Console" w:hAnsi="Classic Console" w:eastAsia="Classic Console" w:cs="Classic Console"/>
+                                <w:sz w:val="32"/>
+                                <w:szCs w:val="32"/>
+                              </w:rPr>
+                              <w:t xml:space="preserve">                int byte = columna / 8;</w:t>
+                            </w:r>
+                            <w:r>
+                              <w:rPr>
+                                <w:rFonts w:ascii="Classic Console" w:hAnsi="Classic Console" w:eastAsia="Classic Console" w:cs="Classic Console"/>
+                                <w:sz w:val="32"/>
+                                <w:szCs w:val="32"/>
+                              </w:rPr>
+                            </w:r>
+                          </w:p>
+                          <w:p>
+                            <w:pPr>
+                              <w:pBdr/>
+                              <w:spacing/>
+                              <w:ind/>
+                              <w:rPr>
+                                <w:rFonts w:ascii="Classic Console" w:hAnsi="Classic Console" w:cs="Classic Console"/>
+                                <w:sz w:val="32"/>
+                                <w:szCs w:val="32"/>
+                              </w:rPr>
+                            </w:pPr>
+                            <w:r>
+                              <w:rPr>
+                                <w:rFonts w:ascii="Classic Console" w:hAnsi="Classic Console" w:eastAsia="Classic Console" w:cs="Classic Console"/>
+                                <w:sz w:val="32"/>
+                                <w:szCs w:val="32"/>
+                              </w:rPr>
+                              <w:t xml:space="preserve">                int bit = columna % 8;</w:t>
+                            </w:r>
+                            <w:r>
+                              <w:rPr>
+                                <w:rFonts w:ascii="Classic Console" w:hAnsi="Classic Console" w:eastAsia="Classic Console" w:cs="Classic Console"/>
+                                <w:sz w:val="32"/>
+                                <w:szCs w:val="32"/>
+                              </w:rPr>
+                            </w:r>
+                          </w:p>
+                          <w:p>
+                            <w:pPr>
+                              <w:pBdr/>
+                              <w:spacing/>
+                              <w:ind/>
+                              <w:rPr>
+                                <w:rFonts w:ascii="Classic Console" w:hAnsi="Classic Console" w:cs="Classic Console"/>
+                                <w:sz w:val="32"/>
+                                <w:szCs w:val="32"/>
+                              </w:rPr>
+                            </w:pPr>
+                            <w:r>
+                              <w:rPr>
+                                <w:rFonts w:ascii="Classic Console" w:hAnsi="Classic Console" w:eastAsia="Classic Console" w:cs="Classic Console"/>
+                                <w:sz w:val="32"/>
+                                <w:szCs w:val="32"/>
+                              </w:rPr>
+                              <w:t xml:space="preserve">                tablero[fila][byte] |= (1 &lt;&lt; (7-bit)); </w:t>
+                            </w:r>
+                            <w:r>
+                              <w:rPr>
+                                <w:rFonts w:ascii="Classic Console" w:hAnsi="Classic Console" w:eastAsia="Classic Console" w:cs="Classic Console"/>
+                                <w:sz w:val="32"/>
+                                <w:szCs w:val="32"/>
+                              </w:rPr>
+                            </w:r>
+                            <w:r>
+                              <w:rPr>
+                                <w:rFonts w:ascii="Classic Console" w:hAnsi="Classic Console" w:eastAsia="Classic Console" w:cs="Classic Console"/>
+                                <w:sz w:val="32"/>
+                                <w:szCs w:val="32"/>
+                              </w:rPr>
+                            </w:r>
+                          </w:p>
+                        </w:txbxContent>
+                      </wps:txbx>
+                      <wps:bodyPr vertOverflow="overflow" horzOverflow="overflow" vert="horz" wrap="square" lIns="91440" tIns="45720" rIns="91440" bIns="45720" numCol="1" spcCol="0" rtlCol="0" fromWordArt="0" anchor="t" anchorCtr="0" forceAA="0" upright="0" compatLnSpc="0"/>
+                    </wps:wsp>
+                  </a:graphicData>
+                </a:graphic>
+              </wp:anchor>
+            </w:drawing>
+          </mc:Choice>
+          <mc:Fallback>
+            <w:pict>
+              <v:shape id="shape 17" o:spid="_x0000_s17" o:spt="202" type="#_x0000_t202" style="position:absolute;z-index:26624;o:allowoverlap:true;o:allowincell:true;mso-position-horizontal-relative:text;margin-left:48.37pt;mso-position-horizontal:absolute;mso-position-vertical-relative:text;margin-top:3.05pt;mso-position-vertical:absolute;width:371.25pt;height:117.00pt;mso-wrap-distance-left:9.07pt;mso-wrap-distance-top:0.00pt;mso-wrap-distance-right:9.07pt;mso-wrap-distance-bottom:0.00pt;rotation:0;v-text-anchor:top;visibility:visible;" fillcolor="#FFFFFF" strokecolor="#000000" strokeweight="0.50pt">
+                <v:textbox inset="0,0,0,0">
+                  <w:txbxContent>
+                    <w:p>
+                      <w:pPr>
+                        <w:pBdr/>
+                        <w:spacing/>
+                        <w:ind/>
+                        <w:rPr>
+                          <w:rFonts w:ascii="Classic Console" w:hAnsi="Classic Console" w:cs="Classic Console"/>
+                          <w:sz w:val="32"/>
+                          <w:szCs w:val="32"/>
+                        </w:rPr>
+                      </w:pPr>
+                      <w:r>
+                        <w:rPr>
+                          <w:rFonts w:ascii="Classic Console" w:hAnsi="Classic Console" w:eastAsia="Classic Console" w:cs="Classic Console"/>
+                          <w:sz w:val="32"/>
+                          <w:szCs w:val="32"/>
+                          <w:lang w:val="es-ES"/>
+                        </w:rPr>
+                        <w:t xml:space="preserve">                </w:t>
+                      </w:r>
+                      <w:r>
+                        <w:rPr>
+                          <w:rFonts w:ascii="Classic Console" w:hAnsi="Classic Console" w:eastAsia="Classic Console" w:cs="Classic Console"/>
+                          <w:sz w:val="32"/>
+                          <w:szCs w:val="32"/>
+                        </w:rPr>
+                        <w:t xml:space="preserve">int fila = y + i;</w:t>
+                      </w:r>
+                      <w:r>
+                        <w:rPr>
+                          <w:rFonts w:ascii="Classic Console" w:hAnsi="Classic Console" w:eastAsia="Classic Console" w:cs="Classic Console"/>
+                          <w:sz w:val="32"/>
+                          <w:szCs w:val="32"/>
+                        </w:rPr>
+                      </w:r>
+                    </w:p>
+                    <w:p>
+                      <w:pPr>
+                        <w:pBdr/>
+                        <w:spacing/>
+                        <w:ind/>
+                        <w:rPr>
+                          <w:rFonts w:ascii="Classic Console" w:hAnsi="Classic Console" w:cs="Classic Console"/>
+                          <w:sz w:val="32"/>
+                          <w:szCs w:val="32"/>
+                        </w:rPr>
+                      </w:pPr>
+                      <w:r>
+                        <w:rPr>
+                          <w:rFonts w:ascii="Classic Console" w:hAnsi="Classic Console" w:eastAsia="Classic Console" w:cs="Classic Console"/>
+                          <w:sz w:val="32"/>
+                          <w:szCs w:val="32"/>
+                        </w:rPr>
+                        <w:t xml:space="preserve">                int columna = x + j;</w:t>
+                      </w:r>
+                      <w:r>
+                        <w:rPr>
+                          <w:rFonts w:ascii="Classic Console" w:hAnsi="Classic Console" w:eastAsia="Classic Console" w:cs="Classic Console"/>
+                          <w:sz w:val="32"/>
+                          <w:szCs w:val="32"/>
+                        </w:rPr>
+                      </w:r>
+                    </w:p>
+                    <w:p>
+                      <w:pPr>
+                        <w:pBdr/>
+                        <w:spacing/>
+                        <w:ind/>
+                        <w:rPr>
+                          <w:rFonts w:ascii="Classic Console" w:hAnsi="Classic Console" w:cs="Classic Console"/>
+                          <w:sz w:val="32"/>
+                          <w:szCs w:val="32"/>
+                        </w:rPr>
+                      </w:pPr>
+                      <w:r>
+                        <w:rPr>
+                          <w:rFonts w:ascii="Classic Console" w:hAnsi="Classic Console" w:eastAsia="Classic Console" w:cs="Classic Console"/>
+                          <w:sz w:val="32"/>
+                          <w:szCs w:val="32"/>
+                        </w:rPr>
+                        <w:t xml:space="preserve">                int byte = columna / 8;</w:t>
+                      </w:r>
+                      <w:r>
+                        <w:rPr>
+                          <w:rFonts w:ascii="Classic Console" w:hAnsi="Classic Console" w:eastAsia="Classic Console" w:cs="Classic Console"/>
+                          <w:sz w:val="32"/>
+                          <w:szCs w:val="32"/>
+                        </w:rPr>
+                      </w:r>
+                    </w:p>
+                    <w:p>
+                      <w:pPr>
+                        <w:pBdr/>
+                        <w:spacing/>
+                        <w:ind/>
+                        <w:rPr>
+                          <w:rFonts w:ascii="Classic Console" w:hAnsi="Classic Console" w:cs="Classic Console"/>
+                          <w:sz w:val="32"/>
+                          <w:szCs w:val="32"/>
+                        </w:rPr>
+                      </w:pPr>
+                      <w:r>
+                        <w:rPr>
+                          <w:rFonts w:ascii="Classic Console" w:hAnsi="Classic Console" w:eastAsia="Classic Console" w:cs="Classic Console"/>
+                          <w:sz w:val="32"/>
+                          <w:szCs w:val="32"/>
+                        </w:rPr>
+                        <w:t xml:space="preserve">                int bit = columna % 8;</w:t>
+                      </w:r>
+                      <w:r>
+                        <w:rPr>
+                          <w:rFonts w:ascii="Classic Console" w:hAnsi="Classic Console" w:eastAsia="Classic Console" w:cs="Classic Console"/>
+                          <w:sz w:val="32"/>
+                          <w:szCs w:val="32"/>
+                        </w:rPr>
+                      </w:r>
+                    </w:p>
+                    <w:p>
+                      <w:pPr>
+                        <w:pBdr/>
+                        <w:spacing/>
+                        <w:ind/>
+                        <w:rPr>
+                          <w:rFonts w:ascii="Classic Console" w:hAnsi="Classic Console" w:cs="Classic Console"/>
+                          <w:sz w:val="32"/>
+                          <w:szCs w:val="32"/>
+                        </w:rPr>
+                      </w:pPr>
+                      <w:r>
+                        <w:rPr>
+                          <w:rFonts w:ascii="Classic Console" w:hAnsi="Classic Console" w:eastAsia="Classic Console" w:cs="Classic Console"/>
+                          <w:sz w:val="32"/>
+                          <w:szCs w:val="32"/>
+                        </w:rPr>
+                        <w:t xml:space="preserve">                tablero[fila][byte] |= (1 &lt;&lt; (7-bit)); </w:t>
+                      </w:r>
+                      <w:r>
+                        <w:rPr>
+                          <w:rFonts w:ascii="Classic Console" w:hAnsi="Classic Console" w:eastAsia="Classic Console" w:cs="Classic Console"/>
+                          <w:sz w:val="32"/>
+                          <w:szCs w:val="32"/>
+                        </w:rPr>
+                      </w:r>
+                      <w:r>
+                        <w:rPr>
+                          <w:rFonts w:ascii="Classic Console" w:hAnsi="Classic Console" w:eastAsia="Classic Console" w:cs="Classic Console"/>
+                          <w:sz w:val="32"/>
+                          <w:szCs w:val="32"/>
+                        </w:rPr>
+                      </w:r>
+                    </w:p>
+                  </w:txbxContent>
+                </v:textbox>
+              </v:shape>
+            </w:pict>
+          </mc:Fallback>
+        </mc:AlternateContent>
+      </w:r>
+      <w:r>
+        <w:rPr>
+          <w:rFonts w:ascii="Times New Roman" w:hAnsi="Times New Roman" w:cs="Times New Roman"/>
+          <w:b w:val="0"/>
+          <w:bCs w:val="0"/>
+          <w:i w:val="0"/>
+          <w:sz w:val="24"/>
+          <w:szCs w:val="24"/>
+          <w:highlight w:val="none"/>
+          <w:u w:val="none"/>
+          <w:lang w:val="es-ES" w:bidi="es-ES"/>
+        </w:rPr>
+      </w:r>
+      <w:r>
+        <w:rPr>
+          <w:rFonts w:ascii="Times New Roman" w:hAnsi="Times New Roman" w:cs="Times New Roman"/>
+          <w:b w:val="0"/>
+          <w:bCs w:val="0"/>
+          <w:i w:val="0"/>
+          <w:sz w:val="24"/>
+          <w:szCs w:val="24"/>
+          <w:highlight w:val="none"/>
+          <w:u w:val="none"/>
+          <w:lang w:val="es-ES" w:bidi="es-ES"/>
+        </w:rPr>
+      </w:r>
+      <w:r>
+        <w:rPr>
+          <w:rFonts w:ascii="Times New Roman" w:hAnsi="Times New Roman" w:cs="Times New Roman"/>
+          <w:b w:val="0"/>
+          <w:bCs w:val="0"/>
+          <w:i w:val="0"/>
+          <w:sz w:val="24"/>
+          <w:szCs w:val="24"/>
+          <w:highlight w:val="none"/>
+          <w:u w:val="none"/>
+          <w:lang w:val="es-ES" w:bidi="es-ES"/>
+        </w:rPr>
+      </w:r>
+    </w:p>
+    <w:p>
+      <w:pPr>
+        <w:pBdr/>
+        <w:spacing/>
+        <w:ind/>
+        <w:jc w:val="center"/>
+        <w:rPr>
+          <w:rFonts w:ascii="Times New Roman" w:hAnsi="Times New Roman" w:cs="Times New Roman"/>
+          <w:b w:val="0"/>
+          <w:bCs w:val="0"/>
+          <w:i w:val="0"/>
+          <w:sz w:val="24"/>
+          <w:szCs w:val="24"/>
+          <w:highlight w:val="none"/>
+          <w:u w:val="none"/>
+          <w:lang w:val="es-ES"/>
+        </w:rPr>
+      </w:pPr>
+      <w:r>
+        <w:rPr>
+          <w:rFonts w:ascii="Times New Roman" w:hAnsi="Times New Roman" w:cs="Times New Roman"/>
+          <w:b w:val="0"/>
+          <w:bCs w:val="0"/>
+          <w:i w:val="0"/>
+          <w:sz w:val="24"/>
+          <w:szCs w:val="24"/>
+          <w:highlight w:val="none"/>
+          <w:u w:val="none"/>
+          <w:lang w:val="es-ES" w:bidi="es-ES"/>
+        </w:rPr>
+      </w:r>
+      <w:r>
+        <w:rPr>
+          <w:rFonts w:ascii="Times New Roman" w:hAnsi="Times New Roman" w:cs="Times New Roman"/>
+          <w:b w:val="0"/>
+          <w:bCs w:val="0"/>
+          <w:i w:val="0"/>
+          <w:sz w:val="24"/>
+          <w:szCs w:val="24"/>
+          <w:highlight w:val="none"/>
+          <w:u w:val="none"/>
+          <w:lang w:val="es-ES" w:bidi="es-ES"/>
+        </w:rPr>
+      </w:r>
+      <w:r>
+        <w:rPr>
+          <w:rFonts w:ascii="Times New Roman" w:hAnsi="Times New Roman" w:cs="Times New Roman"/>
+          <w:b w:val="0"/>
+          <w:bCs w:val="0"/>
+          <w:i w:val="0"/>
+          <w:sz w:val="24"/>
+          <w:szCs w:val="24"/>
+          <w:highlight w:val="none"/>
+          <w:u w:val="none"/>
+          <w:lang w:val="es-ES" w:bidi="es-ES"/>
+        </w:rPr>
+      </w:r>
+    </w:p>
+    <w:p>
+      <w:pPr>
+        <w:pBdr/>
+        <w:spacing/>
+        <w:ind/>
+        <w:jc w:val="center"/>
+        <w:rPr>
+          <w:rFonts w:ascii="Times New Roman" w:hAnsi="Times New Roman" w:cs="Times New Roman"/>
+          <w:b w:val="0"/>
+          <w:bCs w:val="0"/>
+          <w:i w:val="0"/>
+          <w:sz w:val="24"/>
+          <w:szCs w:val="24"/>
+          <w:u w:val="none"/>
+        </w:rPr>
+      </w:pPr>
+      <w:r>
+        <w:rPr>
+          <w:rFonts w:ascii="Times New Roman" w:hAnsi="Times New Roman" w:cs="Times New Roman"/>
+          <w:b w:val="0"/>
+          <w:bCs w:val="0"/>
+          <w:i w:val="0"/>
+          <w:sz w:val="24"/>
+          <w:szCs w:val="24"/>
+          <w:u w:val="none"/>
+        </w:rPr>
+      </w:r>
+      <w:r>
+        <w:rPr>
+          <w:rFonts w:ascii="Times New Roman" w:hAnsi="Times New Roman" w:cs="Times New Roman"/>
+          <w:b w:val="0"/>
+          <w:bCs w:val="0"/>
+          <w:i w:val="0"/>
+          <w:sz w:val="24"/>
+          <w:szCs w:val="24"/>
+          <w:u w:val="none"/>
+        </w:rPr>
+      </w:r>
+      <w:r>
+        <w:rPr>
+          <w:rFonts w:ascii="Times New Roman" w:hAnsi="Times New Roman" w:cs="Times New Roman"/>
+          <w:b w:val="0"/>
+          <w:bCs w:val="0"/>
+          <w:i w:val="0"/>
+          <w:sz w:val="24"/>
+          <w:szCs w:val="24"/>
+          <w:u w:val="none"/>
+        </w:rPr>
+      </w:r>
+    </w:p>
+    <w:p>
+      <w:pPr>
+        <w:pBdr/>
+        <w:spacing/>
+        <w:ind/>
+        <w:jc w:val="center"/>
+        <w:rPr>
+          <w:rFonts w:ascii="Times New Roman" w:hAnsi="Times New Roman" w:cs="Times New Roman"/>
+          <w:b w:val="0"/>
+          <w:bCs w:val="0"/>
+          <w:i w:val="0"/>
+          <w:sz w:val="24"/>
+          <w:szCs w:val="24"/>
+          <w:u w:val="none"/>
+        </w:rPr>
+      </w:pPr>
+      <w:r>
+        <w:rPr>
+          <w:rFonts w:ascii="Times New Roman" w:hAnsi="Times New Roman" w:cs="Times New Roman"/>
+          <w:b w:val="0"/>
+          <w:bCs w:val="0"/>
+          <w:i w:val="0"/>
+          <w:iCs w:val="0"/>
+          <w:sz w:val="24"/>
+          <w:szCs w:val="24"/>
+          <w:highlight w:val="none"/>
+          <w:u w:val="none"/>
+          <w:lang w:val="es-ES"/>
+        </w:rPr>
+      </w:r>
+      <w:r>
+        <w:rPr>
+          <w:rFonts w:ascii="Times New Roman" w:hAnsi="Times New Roman" w:cs="Times New Roman"/>
+          <w:b w:val="0"/>
+          <w:bCs w:val="0"/>
+          <w:i w:val="0"/>
+          <w:iCs w:val="0"/>
+          <w:sz w:val="24"/>
+          <w:szCs w:val="24"/>
+          <w:highlight w:val="none"/>
+          <w:u w:val="none"/>
+          <w:lang w:val="es-ES"/>
+        </w:rPr>
+      </w:r>
+      <w:r>
+        <w:rPr>
+          <w:rFonts w:ascii="Times New Roman" w:hAnsi="Times New Roman" w:cs="Times New Roman"/>
+          <w:b w:val="0"/>
+          <w:bCs w:val="0"/>
+          <w:i w:val="0"/>
+          <w:iCs w:val="0"/>
+          <w:sz w:val="24"/>
+          <w:szCs w:val="24"/>
+          <w:highlight w:val="none"/>
+          <w:u w:val="none"/>
+          <w:lang w:val="es-ES"/>
+        </w:rPr>
+      </w:r>
+    </w:p>
+    <w:p>
+      <w:pPr>
+        <w:pBdr/>
+        <w:spacing/>
+        <w:ind/>
+        <w:jc w:val="center"/>
+        <w:rPr>
           <w:rFonts w:ascii="Asana Math" w:hAnsi="Asana Math" w:cs="Asana Math"/>
         </w:rPr>
       </w:pPr>
@@ -10023,6 +11199,27 @@
           <w:rFonts w:ascii="Asana Math" w:hAnsi="Asana Math" w:cs="Asana Math"/>
         </w:rPr>
       </w:r>
+      <w:r>
+        <w:rPr>
+          <w:rFonts w:ascii="Asana Math" w:hAnsi="Asana Math" w:cs="Asana Math"/>
+        </w:rPr>
+      </w:r>
+      <w:r>
+        <w:rPr>
+          <w:rFonts w:ascii="Asana Math" w:hAnsi="Asana Math" w:cs="Asana Math"/>
+        </w:rPr>
+      </w:r>
+    </w:p>
+    <w:p>
+      <w:pPr>
+        <w:pBdr/>
+        <w:spacing/>
+        <w:ind/>
+        <w:jc w:val="center"/>
+        <w:rPr>
+          <w:rFonts w:ascii="Asana Math" w:hAnsi="Asana Math" w:cs="Asana Math"/>
+        </w:rPr>
+      </w:pPr>
       <w:r>
         <w:rPr>
           <w:rFonts w:ascii="Asana Math" w:hAnsi="Asana Math" w:cs="Asana Math"/>
@@ -10172,7 +11369,7 @@
               <wp:inline xmlns:wp="http://schemas.openxmlformats.org/drawingml/2006/wordprocessingDrawing" distT="0" distB="0" distL="0" distR="0">
                 <wp:extent cx="3573518" cy="1962101"/>
                 <wp:effectExtent l="0" t="0" r="0" b="0"/>
-                <wp:docPr id="18" name=""/>
+                <wp:docPr id="19" name=""/>
                 <wp:cNvGraphicFramePr>
                   <a:graphicFrameLocks xmlns:a="http://schemas.openxmlformats.org/drawingml/2006/main" noChangeAspect="1"/>
                 </wp:cNvGraphicFramePr>
@@ -10226,7 +11423,7 @@
                 <v:path o:extrusionok="f" gradientshapeok="t" o:connecttype="rect"/>
                 <o:lock v:ext="edit" aspectratio="t"/>
               </v:shapetype>
-              <v:shape id="_x0000_i17" o:spid="_x0000_s17" type="#_x0000_t75" style="width:281.38pt;height:154.50pt;mso-wrap-distance-left:0.00pt;mso-wrap-distance-top:0.00pt;mso-wrap-distance-right:0.00pt;mso-wrap-distance-bottom:0.00pt;z-index:1;" stroked="false">
+              <v:shape id="_x0000_i18" o:spid="_x0000_s18" type="#_x0000_t75" style="width:281.38pt;height:154.50pt;mso-wrap-distance-left:0.00pt;mso-wrap-distance-top:0.00pt;mso-wrap-distance-right:0.00pt;mso-wrap-distance-bottom:0.00pt;z-index:1;" stroked="false">
                 <v:imagedata r:id="rId19" o:title=""/>
                 <o:lock v:ext="edit" rotation="t"/>
               </v:shape>
@@ -10634,7 +11831,7 @@
         <w:pBdr/>
         <w:spacing/>
         <w:ind/>
-        <w:jc w:val="center"/>
+        <w:jc w:val="left"/>
         <w:rPr>
           <w:rFonts w:ascii="Asana Math" w:hAnsi="Asana Math" w:cs="Asana Math"/>
         </w:rPr>
@@ -10643,199 +11840,6 @@
         <w:rPr>
           <w:rFonts w:ascii="Asana Math" w:hAnsi="Asana Math" w:cs="Asana Math"/>
         </w:rPr>
-      </w:r>
-      <w:r>
-        <w:rPr>
-          <w:rFonts w:ascii="Asana Math" w:hAnsi="Asana Math" w:cs="Asana Math"/>
-        </w:rPr>
-      </w:r>
-      <w:r>
-        <w:rPr>
-          <w:rFonts w:ascii="Asana Math" w:hAnsi="Asana Math" w:cs="Asana Math"/>
-        </w:rPr>
-      </w:r>
-    </w:p>
-    <w:p>
-      <w:pPr>
-        <w:pBdr/>
-        <w:spacing/>
-        <w:ind/>
-        <w:jc w:val="center"/>
-        <w:rPr>
-          <w:rFonts w:ascii="Asana Math" w:hAnsi="Asana Math" w:cs="Asana Math"/>
-          <w:b w:val="0"/>
-          <w:bCs w:val="0"/>
-          <w:sz w:val="36"/>
-          <w:szCs w:val="36"/>
-        </w:rPr>
-      </w:pPr>
-      <w:r>
-        <w:rPr>
-          <w:rFonts w:ascii="Asana Math" w:hAnsi="Asana Math" w:eastAsia="Asana Math" w:cs="Asana Math"/>
-          <w:b w:val="0"/>
-          <w:bCs w:val="0"/>
-          <w:sz w:val="28"/>
-          <w:szCs w:val="28"/>
-          <w:highlight w:val="none"/>
-          <w:lang w:val="es-ES"/>
-        </w:rPr>
-        <w:t xml:space="preserve">MOVIMIENTOS.</w:t>
-      </w:r>
-      <w:r>
-        <w:rPr>
-          <w:rFonts w:ascii="Asana Math" w:hAnsi="Asana Math" w:cs="Asana Math"/>
-          <w:b w:val="0"/>
-          <w:bCs w:val="0"/>
-          <w:sz w:val="36"/>
-          <w:szCs w:val="36"/>
-        </w:rPr>
-      </w:r>
-      <w:r>
-        <w:rPr>
-          <w:rFonts w:ascii="Asana Math" w:hAnsi="Asana Math" w:cs="Asana Math"/>
-          <w:b w:val="0"/>
-          <w:bCs w:val="0"/>
-          <w:sz w:val="36"/>
-          <w:szCs w:val="36"/>
-        </w:rPr>
-      </w:r>
-    </w:p>
-    <w:p>
-      <w:pPr>
-        <w:pBdr/>
-        <w:spacing/>
-        <w:ind w:firstLine="0" w:left="0"/>
-        <w:jc w:val="center"/>
-        <w:rPr>
-          <w:rFonts w:ascii="Asana Math" w:hAnsi="Asana Math" w:cs="Asana Math"/>
-        </w:rPr>
-      </w:pPr>
-      <w:r>
-        <w:rPr>
-          <w:rFonts w:ascii="Asana Math" w:hAnsi="Asana Math" w:eastAsia="Asana Math" w:cs="Asana Math"/>
-          <w:highlight w:val="none"/>
-          <w:lang w:val="es-ES"/>
-        </w:rPr>
-        <w:t xml:space="preserve">Ahora nos centraremos en los movimientos b</w:t>
-      </w:r>
-      <w:r>
-        <w:rPr>
-          <w:rFonts w:ascii="Asana Math" w:hAnsi="Asana Math" w:eastAsia="Asana Math" w:cs="Asana Math"/>
-          <w:highlight w:val="none"/>
-          <w:lang w:val="es-ES"/>
-        </w:rPr>
-        <w:t xml:space="preserve">ásicos que tendra nuestro tetris que son derecha-izquierda y abajo, nuestra idea principal ser</w:t>
-      </w:r>
-      <w:r>
-        <w:rPr>
-          <w:rFonts w:ascii="Asana Math" w:hAnsi="Asana Math" w:eastAsia="Asana Math" w:cs="Asana Math"/>
-          <w:highlight w:val="none"/>
-          <w:lang w:val="es-ES"/>
-        </w:rPr>
-        <w:t xml:space="preserve">á no mover la ficha o modificar alguien valor binario, lo unico que haremos ser</w:t>
-      </w:r>
-      <w:r>
-        <w:rPr>
-          <w:rFonts w:ascii="Asana Math" w:hAnsi="Asana Math" w:eastAsia="Asana Math" w:cs="Asana Math"/>
-          <w:highlight w:val="none"/>
-          <w:lang w:val="es-ES"/>
-        </w:rPr>
-        <w:t xml:space="preserve">á mover la posici</w:t>
-      </w:r>
-      <w:r>
-        <w:rPr>
-          <w:rFonts w:ascii="Asana Math" w:hAnsi="Asana Math" w:eastAsia="Asana Math" w:cs="Asana Math"/>
-          <w:highlight w:val="none"/>
-          <w:lang w:val="es-ES"/>
-        </w:rPr>
-        <w:t xml:space="preserve">ón en donde se coloca la matriz de la pieza que en este caso esta en valores de posicion x y y, entonces si queremos que la ficha este mas a la derecha lo unico que haremos ser</w:t>
-      </w:r>
-      <w:r>
-        <w:rPr>
-          <w:rFonts w:ascii="Asana Math" w:hAnsi="Asana Math" w:eastAsia="Asana Math" w:cs="Asana Math"/>
-          <w:highlight w:val="none"/>
-          <w:lang w:val="es-ES"/>
-        </w:rPr>
-        <w:t xml:space="preserve">á un </w:t>
-      </w:r>
-      <m:oMath>
-        <m:r>
-          <w:rPr>
-            <w:rFonts w:hint="default" w:ascii="Cambria Math" w:hAnsi="Cambria Math" w:eastAsia="Cambria Math" w:cs="Cambria Math"/>
-            <w:highlight w:val="none"/>
-            <w:lang w:val="es-ES" w:bidi="es-ES"/>
-          </w:rPr>
-          <m:rPr>
-            <m:sty m:val="i"/>
-          </m:rPr>
-          <m:t>x++</m:t>
-        </m:r>
-      </m:oMath>
-      <w:r>
-        <w:rPr>
-          <w:rFonts w:ascii="Asana Math" w:hAnsi="Asana Math" w:eastAsia="Asana Math" w:cs="Asana Math"/>
-          <w:highlight w:val="none"/>
-          <w:lang w:val="es-ES"/>
-        </w:rPr>
-        <w:t xml:space="preserve"> o si quieremos que la ficha esta mas a la izquierda utilizamos un </w:t>
-      </w:r>
-      <m:oMath>
-        <m:r>
-          <w:rPr>
-            <w:rFonts w:hint="default" w:ascii="Cambria Math" w:hAnsi="Cambria Math" w:eastAsia="Cambria Math" w:cs="Cambria Math"/>
-            <w:highlight w:val="none"/>
-            <w:lang w:val="es-ES" w:bidi="es-ES"/>
-          </w:rPr>
-          <m:rPr>
-            <m:sty m:val="i"/>
-          </m:rPr>
-          <m:t>x--</m:t>
-        </m:r>
-      </m:oMath>
-      <w:r>
-        <w:rPr>
-          <w:rFonts w:ascii="Asana Math" w:hAnsi="Asana Math" w:eastAsia="Asana Math" w:cs="Asana Math"/>
-          <w:highlight w:val="none"/>
-          <w:lang w:val="es-ES"/>
-        </w:rPr>
-        <w:t xml:space="preserve">, despues que colocamos la nueva posicion inmediatamente se har</w:t>
-      </w:r>
-      <w:r>
-        <w:rPr>
-          <w:rFonts w:ascii="Asana Math" w:hAnsi="Asana Math" w:eastAsia="Asana Math" w:cs="Asana Math"/>
-          <w:highlight w:val="none"/>
-          <w:lang w:val="es-ES"/>
-        </w:rPr>
-        <w:t xml:space="preserve">á el bitmasking , para moverle para abajo lo unico que haremos ser</w:t>
-      </w:r>
-      <w:r>
-        <w:rPr>
-          <w:rFonts w:ascii="Asana Math" w:hAnsi="Asana Math" w:eastAsia="Asana Math" w:cs="Asana Math"/>
-          <w:highlight w:val="none"/>
-          <w:lang w:val="es-ES"/>
-        </w:rPr>
-        <w:t xml:space="preserve">á sumar el eje y en </w:t>
-      </w:r>
-      <m:oMath>
-        <m:r>
-          <w:rPr>
-            <w:rFonts w:hint="default" w:ascii="Cambria Math" w:hAnsi="Cambria Math" w:eastAsia="Cambria Math" w:cs="Cambria Math"/>
-            <w:highlight w:val="none"/>
-            <w:lang w:val="es-ES" w:bidi="es-ES"/>
-          </w:rPr>
-          <m:rPr>
-            <m:sty m:val="i"/>
-          </m:rPr>
-          <m:t>y++</m:t>
-        </m:r>
-      </m:oMath>
-      <w:r>
-        <w:rPr>
-          <w:rFonts w:ascii="Asana Math" w:hAnsi="Asana Math" w:eastAsia="Asana Math" w:cs="Asana Math"/>
-          <w:highlight w:val="none"/>
-          <w:lang w:val="es-ES"/>
-        </w:rPr>
-        <w:t xml:space="preserve"> esto inmediatamente me movera las fichas.</w:t>
       </w:r>
       <w:r>
         <w:rPr>

</xml_diff>